<commit_message>
treat while & estructura de memoria chapter3
</commit_message>
<xml_diff>
--- a/Optimization of the circom compiler.docx
+++ b/Optimization of the circom compiler.docx
@@ -586,14 +586,12 @@
         </w:rPr>
         <w:t xml:space="preserve">Clara Rodríguez </w:t>
       </w:r>
-      <w:proofErr w:type="spellStart"/>
-      <w:r>
-        <w:rPr>
-          <w:lang w:val="es-ES"/>
-        </w:rPr>
-        <w:t>Nuñez</w:t>
-      </w:r>
-      <w:proofErr w:type="spellEnd"/>
+      <w:r>
+        <w:rPr>
+          <w:lang w:val="es-ES"/>
+        </w:rPr>
+        <w:t>Núñez</w:t>
+      </w:r>
     </w:p>
     <w:p>
       <w:pPr>
@@ -652,42 +650,10 @@
         <w:pStyle w:val="FooterPage"/>
       </w:pPr>
       <w:r>
-        <w:rPr>
-          <w:lang w:val="en-US"/>
-        </w:rPr>
-        <w:fldChar w:fldCharType="begin">
-          <w:ffData>
-            <w:name w:val=""/>
-            <w:enabled/>
-            <w:calcOnExit w:val="0"/>
-            <w:textInput>
-              <w:default w:val="Grado en Ingeniería Informática"/>
-            </w:textInput>
-          </w:ffData>
-        </w:fldChar>
-      </w:r>
-      <w:r>
-        <w:instrText xml:space="preserve"> FORMTEXT </w:instrText>
-      </w:r>
-      <w:r>
-        <w:rPr>
-          <w:lang w:val="en-US"/>
-        </w:rPr>
-      </w:r>
-      <w:r>
-        <w:rPr>
-          <w:lang w:val="en-US"/>
-        </w:rPr>
-        <w:fldChar w:fldCharType="separate"/>
-      </w:r>
-      <w:r>
-        <w:t>Grado en Ingeniería Informática</w:t>
-      </w:r>
-      <w:r>
-        <w:rPr>
-          <w:lang w:val="en-US"/>
-        </w:rPr>
-        <w:fldChar w:fldCharType="end"/>
+        <w:t>Grado e</w:t>
+      </w:r>
+      <w:r>
+        <w:t>n Ingeniería Informática</w:t>
       </w:r>
     </w:p>
     <w:p>
@@ -803,6 +769,7 @@
       </w:pPr>
       <w:r>
         <w:rPr>
+          <w:highlight w:val="cyan"/>
           <w:lang w:val="es-ES"/>
         </w:rPr>
         <w:t>A todos los caídos durante el proceso de creación de esta plantilla.</w:t>
@@ -854,6 +821,7 @@
       </w:pPr>
       <w:r>
         <w:rPr>
+          <w:highlight w:val="cyan"/>
           <w:lang w:val="es-ES"/>
         </w:rPr>
         <w:t>A Gonzalo, por el tiempo empleado en hacer estas plantillas. A Adrián, Enrique y Nacho, por sus comentarios para mejorar lo que hicimos. Y a Narciso, a quien no le ha hecho falta el Anillo Único para coordinarnos a todos.</w:t>
@@ -936,23 +904,27 @@
     <w:p>
       <w:pPr>
         <w:rPr>
-          <w:lang w:val="es-ES"/>
-        </w:rPr>
-      </w:pPr>
-      <w:r>
-        <w:rPr>
+          <w:highlight w:val="cyan"/>
+          <w:lang w:val="es-ES"/>
+        </w:rPr>
+      </w:pPr>
+      <w:r>
+        <w:rPr>
+          <w:highlight w:val="cyan"/>
           <w:lang w:val="es-ES" w:eastAsia="es-ES"/>
         </w:rPr>
         <w:t xml:space="preserve">Un resumen en castellano de media página, incluyendo el título en castellano. A </w:t>
       </w:r>
       <w:r>
         <w:rPr>
+          <w:highlight w:val="cyan"/>
           <w:lang w:val="es-ES" w:eastAsia="es-ES"/>
         </w:rPr>
         <w:t>continuación,</w:t>
       </w:r>
       <w:r>
         <w:rPr>
+          <w:highlight w:val="cyan"/>
           <w:lang w:val="es-ES" w:eastAsia="es-ES"/>
         </w:rPr>
         <w:t xml:space="preserve"> se escribirá una lista de no más de 10 palabras clave</w:t>
@@ -962,12 +934,14 @@
       <w:pPr>
         <w:rPr>
           <w:rStyle w:val="Textoennegrita"/>
+          <w:highlight w:val="cyan"/>
           <w:lang w:val="es-ES"/>
         </w:rPr>
       </w:pPr>
       <w:r>
         <w:rPr>
           <w:rStyle w:val="Textoennegrita"/>
+          <w:highlight w:val="cyan"/>
           <w:lang w:val="es-ES"/>
         </w:rPr>
         <w:t>Palabras clave</w:t>
@@ -981,12 +955,14 @@
       </w:pPr>
       <w:r>
         <w:rPr>
+          <w:highlight w:val="cyan"/>
           <w:lang w:val="es-ES"/>
         </w:rPr>
         <w:t>Palabra 1, palabra 2</w:t>
       </w:r>
       <w:r>
         <w:rPr>
+          <w:highlight w:val="cyan"/>
           <w:lang w:val="es-ES"/>
         </w:rPr>
         <w:t xml:space="preserve"> (máx. 10 palabras separadas por comas)</w:t>
@@ -1052,20 +1028,28 @@
       </w:r>
     </w:p>
     <w:p>
-      <w:r>
-        <w:rPr>
+      <w:pPr>
+        <w:rPr>
+          <w:highlight w:val="cyan"/>
+        </w:rPr>
+      </w:pPr>
+      <w:r>
+        <w:rPr>
+          <w:highlight w:val="cyan"/>
           <w:lang w:eastAsia="es-ES"/>
         </w:rPr>
         <w:t xml:space="preserve">An abstract in </w:t>
       </w:r>
       <w:r>
         <w:rPr>
+          <w:highlight w:val="cyan"/>
           <w:lang w:eastAsia="es-ES"/>
         </w:rPr>
         <w:t>English</w:t>
       </w:r>
       <w:r>
         <w:rPr>
+          <w:highlight w:val="cyan"/>
           <w:lang w:eastAsia="es-ES"/>
         </w:rPr>
         <w:t>, no more than a half page, including the title in English. Below, a list with no more than 10 keywords.</w:t>
@@ -1075,29 +1059,46 @@
       <w:pPr>
         <w:rPr>
           <w:rStyle w:val="Textoennegrita"/>
+          <w:highlight w:val="cyan"/>
         </w:rPr>
       </w:pPr>
       <w:r>
         <w:rPr>
           <w:rStyle w:val="Textoennegrita"/>
+          <w:highlight w:val="cyan"/>
         </w:rPr>
         <w:t>Keywords</w:t>
       </w:r>
     </w:p>
     <w:p>
       <w:r>
+        <w:rPr>
+          <w:highlight w:val="cyan"/>
+        </w:rPr>
         <w:t>Keyw</w:t>
       </w:r>
       <w:r>
+        <w:rPr>
+          <w:highlight w:val="cyan"/>
+        </w:rPr>
         <w:t xml:space="preserve">ord1, </w:t>
       </w:r>
       <w:r>
+        <w:rPr>
+          <w:highlight w:val="cyan"/>
+        </w:rPr>
         <w:t>Keyw</w:t>
       </w:r>
       <w:r>
+        <w:rPr>
+          <w:highlight w:val="cyan"/>
+        </w:rPr>
         <w:t>ord2</w:t>
       </w:r>
       <w:r>
+        <w:rPr>
+          <w:highlight w:val="cyan"/>
+        </w:rPr>
         <w:t xml:space="preserve"> (10 keywords max., separated by commas).</w:t>
       </w:r>
     </w:p>
@@ -2480,21 +2481,11 @@
         <w:pStyle w:val="PageHeading"/>
       </w:pPr>
       <w:bookmarkStart w:id="2" w:name="IndiceFiguras"/>
-      <w:proofErr w:type="spellStart"/>
       <w:r>
         <w:lastRenderedPageBreak/>
-        <w:t>Índice</w:t>
-      </w:r>
-      <w:proofErr w:type="spellEnd"/>
-      <w:r>
-        <w:t xml:space="preserve"> de </w:t>
-      </w:r>
-      <w:proofErr w:type="spellStart"/>
-      <w:r>
-        <w:t>figuras</w:t>
+        <w:t>Índice de figuras</w:t>
       </w:r>
       <w:bookmarkEnd w:id="2"/>
-      <w:proofErr w:type="spellEnd"/>
     </w:p>
     <w:p>
       <w:pPr>
@@ -2671,21 +2662,11 @@
           <w:u w:val="single"/>
         </w:rPr>
       </w:pPr>
-      <w:proofErr w:type="spellStart"/>
       <w:r>
         <w:lastRenderedPageBreak/>
-        <w:t>Índice</w:t>
-      </w:r>
-      <w:proofErr w:type="spellEnd"/>
-      <w:r>
-        <w:t xml:space="preserve"> de </w:t>
-      </w:r>
-      <w:proofErr w:type="spellStart"/>
-      <w:r>
-        <w:t>tablas</w:t>
+        <w:t>Índice de tablas</w:t>
       </w:r>
       <w:bookmarkEnd w:id="3"/>
-      <w:proofErr w:type="spellEnd"/>
     </w:p>
     <w:p>
       <w:pPr>
@@ -2814,11 +2795,13 @@
       <w:pPr>
         <w:ind w:firstLine="0"/>
         <w:rPr>
+          <w:highlight w:val="cyan"/>
           <w:shd w:val="clear" w:color="auto" w:fill="FFFFFF"/>
         </w:rPr>
       </w:pPr>
       <w:r>
         <w:rPr>
+          <w:highlight w:val="cyan"/>
           <w:shd w:val="clear" w:color="auto" w:fill="FFFFFF"/>
         </w:rPr>
         <w:t>This TFG is about optimizing the memory usage of the Circom compiler.</w:t>
@@ -2828,17 +2811,20 @@
       <w:pPr>
         <w:ind w:firstLine="0"/>
         <w:rPr>
+          <w:highlight w:val="cyan"/>
           <w:shd w:val="clear" w:color="auto" w:fill="FFFFFF"/>
         </w:rPr>
       </w:pPr>
       <w:r>
         <w:rPr>
+          <w:highlight w:val="cyan"/>
           <w:shd w:val="clear" w:color="auto" w:fill="FFFFFF"/>
         </w:rPr>
         <w:t>The Circom compiler is a tool used in many Universities, developed by the UCM and the UPC, and its purpose is to translate an arithmetic program in the Circom language to C++</w:t>
       </w:r>
       <w:r>
         <w:rPr>
+          <w:highlight w:val="cyan"/>
           <w:shd w:val="clear" w:color="auto" w:fill="FFFFFF"/>
         </w:rPr>
         <w:t xml:space="preserve"> or Web Assembly.</w:t>
@@ -2848,51 +2834,42 @@
       <w:pPr>
         <w:ind w:firstLine="0"/>
         <w:rPr>
+          <w:highlight w:val="cyan"/>
           <w:shd w:val="clear" w:color="auto" w:fill="FFFFFF"/>
         </w:rPr>
       </w:pPr>
       <w:r>
         <w:rPr>
+          <w:highlight w:val="cyan"/>
           <w:shd w:val="clear" w:color="auto" w:fill="FFFFFF"/>
         </w:rPr>
-        <w:t xml:space="preserve">The code of the Circom compiler is written in Rust, so it has the possibility to specify the size of the variables. But in the code, all the variable sizes are the same, so the size needs to be </w:t>
-      </w:r>
-      <w:proofErr w:type="gramStart"/>
-      <w:r>
+        <w:t xml:space="preserve">The code of the Circom compiler is written in Rust, so it has the possibility to specify the size of the variables. But in the code, all the variable sizes are the same, so the size needs to be really big. </w:t>
+      </w:r>
+    </w:p>
+    <w:p>
+      <w:pPr>
+        <w:ind w:firstLine="0"/>
         <w:rPr>
           <w:shd w:val="clear" w:color="auto" w:fill="FFFFFF"/>
         </w:rPr>
-        <w:t>really big</w:t>
-      </w:r>
-      <w:proofErr w:type="gramEnd"/>
-      <w:r>
-        <w:rPr>
+      </w:pPr>
+      <w:r>
+        <w:rPr>
+          <w:highlight w:val="cyan"/>
           <w:shd w:val="clear" w:color="auto" w:fill="FFFFFF"/>
         </w:rPr>
-        <w:t xml:space="preserve">. </w:t>
-      </w:r>
-    </w:p>
-    <w:p>
-      <w:pPr>
-        <w:ind w:firstLine="0"/>
-        <w:rPr>
+        <w:t xml:space="preserve">What I intend to do is to reduce those variables sizes by </w:t>
+      </w:r>
+      <w:r>
+        <w:rPr>
+          <w:highlight w:val="cyan"/>
           <w:shd w:val="clear" w:color="auto" w:fill="FFFFFF"/>
         </w:rPr>
-      </w:pPr>
-      <w:r>
-        <w:rPr>
-          <w:shd w:val="clear" w:color="auto" w:fill="FFFFFF"/>
-        </w:rPr>
-        <w:t xml:space="preserve">What I intend to do is to reduce those variables sizes by </w:t>
-      </w:r>
-      <w:r>
-        <w:rPr>
-          <w:shd w:val="clear" w:color="auto" w:fill="FFFFFF"/>
-        </w:rPr>
         <w:t>analyzing</w:t>
       </w:r>
       <w:r>
         <w:rPr>
+          <w:highlight w:val="cyan"/>
           <w:shd w:val="clear" w:color="auto" w:fill="FFFFFF"/>
         </w:rPr>
         <w:t xml:space="preserve"> the different values that it can take and narrowing the bytes down to the ones needed by those values.</w:t>
@@ -2912,6 +2889,7 @@
         <w:rPr>
           <w:color w:val="EE0000"/>
           <w:shd w:val="clear" w:color="auto" w:fill="FFFFFF"/>
+          <w:lang w:val="es-ES"/>
         </w:rPr>
       </w:pPr>
       <w:r>
@@ -2919,52 +2897,38 @@
           <w:color w:val="EE0000"/>
           <w:highlight w:val="yellow"/>
           <w:shd w:val="clear" w:color="auto" w:fill="FFFFFF"/>
-        </w:rPr>
-        <w:t xml:space="preserve">Hablar de </w:t>
-      </w:r>
+          <w:lang w:val="es-ES"/>
+        </w:rPr>
+        <w:t>Hablar de Circom</w:t>
+      </w:r>
+    </w:p>
+    <w:p>
+      <w:pPr>
+        <w:ind w:firstLine="0"/>
+        <w:rPr>
+          <w:color w:val="EE0000"/>
+          <w:shd w:val="clear" w:color="auto" w:fill="FFFFFF"/>
+          <w:lang w:val="es-ES"/>
+        </w:rPr>
+      </w:pPr>
+    </w:p>
+    <w:p>
+      <w:pPr>
+        <w:ind w:firstLine="0"/>
+        <w:rPr>
+          <w:color w:val="EE0000"/>
+          <w:shd w:val="clear" w:color="auto" w:fill="FFFFFF"/>
+          <w:lang w:val="es-ES"/>
+        </w:rPr>
+      </w:pPr>
       <w:r>
         <w:rPr>
           <w:color w:val="EE0000"/>
           <w:highlight w:val="yellow"/>
           <w:shd w:val="clear" w:color="auto" w:fill="FFFFFF"/>
-        </w:rPr>
-        <w:t>Circom</w:t>
-      </w:r>
-    </w:p>
-    <w:p>
-      <w:pPr>
-        <w:ind w:firstLine="0"/>
-        <w:rPr>
-          <w:color w:val="EE0000"/>
-          <w:shd w:val="clear" w:color="auto" w:fill="FFFFFF"/>
-        </w:rPr>
-      </w:pPr>
-    </w:p>
-    <w:p>
-      <w:pPr>
-        <w:ind w:firstLine="0"/>
-        <w:rPr>
-          <w:color w:val="EE0000"/>
-          <w:shd w:val="clear" w:color="auto" w:fill="FFFFFF"/>
-        </w:rPr>
-      </w:pPr>
-      <w:proofErr w:type="spellStart"/>
-      <w:r>
-        <w:rPr>
-          <w:color w:val="EE0000"/>
-          <w:highlight w:val="yellow"/>
-          <w:shd w:val="clear" w:color="auto" w:fill="FFFFFF"/>
-        </w:rPr>
-        <w:t>Hblar</w:t>
-      </w:r>
-      <w:proofErr w:type="spellEnd"/>
-      <w:r>
-        <w:rPr>
-          <w:color w:val="EE0000"/>
-          <w:highlight w:val="yellow"/>
-          <w:shd w:val="clear" w:color="auto" w:fill="FFFFFF"/>
-        </w:rPr>
-        <w:t xml:space="preserve"> de Rust</w:t>
+          <w:lang w:val="es-ES"/>
+        </w:rPr>
+        <w:t>Hblar de Rust</w:t>
       </w:r>
     </w:p>
     <w:p>
@@ -2988,21 +2952,33 @@
     <w:p>
       <w:pPr>
         <w:pStyle w:val="Textoindependiente"/>
-      </w:pPr>
-      <w:r>
+        <w:rPr>
+          <w:highlight w:val="cyan"/>
+        </w:rPr>
+      </w:pPr>
+      <w:r>
+        <w:rPr>
+          <w:highlight w:val="cyan"/>
+        </w:rPr>
         <w:t>For the TFG I wanted to do something impactful that also required optimiz</w:t>
       </w:r>
       <w:r>
+        <w:rPr>
+          <w:highlight w:val="cyan"/>
+        </w:rPr>
         <w:t>ation</w:t>
       </w:r>
       <w:r>
+        <w:rPr>
+          <w:highlight w:val="cyan"/>
+        </w:rPr>
         <w:t>.</w:t>
       </w:r>
       <w:r>
-        <w:t xml:space="preserve"> </w:t>
-      </w:r>
-      <w:r>
-        <w:t>By optimizing Circom I can get both.</w:t>
+        <w:rPr>
+          <w:highlight w:val="cyan"/>
+        </w:rPr>
+        <w:t xml:space="preserve"> By optimizing Circom I can get both.</w:t>
       </w:r>
     </w:p>
     <w:p>
@@ -3010,9 +2986,15 @@
         <w:pStyle w:val="Textoindependiente"/>
       </w:pPr>
       <w:r>
+        <w:rPr>
+          <w:highlight w:val="cyan"/>
+        </w:rPr>
         <w:t>Circom is a widely used compiler in many universities, and it has an issue with the size of the variables</w:t>
       </w:r>
       <w:r>
+        <w:rPr>
+          <w:highlight w:val="cyan"/>
+        </w:rPr>
         <w:t xml:space="preserve"> and signals, so by solving this issue I optimize the memory usage of the compiler for many people.</w:t>
       </w:r>
     </w:p>
@@ -3041,6 +3023,9 @@
         <w:pStyle w:val="Textoindependiente"/>
       </w:pPr>
       <w:r>
+        <w:rPr>
+          <w:highlight w:val="cyan"/>
+        </w:rPr>
         <w:t>For this project I want to explore the Circom compiler, and by doing so learn how Rust works at a high level. Moreover, I want to make this project a gateway to future projects optimizing systems.</w:t>
       </w:r>
     </w:p>
@@ -3061,20 +3046,34 @@
       <w:bookmarkEnd w:id="12"/>
     </w:p>
     <w:p>
-      <w:proofErr w:type="gramStart"/>
-      <w:r>
-        <w:t>First of all</w:t>
-      </w:r>
-      <w:proofErr w:type="gramEnd"/>
-      <w:r>
-        <w:t>, I had to learn the basics of Rust and how it does manage memory</w:t>
-      </w:r>
-      <w:r>
+      <w:pPr>
+        <w:rPr>
+          <w:highlight w:val="cyan"/>
+        </w:rPr>
+      </w:pPr>
+      <w:r>
+        <w:rPr>
+          <w:highlight w:val="cyan"/>
+        </w:rPr>
+        <w:t>First of all, I had to learn the basics of Rust and how it does manage memory</w:t>
+      </w:r>
+      <w:r>
+        <w:rPr>
+          <w:highlight w:val="cyan"/>
+        </w:rPr>
         <w:t>, so I studied and practiced a little bit during the previous summer.</w:t>
       </w:r>
     </w:p>
     <w:p>
-      <w:r>
+      <w:pPr>
+        <w:rPr>
+          <w:highlight w:val="cyan"/>
+        </w:rPr>
+      </w:pPr>
+      <w:r>
+        <w:rPr>
+          <w:highlight w:val="cyan"/>
+        </w:rPr>
         <w:t>Then, I went through the first semester by reading documentation and papers about Circom and the usage of it.</w:t>
       </w:r>
     </w:p>
@@ -3091,29 +3090,22 @@
         </w:sectPr>
       </w:pPr>
       <w:r>
+        <w:rPr>
+          <w:highlight w:val="cyan"/>
+        </w:rPr>
         <w:t xml:space="preserve">And now in the second semester, I will start to </w:t>
       </w:r>
       <w:r>
+        <w:rPr>
+          <w:highlight w:val="cyan"/>
+        </w:rPr>
         <w:t>analyze</w:t>
       </w:r>
       <w:r>
-        <w:t xml:space="preserve"> the different areas of the code to be </w:t>
-      </w:r>
-      <w:proofErr w:type="gramStart"/>
-      <w:r>
-        <w:t>optimized, and</w:t>
-      </w:r>
-      <w:proofErr w:type="gramEnd"/>
-      <w:r>
-        <w:t xml:space="preserve"> then </w:t>
-      </w:r>
-      <w:proofErr w:type="gramStart"/>
-      <w:r>
-        <w:t>implementing</w:t>
-      </w:r>
-      <w:proofErr w:type="gramEnd"/>
-      <w:r>
-        <w:t xml:space="preserve"> some changes to optimize memory usage of the code.</w:t>
+        <w:rPr>
+          <w:highlight w:val="cyan"/>
+        </w:rPr>
+        <w:t xml:space="preserve"> the different areas of the code to be optimized, and then implementing some changes to optimize memory usage of the code.</w:t>
       </w:r>
     </w:p>
     <w:p>
@@ -3138,88 +3130,116 @@
       </w:r>
       <w:bookmarkEnd w:id="13"/>
       <w:bookmarkEnd w:id="14"/>
+    </w:p>
+    <w:p>
+      <w:pPr>
+        <w:pStyle w:val="Ttulo1"/>
+      </w:pPr>
       <w:r>
         <w:t>The problem to solve</w:t>
       </w:r>
     </w:p>
     <w:p>
-      <w:r>
+      <w:pPr>
+        <w:rPr>
+          <w:highlight w:val="cyan"/>
+        </w:rPr>
+      </w:pPr>
+      <w:r>
+        <w:rPr>
+          <w:highlight w:val="cyan"/>
+        </w:rPr>
         <w:t xml:space="preserve">The Circom </w:t>
       </w:r>
       <w:r>
+        <w:rPr>
+          <w:highlight w:val="cyan"/>
+        </w:rPr>
         <w:t>compiler,</w:t>
       </w:r>
       <w:r>
+        <w:rPr>
+          <w:highlight w:val="cyan"/>
+        </w:rPr>
         <w:t xml:space="preserve"> </w:t>
       </w:r>
       <w:r>
+        <w:rPr>
+          <w:highlight w:val="cyan"/>
+        </w:rPr>
         <w:t>like</w:t>
       </w:r>
       <w:r>
+        <w:rPr>
+          <w:highlight w:val="cyan"/>
+        </w:rPr>
         <w:t xml:space="preserve"> many other </w:t>
       </w:r>
       <w:r>
+        <w:rPr>
+          <w:highlight w:val="cyan"/>
+        </w:rPr>
         <w:t>compilers,</w:t>
       </w:r>
       <w:r>
+        <w:rPr>
+          <w:highlight w:val="cyan"/>
+        </w:rPr>
         <w:t xml:space="preserve"> uses signals to transmit information between different parts of the code. These signals are the key to the problem to solve.</w:t>
       </w:r>
     </w:p>
     <w:p>
-      <w:r>
+      <w:pPr>
+        <w:rPr>
+          <w:highlight w:val="cyan"/>
+        </w:rPr>
+      </w:pPr>
+      <w:r>
+        <w:rPr>
+          <w:highlight w:val="cyan"/>
+        </w:rPr>
         <w:t>These signals are assigned 256 bits, and the code generated ends up with those huge signals. This can be a problem because some of the signals are too small for the 256 bits, and the unused bits get wasted.</w:t>
       </w:r>
     </w:p>
     <w:p>
-      <w:r>
-        <w:t xml:space="preserve">These signals may be assigned to one or many different values. For the ones that are assigned only one value, it is obvious that the memory is wasted, but for the others it is more difficult because you would need to </w:t>
-      </w:r>
-      <w:proofErr w:type="spellStart"/>
-      <w:r>
-        <w:t>analize</w:t>
-      </w:r>
-      <w:proofErr w:type="spellEnd"/>
-      <w:r>
-        <w:t xml:space="preserve"> the different values that it can take, and then you will see how much of the memory assigned to the signal is wasted.</w:t>
-      </w:r>
-    </w:p>
-    <w:p/>
-    <w:p>
-      <w:r>
+      <w:pPr>
         <w:rPr>
           <w:highlight w:val="cyan"/>
         </w:rPr>
+      </w:pPr>
+      <w:r>
+        <w:rPr>
+          <w:highlight w:val="cyan"/>
+        </w:rPr>
+        <w:t>These signals may be assigned to one or many different values. For the ones that are assigned only one value, it is obvious that the memory is wasted, but for the others it is more difficult because you would need to analize the different values that it can take, and then you will see how much of the memory assigned to the signal is wasted.</w:t>
+      </w:r>
+    </w:p>
+    <w:p>
+      <w:pPr>
+        <w:rPr>
+          <w:highlight w:val="cyan"/>
+        </w:rPr>
+      </w:pPr>
+    </w:p>
+    <w:p>
+      <w:pPr>
+        <w:rPr>
+          <w:highlight w:val="cyan"/>
+        </w:rPr>
+      </w:pPr>
+      <w:r>
+        <w:rPr>
+          <w:highlight w:val="cyan"/>
+        </w:rPr>
         <w:t>Example with a Boolean signal.</w:t>
       </w:r>
     </w:p>
     <w:p>
       <w:r>
-        <w:t xml:space="preserve">In this example you can observe that the signal </w:t>
-      </w:r>
-      <w:r>
         <w:rPr>
           <w:highlight w:val="cyan"/>
         </w:rPr>
-        <w:t>X</w:t>
-      </w:r>
-      <w:r>
-        <w:t xml:space="preserve"> can only take the values ‘1’ and ‘0’, </w:t>
-      </w:r>
-      <w:proofErr w:type="gramStart"/>
-      <w:r>
-        <w:t>which  only</w:t>
-      </w:r>
-      <w:proofErr w:type="gramEnd"/>
-      <w:r>
-        <w:t xml:space="preserve"> would need 1 bit, however it is assigned 256 </w:t>
-      </w:r>
-      <w:proofErr w:type="gramStart"/>
-      <w:r>
-        <w:t>bits</w:t>
-      </w:r>
-      <w:proofErr w:type="gramEnd"/>
-      <w:r>
-        <w:t xml:space="preserve"> and it is wasting 255 bits that will never use.</w:t>
+        <w:t>In this example you can observe that the signal X can only take the values ‘1’ and ‘0’, which  only would need 1 bit, however it is assigned 256 bits and it is wasting 255 bits that will never use.</w:t>
       </w:r>
     </w:p>
     <w:p/>
@@ -3238,130 +3258,338 @@
       <w:pPr>
         <w:pStyle w:val="Ttulo1"/>
       </w:pPr>
-      <w:bookmarkStart w:id="15" w:name="_Toc116636441"/>
-      <w:bookmarkStart w:id="16" w:name="_Toc221452911"/>
-      <w:proofErr w:type="spellStart"/>
       <w:r>
         <w:lastRenderedPageBreak/>
-        <w:t>Capítulos</w:t>
-      </w:r>
-      <w:proofErr w:type="spellEnd"/>
+        <w:t>Analysis</w:t>
+      </w:r>
       <w:r>
         <w:t xml:space="preserve"> </w:t>
       </w:r>
-      <w:proofErr w:type="spellStart"/>
-      <w:r>
-        <w:t>varios</w:t>
+      <w:r>
+        <w:t>Infix operations</w:t>
+      </w:r>
+    </w:p>
+    <w:p>
+      <w:pPr>
+        <w:pStyle w:val="Ttulo1"/>
+        <w:numPr>
+          <w:ilvl w:val="0"/>
+          <w:numId w:val="0"/>
+        </w:numPr>
+      </w:pPr>
+    </w:p>
+    <w:p>
+      <w:pPr>
+        <w:rPr>
+          <w:highlight w:val="cyan"/>
+          <w:lang w:val="es-ES"/>
+        </w:rPr>
+      </w:pPr>
+      <w:r>
+        <w:rPr>
+          <w:highlight w:val="cyan"/>
+          <w:lang w:val="es-ES"/>
+        </w:rPr>
+        <w:t xml:space="preserve">Este es un ejemplo de capítulo del Trabajo de Fin de </w:t>
+      </w:r>
+      <w:r>
+        <w:rPr>
+          <w:highlight w:val="cyan"/>
+          <w:lang w:val="es-ES"/>
+        </w:rPr>
+        <w:t>Grado</w:t>
+      </w:r>
+      <w:r>
+        <w:rPr>
+          <w:highlight w:val="cyan"/>
+          <w:lang w:val="es-ES"/>
+        </w:rPr>
+        <w:t xml:space="preserve">. Cada capítulo comienza con el nombre del capítulo. Este párrafo ha de usar el estilo Título 1, con el fin de que aparezca automáticamente en el </w:t>
+      </w:r>
+      <w:r>
+        <w:rPr>
+          <w:highlight w:val="cyan"/>
+        </w:rPr>
+        <w:fldChar w:fldCharType="begin"/>
+      </w:r>
+      <w:r>
+        <w:rPr>
+          <w:highlight w:val="cyan"/>
+          <w:lang w:val="es-ES"/>
+        </w:rPr>
+        <w:instrText xml:space="preserve"> REF Indice \h </w:instrText>
+      </w:r>
+      <w:r>
+        <w:rPr>
+          <w:highlight w:val="cyan"/>
+        </w:rPr>
+      </w:r>
+      <w:r>
+        <w:rPr>
+          <w:highlight w:val="cyan"/>
+          <w:lang w:val="es-ES"/>
+        </w:rPr>
+        <w:instrText xml:space="preserve"> \* MERGEFORMAT </w:instrText>
+      </w:r>
+      <w:r>
+        <w:rPr>
+          <w:highlight w:val="cyan"/>
+        </w:rPr>
+        <w:fldChar w:fldCharType="separate"/>
+      </w:r>
+      <w:r>
+        <w:rPr>
+          <w:highlight w:val="cyan"/>
+          <w:lang w:val="es-ES"/>
+        </w:rPr>
+        <w:t>Índice de contenidos</w:t>
+      </w:r>
+      <w:r>
+        <w:rPr>
+          <w:highlight w:val="cyan"/>
+        </w:rPr>
+        <w:fldChar w:fldCharType="end"/>
+      </w:r>
+      <w:r>
+        <w:rPr>
+          <w:highlight w:val="cyan"/>
+          <w:lang w:val="es-ES"/>
+        </w:rPr>
+        <w:t xml:space="preserve"> (el índice se puede actualizar en cualquier momento pulsando sobre él con el botón derecho y seleccionando la opción </w:t>
+      </w:r>
+      <w:r>
+        <w:rPr>
+          <w:i/>
+          <w:highlight w:val="cyan"/>
+          <w:lang w:val="es-ES"/>
+        </w:rPr>
+        <w:t>Actualizar campos</w:t>
+      </w:r>
+      <w:r>
+        <w:rPr>
+          <w:highlight w:val="cyan"/>
+          <w:lang w:val="es-ES"/>
+        </w:rPr>
+        <w:t xml:space="preserve">. </w:t>
+      </w:r>
+    </w:p>
+    <w:p>
+      <w:pPr>
+        <w:rPr>
+          <w:lang w:val="es-ES"/>
+        </w:rPr>
+      </w:pPr>
+      <w:r>
+        <w:rPr>
+          <w:highlight w:val="cyan"/>
+          <w:lang w:val="es-ES"/>
+        </w:rPr>
+        <w:t>Cada capítulo ha de terminar con un “</w:t>
+      </w:r>
+      <w:r>
+        <w:rPr>
+          <w:i/>
+          <w:highlight w:val="cyan"/>
+          <w:lang w:val="es-ES"/>
+        </w:rPr>
+        <w:t>Salto de sección – Página impar</w:t>
+      </w:r>
+      <w:r>
+        <w:rPr>
+          <w:highlight w:val="cyan"/>
+          <w:lang w:val="es-ES"/>
+        </w:rPr>
+        <w:t>” con el fin de que cada capítulo comience siempre en la misma página (como si de un libro se tratase), dejando una página en blanco si fuese necesario.</w:t>
+      </w:r>
+    </w:p>
+    <w:p>
+      <w:pPr>
+        <w:pStyle w:val="Ttulo2"/>
+        <w:numPr>
+          <w:ilvl w:val="0"/>
+          <w:numId w:val="0"/>
+        </w:numPr>
+        <w:rPr>
+          <w:lang w:val="es-ES"/>
+        </w:rPr>
+      </w:pPr>
+      <w:bookmarkStart w:id="15" w:name="_Toc116636442"/>
+      <w:bookmarkStart w:id="16" w:name="_Toc221452912"/>
+      <w:r>
+        <w:rPr>
+          <w:lang w:val="es-ES"/>
+        </w:rPr>
+        <w:t>3.1 Compute bounds</w:t>
       </w:r>
       <w:bookmarkEnd w:id="15"/>
       <w:bookmarkEnd w:id="16"/>
-      <w:proofErr w:type="spellEnd"/>
-    </w:p>
-    <w:p>
-      <w:pPr>
-        <w:rPr>
-          <w:lang w:val="es-ES"/>
-        </w:rPr>
-      </w:pPr>
-      <w:r>
-        <w:rPr>
-          <w:lang w:val="es-ES"/>
-        </w:rPr>
-        <w:t xml:space="preserve">Este es un ejemplo de capítulo del Trabajo de Fin de </w:t>
-      </w:r>
-      <w:r>
-        <w:rPr>
-          <w:lang w:val="es-ES"/>
-        </w:rPr>
-        <w:t>Grado</w:t>
-      </w:r>
-      <w:r>
-        <w:rPr>
-          <w:lang w:val="es-ES"/>
-        </w:rPr>
-        <w:t xml:space="preserve">. Cada capítulo comienza con el nombre del capítulo. Este párrafo ha de usar el estilo Título 1, con el fin de que aparezca automáticamente en el </w:t>
-      </w:r>
-      <w:r>
-        <w:fldChar w:fldCharType="begin"/>
-      </w:r>
-      <w:r>
-        <w:rPr>
-          <w:lang w:val="es-ES"/>
-        </w:rPr>
-        <w:instrText xml:space="preserve"> REF Indice \h </w:instrText>
-      </w:r>
-      <w:r>
-        <w:fldChar w:fldCharType="separate"/>
-      </w:r>
-      <w:r>
-        <w:rPr>
-          <w:lang w:val="es-ES"/>
-        </w:rPr>
-        <w:t>Índice de contenidos</w:t>
-      </w:r>
-      <w:r>
-        <w:fldChar w:fldCharType="end"/>
-      </w:r>
-      <w:r>
-        <w:rPr>
-          <w:lang w:val="es-ES"/>
-        </w:rPr>
-        <w:t xml:space="preserve"> (el índice se puede actualizar en cualquier momento pulsando sobre él con el botón derecho y seleccionando la opción </w:t>
-      </w:r>
-      <w:r>
-        <w:rPr>
-          <w:i/>
-          <w:lang w:val="es-ES"/>
-        </w:rPr>
-        <w:t>Actualizar campos</w:t>
-      </w:r>
-      <w:r>
-        <w:rPr>
-          <w:lang w:val="es-ES"/>
-        </w:rPr>
-        <w:t xml:space="preserve">. </w:t>
-      </w:r>
-    </w:p>
-    <w:p>
-      <w:pPr>
-        <w:rPr>
-          <w:lang w:val="es-ES"/>
-        </w:rPr>
-      </w:pPr>
-      <w:r>
-        <w:rPr>
-          <w:lang w:val="es-ES"/>
-        </w:rPr>
-        <w:t>Cada capítulo ha de terminar con un “</w:t>
-      </w:r>
-      <w:r>
-        <w:rPr>
-          <w:i/>
-          <w:lang w:val="es-ES"/>
-        </w:rPr>
-        <w:t>Salto de sección – Página impar</w:t>
-      </w:r>
-      <w:r>
-        <w:rPr>
-          <w:lang w:val="es-ES"/>
-        </w:rPr>
-        <w:t>” con el fin de que cada capítulo comience siempre en la misma página (como si de un libro se tratase), dejando una página en blanco si fuese necesario.</w:t>
-      </w:r>
+    </w:p>
+    <w:p>
+      <w:pPr>
+        <w:rPr>
+          <w:lang w:val="es-ES"/>
+        </w:rPr>
+      </w:pPr>
+      <w:r>
+        <w:rPr>
+          <w:highlight w:val="cyan"/>
+          <w:lang w:val="es-ES"/>
+        </w:rPr>
+        <w:t>El título de las</w:t>
+      </w:r>
+      <w:r>
+        <w:rPr>
+          <w:highlight w:val="cyan"/>
+          <w:lang w:val="es-ES"/>
+        </w:rPr>
+        <w:t xml:space="preserve"> secciones de un capítulo usa el estilo Título 2. Si necesitamos tener subsecciones entonces utilizaremos el estilo Título 3, como se ve a continuación.</w:t>
+      </w:r>
+      <w:r>
+        <w:rPr>
+          <w:lang w:val="es-ES"/>
+        </w:rPr>
+        <w:t xml:space="preserve"> </w:t>
+      </w:r>
+    </w:p>
+    <w:p>
+      <w:pPr>
+        <w:pStyle w:val="Ttulo3"/>
+      </w:pPr>
+      <w:r>
+        <w:t>Infix operations</w:t>
+      </w:r>
+    </w:p>
+    <w:p>
+      <w:pPr>
+        <w:pStyle w:val="Ttulo3"/>
+      </w:pPr>
+      <w:r>
+        <w:t>Prefix operations</w:t>
+      </w:r>
+    </w:p>
+    <w:p>
+      <w:pPr>
+        <w:pStyle w:val="Ttulo3"/>
+      </w:pPr>
+      <w:r>
+        <w:t>Switch operations</w:t>
+      </w:r>
+    </w:p>
+    <w:p>
+      <w:pPr>
+        <w:pStyle w:val="Ttulo3"/>
+      </w:pPr>
+      <w:r>
+        <w:t>Variables</w:t>
+      </w:r>
+    </w:p>
+    <w:p>
+      <w:pPr>
+        <w:pStyle w:val="Ttulo3"/>
+      </w:pPr>
+      <w:r>
+        <w:t>Numbers</w:t>
+      </w:r>
+    </w:p>
+    <w:p>
+      <w:pPr>
+        <w:pStyle w:val="Ttulo3"/>
+      </w:pPr>
+      <w:r>
+        <w:t>Array in line</w:t>
+      </w:r>
+    </w:p>
+    <w:p>
+      <w:pPr>
+        <w:pStyle w:val="Ttulo3"/>
+      </w:pPr>
+      <w:r>
+        <w:t>Uniform array</w:t>
+      </w:r>
+    </w:p>
+    <w:p>
+      <w:pPr>
+        <w:pStyle w:val="Textoindependiente"/>
+      </w:pPr>
+    </w:p>
+    <w:p>
+      <w:pPr>
+        <w:pStyle w:val="Textoindependiente"/>
+      </w:pPr>
     </w:p>
     <w:p>
       <w:pPr>
         <w:pStyle w:val="Ttulo2"/>
-        <w:rPr>
-          <w:lang w:val="es-ES"/>
-        </w:rPr>
-      </w:pPr>
-      <w:bookmarkStart w:id="17" w:name="_Toc116636442"/>
-      <w:bookmarkStart w:id="18" w:name="_Toc221452912"/>
-      <w:r>
-        <w:rPr>
-          <w:lang w:val="es-ES"/>
-        </w:rPr>
-        <w:t>Secciones de un capítulo (Título 2)</w:t>
+      </w:pPr>
+      <w:r>
+        <w:lastRenderedPageBreak/>
+        <w:t>Treat statements</w:t>
+      </w:r>
+    </w:p>
+    <w:p>
+      <w:pPr>
+        <w:pStyle w:val="Ttulo3"/>
+      </w:pPr>
+      <w:r>
+        <w:t xml:space="preserve"> </w:t>
+      </w:r>
+      <w:r>
+        <w:t>Treat conditional</w:t>
+      </w:r>
+      <w:r>
+        <w:t>s</w:t>
+      </w:r>
+    </w:p>
+    <w:p>
+      <w:pPr>
+        <w:pStyle w:val="Ttulo3"/>
+      </w:pPr>
+      <w:r>
+        <w:t xml:space="preserve">Treat </w:t>
+      </w:r>
+      <w:r>
+        <w:t xml:space="preserve"> </w:t>
+      </w:r>
+      <w:r>
+        <w:t>while loops</w:t>
+      </w:r>
+    </w:p>
+    <w:p>
+      <w:pPr>
+        <w:pStyle w:val="Ttulo2"/>
+        <w:numPr>
+          <w:ilvl w:val="0"/>
+          <w:numId w:val="0"/>
+        </w:numPr>
+        <w:rPr>
+          <w:lang w:val="es-ES"/>
+        </w:rPr>
+      </w:pPr>
+    </w:p>
+    <w:p>
+      <w:pPr>
+        <w:pStyle w:val="Textoindependiente"/>
+        <w:rPr>
+          <w:lang w:val="es-ES"/>
+        </w:rPr>
+      </w:pPr>
+    </w:p>
+    <w:p>
+      <w:pPr>
+        <w:ind w:firstLine="0"/>
+        <w:rPr>
+          <w:lang w:val="es-ES"/>
+        </w:rPr>
+      </w:pPr>
+    </w:p>
+    <w:p>
+      <w:pPr>
+        <w:pStyle w:val="Ttulo3"/>
+      </w:pPr>
+      <w:bookmarkStart w:id="17" w:name="_Toc116636443"/>
+      <w:bookmarkStart w:id="18" w:name="_Toc221452913"/>
+      <w:r>
+        <w:t>Subsecciones (Título 3)</w:t>
       </w:r>
       <w:bookmarkEnd w:id="17"/>
       <w:bookmarkEnd w:id="18"/>
@@ -3376,164 +3604,177 @@
         <w:rPr>
           <w:lang w:val="es-ES"/>
         </w:rPr>
-        <w:t>El título de las</w:t>
-      </w:r>
-      <w:r>
-        <w:rPr>
-          <w:lang w:val="es-ES"/>
-        </w:rPr>
-        <w:t xml:space="preserve"> secciones de un capítulo usa el estilo Título 2. Si necesitamos tener subsecciones entonces utilizaremos el estilo Título 3, como se ve a continuación.</w:t>
-      </w:r>
-      <w:r>
-        <w:rPr>
-          <w:lang w:val="es-ES"/>
-        </w:rPr>
-        <w:t xml:space="preserve"> </w:t>
-      </w:r>
-    </w:p>
-    <w:p>
-      <w:pPr>
-        <w:pStyle w:val="Ttulo3"/>
-      </w:pPr>
-      <w:bookmarkStart w:id="19" w:name="_Toc116636443"/>
-      <w:bookmarkStart w:id="20" w:name="_Toc221452913"/>
-      <w:proofErr w:type="spellStart"/>
-      <w:r>
-        <w:t>Subsecciones</w:t>
-      </w:r>
-      <w:proofErr w:type="spellEnd"/>
-      <w:r>
-        <w:t xml:space="preserve"> (</w:t>
-      </w:r>
-      <w:proofErr w:type="spellStart"/>
-      <w:r>
-        <w:t>Título</w:t>
-      </w:r>
-      <w:proofErr w:type="spellEnd"/>
-      <w:r>
-        <w:t xml:space="preserve"> 3)</w:t>
+        <w:t>L</w:t>
+      </w:r>
+      <w:r>
+        <w:rPr>
+          <w:lang w:val="es-ES"/>
+        </w:rPr>
+        <w:t>o</w:t>
+      </w:r>
+      <w:r>
+        <w:rPr>
+          <w:lang w:val="es-ES"/>
+        </w:rPr>
+        <w:t xml:space="preserve">s </w:t>
+      </w:r>
+      <w:r>
+        <w:rPr>
+          <w:lang w:val="es-ES"/>
+        </w:rPr>
+        <w:t xml:space="preserve">títulos de las </w:t>
+      </w:r>
+      <w:r>
+        <w:rPr>
+          <w:lang w:val="es-ES"/>
+        </w:rPr>
+        <w:t>subsecciones usan el estilo Título 3. Es posible que una subsección tenga también sub-subsecciones, como veremos a continuación.</w:t>
+      </w:r>
+    </w:p>
+    <w:p>
+      <w:pPr>
+        <w:pStyle w:val="Ttulo4"/>
+      </w:pPr>
+      <w:r>
+        <w:t>Sub-subsecciones (Título 4)</w:t>
+      </w:r>
+    </w:p>
+    <w:p>
+      <w:pPr>
+        <w:rPr>
+          <w:lang w:val="es-ES"/>
+        </w:rPr>
+      </w:pPr>
+      <w:r>
+        <w:rPr>
+          <w:lang w:val="es-ES"/>
+        </w:rPr>
+        <w:t>Las sub-subseccion</w:t>
+      </w:r>
+      <w:r>
+        <w:rPr>
+          <w:lang w:val="es-ES"/>
+        </w:rPr>
+        <w:t xml:space="preserve">es utilizan el estilo Título 4. </w:t>
+      </w:r>
+      <w:r>
+        <w:rPr>
+          <w:lang w:val="es-ES"/>
+        </w:rPr>
+        <w:t>E</w:t>
+      </w:r>
+      <w:r>
+        <w:rPr>
+          <w:lang w:val="es-ES"/>
+        </w:rPr>
+        <w:t xml:space="preserve">stas no aparecen en el </w:t>
+      </w:r>
+      <w:r>
+        <w:fldChar w:fldCharType="begin"/>
+      </w:r>
+      <w:r>
+        <w:rPr>
+          <w:lang w:val="es-ES"/>
+        </w:rPr>
+        <w:instrText xml:space="preserve"> REF Indice \h </w:instrText>
+      </w:r>
+      <w:r>
+        <w:fldChar w:fldCharType="separate"/>
+      </w:r>
+      <w:r>
+        <w:rPr>
+          <w:lang w:val="es-ES"/>
+        </w:rPr>
+        <w:t>Índice de contenidos</w:t>
+      </w:r>
+      <w:r>
+        <w:fldChar w:fldCharType="end"/>
+      </w:r>
+      <w:r>
+        <w:rPr>
+          <w:lang w:val="es-ES"/>
+        </w:rPr>
+        <w:t xml:space="preserve">. </w:t>
+      </w:r>
+      <w:r>
+        <w:rPr>
+          <w:lang w:val="es-ES"/>
+        </w:rPr>
+        <w:t xml:space="preserve">No se recomienda bajar más de nivel. </w:t>
+      </w:r>
+      <w:r>
+        <w:rPr>
+          <w:lang w:val="es-ES"/>
+        </w:rPr>
+        <w:t>El estilo Título 5 está reservado para los nombres de los capítulos en inglés, mientras que</w:t>
+      </w:r>
+      <w:r>
+        <w:rPr>
+          <w:lang w:val="es-ES"/>
+        </w:rPr>
+        <w:t xml:space="preserve"> el resto</w:t>
+      </w:r>
+      <w:r>
+        <w:rPr>
+          <w:lang w:val="es-ES"/>
+        </w:rPr>
+        <w:t xml:space="preserve"> de </w:t>
+      </w:r>
+      <w:r>
+        <w:rPr>
+          <w:lang w:val="es-ES"/>
+        </w:rPr>
+        <w:t>los estilos</w:t>
+      </w:r>
+      <w:r>
+        <w:rPr>
+          <w:lang w:val="es-ES"/>
+        </w:rPr>
+        <w:t xml:space="preserve"> de títulos (Título 6</w:t>
+      </w:r>
+      <w:r>
+        <w:rPr>
+          <w:lang w:val="es-ES"/>
+        </w:rPr>
+        <w:t xml:space="preserve">, Título </w:t>
+      </w:r>
+      <w:r>
+        <w:rPr>
+          <w:lang w:val="es-ES"/>
+        </w:rPr>
+        <w:t>7</w:t>
+      </w:r>
+      <w:r>
+        <w:rPr>
+          <w:lang w:val="es-ES"/>
+        </w:rPr>
+        <w:t>…) se reservan para las secciones de los apéndices.</w:t>
+      </w:r>
+    </w:p>
+    <w:p>
+      <w:pPr>
+        <w:pStyle w:val="Ttulo2"/>
+      </w:pPr>
+      <w:bookmarkStart w:id="19" w:name="_Toc116636444"/>
+      <w:bookmarkStart w:id="20" w:name="_Toc221452914"/>
+      <w:r>
+        <w:t>Listas numeradas y con viñetas</w:t>
       </w:r>
       <w:bookmarkEnd w:id="19"/>
       <w:bookmarkEnd w:id="20"/>
     </w:p>
     <w:p>
       <w:pPr>
-        <w:rPr>
-          <w:lang w:val="es-ES"/>
-        </w:rPr>
-      </w:pPr>
-      <w:r>
-        <w:rPr>
-          <w:lang w:val="es-ES"/>
-        </w:rPr>
-        <w:t>L</w:t>
-      </w:r>
-      <w:r>
-        <w:rPr>
-          <w:lang w:val="es-ES"/>
-        </w:rPr>
-        <w:t>o</w:t>
-      </w:r>
-      <w:r>
-        <w:rPr>
-          <w:lang w:val="es-ES"/>
-        </w:rPr>
-        <w:t xml:space="preserve">s </w:t>
-      </w:r>
-      <w:r>
-        <w:rPr>
-          <w:lang w:val="es-ES"/>
-        </w:rPr>
-        <w:t xml:space="preserve">títulos de las </w:t>
-      </w:r>
-      <w:r>
-        <w:rPr>
-          <w:lang w:val="es-ES"/>
-        </w:rPr>
-        <w:t xml:space="preserve">subsecciones usan el estilo Título 3. Es posible que una subsección tenga también </w:t>
-      </w:r>
-      <w:proofErr w:type="spellStart"/>
-      <w:r>
-        <w:rPr>
-          <w:lang w:val="es-ES"/>
-        </w:rPr>
-        <w:t>sub-subsecciones</w:t>
-      </w:r>
-      <w:proofErr w:type="spellEnd"/>
-      <w:r>
-        <w:rPr>
-          <w:lang w:val="es-ES"/>
-        </w:rPr>
-        <w:t>, como veremos a continuación.</w:t>
-      </w:r>
-    </w:p>
-    <w:p>
-      <w:pPr>
-        <w:pStyle w:val="Ttulo4"/>
-      </w:pPr>
-      <w:r>
-        <w:t>Sub-</w:t>
-      </w:r>
-      <w:proofErr w:type="spellStart"/>
-      <w:r>
-        <w:t>subsecciones</w:t>
-      </w:r>
-      <w:proofErr w:type="spellEnd"/>
-      <w:r>
-        <w:t xml:space="preserve"> (</w:t>
-      </w:r>
-      <w:proofErr w:type="spellStart"/>
-      <w:r>
-        <w:t>Título</w:t>
-      </w:r>
-      <w:proofErr w:type="spellEnd"/>
-      <w:r>
-        <w:t xml:space="preserve"> 4)</w:t>
-      </w:r>
-    </w:p>
-    <w:p>
-      <w:pPr>
-        <w:rPr>
-          <w:lang w:val="es-ES"/>
-        </w:rPr>
-      </w:pPr>
-      <w:r>
-        <w:rPr>
-          <w:lang w:val="es-ES"/>
-        </w:rPr>
-        <w:t xml:space="preserve">Las </w:t>
-      </w:r>
-      <w:proofErr w:type="spellStart"/>
-      <w:r>
-        <w:rPr>
-          <w:lang w:val="es-ES"/>
-        </w:rPr>
-        <w:t>sub-subseccion</w:t>
-      </w:r>
-      <w:r>
-        <w:rPr>
-          <w:lang w:val="es-ES"/>
-        </w:rPr>
-        <w:t>es</w:t>
-      </w:r>
-      <w:proofErr w:type="spellEnd"/>
-      <w:r>
-        <w:rPr>
-          <w:lang w:val="es-ES"/>
-        </w:rPr>
-        <w:t xml:space="preserve"> utilizan el estilo Título 4. </w:t>
-      </w:r>
-      <w:r>
-        <w:rPr>
-          <w:lang w:val="es-ES"/>
-        </w:rPr>
-        <w:t>E</w:t>
-      </w:r>
-      <w:r>
-        <w:rPr>
-          <w:lang w:val="es-ES"/>
-        </w:rPr>
-        <w:t xml:space="preserve">stas no aparecen en el </w:t>
+        <w:pStyle w:val="Textoindependiente"/>
+        <w:rPr>
+          <w:lang w:val="es-ES"/>
+        </w:rPr>
+      </w:pPr>
+      <w:r>
+        <w:rPr>
+          <w:lang w:val="es-ES"/>
+        </w:rPr>
+        <w:t xml:space="preserve">Para hacer listas numeradas (como las que aparecen en la </w:t>
       </w:r>
       <w:r>
         <w:fldChar w:fldCharType="begin"/>
@@ -3542,7 +3783,7 @@
         <w:rPr>
           <w:lang w:val="es-ES"/>
         </w:rPr>
-        <w:instrText xml:space="preserve"> REF Indice \h </w:instrText>
+        <w:instrText xml:space="preserve"> REF _Ref11682300 \h </w:instrText>
       </w:r>
       <w:r>
         <w:fldChar w:fldCharType="separate"/>
@@ -3551,7 +3792,7 @@
         <w:rPr>
           <w:lang w:val="es-ES"/>
         </w:rPr>
-        <w:t>Índice de contenidos</w:t>
+        <w:t>Introducción</w:t>
       </w:r>
       <w:r>
         <w:fldChar w:fldCharType="end"/>
@@ -3560,169 +3801,33 @@
         <w:rPr>
           <w:lang w:val="es-ES"/>
         </w:rPr>
-        <w:t xml:space="preserve">. </w:t>
-      </w:r>
-      <w:r>
-        <w:rPr>
-          <w:lang w:val="es-ES"/>
-        </w:rPr>
-        <w:t xml:space="preserve">No se recomienda bajar más de nivel. </w:t>
-      </w:r>
-      <w:r>
-        <w:rPr>
-          <w:lang w:val="es-ES"/>
-        </w:rPr>
-        <w:t>El estilo Título 5 está reservado para los nombres de los capítulos en inglés, mientras que</w:t>
-      </w:r>
-      <w:r>
-        <w:rPr>
-          <w:lang w:val="es-ES"/>
-        </w:rPr>
-        <w:t xml:space="preserve"> el resto</w:t>
-      </w:r>
-      <w:r>
-        <w:rPr>
-          <w:lang w:val="es-ES"/>
-        </w:rPr>
-        <w:t xml:space="preserve"> de </w:t>
-      </w:r>
-      <w:r>
-        <w:rPr>
-          <w:lang w:val="es-ES"/>
-        </w:rPr>
-        <w:t>los estilos</w:t>
-      </w:r>
-      <w:r>
-        <w:rPr>
-          <w:lang w:val="es-ES"/>
-        </w:rPr>
-        <w:t xml:space="preserve"> de títulos (Título 6</w:t>
-      </w:r>
-      <w:r>
-        <w:rPr>
-          <w:lang w:val="es-ES"/>
-        </w:rPr>
-        <w:t xml:space="preserve">, Título </w:t>
-      </w:r>
-      <w:r>
-        <w:rPr>
-          <w:lang w:val="es-ES"/>
-        </w:rPr>
-        <w:t>7</w:t>
-      </w:r>
-      <w:r>
-        <w:rPr>
-          <w:lang w:val="es-ES"/>
-        </w:rPr>
-        <w:t>…) se reservan para las secciones de los apéndices.</w:t>
+        <w:t xml:space="preserve"> de este documento) se recomienda utilizar los estilos Lista con números y Lista con Viñetas, respectivamente.</w:t>
+      </w:r>
+    </w:p>
+    <w:p>
+      <w:pPr>
+        <w:rPr>
+          <w:lang w:val="es-ES"/>
+        </w:rPr>
+      </w:pPr>
+      <w:r>
+        <w:rPr>
+          <w:lang w:val="es-ES"/>
+        </w:rPr>
+        <w:t xml:space="preserve">En caso de listas con varios niveles se recomienda hacer uso de las opciones de creación de listas multinivel que proporciona Word y que ayudan a gestionar el aspecto y los estilos de numeración de cada uno de los niveles. </w:t>
       </w:r>
     </w:p>
     <w:p>
       <w:pPr>
         <w:pStyle w:val="Ttulo2"/>
       </w:pPr>
-      <w:bookmarkStart w:id="21" w:name="_Toc116636444"/>
-      <w:bookmarkStart w:id="22" w:name="_Toc221452914"/>
-      <w:proofErr w:type="spellStart"/>
-      <w:r>
-        <w:t>Listas</w:t>
-      </w:r>
-      <w:proofErr w:type="spellEnd"/>
-      <w:r>
-        <w:t xml:space="preserve"> </w:t>
-      </w:r>
-      <w:proofErr w:type="spellStart"/>
-      <w:r>
-        <w:t>numeradas</w:t>
-      </w:r>
-      <w:proofErr w:type="spellEnd"/>
-      <w:r>
-        <w:t xml:space="preserve"> y con </w:t>
-      </w:r>
-      <w:proofErr w:type="spellStart"/>
-      <w:r>
-        <w:t>viñetas</w:t>
+      <w:bookmarkStart w:id="21" w:name="_Toc116636445"/>
+      <w:bookmarkStart w:id="22" w:name="_Toc221452915"/>
+      <w:r>
+        <w:t>Figuras y tablas</w:t>
       </w:r>
       <w:bookmarkEnd w:id="21"/>
       <w:bookmarkEnd w:id="22"/>
-      <w:proofErr w:type="spellEnd"/>
-    </w:p>
-    <w:p>
-      <w:pPr>
-        <w:pStyle w:val="Textoindependiente"/>
-        <w:rPr>
-          <w:lang w:val="es-ES"/>
-        </w:rPr>
-      </w:pPr>
-      <w:r>
-        <w:rPr>
-          <w:lang w:val="es-ES"/>
-        </w:rPr>
-        <w:t xml:space="preserve">Para hacer listas numeradas (como las que aparecen en la </w:t>
-      </w:r>
-      <w:r>
-        <w:fldChar w:fldCharType="begin"/>
-      </w:r>
-      <w:r>
-        <w:rPr>
-          <w:lang w:val="es-ES"/>
-        </w:rPr>
-        <w:instrText xml:space="preserve"> REF _Ref11682300 \h </w:instrText>
-      </w:r>
-      <w:r>
-        <w:fldChar w:fldCharType="separate"/>
-      </w:r>
-      <w:r>
-        <w:rPr>
-          <w:lang w:val="es-ES"/>
-        </w:rPr>
-        <w:t>Introducción</w:t>
-      </w:r>
-      <w:r>
-        <w:fldChar w:fldCharType="end"/>
-      </w:r>
-      <w:r>
-        <w:rPr>
-          <w:lang w:val="es-ES"/>
-        </w:rPr>
-        <w:t xml:space="preserve"> de este documento) se recomienda utilizar los estilos Lista con números y Lista con Viñetas, respectivamente.</w:t>
-      </w:r>
-    </w:p>
-    <w:p>
-      <w:pPr>
-        <w:rPr>
-          <w:lang w:val="es-ES"/>
-        </w:rPr>
-      </w:pPr>
-      <w:r>
-        <w:rPr>
-          <w:lang w:val="es-ES"/>
-        </w:rPr>
-        <w:t xml:space="preserve">En caso de listas con varios niveles se recomienda hacer uso de las opciones de creación de listas multinivel que proporciona Word y que ayudan a gestionar el aspecto y los estilos de numeración de cada uno de los niveles. </w:t>
-      </w:r>
-    </w:p>
-    <w:p>
-      <w:pPr>
-        <w:pStyle w:val="Ttulo2"/>
-      </w:pPr>
-      <w:bookmarkStart w:id="23" w:name="_Toc116636445"/>
-      <w:bookmarkStart w:id="24" w:name="_Toc221452915"/>
-      <w:proofErr w:type="spellStart"/>
-      <w:r>
-        <w:lastRenderedPageBreak/>
-        <w:t>Figuras</w:t>
-      </w:r>
-      <w:proofErr w:type="spellEnd"/>
-      <w:r>
-        <w:t xml:space="preserve"> y </w:t>
-      </w:r>
-      <w:proofErr w:type="spellStart"/>
-      <w:r>
-        <w:t>tablas</w:t>
-      </w:r>
-      <w:bookmarkEnd w:id="23"/>
-      <w:bookmarkEnd w:id="24"/>
-      <w:proofErr w:type="spellEnd"/>
     </w:p>
     <w:p>
       <w:pPr>
@@ -3786,7 +3891,14 @@
         <w:rPr>
           <w:lang w:val="es-ES"/>
         </w:rPr>
-        <w:t xml:space="preserve"> Todas las figuras que se añadan han de estar referenciadas desde el texto (como acabamos de hacer) por lo que se recomienda que, cada vez que se inserte una imagen, se sigan los pasos que se detallan a continuación.</w:t>
+        <w:t xml:space="preserve"> Todas las figuras que se añadan han de estar referenciadas desde el texto (como acabamos de hacer) </w:t>
+      </w:r>
+      <w:r>
+        <w:rPr>
+          <w:lang w:val="es-ES"/>
+        </w:rPr>
+        <w:lastRenderedPageBreak/>
+        <w:t>por lo que se recomienda que, cada vez que se inserte una imagen, se sigan los pasos que se detallan a continuación.</w:t>
       </w:r>
     </w:p>
     <w:p>
@@ -4122,8 +4234,8 @@
           <w:lang w:val="es-ES"/>
         </w:rPr>
       </w:pPr>
-      <w:bookmarkStart w:id="25" w:name="_Ref116635864"/>
-      <w:bookmarkStart w:id="26" w:name="_Toc116637587"/>
+      <w:bookmarkStart w:id="23" w:name="_Ref116635864"/>
+      <w:bookmarkStart w:id="24" w:name="_Toc116637587"/>
       <w:r>
         <w:rPr>
           <w:lang w:val="es-ES"/>
@@ -4178,7 +4290,7 @@
       <w:r>
         <w:fldChar w:fldCharType="end"/>
       </w:r>
-      <w:bookmarkEnd w:id="25"/>
+      <w:bookmarkEnd w:id="23"/>
       <w:r>
         <w:rPr>
           <w:lang w:val="es-ES"/>
@@ -4191,7 +4303,7 @@
         </w:rPr>
         <w:t xml:space="preserve"> Ejemplo de figura</w:t>
       </w:r>
-      <w:bookmarkEnd w:id="26"/>
+      <w:bookmarkEnd w:id="24"/>
     </w:p>
     <w:p>
       <w:pPr>
@@ -4432,7 +4544,6 @@
               <w:pStyle w:val="Textotabla"/>
             </w:pPr>
             <w:r>
-              <w:lastRenderedPageBreak/>
               <w:t>2</w:t>
             </w:r>
           </w:p>
@@ -4565,156 +4676,129 @@
       <w:pPr>
         <w:pStyle w:val="Descripcin"/>
       </w:pPr>
-      <w:bookmarkStart w:id="27" w:name="_Ref11681936"/>
-      <w:bookmarkStart w:id="28" w:name="_Toc11912424"/>
-      <w:proofErr w:type="spellStart"/>
-      <w:r>
-        <w:t>Tabla</w:t>
-      </w:r>
-      <w:proofErr w:type="spellEnd"/>
+      <w:bookmarkStart w:id="25" w:name="_Ref11681936"/>
+      <w:bookmarkStart w:id="26" w:name="_Toc11912424"/>
+      <w:r>
+        <w:t xml:space="preserve">Tabla </w:t>
+      </w:r>
+      <w:r>
+        <w:fldChar w:fldCharType="begin"/>
+      </w:r>
+      <w:r>
+        <w:instrText xml:space="preserve"> STYLEREF 1 \s </w:instrText>
+      </w:r>
+      <w:r>
+        <w:fldChar w:fldCharType="separate"/>
+      </w:r>
+      <w:r>
+        <w:t>3</w:t>
+      </w:r>
+      <w:r>
+        <w:fldChar w:fldCharType="end"/>
+      </w:r>
+      <w:r>
+        <w:noBreakHyphen/>
+      </w:r>
+      <w:r>
+        <w:fldChar w:fldCharType="begin"/>
+      </w:r>
+      <w:r>
+        <w:instrText xml:space="preserve"> SEQ Tabla \* ARABIC \s 1 </w:instrText>
+      </w:r>
+      <w:r>
+        <w:fldChar w:fldCharType="separate"/>
+      </w:r>
+      <w:r>
+        <w:t>1</w:t>
+      </w:r>
+      <w:r>
+        <w:fldChar w:fldCharType="end"/>
+      </w:r>
+      <w:bookmarkEnd w:id="25"/>
+      <w:r>
+        <w:t>. Ejemplo de tabla</w:t>
+      </w:r>
+      <w:bookmarkEnd w:id="26"/>
       <w:r>
         <w:t xml:space="preserve"> </w:t>
       </w:r>
+    </w:p>
+    <w:p>
+      <w:pPr>
+        <w:rPr>
+          <w:lang w:val="es-ES"/>
+        </w:rPr>
+      </w:pPr>
+      <w:r>
+        <w:rPr>
+          <w:lang w:val="es-ES"/>
+        </w:rPr>
+        <w:lastRenderedPageBreak/>
+        <w:t xml:space="preserve">Al igual que con las figuras, es recomendable insertar un pie de tabla explicativo. El título de la tabla se añade con la opción </w:t>
+      </w:r>
+      <w:r>
+        <w:rPr>
+          <w:i/>
+          <w:lang w:val="es-ES"/>
+        </w:rPr>
+        <w:t>Insertar Título</w:t>
+      </w:r>
+      <w:r>
+        <w:rPr>
+          <w:lang w:val="es-ES"/>
+        </w:rPr>
+        <w:t xml:space="preserve"> del menú </w:t>
+      </w:r>
+      <w:r>
+        <w:rPr>
+          <w:i/>
+          <w:lang w:val="es-ES"/>
+        </w:rPr>
+        <w:t>Referencias – Títulos</w:t>
+      </w:r>
+      <w:r>
+        <w:rPr>
+          <w:lang w:val="es-ES"/>
+        </w:rPr>
+        <w:t xml:space="preserve">. Al igual que antes, este título aparecerá con el estilo Descripción. Podremos hacer referencias a las tablas desde el texto utilizando para ello las Referencias cruzadas. Por último, todas las tablas aparecerán referenciadas automáticamente en el </w:t>
+      </w:r>
       <w:r>
         <w:fldChar w:fldCharType="begin"/>
       </w:r>
       <w:r>
-        <w:instrText xml:space="preserve"> STYLEREF 1 \s </w:instrText>
+        <w:rPr>
+          <w:lang w:val="es-ES"/>
+        </w:rPr>
+        <w:instrText xml:space="preserve"> REF IndiceTablas \h </w:instrText>
       </w:r>
       <w:r>
         <w:fldChar w:fldCharType="separate"/>
       </w:r>
       <w:r>
-        <w:t>3</w:t>
+        <w:rPr>
+          <w:lang w:val="es-ES"/>
+        </w:rPr>
+        <w:t>Índice de tablas</w:t>
       </w:r>
       <w:r>
         <w:fldChar w:fldCharType="end"/>
       </w:r>
       <w:r>
-        <w:noBreakHyphen/>
-      </w:r>
-      <w:r>
-        <w:fldChar w:fldCharType="begin"/>
-      </w:r>
-      <w:r>
-        <w:instrText xml:space="preserve"> SEQ Tabla \* ARABIC \s 1 </w:instrText>
-      </w:r>
-      <w:r>
-        <w:fldChar w:fldCharType="separate"/>
-      </w:r>
-      <w:r>
-        <w:t>1</w:t>
-      </w:r>
-      <w:r>
-        <w:fldChar w:fldCharType="end"/>
+        <w:rPr>
+          <w:lang w:val="es-ES"/>
+        </w:rPr>
+        <w:t>.</w:t>
+      </w:r>
+    </w:p>
+    <w:p>
+      <w:pPr>
+        <w:pStyle w:val="Ttulo2"/>
+      </w:pPr>
+      <w:bookmarkStart w:id="27" w:name="_Toc221452916"/>
+      <w:r>
+        <w:t>Problemas conocidos</w:t>
       </w:r>
       <w:bookmarkEnd w:id="27"/>
-      <w:r>
-        <w:t xml:space="preserve">. </w:t>
-      </w:r>
-      <w:proofErr w:type="spellStart"/>
-      <w:r>
-        <w:t>Ejemplo</w:t>
-      </w:r>
-      <w:proofErr w:type="spellEnd"/>
-      <w:r>
-        <w:t xml:space="preserve"> de </w:t>
-      </w:r>
-      <w:proofErr w:type="spellStart"/>
-      <w:r>
-        <w:t>tabla</w:t>
-      </w:r>
-      <w:bookmarkEnd w:id="28"/>
-      <w:proofErr w:type="spellEnd"/>
-      <w:r>
-        <w:t xml:space="preserve"> </w:t>
-      </w:r>
-    </w:p>
-    <w:p>
-      <w:pPr>
-        <w:rPr>
-          <w:lang w:val="es-ES"/>
-        </w:rPr>
-      </w:pPr>
-      <w:r>
-        <w:rPr>
-          <w:lang w:val="es-ES"/>
-        </w:rPr>
-        <w:t xml:space="preserve">Al igual que con las figuras, es recomendable insertar un pie de tabla explicativo. El título de la tabla se añade con la opción </w:t>
-      </w:r>
-      <w:r>
-        <w:rPr>
-          <w:i/>
-          <w:lang w:val="es-ES"/>
-        </w:rPr>
-        <w:t>Insertar Título</w:t>
-      </w:r>
-      <w:r>
-        <w:rPr>
-          <w:lang w:val="es-ES"/>
-        </w:rPr>
-        <w:t xml:space="preserve"> del menú </w:t>
-      </w:r>
-      <w:r>
-        <w:rPr>
-          <w:i/>
-          <w:lang w:val="es-ES"/>
-        </w:rPr>
-        <w:t>Referencias – Títulos</w:t>
-      </w:r>
-      <w:r>
-        <w:rPr>
-          <w:lang w:val="es-ES"/>
-        </w:rPr>
-        <w:t xml:space="preserve">. Al igual que antes, este título aparecerá con el estilo Descripción. Podremos hacer referencias a las tablas desde el texto utilizando para ello las Referencias cruzadas. Por último, todas las tablas aparecerán referenciadas automáticamente en el </w:t>
-      </w:r>
-      <w:r>
-        <w:fldChar w:fldCharType="begin"/>
-      </w:r>
-      <w:r>
-        <w:rPr>
-          <w:lang w:val="es-ES"/>
-        </w:rPr>
-        <w:instrText xml:space="preserve"> REF IndiceTablas \h </w:instrText>
-      </w:r>
-      <w:r>
-        <w:fldChar w:fldCharType="separate"/>
-      </w:r>
-      <w:r>
-        <w:rPr>
-          <w:lang w:val="es-ES"/>
-        </w:rPr>
-        <w:t>Índice de tablas</w:t>
-      </w:r>
-      <w:r>
-        <w:fldChar w:fldCharType="end"/>
-      </w:r>
-      <w:r>
-        <w:rPr>
-          <w:lang w:val="es-ES"/>
-        </w:rPr>
-        <w:t>.</w:t>
-      </w:r>
-    </w:p>
-    <w:p>
-      <w:pPr>
-        <w:pStyle w:val="Ttulo2"/>
-      </w:pPr>
-      <w:bookmarkStart w:id="29" w:name="_Toc221452916"/>
-      <w:proofErr w:type="spellStart"/>
-      <w:r>
-        <w:t>Problemas</w:t>
-      </w:r>
-      <w:proofErr w:type="spellEnd"/>
-      <w:r>
-        <w:t xml:space="preserve"> </w:t>
-      </w:r>
-      <w:proofErr w:type="spellStart"/>
-      <w:r>
-        <w:t>conocidos</w:t>
-      </w:r>
-      <w:bookmarkEnd w:id="29"/>
-      <w:proofErr w:type="spellEnd"/>
     </w:p>
     <w:p>
       <w:pPr>
@@ -4909,31 +4993,7 @@
         <w:t xml:space="preserve">. </w:t>
       </w:r>
       <w:r>
-        <w:t xml:space="preserve">Esto se </w:t>
-      </w:r>
-      <w:proofErr w:type="spellStart"/>
-      <w:r>
-        <w:t>puede</w:t>
-      </w:r>
-      <w:proofErr w:type="spellEnd"/>
-      <w:r>
-        <w:t xml:space="preserve"> </w:t>
-      </w:r>
-      <w:proofErr w:type="spellStart"/>
-      <w:r>
-        <w:t>deber</w:t>
-      </w:r>
-      <w:proofErr w:type="spellEnd"/>
-      <w:r>
-        <w:t xml:space="preserve"> a dos </w:t>
-      </w:r>
-      <w:proofErr w:type="spellStart"/>
-      <w:r>
-        <w:t>motivos</w:t>
-      </w:r>
-      <w:proofErr w:type="spellEnd"/>
-      <w:r>
-        <w:t>:</w:t>
+        <w:t>Esto se puede deber a dos motivos:</w:t>
       </w:r>
     </w:p>
     <w:p>
@@ -4967,14 +5027,7 @@
         <w:rPr>
           <w:lang w:val="es-ES"/>
         </w:rPr>
-        <w:t xml:space="preserve">un menú </w:t>
-      </w:r>
-      <w:r>
-        <w:rPr>
-          <w:lang w:val="es-ES"/>
-        </w:rPr>
-        <w:lastRenderedPageBreak/>
-        <w:t xml:space="preserve">como el de la </w:t>
+        <w:t xml:space="preserve">un menú como el de la </w:t>
       </w:r>
       <w:r>
         <w:fldChar w:fldCharType="begin"/>
@@ -5024,13 +5077,8 @@
         <w:pStyle w:val="Lista2"/>
       </w:pPr>
       <w:r>
-        <w:t xml:space="preserve">Page Heading / </w:t>
-      </w:r>
-      <w:proofErr w:type="spellStart"/>
-      <w:r>
-        <w:t>vacío</w:t>
-      </w:r>
-      <w:proofErr w:type="spellEnd"/>
+        <w:t>Page Heading / vacío</w:t>
+      </w:r>
     </w:p>
     <w:p>
       <w:pPr>
@@ -5043,6 +5091,7 @@
         <w:rPr>
           <w:lang w:val="es-ES"/>
         </w:rPr>
+        <w:lastRenderedPageBreak/>
         <w:t>Page Heading TOC / 1</w:t>
       </w:r>
     </w:p>
@@ -5092,39 +5141,24 @@
       <w:pPr>
         <w:pStyle w:val="Lista2"/>
       </w:pPr>
-      <w:proofErr w:type="spellStart"/>
-      <w:r>
-        <w:t>Título</w:t>
-      </w:r>
-      <w:proofErr w:type="spellEnd"/>
-      <w:r>
-        <w:t xml:space="preserve"> 3 / 3</w:t>
+      <w:r>
+        <w:t>Título 3 / 3</w:t>
       </w:r>
     </w:p>
     <w:p>
       <w:pPr>
         <w:pStyle w:val="Lista2"/>
       </w:pPr>
-      <w:proofErr w:type="spellStart"/>
-      <w:r>
-        <w:t>Título</w:t>
-      </w:r>
-      <w:proofErr w:type="spellEnd"/>
-      <w:r>
-        <w:t xml:space="preserve"> 5 / 1</w:t>
+      <w:r>
+        <w:t>Título 5 / 1</w:t>
       </w:r>
     </w:p>
     <w:p>
       <w:pPr>
         <w:pStyle w:val="Lista2"/>
       </w:pPr>
-      <w:proofErr w:type="spellStart"/>
-      <w:r>
-        <w:t>Título</w:t>
-      </w:r>
-      <w:proofErr w:type="spellEnd"/>
-      <w:r>
-        <w:t xml:space="preserve"> 6 / 1</w:t>
+      <w:r>
+        <w:t>Título 6 / 1</w:t>
       </w:r>
     </w:p>
     <w:p>
@@ -5187,8 +5221,8 @@
           <w:lang w:val="es-ES"/>
         </w:rPr>
       </w:pPr>
-      <w:bookmarkStart w:id="30" w:name="_Ref116637266"/>
-      <w:bookmarkStart w:id="31" w:name="_Toc116637588"/>
+      <w:bookmarkStart w:id="28" w:name="_Ref116637266"/>
+      <w:bookmarkStart w:id="29" w:name="_Toc116637588"/>
       <w:r>
         <w:rPr>
           <w:lang w:val="es-ES"/>
@@ -5243,14 +5277,14 @@
       <w:r>
         <w:fldChar w:fldCharType="end"/>
       </w:r>
-      <w:bookmarkEnd w:id="30"/>
+      <w:bookmarkEnd w:id="28"/>
       <w:r>
         <w:rPr>
           <w:lang w:val="es-ES"/>
         </w:rPr>
         <w:t>. Opciones para configurar la tabla de contenidos</w:t>
       </w:r>
-      <w:bookmarkEnd w:id="31"/>
+      <w:bookmarkEnd w:id="29"/>
     </w:p>
     <w:p>
       <w:pPr>
@@ -5277,34 +5311,16 @@
       <w:pPr>
         <w:pStyle w:val="Ttulo1"/>
       </w:pPr>
-      <w:bookmarkStart w:id="32" w:name="_Ref11684775"/>
-      <w:bookmarkStart w:id="33" w:name="_Toc116636446"/>
-      <w:bookmarkStart w:id="34" w:name="_Toc221452917"/>
-      <w:proofErr w:type="spellStart"/>
+      <w:bookmarkStart w:id="30" w:name="_Ref11684775"/>
+      <w:bookmarkStart w:id="31" w:name="_Toc116636446"/>
+      <w:bookmarkStart w:id="32" w:name="_Toc221452917"/>
       <w:r>
         <w:lastRenderedPageBreak/>
-        <w:t>Conclusiones</w:t>
-      </w:r>
-      <w:proofErr w:type="spellEnd"/>
-      <w:r>
-        <w:t xml:space="preserve"> y </w:t>
-      </w:r>
-      <w:proofErr w:type="spellStart"/>
-      <w:r>
-        <w:t>trabajo</w:t>
-      </w:r>
-      <w:proofErr w:type="spellEnd"/>
-      <w:r>
-        <w:t xml:space="preserve"> </w:t>
-      </w:r>
-      <w:proofErr w:type="spellStart"/>
-      <w:r>
-        <w:t>futuro</w:t>
-      </w:r>
+        <w:t>Conclusiones y trabajo futuro</w:t>
+      </w:r>
+      <w:bookmarkEnd w:id="30"/>
+      <w:bookmarkEnd w:id="31"/>
       <w:bookmarkEnd w:id="32"/>
-      <w:bookmarkEnd w:id="33"/>
-      <w:bookmarkEnd w:id="34"/>
-      <w:proofErr w:type="spellEnd"/>
     </w:p>
     <w:p>
       <w:pPr>
@@ -5369,20 +5385,19 @@
       <w:pPr>
         <w:pStyle w:val="EnglishSectionTitle"/>
       </w:pPr>
-      <w:bookmarkStart w:id="35" w:name="_Toc116636447"/>
-      <w:bookmarkStart w:id="36" w:name="_Toc221452918"/>
+      <w:bookmarkStart w:id="33" w:name="_Toc116636447"/>
+      <w:bookmarkStart w:id="34" w:name="_Toc221452918"/>
       <w:r>
         <w:lastRenderedPageBreak/>
         <w:t>Introduction</w:t>
       </w:r>
-      <w:bookmarkEnd w:id="35"/>
-      <w:bookmarkEnd w:id="36"/>
+      <w:bookmarkEnd w:id="33"/>
+      <w:bookmarkEnd w:id="34"/>
     </w:p>
     <w:p>
       <w:r>
         <w:t>“</w:t>
       </w:r>
-      <w:proofErr w:type="spellStart"/>
       <w:r>
         <w:fldChar w:fldCharType="begin"/>
       </w:r>
@@ -5395,7 +5410,6 @@
       <w:r>
         <w:t>Introducción</w:t>
       </w:r>
-      <w:proofErr w:type="spellEnd"/>
       <w:r>
         <w:fldChar w:fldCharType="end"/>
       </w:r>
@@ -5439,21 +5453,7 @@
         <w:rPr>
           <w:lang w:val="es-ES"/>
         </w:rPr>
-        <w:t>Los títulos de las subsecciones de esta sección (</w:t>
-      </w:r>
-      <w:proofErr w:type="spellStart"/>
-      <w:r>
-        <w:rPr>
-          <w:lang w:val="es-ES"/>
-        </w:rPr>
-        <w:t>Introduction</w:t>
-      </w:r>
-      <w:proofErr w:type="spellEnd"/>
-      <w:r>
-        <w:rPr>
-          <w:lang w:val="es-ES"/>
-        </w:rPr>
-        <w:t xml:space="preserve">) usan el estilo </w:t>
+        <w:t xml:space="preserve">Los títulos de las subsecciones de esta sección (Introduction) usan el estilo </w:t>
       </w:r>
       <w:r>
         <w:rPr>
@@ -5547,20 +5547,19 @@
       <w:pPr>
         <w:pStyle w:val="EnglishSectionTitle"/>
       </w:pPr>
-      <w:bookmarkStart w:id="37" w:name="_Toc116636448"/>
-      <w:bookmarkStart w:id="38" w:name="_Toc221452919"/>
+      <w:bookmarkStart w:id="35" w:name="_Toc116636448"/>
+      <w:bookmarkStart w:id="36" w:name="_Toc221452919"/>
       <w:r>
         <w:lastRenderedPageBreak/>
         <w:t>Conclusions and future work</w:t>
       </w:r>
-      <w:bookmarkEnd w:id="37"/>
-      <w:bookmarkEnd w:id="38"/>
+      <w:bookmarkEnd w:id="35"/>
+      <w:bookmarkEnd w:id="36"/>
     </w:p>
     <w:p>
       <w:r>
         <w:t>“</w:t>
       </w:r>
-      <w:proofErr w:type="spellStart"/>
       <w:r>
         <w:fldChar w:fldCharType="begin"/>
       </w:r>
@@ -5571,37 +5570,20 @@
         <w:fldChar w:fldCharType="separate"/>
       </w:r>
       <w:r>
-        <w:t>Conclusiones</w:t>
-      </w:r>
-      <w:proofErr w:type="spellEnd"/>
-      <w:r>
-        <w:t xml:space="preserve"> y </w:t>
-      </w:r>
-      <w:proofErr w:type="spellStart"/>
-      <w:r>
-        <w:t>trabajo</w:t>
-      </w:r>
-      <w:proofErr w:type="spellEnd"/>
+        <w:t>Conclusiones y trabajo futuro</w:t>
+      </w:r>
+      <w:r>
+        <w:fldChar w:fldCharType="end"/>
+      </w:r>
+      <w:r>
+        <w:t>” section must be translated to English if th</w:t>
+      </w:r>
+      <w:r>
+        <w:t>is</w:t>
+      </w:r>
       <w:r>
         <w:t xml:space="preserve"> </w:t>
       </w:r>
-      <w:proofErr w:type="spellStart"/>
-      <w:r>
-        <w:t>futuro</w:t>
-      </w:r>
-      <w:proofErr w:type="spellEnd"/>
-      <w:r>
-        <w:fldChar w:fldCharType="end"/>
-      </w:r>
-      <w:r>
-        <w:t>” section must be translated to English if th</w:t>
-      </w:r>
-      <w:r>
-        <w:t>is</w:t>
-      </w:r>
-      <w:r>
-        <w:t xml:space="preserve"> </w:t>
-      </w:r>
       <w:r>
         <w:t>Bachelor</w:t>
       </w:r>
@@ -5633,35 +5615,7 @@
         <w:rPr>
           <w:lang w:val="es-ES"/>
         </w:rPr>
-        <w:t>Los títulos de las subsecciones de esta sección (</w:t>
-      </w:r>
-      <w:proofErr w:type="spellStart"/>
-      <w:r>
-        <w:rPr>
-          <w:lang w:val="es-ES"/>
-        </w:rPr>
-        <w:t>Conclusions</w:t>
-      </w:r>
-      <w:proofErr w:type="spellEnd"/>
-      <w:r>
-        <w:rPr>
-          <w:lang w:val="es-ES"/>
-        </w:rPr>
-        <w:t xml:space="preserve"> and future </w:t>
-      </w:r>
-      <w:proofErr w:type="spellStart"/>
-      <w:r>
-        <w:rPr>
-          <w:lang w:val="es-ES"/>
-        </w:rPr>
-        <w:t>work</w:t>
-      </w:r>
-      <w:proofErr w:type="spellEnd"/>
-      <w:r>
-        <w:rPr>
-          <w:lang w:val="es-ES"/>
-        </w:rPr>
-        <w:t xml:space="preserve">) usan el estilo </w:t>
+        <w:t xml:space="preserve">Los títulos de las subsecciones de esta sección (Conclusions and future work) usan el estilo </w:t>
       </w:r>
       <w:r>
         <w:rPr>
@@ -5696,8 +5650,8 @@
           <w:docGrid w:linePitch="360"/>
         </w:sectPr>
       </w:pPr>
-      <w:bookmarkStart w:id="39" w:name="Bibliografía"/>
-      <w:bookmarkStart w:id="40" w:name="Apendices"/>
+      <w:bookmarkStart w:id="37" w:name="Bibliografía"/>
+      <w:bookmarkStart w:id="38" w:name="Apendices"/>
     </w:p>
     <w:p>
       <w:pPr>
@@ -5706,8 +5660,8 @@
           <w:lang w:val="es-ES"/>
         </w:rPr>
       </w:pPr>
-      <w:bookmarkStart w:id="41" w:name="_Toc116636449"/>
-      <w:bookmarkStart w:id="42" w:name="_Toc221452920"/>
+      <w:bookmarkStart w:id="39" w:name="_Toc116636449"/>
+      <w:bookmarkStart w:id="40" w:name="_Toc221452920"/>
       <w:r>
         <w:rPr>
           <w:lang w:val="es-ES"/>
@@ -5715,8 +5669,8 @@
         <w:lastRenderedPageBreak/>
         <w:t>Contribuciones Personales</w:t>
       </w:r>
-      <w:bookmarkEnd w:id="41"/>
-      <w:bookmarkEnd w:id="42"/>
+      <w:bookmarkEnd w:id="39"/>
+      <w:bookmarkEnd w:id="40"/>
     </w:p>
     <w:p>
       <w:pPr>
@@ -5845,17 +5799,15 @@
       <w:pPr>
         <w:pStyle w:val="PageHeadingTOC"/>
       </w:pPr>
-      <w:bookmarkStart w:id="43" w:name="_Toc116636450"/>
-      <w:bookmarkStart w:id="44" w:name="_Toc221452921"/>
-      <w:proofErr w:type="spellStart"/>
+      <w:bookmarkStart w:id="41" w:name="_Toc116636450"/>
+      <w:bookmarkStart w:id="42" w:name="_Toc221452921"/>
       <w:r>
         <w:lastRenderedPageBreak/>
         <w:t>Bibliografía</w:t>
       </w:r>
-      <w:bookmarkEnd w:id="39"/>
-      <w:bookmarkEnd w:id="43"/>
-      <w:bookmarkEnd w:id="44"/>
-      <w:proofErr w:type="spellEnd"/>
+      <w:bookmarkEnd w:id="37"/>
+      <w:bookmarkEnd w:id="41"/>
+      <w:bookmarkEnd w:id="42"/>
       <w:r>
         <w:rPr>
           <w:sz w:val="22"/>
@@ -5995,41 +5947,29 @@
       <w:pPr>
         <w:pStyle w:val="PageHeading"/>
       </w:pPr>
-      <w:proofErr w:type="spellStart"/>
       <w:r>
         <w:lastRenderedPageBreak/>
         <w:t>Apéndices</w:t>
       </w:r>
-      <w:bookmarkStart w:id="45" w:name="_Toc267562109"/>
-      <w:bookmarkEnd w:id="40"/>
-      <w:proofErr w:type="spellEnd"/>
+      <w:bookmarkStart w:id="43" w:name="_Toc267562109"/>
+      <w:bookmarkEnd w:id="38"/>
     </w:p>
     <w:p>
       <w:pPr>
         <w:pStyle w:val="Ttulo6"/>
       </w:pPr>
-      <w:bookmarkStart w:id="46" w:name="_Toc221452922"/>
-      <w:bookmarkEnd w:id="45"/>
-      <w:proofErr w:type="spellStart"/>
-      <w:r>
-        <w:t>Título</w:t>
-      </w:r>
-      <w:proofErr w:type="spellEnd"/>
-      <w:r>
-        <w:t xml:space="preserve"> del</w:t>
+      <w:bookmarkStart w:id="44" w:name="_Toc221452922"/>
+      <w:bookmarkEnd w:id="43"/>
+      <w:r>
+        <w:t>Título del</w:t>
       </w:r>
       <w:r>
         <w:t xml:space="preserve"> primer</w:t>
       </w:r>
       <w:r>
-        <w:t xml:space="preserve"> </w:t>
-      </w:r>
-      <w:proofErr w:type="spellStart"/>
-      <w:r>
-        <w:t>apéndice</w:t>
-      </w:r>
-      <w:bookmarkEnd w:id="46"/>
-      <w:proofErr w:type="spellEnd"/>
+        <w:t xml:space="preserve"> apéndice</w:t>
+      </w:r>
+      <w:bookmarkEnd w:id="44"/>
     </w:p>
     <w:p>
       <w:pPr>
@@ -6132,21 +6072,7 @@
         <w:rPr>
           <w:lang w:val="es-ES"/>
         </w:rPr>
-        <w:t xml:space="preserve">Para los títulos de las subsecciones de los apéndices se utiliza el estilo Título 8. Para las </w:t>
-      </w:r>
-      <w:proofErr w:type="spellStart"/>
-      <w:r>
-        <w:rPr>
-          <w:lang w:val="es-ES"/>
-        </w:rPr>
-        <w:t>sub-subsecciones</w:t>
-      </w:r>
-      <w:proofErr w:type="spellEnd"/>
-      <w:r>
-        <w:rPr>
-          <w:lang w:val="es-ES"/>
-        </w:rPr>
-        <w:t xml:space="preserve"> se usa el estilo Título 9, como aparece a continuación.</w:t>
+        <w:t>Para los títulos de las subsecciones de los apéndices se utiliza el estilo Título 8. Para las sub-subsecciones se usa el estilo Título 9, como aparece a continuación.</w:t>
       </w:r>
     </w:p>
     <w:p>
@@ -6156,82 +6082,23 @@
           <w:lang w:val="es-ES"/>
         </w:rPr>
       </w:pPr>
-      <w:proofErr w:type="spellStart"/>
-      <w:r>
-        <w:rPr>
-          <w:lang w:val="es-ES"/>
-        </w:rPr>
-        <w:t>Sub-subsecciones</w:t>
-      </w:r>
-      <w:proofErr w:type="spellEnd"/>
-      <w:r>
-        <w:rPr>
-          <w:lang w:val="es-ES"/>
-        </w:rPr>
-        <w:t xml:space="preserve"> del apéndice (Título 9)</w:t>
-      </w:r>
-    </w:p>
-    <w:p>
-      <w:r>
-        <w:rPr>
-          <w:lang w:val="es-ES"/>
-        </w:rPr>
-        <w:t xml:space="preserve">Para las </w:t>
-      </w:r>
-      <w:proofErr w:type="spellStart"/>
-      <w:r>
-        <w:rPr>
-          <w:lang w:val="es-ES"/>
-        </w:rPr>
-        <w:t>sub-subsecciones</w:t>
-      </w:r>
-      <w:proofErr w:type="spellEnd"/>
-      <w:r>
-        <w:rPr>
-          <w:lang w:val="es-ES"/>
-        </w:rPr>
-        <w:t xml:space="preserve"> de un apéndice se utiliza el estilo Título 9. </w:t>
-      </w:r>
-      <w:r>
-        <w:t xml:space="preserve">No se </w:t>
-      </w:r>
-      <w:proofErr w:type="spellStart"/>
-      <w:r>
-        <w:t>recomienda</w:t>
-      </w:r>
-      <w:proofErr w:type="spellEnd"/>
-      <w:r>
-        <w:t xml:space="preserve"> </w:t>
-      </w:r>
-      <w:proofErr w:type="spellStart"/>
-      <w:r>
-        <w:t>añadir</w:t>
-      </w:r>
-      <w:proofErr w:type="spellEnd"/>
-      <w:r>
-        <w:t xml:space="preserve"> </w:t>
-      </w:r>
-      <w:proofErr w:type="spellStart"/>
-      <w:r>
-        <w:t>más</w:t>
-      </w:r>
-      <w:proofErr w:type="spellEnd"/>
-      <w:r>
-        <w:t xml:space="preserve"> </w:t>
-      </w:r>
-      <w:proofErr w:type="spellStart"/>
-      <w:r>
-        <w:t>niveles</w:t>
-      </w:r>
-      <w:proofErr w:type="spellEnd"/>
-      <w:r>
-        <w:t xml:space="preserve"> de </w:t>
-      </w:r>
-      <w:proofErr w:type="spellStart"/>
-      <w:r>
-        <w:t>subsección</w:t>
-      </w:r>
-      <w:proofErr w:type="spellEnd"/>
+      <w:r>
+        <w:rPr>
+          <w:lang w:val="es-ES"/>
+        </w:rPr>
+        <w:t>Sub-subsecciones del apéndice (Título 9)</w:t>
+      </w:r>
+    </w:p>
+    <w:p>
+      <w:r>
+        <w:rPr>
+          <w:lang w:val="es-ES"/>
+        </w:rPr>
+        <w:t xml:space="preserve">Para las sub-subsecciones de un apéndice se utiliza el estilo Título 9. </w:t>
+      </w:r>
+      <w:r>
+        <w:t>No se recomienda añadir más niveles de subsección</w:t>
+      </w:r>
       <w:r>
         <w:t>.</w:t>
       </w:r>
@@ -6252,30 +6119,12 @@
       <w:pPr>
         <w:pStyle w:val="Ttulo6"/>
       </w:pPr>
-      <w:bookmarkStart w:id="47" w:name="_Toc221452923"/>
-      <w:proofErr w:type="spellStart"/>
+      <w:bookmarkStart w:id="45" w:name="_Toc221452923"/>
       <w:r>
         <w:lastRenderedPageBreak/>
-        <w:t>Título</w:t>
-      </w:r>
-      <w:proofErr w:type="spellEnd"/>
-      <w:r>
-        <w:t xml:space="preserve"> del </w:t>
-      </w:r>
-      <w:proofErr w:type="spellStart"/>
-      <w:r>
-        <w:t>segundo</w:t>
-      </w:r>
-      <w:proofErr w:type="spellEnd"/>
-      <w:r>
-        <w:t xml:space="preserve"> </w:t>
-      </w:r>
-      <w:proofErr w:type="spellStart"/>
-      <w:r>
-        <w:t>apéndice</w:t>
-      </w:r>
-      <w:bookmarkEnd w:id="47"/>
-      <w:proofErr w:type="spellEnd"/>
+        <w:t>Título del segundo apéndice</w:t>
+      </w:r>
+      <w:bookmarkEnd w:id="45"/>
     </w:p>
     <w:p>
       <w:pPr>

</xml_diff>

<commit_message>
Memoria con el analisis op infix y prefix
</commit_message>
<xml_diff>
--- a/Optimization of the circom compiler.docx
+++ b/Optimization of the circom compiler.docx
@@ -405,14 +405,12 @@
         <w:rPr>
           <w:caps/>
           <w:sz w:val="40"/>
-          <w:lang w:val="es-ES"/>
         </w:rPr>
       </w:pPr>
       <w:r>
         <w:rPr>
           <w:caps/>
           <w:sz w:val="40"/>
-          <w:lang w:val="es-ES"/>
         </w:rPr>
         <w:t>OptimizaciOn del compilador circom</w:t>
       </w:r>
@@ -420,15 +418,11 @@
     <w:p>
       <w:pPr>
         <w:pStyle w:val="TitlePage"/>
-        <w:rPr>
-          <w:lang w:val="es-ES"/>
-        </w:rPr>
       </w:pPr>
       <w:r>
         <w:rPr>
           <w:caps/>
           <w:sz w:val="40"/>
-          <w:lang w:val="es-ES"/>
         </w:rPr>
         <w:t>Optimization of the circom compiler</w:t>
       </w:r>
@@ -436,9 +430,6 @@
     <w:p>
       <w:pPr>
         <w:pStyle w:val="TitlePage"/>
-        <w:rPr>
-          <w:lang w:val="es-ES"/>
-        </w:rPr>
       </w:pPr>
     </w:p>
     <w:p>
@@ -3265,142 +3256,82 @@
       <w:r>
         <w:t xml:space="preserve"> </w:t>
       </w:r>
-      <w:r>
-        <w:t>Infix operations</w:t>
-      </w:r>
-    </w:p>
-    <w:p>
-      <w:pPr>
-        <w:pStyle w:val="Ttulo1"/>
-        <w:numPr>
-          <w:ilvl w:val="0"/>
-          <w:numId w:val="0"/>
-        </w:numPr>
-      </w:pPr>
-    </w:p>
-    <w:p>
-      <w:pPr>
-        <w:rPr>
-          <w:highlight w:val="cyan"/>
-          <w:lang w:val="es-ES"/>
-        </w:rPr>
-      </w:pPr>
-      <w:r>
-        <w:rPr>
-          <w:highlight w:val="cyan"/>
-          <w:lang w:val="es-ES"/>
-        </w:rPr>
-        <w:t xml:space="preserve">Este es un ejemplo de capítulo del Trabajo de Fin de </w:t>
-      </w:r>
-      <w:r>
-        <w:rPr>
-          <w:highlight w:val="cyan"/>
-          <w:lang w:val="es-ES"/>
-        </w:rPr>
-        <w:t>Grado</w:t>
-      </w:r>
-      <w:r>
-        <w:rPr>
-          <w:highlight w:val="cyan"/>
-          <w:lang w:val="es-ES"/>
-        </w:rPr>
-        <w:t xml:space="preserve">. Cada capítulo comienza con el nombre del capítulo. Este párrafo ha de usar el estilo Título 1, con el fin de que aparezca automáticamente en el </w:t>
-      </w:r>
-      <w:r>
-        <w:rPr>
-          <w:highlight w:val="cyan"/>
-        </w:rPr>
-        <w:fldChar w:fldCharType="begin"/>
-      </w:r>
-      <w:r>
-        <w:rPr>
-          <w:highlight w:val="cyan"/>
-          <w:lang w:val="es-ES"/>
-        </w:rPr>
-        <w:instrText xml:space="preserve"> REF Indice \h </w:instrText>
-      </w:r>
-      <w:r>
-        <w:rPr>
-          <w:highlight w:val="cyan"/>
-        </w:rPr>
-      </w:r>
-      <w:r>
-        <w:rPr>
-          <w:highlight w:val="cyan"/>
-          <w:lang w:val="es-ES"/>
-        </w:rPr>
-        <w:instrText xml:space="preserve"> \* MERGEFORMAT </w:instrText>
-      </w:r>
-      <w:r>
-        <w:rPr>
-          <w:highlight w:val="cyan"/>
-        </w:rPr>
-        <w:fldChar w:fldCharType="separate"/>
-      </w:r>
-      <w:r>
-        <w:rPr>
-          <w:highlight w:val="cyan"/>
-          <w:lang w:val="es-ES"/>
-        </w:rPr>
-        <w:t>Índice de contenidos</w:t>
-      </w:r>
-      <w:r>
-        <w:rPr>
-          <w:highlight w:val="cyan"/>
-        </w:rPr>
-        <w:fldChar w:fldCharType="end"/>
-      </w:r>
-      <w:r>
-        <w:rPr>
-          <w:highlight w:val="cyan"/>
-          <w:lang w:val="es-ES"/>
-        </w:rPr>
-        <w:t xml:space="preserve"> (el índice se puede actualizar en cualquier momento pulsando sobre él con el botón derecho y seleccionando la opción </w:t>
-      </w:r>
-      <w:r>
-        <w:rPr>
-          <w:i/>
-          <w:highlight w:val="cyan"/>
-          <w:lang w:val="es-ES"/>
-        </w:rPr>
-        <w:t>Actualizar campos</w:t>
-      </w:r>
-      <w:r>
-        <w:rPr>
-          <w:highlight w:val="cyan"/>
-          <w:lang w:val="es-ES"/>
-        </w:rPr>
-        <w:t xml:space="preserve">. </w:t>
-      </w:r>
-    </w:p>
-    <w:p>
-      <w:pPr>
-        <w:rPr>
-          <w:lang w:val="es-ES"/>
-        </w:rPr>
-      </w:pPr>
-      <w:r>
-        <w:rPr>
-          <w:highlight w:val="cyan"/>
-          <w:lang w:val="es-ES"/>
-        </w:rPr>
-        <w:t>Cada capítulo ha de terminar con un “</w:t>
-      </w:r>
-      <w:r>
-        <w:rPr>
-          <w:i/>
-          <w:highlight w:val="cyan"/>
-          <w:lang w:val="es-ES"/>
-        </w:rPr>
-        <w:t>Salto de sección – Página impar</w:t>
-      </w:r>
-      <w:r>
-        <w:rPr>
-          <w:highlight w:val="cyan"/>
-          <w:lang w:val="es-ES"/>
-        </w:rPr>
-        <w:t>” con el fin de que cada capítulo comience siempre en la misma página (como si de un libro se tratase), dejando una página en blanco si fuese necesario.</w:t>
-      </w:r>
+    </w:p>
+    <w:p>
+      <w:pPr>
+        <w:pStyle w:val="Textoindependiente"/>
+      </w:pPr>
+      <w:r>
+        <w:t>In this chapter I will explain the methodology of the analysis of the size of the variables for each kind of operation and statement.</w:t>
+      </w:r>
+    </w:p>
+    <w:p>
+      <w:pPr>
+        <w:pStyle w:val="Textoindependiente"/>
+      </w:pPr>
+      <w:r>
+        <w:t xml:space="preserve">For the analysis we will study the bounds in which the operation or statement moves around. To do so, we </w:t>
+      </w:r>
+      <w:r>
+        <w:t>must</w:t>
+      </w:r>
+      <w:r>
+        <w:t xml:space="preserve"> keep in mind that the value is in the range [0,prime), being prime a huge prime number bigger than any value in the compiler.</w:t>
+      </w:r>
+    </w:p>
+    <w:p>
+      <w:pPr>
+        <w:pStyle w:val="Textoindependiente"/>
+      </w:pPr>
+      <w:r>
+        <w:t xml:space="preserve">The bounds </w:t>
+      </w:r>
+      <w:r>
+        <w:t>consist</w:t>
+      </w:r>
+      <w:r>
+        <w:t xml:space="preserve"> </w:t>
+      </w:r>
+      <w:r>
+        <w:t>of</w:t>
+      </w:r>
+      <w:r>
+        <w:t xml:space="preserve"> two numbers</w:t>
+      </w:r>
+      <w:r>
+        <w:t xml:space="preserve"> of the type BigInt</w:t>
+      </w:r>
+      <w:r>
+        <w:t xml:space="preserve">, </w:t>
+      </w:r>
+      <w:r>
+        <w:t>min and max, which will keep the minimum and maximum value that the operation or statement can take</w:t>
+      </w:r>
+      <w:r>
+        <w:t>.</w:t>
+      </w:r>
+    </w:p>
+    <w:p>
+      <w:pPr>
+        <w:pStyle w:val="Textoindependiente"/>
+      </w:pPr>
+      <w:r>
+        <w:t>For the statements we will also have a hash map, called context, to keep the bounds of a</w:t>
+      </w:r>
+      <w:r>
+        <w:t xml:space="preserve"> signal </w:t>
+      </w:r>
+      <w:r>
+        <w:t>by the string of its name.</w:t>
+      </w:r>
+      <w:r>
+        <w:t xml:space="preserve"> The purpose of the hash map is to keep the compiler from calculating the bounds of a signal each time that it needs its bounds.</w:t>
+      </w:r>
+    </w:p>
+    <w:p>
+      <w:pPr>
+        <w:pStyle w:val="Textoindependiente"/>
+      </w:pPr>
     </w:p>
     <w:p>
       <w:pPr>
@@ -3409,63 +3340,344 @@
           <w:ilvl w:val="0"/>
           <w:numId w:val="0"/>
         </w:numPr>
-        <w:rPr>
-          <w:lang w:val="es-ES"/>
-        </w:rPr>
       </w:pPr>
       <w:bookmarkStart w:id="15" w:name="_Toc116636442"/>
       <w:bookmarkStart w:id="16" w:name="_Toc221452912"/>
       <w:r>
-        <w:rPr>
-          <w:lang w:val="es-ES"/>
-        </w:rPr>
         <w:t>3.1 Compute bounds</w:t>
       </w:r>
       <w:bookmarkEnd w:id="15"/>
       <w:bookmarkEnd w:id="16"/>
     </w:p>
     <w:p>
-      <w:pPr>
-        <w:rPr>
-          <w:lang w:val="es-ES"/>
-        </w:rPr>
-      </w:pPr>
-      <w:r>
-        <w:rPr>
-          <w:highlight w:val="cyan"/>
-          <w:lang w:val="es-ES"/>
-        </w:rPr>
-        <w:t>El título de las</w:t>
-      </w:r>
-      <w:r>
-        <w:rPr>
-          <w:highlight w:val="cyan"/>
-          <w:lang w:val="es-ES"/>
-        </w:rPr>
-        <w:t xml:space="preserve"> secciones de un capítulo usa el estilo Título 2. Si necesitamos tener subsecciones entonces utilizaremos el estilo Título 3, como se ve a continuación.</w:t>
-      </w:r>
-      <w:r>
-        <w:rPr>
-          <w:lang w:val="es-ES"/>
-        </w:rPr>
+      <w:r>
+        <w:t>The computing of bounds i</w:t>
+      </w:r>
+      <w:r>
+        <w:t>s a very sophisticated part of the program, in witch you get an expression, and depending on the kind of the expression, you have to carefully analyze what the minimum and maximum bound</w:t>
+      </w:r>
+      <w:r>
+        <w:t>s</w:t>
+      </w:r>
+      <w:r>
+        <w:t xml:space="preserve"> are.</w:t>
+      </w:r>
+    </w:p>
+    <w:p>
+      <w:pPr>
+        <w:pStyle w:val="Ttulo3"/>
+      </w:pPr>
+      <w:r>
+        <w:t>Infix operations</w:t>
+      </w:r>
+    </w:p>
+    <w:p>
+      <w:pPr>
+        <w:pStyle w:val="Textoindependiente"/>
+      </w:pPr>
+      <w:r>
+        <w:t>In this kind of operations we are going to have two expressions and an operand, so first of all we need to calculate the bounds of both expressions and then, depending on the operand, we will have different ways to calculate the</w:t>
+      </w:r>
+      <w:r>
+        <w:t xml:space="preserve"> resulting bounds.</w:t>
+      </w:r>
+    </w:p>
+    <w:p>
+      <w:pPr>
+        <w:pStyle w:val="Ttulo4"/>
+      </w:pPr>
+      <w:r>
+        <w:t>Boolean operations</w:t>
+      </w:r>
+    </w:p>
+    <w:p>
+      <w:pPr>
+        <w:pStyle w:val="Textoindependiente"/>
+      </w:pPr>
+      <w:r>
+        <w:t>This operations have a common characteristic, which is that the result is always going to be either “1” or “0”. This gives as an easy calculation of the bounds of the expressions because the maximum will always be “1”, and the minimum will always be “0”.</w:t>
+      </w:r>
+    </w:p>
+    <w:p>
+      <w:pPr>
+        <w:pStyle w:val="Textoindependiente"/>
+      </w:pPr>
+    </w:p>
+    <w:p>
+      <w:pPr>
+        <w:pStyle w:val="Ttulo4"/>
+      </w:pPr>
+      <w:r>
+        <w:lastRenderedPageBreak/>
+        <w:t xml:space="preserve">Arithmetic integer </w:t>
+      </w:r>
+      <w:r>
+        <w:t>operations</w:t>
+      </w:r>
+    </w:p>
+    <w:p>
+      <w:pPr>
+        <w:pStyle w:val="Textoindependiente"/>
+      </w:pPr>
+      <w:r>
+        <w:t>These 3 operations (Add, Sub, and Mul) are very similar among them in the way their bounds are calculated.</w:t>
+      </w:r>
+    </w:p>
+    <w:p>
+      <w:pPr>
+        <w:pStyle w:val="Textoindependiente"/>
+      </w:pPr>
+      <w:r>
+        <w:t>For the Add operation you just have to add the bounds, min with min and max with max, and you will have the bounds of the whole expression.</w:t>
+      </w:r>
+    </w:p>
+    <w:p>
+      <w:pPr>
+        <w:pStyle w:val="Textoindependiente"/>
+      </w:pPr>
+      <w:r>
+        <w:t xml:space="preserve">For the Sub operation is a bit different but the same concept, you want the minimum to be the smallest possible result, so you </w:t>
+      </w:r>
+      <w:r>
+        <w:t>subtract</w:t>
+      </w:r>
+      <w:r>
+        <w:t xml:space="preserve"> to the le</w:t>
+      </w:r>
+      <w:r>
+        <w:t>f</w:t>
+      </w:r>
+      <w:r>
+        <w:t xml:space="preserve">t min the right max, </w:t>
+      </w:r>
+      <w:r>
+        <w:t>and with the maximum the other way around, subtract to the left max the right min.</w:t>
+      </w:r>
+    </w:p>
+    <w:p>
+      <w:pPr>
+        <w:pStyle w:val="Textoindependiente"/>
+      </w:pPr>
+      <w:r>
+        <w:t>And finally, the Mul operations works as the Add operation with th twist that now you multiply instead of summing.</w:t>
+      </w:r>
+    </w:p>
+    <w:p>
+      <w:pPr>
+        <w:pStyle w:val="Ttulo4"/>
+      </w:pPr>
+      <w:r>
+        <w:t>Division operations</w:t>
+      </w:r>
+    </w:p>
+    <w:p>
+      <w:pPr>
+        <w:pStyle w:val="Textoindependiente"/>
+      </w:pPr>
+      <w:r>
+        <w:t xml:space="preserve">There are two kinds of divisions in Circom, the Divison and the Interger Division. The two of them have </w:t>
+      </w:r>
+      <w:r>
+        <w:t>very similar bounds, the minimum is going to be 0 for both of them, and the maximum is going to be the prime number for Division, and the max of the left expression for the Integer Division.</w:t>
+      </w:r>
+    </w:p>
+    <w:p>
+      <w:pPr>
+        <w:pStyle w:val="Ttulo4"/>
+      </w:pPr>
+      <w:r>
+        <w:t>Power</w:t>
+      </w:r>
+      <w:r>
         <w:t xml:space="preserve"> </w:t>
       </w:r>
+      <w:r>
+        <w:t xml:space="preserve">and modulus </w:t>
+      </w:r>
+      <w:r>
+        <w:t>operations</w:t>
+      </w:r>
+    </w:p>
+    <w:p>
+      <w:pPr>
+        <w:pStyle w:val="Textoindependiente"/>
+      </w:pPr>
+      <w:r>
+        <w:t>The</w:t>
+      </w:r>
+      <w:r>
+        <w:t xml:space="preserve">se </w:t>
+      </w:r>
+      <w:r>
+        <w:t>operation</w:t>
+      </w:r>
+      <w:r>
+        <w:t>s</w:t>
+      </w:r>
+      <w:r>
+        <w:t xml:space="preserve"> </w:t>
+      </w:r>
+      <w:r>
+        <w:t>have very easy bounds. For the power, we are going to keep the prime as maximum, and 1 or 0 for the minimum. And for the modulus, the minimum would be 0, and the maximum will be the expression on the right.</w:t>
+      </w:r>
+    </w:p>
+    <w:p>
+      <w:pPr>
+        <w:pStyle w:val="Ttulo4"/>
+      </w:pPr>
+      <w:r>
+        <w:t>Shift</w:t>
+      </w:r>
+      <w:r>
+        <w:t xml:space="preserve"> operations</w:t>
+      </w:r>
+    </w:p>
+    <w:p>
+      <w:pPr>
+        <w:pStyle w:val="Textoindependiente"/>
+      </w:pPr>
+      <w:r>
+        <w:t>For the shift left, the maximum and minimum will be shifted so we shall multiply them by 2 to the power of the minimum and maximum. As for the right shift, we will just keep the maximum of the left expression, and for the minimum we will have a 0.</w:t>
+      </w:r>
+    </w:p>
+    <w:p>
+      <w:pPr>
+        <w:pStyle w:val="Ttulo4"/>
+      </w:pPr>
+      <w:r>
+        <w:t>Bit</w:t>
+      </w:r>
+      <w:r>
+        <w:t xml:space="preserve"> operations</w:t>
+      </w:r>
+    </w:p>
+    <w:p>
+      <w:pPr>
+        <w:pStyle w:val="Textoindependiente"/>
+      </w:pPr>
+      <w:r>
+        <w:t xml:space="preserve">For the </w:t>
+      </w:r>
+      <w:r>
+        <w:t>“</w:t>
+      </w:r>
+      <w:r>
+        <w:t>O</w:t>
+      </w:r>
+      <w:r>
+        <w:t>r</w:t>
+      </w:r>
+      <w:r>
+        <w:t>”</w:t>
+      </w:r>
+      <w:r>
+        <w:t xml:space="preserve"> operation, we</w:t>
+      </w:r>
+      <w:r>
+        <w:t xml:space="preserve"> </w:t>
+      </w:r>
+      <w:r>
+        <w:t xml:space="preserve">just </w:t>
+      </w:r>
+      <w:r>
+        <w:t xml:space="preserve">must add the maximus and find the biggest minimum of both expressions. In the other hand, the </w:t>
+      </w:r>
+      <w:r>
+        <w:t>“</w:t>
+      </w:r>
+      <w:r>
+        <w:t>And</w:t>
+      </w:r>
+      <w:r>
+        <w:t>”</w:t>
+      </w:r>
+      <w:r>
+        <w:t xml:space="preserve"> operation</w:t>
+      </w:r>
+      <w:r>
+        <w:t xml:space="preserve"> keeps a 0 in its minimum, and the minimum max of both expressions as the maximus. And finally, the “Xor” operation has the minimum of the “And”, and the maximum of the “Or”.</w:t>
+      </w:r>
     </w:p>
     <w:p>
       <w:pPr>
         <w:pStyle w:val="Ttulo3"/>
       </w:pPr>
       <w:r>
-        <w:t>Infix operations</w:t>
-      </w:r>
-    </w:p>
-    <w:p>
-      <w:pPr>
-        <w:pStyle w:val="Ttulo3"/>
-      </w:pPr>
-      <w:r>
+        <w:lastRenderedPageBreak/>
         <w:t>Prefix operations</w:t>
       </w:r>
+    </w:p>
+    <w:p>
+      <w:pPr>
+        <w:pStyle w:val="Textoindependiente"/>
+      </w:pPr>
+      <w:r>
+        <w:t>This kind of operation consists of only one expression and one operand, which makes them easier than the previous ones. Also, in this category there are only three different operands, which bounds are calculated as follows:</w:t>
+      </w:r>
+    </w:p>
+    <w:p>
+      <w:pPr>
+        <w:pStyle w:val="Ttulo4"/>
+      </w:pPr>
+      <w:r>
+        <w:t>Subtraction</w:t>
+      </w:r>
+    </w:p>
+    <w:p>
+      <w:pPr>
+        <w:pStyle w:val="Textoindependiente"/>
+      </w:pPr>
+      <w:r>
+        <w:t>This operation denominated as “Sub”, consists of a minus before the expression, and because of that, the minimum is -max, ad the maximus is -min. As we want values between [0, prime), we will add prime-1 to both.</w:t>
+      </w:r>
+    </w:p>
+    <w:p>
+      <w:pPr>
+        <w:pStyle w:val="Ttulo4"/>
+      </w:pPr>
+      <w:r>
+        <w:t>Not</w:t>
+      </w:r>
+    </w:p>
+    <w:p>
+      <w:pPr>
+        <w:pStyle w:val="Textoindependiente"/>
+      </w:pPr>
+      <w:r>
+        <w:t>This operation denominated as “BoolNot” is used for Boolean expressions, and because of that, its bounds are easier as they are [0, 1].</w:t>
+      </w:r>
+    </w:p>
+    <w:p>
+      <w:pPr>
+        <w:pStyle w:val="Ttulo4"/>
+      </w:pPr>
+      <w:r>
+        <w:t>Complement</w:t>
+      </w:r>
+    </w:p>
+    <w:p>
+      <w:pPr>
+        <w:pStyle w:val="Textoindependiente"/>
+      </w:pPr>
+      <w:r>
+        <w:t>This binary operations converts all 1s to 0s and vice versa, therefore, the minumun will be 0, and the maximum will be</w:t>
+      </w:r>
+      <w:r>
+        <w:t xml:space="preserve"> twice</w:t>
+      </w:r>
+      <w:r>
+        <w:t xml:space="preserve"> the max values of the expression. </w:t>
+      </w:r>
+    </w:p>
+    <w:p>
+      <w:pPr>
+        <w:pStyle w:val="Textoindependiente"/>
+      </w:pPr>
+    </w:p>
+    <w:p>
+      <w:pPr>
+        <w:pStyle w:val="Textoindependiente"/>
+      </w:pPr>
     </w:p>
     <w:p>
       <w:pPr>
@@ -6763,6 +6975,92 @@
     </w:lvl>
   </w:abstractNum>
   <w:abstractNum w:abstractNumId="11" w15:restartNumberingAfterBreak="0">
+    <w:nsid w:val="01C626AC"/>
+    <w:multiLevelType w:val="hybridMultilevel"/>
+    <w:tmpl w:val="B1A81D02"/>
+    <w:lvl w:ilvl="0" w:tplc="0C0A000F">
+      <w:start w:val="1"/>
+      <w:numFmt w:val="decimal"/>
+      <w:lvlText w:val="%1."/>
+      <w:lvlJc w:val="left"/>
+      <w:pPr>
+        <w:ind w:left="1440" w:hanging="360"/>
+      </w:pPr>
+    </w:lvl>
+    <w:lvl w:ilvl="1" w:tplc="0C0A0019" w:tentative="1">
+      <w:start w:val="1"/>
+      <w:numFmt w:val="lowerLetter"/>
+      <w:lvlText w:val="%2."/>
+      <w:lvlJc w:val="left"/>
+      <w:pPr>
+        <w:ind w:left="2160" w:hanging="360"/>
+      </w:pPr>
+    </w:lvl>
+    <w:lvl w:ilvl="2" w:tplc="0C0A001B" w:tentative="1">
+      <w:start w:val="1"/>
+      <w:numFmt w:val="lowerRoman"/>
+      <w:lvlText w:val="%3."/>
+      <w:lvlJc w:val="right"/>
+      <w:pPr>
+        <w:ind w:left="2880" w:hanging="180"/>
+      </w:pPr>
+    </w:lvl>
+    <w:lvl w:ilvl="3" w:tplc="0C0A000F" w:tentative="1">
+      <w:start w:val="1"/>
+      <w:numFmt w:val="decimal"/>
+      <w:lvlText w:val="%4."/>
+      <w:lvlJc w:val="left"/>
+      <w:pPr>
+        <w:ind w:left="3600" w:hanging="360"/>
+      </w:pPr>
+    </w:lvl>
+    <w:lvl w:ilvl="4" w:tplc="0C0A0019" w:tentative="1">
+      <w:start w:val="1"/>
+      <w:numFmt w:val="lowerLetter"/>
+      <w:lvlText w:val="%5."/>
+      <w:lvlJc w:val="left"/>
+      <w:pPr>
+        <w:ind w:left="4320" w:hanging="360"/>
+      </w:pPr>
+    </w:lvl>
+    <w:lvl w:ilvl="5" w:tplc="0C0A001B" w:tentative="1">
+      <w:start w:val="1"/>
+      <w:numFmt w:val="lowerRoman"/>
+      <w:lvlText w:val="%6."/>
+      <w:lvlJc w:val="right"/>
+      <w:pPr>
+        <w:ind w:left="5040" w:hanging="180"/>
+      </w:pPr>
+    </w:lvl>
+    <w:lvl w:ilvl="6" w:tplc="0C0A000F" w:tentative="1">
+      <w:start w:val="1"/>
+      <w:numFmt w:val="decimal"/>
+      <w:lvlText w:val="%7."/>
+      <w:lvlJc w:val="left"/>
+      <w:pPr>
+        <w:ind w:left="5760" w:hanging="360"/>
+      </w:pPr>
+    </w:lvl>
+    <w:lvl w:ilvl="7" w:tplc="0C0A0019" w:tentative="1">
+      <w:start w:val="1"/>
+      <w:numFmt w:val="lowerLetter"/>
+      <w:lvlText w:val="%8."/>
+      <w:lvlJc w:val="left"/>
+      <w:pPr>
+        <w:ind w:left="6480" w:hanging="360"/>
+      </w:pPr>
+    </w:lvl>
+    <w:lvl w:ilvl="8" w:tplc="0C0A001B" w:tentative="1">
+      <w:start w:val="1"/>
+      <w:numFmt w:val="lowerRoman"/>
+      <w:lvlText w:val="%9."/>
+      <w:lvlJc w:val="right"/>
+      <w:pPr>
+        <w:ind w:left="7200" w:hanging="180"/>
+      </w:pPr>
+    </w:lvl>
+  </w:abstractNum>
+  <w:abstractNum w:abstractNumId="12" w15:restartNumberingAfterBreak="0">
     <w:nsid w:val="037C65F7"/>
     <w:multiLevelType w:val="multilevel"/>
     <w:tmpl w:val="7B246FA4"/>
@@ -6892,7 +7190,7 @@
       </w:rPr>
     </w:lvl>
   </w:abstractNum>
-  <w:abstractNum w:abstractNumId="12" w15:restartNumberingAfterBreak="0">
+  <w:abstractNum w:abstractNumId="13" w15:restartNumberingAfterBreak="0">
     <w:nsid w:val="04B41DBE"/>
     <w:multiLevelType w:val="multilevel"/>
     <w:tmpl w:val="040A001D"/>
@@ -6978,7 +7276,7 @@
       </w:pPr>
     </w:lvl>
   </w:abstractNum>
-  <w:abstractNum w:abstractNumId="13" w15:restartNumberingAfterBreak="0">
+  <w:abstractNum w:abstractNumId="14" w15:restartNumberingAfterBreak="0">
     <w:nsid w:val="050B21E0"/>
     <w:multiLevelType w:val="multilevel"/>
     <w:tmpl w:val="BD480CCC"/>
@@ -7107,7 +7405,7 @@
       </w:rPr>
     </w:lvl>
   </w:abstractNum>
-  <w:abstractNum w:abstractNumId="14" w15:restartNumberingAfterBreak="0">
+  <w:abstractNum w:abstractNumId="15" w15:restartNumberingAfterBreak="0">
     <w:nsid w:val="0C3A4D66"/>
     <w:multiLevelType w:val="multilevel"/>
     <w:tmpl w:val="AA562C7C"/>
@@ -7237,7 +7535,7 @@
       </w:rPr>
     </w:lvl>
   </w:abstractNum>
-  <w:abstractNum w:abstractNumId="15" w15:restartNumberingAfterBreak="0">
+  <w:abstractNum w:abstractNumId="16" w15:restartNumberingAfterBreak="0">
     <w:nsid w:val="0EA63C0C"/>
     <w:multiLevelType w:val="multilevel"/>
     <w:tmpl w:val="AA562C7C"/>
@@ -7367,7 +7665,7 @@
       </w:rPr>
     </w:lvl>
   </w:abstractNum>
-  <w:abstractNum w:abstractNumId="16" w15:restartNumberingAfterBreak="0">
+  <w:abstractNum w:abstractNumId="17" w15:restartNumberingAfterBreak="0">
     <w:nsid w:val="17BB27E3"/>
     <w:multiLevelType w:val="multilevel"/>
     <w:tmpl w:val="A8D47B9C"/>
@@ -7497,7 +7795,7 @@
       </w:rPr>
     </w:lvl>
   </w:abstractNum>
-  <w:abstractNum w:abstractNumId="17" w15:restartNumberingAfterBreak="0">
+  <w:abstractNum w:abstractNumId="18" w15:restartNumberingAfterBreak="0">
     <w:nsid w:val="18BE7767"/>
     <w:multiLevelType w:val="multilevel"/>
     <w:tmpl w:val="AAE46A2C"/>
@@ -7627,7 +7925,7 @@
       </w:rPr>
     </w:lvl>
   </w:abstractNum>
-  <w:abstractNum w:abstractNumId="18" w15:restartNumberingAfterBreak="0">
+  <w:abstractNum w:abstractNumId="19" w15:restartNumberingAfterBreak="0">
     <w:nsid w:val="1CCF6661"/>
     <w:multiLevelType w:val="multilevel"/>
     <w:tmpl w:val="C948882C"/>
@@ -7714,7 +8012,7 @@
       </w:pPr>
     </w:lvl>
   </w:abstractNum>
-  <w:abstractNum w:abstractNumId="19" w15:restartNumberingAfterBreak="0">
+  <w:abstractNum w:abstractNumId="20" w15:restartNumberingAfterBreak="0">
     <w:nsid w:val="233156BA"/>
     <w:multiLevelType w:val="multilevel"/>
     <w:tmpl w:val="29F6372C"/>
@@ -7844,7 +8142,7 @@
       </w:rPr>
     </w:lvl>
   </w:abstractNum>
-  <w:abstractNum w:abstractNumId="20" w15:restartNumberingAfterBreak="0">
+  <w:abstractNum w:abstractNumId="21" w15:restartNumberingAfterBreak="0">
     <w:nsid w:val="250F6CC7"/>
     <w:multiLevelType w:val="multilevel"/>
     <w:tmpl w:val="1B084830"/>
@@ -7971,7 +8269,7 @@
       </w:rPr>
     </w:lvl>
   </w:abstractNum>
-  <w:abstractNum w:abstractNumId="21" w15:restartNumberingAfterBreak="0">
+  <w:abstractNum w:abstractNumId="22" w15:restartNumberingAfterBreak="0">
     <w:nsid w:val="2FFC21B7"/>
     <w:multiLevelType w:val="hybridMultilevel"/>
     <w:tmpl w:val="4336DDD2"/>
@@ -8111,7 +8409,7 @@
       </w:rPr>
     </w:lvl>
   </w:abstractNum>
-  <w:abstractNum w:abstractNumId="22" w15:restartNumberingAfterBreak="0">
+  <w:abstractNum w:abstractNumId="23" w15:restartNumberingAfterBreak="0">
     <w:nsid w:val="321C0D15"/>
     <w:multiLevelType w:val="multilevel"/>
     <w:tmpl w:val="54140BA4"/>
@@ -8246,7 +8544,7 @@
       </w:rPr>
     </w:lvl>
   </w:abstractNum>
-  <w:abstractNum w:abstractNumId="23" w15:restartNumberingAfterBreak="0">
+  <w:abstractNum w:abstractNumId="24" w15:restartNumberingAfterBreak="0">
     <w:nsid w:val="330865B5"/>
     <w:multiLevelType w:val="multilevel"/>
     <w:tmpl w:val="040A001D"/>
@@ -8332,7 +8630,7 @@
       </w:pPr>
     </w:lvl>
   </w:abstractNum>
-  <w:abstractNum w:abstractNumId="24" w15:restartNumberingAfterBreak="0">
+  <w:abstractNum w:abstractNumId="25" w15:restartNumberingAfterBreak="0">
     <w:nsid w:val="3521773B"/>
     <w:multiLevelType w:val="hybridMultilevel"/>
     <w:tmpl w:val="EC8C53F0"/>
@@ -8418,7 +8716,7 @@
       </w:pPr>
     </w:lvl>
   </w:abstractNum>
-  <w:abstractNum w:abstractNumId="25" w15:restartNumberingAfterBreak="0">
+  <w:abstractNum w:abstractNumId="26" w15:restartNumberingAfterBreak="0">
     <w:nsid w:val="59957CE0"/>
     <w:multiLevelType w:val="multilevel"/>
     <w:tmpl w:val="AA562C7C"/>
@@ -8548,7 +8846,7 @@
       </w:rPr>
     </w:lvl>
   </w:abstractNum>
-  <w:abstractNum w:abstractNumId="26" w15:restartNumberingAfterBreak="0">
+  <w:abstractNum w:abstractNumId="27" w15:restartNumberingAfterBreak="0">
     <w:nsid w:val="64F42C83"/>
     <w:multiLevelType w:val="multilevel"/>
     <w:tmpl w:val="AA562C7C"/>
@@ -8678,7 +8976,7 @@
       </w:rPr>
     </w:lvl>
   </w:abstractNum>
-  <w:abstractNum w:abstractNumId="27" w15:restartNumberingAfterBreak="0">
+  <w:abstractNum w:abstractNumId="28" w15:restartNumberingAfterBreak="0">
     <w:nsid w:val="67B85907"/>
     <w:multiLevelType w:val="hybridMultilevel"/>
     <w:tmpl w:val="6E6E04D6"/>
@@ -8764,7 +9062,7 @@
       </w:pPr>
     </w:lvl>
   </w:abstractNum>
-  <w:abstractNum w:abstractNumId="28" w15:restartNumberingAfterBreak="0">
+  <w:abstractNum w:abstractNumId="29" w15:restartNumberingAfterBreak="0">
     <w:nsid w:val="6FBF4159"/>
     <w:multiLevelType w:val="multilevel"/>
     <w:tmpl w:val="982674FA"/>
@@ -8894,7 +9192,7 @@
       </w:rPr>
     </w:lvl>
   </w:abstractNum>
-  <w:abstractNum w:abstractNumId="29" w15:restartNumberingAfterBreak="0">
+  <w:abstractNum w:abstractNumId="30" w15:restartNumberingAfterBreak="0">
     <w:nsid w:val="70301EDE"/>
     <w:multiLevelType w:val="multilevel"/>
     <w:tmpl w:val="DFFA0438"/>
@@ -9024,7 +9322,7 @@
       </w:rPr>
     </w:lvl>
   </w:abstractNum>
-  <w:abstractNum w:abstractNumId="30" w15:restartNumberingAfterBreak="0">
+  <w:abstractNum w:abstractNumId="31" w15:restartNumberingAfterBreak="0">
     <w:nsid w:val="736F4A0D"/>
     <w:multiLevelType w:val="multilevel"/>
     <w:tmpl w:val="040A001D"/>
@@ -9110,7 +9408,7 @@
       </w:pPr>
     </w:lvl>
   </w:abstractNum>
-  <w:abstractNum w:abstractNumId="31" w15:restartNumberingAfterBreak="0">
+  <w:abstractNum w:abstractNumId="32" w15:restartNumberingAfterBreak="0">
     <w:nsid w:val="76864434"/>
     <w:multiLevelType w:val="multilevel"/>
     <w:tmpl w:val="040A001D"/>
@@ -9196,7 +9494,7 @@
       </w:pPr>
     </w:lvl>
   </w:abstractNum>
-  <w:abstractNum w:abstractNumId="32" w15:restartNumberingAfterBreak="0">
+  <w:abstractNum w:abstractNumId="33" w15:restartNumberingAfterBreak="0">
     <w:nsid w:val="78622BFC"/>
     <w:multiLevelType w:val="multilevel"/>
     <w:tmpl w:val="473C4EE0"/>
@@ -9309,7 +9607,7 @@
       </w:pPr>
     </w:lvl>
   </w:abstractNum>
-  <w:abstractNum w:abstractNumId="33" w15:restartNumberingAfterBreak="0">
+  <w:abstractNum w:abstractNumId="34" w15:restartNumberingAfterBreak="0">
     <w:nsid w:val="79E81350"/>
     <w:multiLevelType w:val="multilevel"/>
     <w:tmpl w:val="D89EC2BE"/>
@@ -9440,7 +9738,7 @@
     </w:lvl>
   </w:abstractNum>
   <w:num w:numId="1" w16cid:durableId="962927342">
-    <w:abstractNumId w:val="21"/>
+    <w:abstractNumId w:val="22"/>
   </w:num>
   <w:num w:numId="2" w16cid:durableId="1200972430">
     <w:abstractNumId w:val="10"/>
@@ -9473,73 +9771,73 @@
     <w:abstractNumId w:val="1"/>
   </w:num>
   <w:num w:numId="12" w16cid:durableId="923101083">
-    <w:abstractNumId w:val="16"/>
+    <w:abstractNumId w:val="17"/>
   </w:num>
   <w:num w:numId="13" w16cid:durableId="1519850972">
-    <w:abstractNumId w:val="22"/>
+    <w:abstractNumId w:val="23"/>
   </w:num>
   <w:num w:numId="14" w16cid:durableId="1283880269">
+    <w:abstractNumId w:val="21"/>
+  </w:num>
+  <w:num w:numId="15" w16cid:durableId="1646739723">
+    <w:abstractNumId w:val="34"/>
+  </w:num>
+  <w:num w:numId="16" w16cid:durableId="466629650">
+    <w:abstractNumId w:val="24"/>
+  </w:num>
+  <w:num w:numId="17" w16cid:durableId="1079012301">
     <w:abstractNumId w:val="20"/>
   </w:num>
-  <w:num w:numId="15" w16cid:durableId="1646739723">
-    <w:abstractNumId w:val="33"/>
-  </w:num>
-  <w:num w:numId="16" w16cid:durableId="466629650">
-    <w:abstractNumId w:val="23"/>
-  </w:num>
-  <w:num w:numId="17" w16cid:durableId="1079012301">
-    <w:abstractNumId w:val="19"/>
-  </w:num>
   <w:num w:numId="18" w16cid:durableId="1163817943">
-    <w:abstractNumId w:val="13"/>
+    <w:abstractNumId w:val="14"/>
   </w:num>
   <w:num w:numId="19" w16cid:durableId="1434395498">
-    <w:abstractNumId w:val="28"/>
+    <w:abstractNumId w:val="29"/>
   </w:num>
   <w:num w:numId="20" w16cid:durableId="1893346169">
-    <w:abstractNumId w:val="11"/>
+    <w:abstractNumId w:val="12"/>
   </w:num>
   <w:num w:numId="21" w16cid:durableId="1509711991">
-    <w:abstractNumId w:val="29"/>
+    <w:abstractNumId w:val="30"/>
   </w:num>
   <w:num w:numId="22" w16cid:durableId="1149319704">
-    <w:abstractNumId w:val="14"/>
+    <w:abstractNumId w:val="15"/>
   </w:num>
   <w:num w:numId="23" w16cid:durableId="53814836">
-    <w:abstractNumId w:val="25"/>
+    <w:abstractNumId w:val="26"/>
   </w:num>
   <w:num w:numId="24" w16cid:durableId="858156727">
-    <w:abstractNumId w:val="26"/>
+    <w:abstractNumId w:val="27"/>
   </w:num>
   <w:num w:numId="25" w16cid:durableId="1782651091">
     <w:abstractNumId w:val="0"/>
   </w:num>
   <w:num w:numId="26" w16cid:durableId="1087188752">
+    <w:abstractNumId w:val="33"/>
+  </w:num>
+  <w:num w:numId="27" w16cid:durableId="524753162">
+    <w:abstractNumId w:val="16"/>
+  </w:num>
+  <w:num w:numId="28" w16cid:durableId="1237086538">
+    <w:abstractNumId w:val="18"/>
+  </w:num>
+  <w:num w:numId="29" w16cid:durableId="960769819">
+    <w:abstractNumId w:val="13"/>
+  </w:num>
+  <w:num w:numId="30" w16cid:durableId="358169484">
     <w:abstractNumId w:val="32"/>
   </w:num>
-  <w:num w:numId="27" w16cid:durableId="524753162">
-    <w:abstractNumId w:val="15"/>
-  </w:num>
-  <w:num w:numId="28" w16cid:durableId="1237086538">
-    <w:abstractNumId w:val="17"/>
-  </w:num>
-  <w:num w:numId="29" w16cid:durableId="960769819">
-    <w:abstractNumId w:val="12"/>
-  </w:num>
-  <w:num w:numId="30" w16cid:durableId="358169484">
+  <w:num w:numId="31" w16cid:durableId="1628580751">
     <w:abstractNumId w:val="31"/>
   </w:num>
-  <w:num w:numId="31" w16cid:durableId="1628580751">
-    <w:abstractNumId w:val="30"/>
-  </w:num>
   <w:num w:numId="32" w16cid:durableId="792945128">
-    <w:abstractNumId w:val="27"/>
+    <w:abstractNumId w:val="28"/>
   </w:num>
   <w:num w:numId="33" w16cid:durableId="959652879">
-    <w:abstractNumId w:val="18"/>
+    <w:abstractNumId w:val="19"/>
   </w:num>
   <w:num w:numId="34" w16cid:durableId="1607956114">
-    <w:abstractNumId w:val="18"/>
+    <w:abstractNumId w:val="19"/>
     <w:lvlOverride w:ilvl="0">
       <w:startOverride w:val="1"/>
     </w:lvlOverride>
@@ -9569,7 +9867,10 @@
     </w:lvlOverride>
   </w:num>
   <w:num w:numId="35" w16cid:durableId="1983190024">
-    <w:abstractNumId w:val="24"/>
+    <w:abstractNumId w:val="25"/>
+  </w:num>
+  <w:num w:numId="36" w16cid:durableId="216741931">
+    <w:abstractNumId w:val="11"/>
   </w:num>
   <w:numIdMacAtCleanup w:val="13"/>
 </w:numbering>

</xml_diff>

<commit_message>
Avanzada la memoria hasta los treat statement
</commit_message>
<xml_diff>
--- a/Optimization of the circom compiler.docx
+++ b/Optimization of the circom compiler.docx
@@ -2794,130 +2794,62 @@
     <w:p>
       <w:pPr>
         <w:pStyle w:val="Textoindependiente"/>
-        <w:rPr>
-          <w:highlight w:val="yellow"/>
-          <w:lang w:val="es-ES"/>
-        </w:rPr>
-      </w:pPr>
-      <w:r>
-        <w:rPr>
-          <w:highlight w:val="yellow"/>
-          <w:lang w:val="es-ES"/>
-        </w:rPr>
-        <w:t>Circom lo hemos desarrollado solo desde la UCM en colaboración con la empresa iden3. Ahora</w:t>
+      </w:pPr>
+      <w:r>
+        <w:t xml:space="preserve">Circom </w:t>
+      </w:r>
+      <w:r>
+        <w:t>was o</w:t>
+      </w:r>
+      <w:r>
+        <w:t>riginally developed at the Universidad Complutense de Madrid in collaboration with the company iden3</w:t>
+      </w:r>
+      <w:r>
+        <w:t>.</w:t>
+      </w:r>
+      <w:r>
+        <w:t xml:space="preserve"> Circom is currently used both in academic and practical contexts. It is taught in several universities as part of applied cryptography courses</w:t>
+      </w:r>
+      <w:r>
+        <w:t>, such as Stanford,</w:t>
+      </w:r>
+      <w:r>
+        <w:t xml:space="preserve"> and is also widely used in applications where privacy is a key requirement, such as digital identity, voting systems, and blockchain-based solutions. In these scenarios, the efficiency of the compiler becomes critical, especially when working with large circuits where memory usage can significantly impact performance. </w:t>
       </w:r>
     </w:p>
     <w:p>
       <w:pPr>
         <w:pStyle w:val="Textoindependiente"/>
-        <w:rPr>
-          <w:highlight w:val="yellow"/>
-          <w:lang w:val="es-ES"/>
-        </w:rPr>
-      </w:pPr>
-      <w:r>
-        <w:rPr>
-          <w:highlight w:val="yellow"/>
-          <w:lang w:val="es-ES"/>
-        </w:rPr>
-        <w:t>mismo se utiliza tanto para docencia y se imparte en bastantes universidades (me suena que</w:t>
+      </w:pPr>
+      <w:r>
+        <w:t xml:space="preserve">The Circom compiler is implemented in Rust, a systems programming language that provides high performance while ensuring memory safety. This makes it particularly suitable for implementing a compiler, where large data structures and complex transformations must be handled efficiently and reliably. Rust also allows fine-grained control over memory representation, which is essential for optimizing </w:t>
+      </w:r>
+      <w:r>
+        <w:t>memory</w:t>
+      </w:r>
+      <w:r>
+        <w:t xml:space="preserve"> usage. </w:t>
       </w:r>
     </w:p>
     <w:p>
       <w:pPr>
         <w:pStyle w:val="Textoindependiente"/>
-        <w:rPr>
-          <w:highlight w:val="yellow"/>
-          <w:lang w:val="es-ES"/>
-        </w:rPr>
-      </w:pPr>
-      <w:r>
-        <w:rPr>
-          <w:highlight w:val="yellow"/>
-          <w:lang w:val="es-ES"/>
-        </w:rPr>
-        <w:t>en Stanford se usa por si quieres poner algún nombre de uni famoso) para explicar criptografía</w:t>
-      </w:r>
-    </w:p>
-    <w:p>
-      <w:pPr>
-        <w:pStyle w:val="Textoindependiente"/>
-        <w:rPr>
-          <w:highlight w:val="yellow"/>
-          <w:lang w:val="es-ES"/>
-        </w:rPr>
-      </w:pPr>
-      <w:r>
-        <w:rPr>
-          <w:highlight w:val="yellow"/>
-          <w:lang w:val="es-ES"/>
-        </w:rPr>
-        <w:t>aplicada. También se usa mucho para temas relacionados con la protocolos donde la</w:t>
-      </w:r>
-    </w:p>
-    <w:p>
-      <w:pPr>
-        <w:pStyle w:val="Textoindependiente"/>
-        <w:rPr>
-          <w:highlight w:val="yellow"/>
-          <w:lang w:val="es-ES"/>
-        </w:rPr>
-      </w:pPr>
-      <w:r>
-        <w:rPr>
-          <w:highlight w:val="yellow"/>
-          <w:lang w:val="es-ES"/>
-        </w:rPr>
-        <w:t>privadidad es importante (votaciones, pasaporte digital...) o en el contexto del blockchain donde</w:t>
-      </w:r>
-    </w:p>
-    <w:p>
-      <w:pPr>
-        <w:pStyle w:val="Textoindependiente"/>
-        <w:rPr>
-          <w:highlight w:val="yellow"/>
-          <w:lang w:val="es-ES"/>
-        </w:rPr>
-      </w:pPr>
-      <w:r>
-        <w:rPr>
-          <w:highlight w:val="yellow"/>
-          <w:lang w:val="es-ES"/>
-        </w:rPr>
-        <w:t>se utiliza para las layer2 (revisar y mirar esto). Por esto es importante su optimización, porque</w:t>
-      </w:r>
-    </w:p>
-    <w:p>
-      <w:pPr>
-        <w:pStyle w:val="Textoindependiente"/>
-        <w:rPr>
-          <w:highlight w:val="yellow"/>
-          <w:lang w:val="es-ES"/>
-        </w:rPr>
-      </w:pPr>
-      <w:r>
-        <w:rPr>
-          <w:highlight w:val="yellow"/>
-          <w:lang w:val="es-ES"/>
-        </w:rPr>
-        <w:t>se usa para fines industriales y proyectos donde el tiempo de ejecución y generaciónde la</w:t>
-      </w:r>
-    </w:p>
-    <w:p>
-      <w:pPr>
-        <w:pStyle w:val="Textoindependiente"/>
-      </w:pPr>
-      <w:r>
-        <w:rPr>
-          <w:highlight w:val="yellow"/>
-        </w:rPr>
-        <w:t>witness es crítico.</w:t>
-      </w:r>
-    </w:p>
-    <w:p>
-      <w:pPr>
-        <w:pStyle w:val="Textoindependiente"/>
-      </w:pPr>
+      </w:pPr>
+      <w:r>
+        <w:t xml:space="preserve">This project focuses on improving the memory efficiency of the Circom compiler. Currently, many internal values are represented using uniform data sizes, which may be larger than necessary. The goal of this work is to analyze the range of values that variables can take and </w:t>
+      </w:r>
+      <w:r>
+        <w:t xml:space="preserve">depending on that, </w:t>
+      </w:r>
+      <w:r>
+        <w:t xml:space="preserve">adjust their memory </w:t>
+      </w:r>
+      <w:r>
+        <w:t>size</w:t>
+      </w:r>
+      <w:r>
+        <w:t xml:space="preserve">, reducing overall memory usage without affecting correctness. </w:t>
+      </w:r>
     </w:p>
     <w:p>
       <w:pPr>
@@ -2937,26 +2869,42 @@
     <w:p>
       <w:pPr>
         <w:pStyle w:val="Textoindependiente"/>
-        <w:rPr>
-          <w:highlight w:val="cyan"/>
-        </w:rPr>
-      </w:pPr>
-      <w:r>
-        <w:rPr>
-          <w:highlight w:val="cyan"/>
-        </w:rPr>
-        <w:t>For the TFG I wanted to do something impactful that also required optimization. By optimizing Circom I can get both.</w:t>
-      </w:r>
-    </w:p>
-    <w:p>
-      <w:pPr>
-        <w:pStyle w:val="Textoindependiente"/>
-      </w:pPr>
-      <w:r>
-        <w:rPr>
-          <w:highlight w:val="cyan"/>
-        </w:rPr>
-        <w:t>Circom is a widely used compiler in many universities, and it has an issue with the size of the variables and signals, so by solving this issue I optimize the memory usage of the compiler for many people.</w:t>
+      </w:pPr>
+      <w:r>
+        <w:t xml:space="preserve">The main motivation for </w:t>
+      </w:r>
+      <w:r>
+        <w:t xml:space="preserve">my TFG </w:t>
+      </w:r>
+      <w:r>
+        <w:t>is to address a real-world problem using a tool already employed in academic and industrial settings. Circom is a</w:t>
+      </w:r>
+      <w:r>
+        <w:t xml:space="preserve">n important </w:t>
+      </w:r>
+      <w:r>
+        <w:t xml:space="preserve">compiler within the zero-knowledge proofing ecosystem, so any improvement in its efficiency could have immediate practical applications. </w:t>
+      </w:r>
+      <w:r>
+        <w:t>Optimizing</w:t>
+      </w:r>
+      <w:r>
+        <w:t xml:space="preserve"> memory usage is </w:t>
+      </w:r>
+      <w:r>
+        <w:t xml:space="preserve">important </w:t>
+      </w:r>
+      <w:r>
+        <w:t>because</w:t>
+      </w:r>
+      <w:r>
+        <w:t xml:space="preserve"> it directly impacts the compiler's scalability and its ability to handle large circuits more efficiently. Furthermore, the project allows </w:t>
+      </w:r>
+      <w:r>
+        <w:t>me</w:t>
+      </w:r>
+      <w:r>
+        <w:t xml:space="preserve"> to work with two particularly appealing areas of computer science: compilers and Rust programming.</w:t>
       </w:r>
     </w:p>
     <w:p>
@@ -2985,10 +2933,64 @@
         <w:pStyle w:val="Textoindependiente"/>
       </w:pPr>
       <w:r>
-        <w:rPr>
-          <w:highlight w:val="cyan"/>
-        </w:rPr>
-        <w:t>For this project I want to explore the Circom compiler, and by doing so learn how Rust works at a high level. Moreover, I want to make this project a gateway to future projects optimizing systems.</w:t>
+        <w:t xml:space="preserve">The overall objective of this </w:t>
+      </w:r>
+      <w:r>
+        <w:t xml:space="preserve">TFG </w:t>
+      </w:r>
+      <w:r>
+        <w:t>is to analyze the memory usage behavior of the Circom compiler and propose an improvement to the representation of its internal variables.</w:t>
+      </w:r>
+      <w:r>
+        <w:t xml:space="preserve"> </w:t>
+      </w:r>
+      <w:r>
+        <w:t>To</w:t>
+      </w:r>
+      <w:r>
+        <w:t xml:space="preserve"> achieve it</w:t>
+      </w:r>
+      <w:r>
+        <w:t xml:space="preserve">, the different types of </w:t>
+      </w:r>
+      <w:r>
+        <w:t xml:space="preserve">operations </w:t>
+      </w:r>
+      <w:r>
+        <w:t xml:space="preserve">and </w:t>
+      </w:r>
+      <w:r>
+        <w:t>statements</w:t>
+      </w:r>
+      <w:r>
+        <w:t xml:space="preserve"> in the </w:t>
+      </w:r>
+      <w:r>
+        <w:t xml:space="preserve">Circom </w:t>
+      </w:r>
+      <w:r>
+        <w:t xml:space="preserve">language will be studied </w:t>
+      </w:r>
+      <w:r>
+        <w:t>to</w:t>
+      </w:r>
+      <w:r>
+        <w:t xml:space="preserve"> </w:t>
+      </w:r>
+      <w:r>
+        <w:t>find</w:t>
+      </w:r>
+      <w:r>
+        <w:t xml:space="preserve"> the range of values </w:t>
+      </w:r>
+      <w:r>
+        <w:rPr>
+          <w:rFonts w:ascii="Arial" w:hAnsi="Arial" w:cs="Arial"/>
+        </w:rPr>
+        <w:t>​​</w:t>
+      </w:r>
+      <w:r>
+        <w:t>that signals and variables can take. Based on this analysis, an attempt will be made to replace generic and oversized representations with others better suited to the actual needs of each case. The aim is to reduce the compiler's memory consumption without compromising the correctness of the compilation process.</w:t>
       </w:r>
     </w:p>
     <w:p>
@@ -2998,6 +3000,11 @@
     </w:p>
     <w:p>
       <w:pPr>
+        <w:pStyle w:val="Textoindependiente"/>
+      </w:pPr>
+    </w:p>
+    <w:p>
+      <w:pPr>
         <w:pStyle w:val="Ttulo2"/>
       </w:pPr>
       <w:bookmarkStart w:id="12" w:name="_Toc221452909"/>
@@ -3008,59 +3015,105 @@
     </w:p>
     <w:p>
       <w:pPr>
-        <w:rPr>
-          <w:highlight w:val="cyan"/>
-        </w:rPr>
-      </w:pPr>
-      <w:r>
-        <w:rPr>
-          <w:highlight w:val="cyan"/>
-        </w:rPr>
-        <w:t>First of all, I had to learn the basics of Rust and how it does manage memory, so I studied and practiced a little bit during the previous summer.</w:t>
-      </w:r>
-    </w:p>
-    <w:p>
-      <w:pPr>
-        <w:rPr>
-          <w:highlight w:val="cyan"/>
-        </w:rPr>
-      </w:pPr>
-      <w:r>
-        <w:rPr>
-          <w:highlight w:val="cyan"/>
-        </w:rPr>
-        <w:t>Then, I went through the first semester by reading documentation and papers about Circom and the usage of it.</w:t>
-      </w:r>
-    </w:p>
-    <w:p>
-      <w:pPr>
-        <w:sectPr>
-          <w:footerReference w:type="default" r:id="rId12"/>
-          <w:type w:val="oddPage"/>
-          <w:pgSz w:w="12240" w:h="15840"/>
-          <w:pgMar w:top="1440" w:right="1440" w:bottom="1440" w:left="1440" w:header="720" w:footer="720" w:gutter="0"/>
-          <w:pgNumType w:start="1"/>
-          <w:cols w:space="720"/>
-          <w:docGrid w:linePitch="360"/>
-        </w:sectPr>
-      </w:pPr>
-      <w:r>
-        <w:rPr>
-          <w:highlight w:val="cyan"/>
-        </w:rPr>
-        <w:t>And now in the second semester, I will start to analyze the different areas of the code to be optimized, and then implementing some changes to optimize memory usage of the code</w:t>
-      </w:r>
-    </w:p>
-    <w:p>
-      <w:pPr>
         <w:pStyle w:val="Textoindependiente"/>
       </w:pPr>
+      <w:r>
+        <w:t xml:space="preserve">The work </w:t>
+      </w:r>
+      <w:r>
+        <w:t>is</w:t>
+      </w:r>
+      <w:r>
+        <w:t xml:space="preserve"> carried out in several phases. </w:t>
+      </w:r>
+    </w:p>
+    <w:p>
+      <w:pPr>
+        <w:pStyle w:val="Textoindependiente"/>
+      </w:pPr>
+      <w:r>
+        <w:t xml:space="preserve">First, it </w:t>
+      </w:r>
+      <w:r>
+        <w:t>is</w:t>
+      </w:r>
+      <w:r>
+        <w:t xml:space="preserve"> necessary to become familiar with Rust and the fundamentals of the Circom compiler, as well as how circuits and constraints are represented. </w:t>
+      </w:r>
+    </w:p>
+    <w:p>
+      <w:pPr>
+        <w:pStyle w:val="Textoindependiente"/>
+      </w:pPr>
+      <w:r>
+        <w:t>T</w:t>
+      </w:r>
+      <w:r>
+        <w:t>he next stage involve</w:t>
+      </w:r>
+      <w:r>
+        <w:t>s</w:t>
+      </w:r>
+      <w:r>
+        <w:t xml:space="preserve"> analyzing the source code to identify areas where memory usage could be optimized. </w:t>
+      </w:r>
+    </w:p>
+    <w:p>
+      <w:pPr>
+        <w:pStyle w:val="Textoindependiente"/>
+      </w:pPr>
+      <w:r>
+        <w:t xml:space="preserve">Finally, the necessary modifications </w:t>
+      </w:r>
+      <w:r>
+        <w:t>are</w:t>
+      </w:r>
+      <w:r>
+        <w:t xml:space="preserve"> implemented, and their impact on the compiler's behavior </w:t>
+      </w:r>
+      <w:r>
+        <w:t>is</w:t>
+      </w:r>
+      <w:r>
+        <w:t xml:space="preserve"> evaluated.</w:t>
+      </w:r>
+    </w:p>
+    <w:p>
+      <w:pPr>
+        <w:pStyle w:val="Textoindependiente"/>
+      </w:pPr>
+    </w:p>
+    <w:p>
+      <w:pPr>
+        <w:pStyle w:val="Textoindependiente"/>
+      </w:pPr>
+    </w:p>
+    <w:p>
+      <w:pPr>
+        <w:pStyle w:val="Textoindependiente"/>
+      </w:pPr>
+    </w:p>
+    <w:p>
+      <w:pPr>
+        <w:pStyle w:val="Textoindependiente"/>
+      </w:pPr>
+    </w:p>
+    <w:p>
+      <w:pPr>
+        <w:pStyle w:val="Textoindependiente"/>
+      </w:pPr>
+    </w:p>
+    <w:p>
+      <w:pPr>
+        <w:pStyle w:val="Textoindependiente"/>
+      </w:pPr>
     </w:p>
     <w:p>
       <w:pPr>
         <w:pStyle w:val="Ttulo2"/>
       </w:pPr>
       <w:r>
+        <w:lastRenderedPageBreak/>
         <w:t>Circom</w:t>
       </w:r>
     </w:p>
@@ -3105,13 +3158,7 @@
         <w:t>,</w:t>
       </w:r>
       <w:r>
-        <w:t xml:space="preserve"> components, and </w:t>
-      </w:r>
-      <w:r>
-        <w:t>templates in</w:t>
-      </w:r>
-      <w:r>
-        <w:t xml:space="preserve"> a C-like synta</w:t>
+        <w:t xml:space="preserve"> components, and templates in a C-like synta</w:t>
       </w:r>
       <w:r>
         <w:t xml:space="preserve">x. </w:t>
@@ -3135,6 +3182,182 @@
     <w:p>
       <w:pPr>
         <w:pStyle w:val="Textoindependiente"/>
+        <w:keepNext/>
+      </w:pPr>
+      <w:r>
+        <w:rPr>
+          <w:noProof/>
+        </w:rPr>
+        <w:drawing>
+          <wp:inline distT="0" distB="0" distL="0" distR="0" wp14:anchorId="2B6DB6B5" wp14:editId="49211F66">
+            <wp:extent cx="3010161" cy="2149026"/>
+            <wp:effectExtent l="0" t="0" r="0" b="3810"/>
+            <wp:docPr id="2039023271" name="Imagen 1" descr="Texto&#10;&#10;El contenido generado por IA puede ser incorrecto."/>
+            <wp:cNvGraphicFramePr>
+              <a:graphicFrameLocks xmlns:a="http://schemas.openxmlformats.org/drawingml/2006/main" noChangeAspect="1"/>
+            </wp:cNvGraphicFramePr>
+            <a:graphic xmlns:a="http://schemas.openxmlformats.org/drawingml/2006/main">
+              <a:graphicData uri="http://schemas.openxmlformats.org/drawingml/2006/picture">
+                <pic:pic xmlns:pic="http://schemas.openxmlformats.org/drawingml/2006/picture">
+                  <pic:nvPicPr>
+                    <pic:cNvPr id="2039023271" name="Imagen 1" descr="Texto&#10;&#10;El contenido generado por IA puede ser incorrecto."/>
+                    <pic:cNvPicPr/>
+                  </pic:nvPicPr>
+                  <pic:blipFill>
+                    <a:blip r:embed="rId12"/>
+                    <a:stretch>
+                      <a:fillRect/>
+                    </a:stretch>
+                  </pic:blipFill>
+                  <pic:spPr>
+                    <a:xfrm>
+                      <a:off x="0" y="0"/>
+                      <a:ext cx="3010161" cy="2149026"/>
+                    </a:xfrm>
+                    <a:prstGeom prst="rect">
+                      <a:avLst/>
+                    </a:prstGeom>
+                  </pic:spPr>
+                </pic:pic>
+              </a:graphicData>
+            </a:graphic>
+          </wp:inline>
+        </w:drawing>
+      </w:r>
+      <w:r>
+        <w:rPr>
+          <w:noProof/>
+        </w:rPr>
+        <w:drawing>
+          <wp:inline distT="0" distB="0" distL="0" distR="0" wp14:anchorId="2E1414AA" wp14:editId="3981E19D">
+            <wp:extent cx="2320636" cy="2156440"/>
+            <wp:effectExtent l="0" t="0" r="3810" b="0"/>
+            <wp:docPr id="768596320" name="Imagen 1" descr="Texto&#10;&#10;El contenido generado por IA puede ser incorrecto."/>
+            <wp:cNvGraphicFramePr>
+              <a:graphicFrameLocks xmlns:a="http://schemas.openxmlformats.org/drawingml/2006/main" noChangeAspect="1"/>
+            </wp:cNvGraphicFramePr>
+            <a:graphic xmlns:a="http://schemas.openxmlformats.org/drawingml/2006/main">
+              <a:graphicData uri="http://schemas.openxmlformats.org/drawingml/2006/picture">
+                <pic:pic xmlns:pic="http://schemas.openxmlformats.org/drawingml/2006/picture">
+                  <pic:nvPicPr>
+                    <pic:cNvPr id="768596320" name="Imagen 1" descr="Texto&#10;&#10;El contenido generado por IA puede ser incorrecto."/>
+                    <pic:cNvPicPr/>
+                  </pic:nvPicPr>
+                  <pic:blipFill>
+                    <a:blip r:embed="rId13"/>
+                    <a:stretch>
+                      <a:fillRect/>
+                    </a:stretch>
+                  </pic:blipFill>
+                  <pic:spPr>
+                    <a:xfrm>
+                      <a:off x="0" y="0"/>
+                      <a:ext cx="2331600" cy="2166628"/>
+                    </a:xfrm>
+                    <a:prstGeom prst="rect">
+                      <a:avLst/>
+                    </a:prstGeom>
+                  </pic:spPr>
+                </pic:pic>
+              </a:graphicData>
+            </a:graphic>
+          </wp:inline>
+        </w:drawing>
+      </w:r>
+    </w:p>
+    <w:p>
+      <w:pPr>
+        <w:pStyle w:val="Descripcin"/>
+        <w:jc w:val="both"/>
+      </w:pPr>
+      <w:r>
+        <w:t xml:space="preserve">Figure </w:t>
+      </w:r>
+      <w:r>
+        <w:fldChar w:fldCharType="begin"/>
+      </w:r>
+      <w:r>
+        <w:instrText xml:space="preserve"> SEQ Figure \* ARABIC </w:instrText>
+      </w:r>
+      <w:r>
+        <w:fldChar w:fldCharType="separate"/>
+      </w:r>
+      <w:r>
+        <w:rPr>
+          <w:noProof/>
+        </w:rPr>
+        <w:t>1</w:t>
+      </w:r>
+      <w:r>
+        <w:fldChar w:fldCharType="end"/>
+      </w:r>
+      <w:r>
+        <w:t xml:space="preserve"> </w:t>
+      </w:r>
+      <w:r>
+        <w:t>from</w:t>
+      </w:r>
+      <w:r>
+        <w:t xml:space="preserve"> </w:t>
+      </w:r>
+      <w:proofErr w:type="spellStart"/>
+      <w:r>
+        <w:t>circomlib</w:t>
+      </w:r>
+      <w:proofErr w:type="spellEnd"/>
+    </w:p>
+    <w:p>
+      <w:pPr>
+        <w:pStyle w:val="Descripcin"/>
+        <w:jc w:val="both"/>
+      </w:pPr>
+      <w:r>
+        <w:t xml:space="preserve">Figure </w:t>
+      </w:r>
+      <w:r>
+        <w:fldChar w:fldCharType="begin"/>
+      </w:r>
+      <w:r>
+        <w:instrText xml:space="preserve"> SEQ Figure \* ARABIC </w:instrText>
+      </w:r>
+      <w:r>
+        <w:fldChar w:fldCharType="separate"/>
+      </w:r>
+      <w:r>
+        <w:rPr>
+          <w:noProof/>
+        </w:rPr>
+        <w:t>2</w:t>
+      </w:r>
+      <w:r>
+        <w:fldChar w:fldCharType="end"/>
+      </w:r>
+      <w:r>
+        <w:t xml:space="preserve"> </w:t>
+      </w:r>
+      <w:r>
+        <w:t>from</w:t>
+      </w:r>
+      <w:r>
+        <w:t xml:space="preserve"> </w:t>
+      </w:r>
+      <w:proofErr w:type="spellStart"/>
+      <w:r>
+        <w:t>circomlib</w:t>
+      </w:r>
+      <w:proofErr w:type="spellEnd"/>
+    </w:p>
+    <w:p>
+      <w:r>
+        <w:t>In those examples we c</w:t>
+      </w:r>
+      <w:r>
+        <w:t>an see two templates from Circom lib. We can observe how Circom is written, and the different ways to assign values to signals and create constraints.</w:t>
+      </w:r>
+    </w:p>
+    <w:p>
+      <w:pPr>
+        <w:pStyle w:val="Textoindependiente"/>
       </w:pPr>
       <w:r>
         <w:t xml:space="preserve">When a Circom </w:t>
@@ -3143,8 +3366,13 @@
         <w:t>“</w:t>
       </w:r>
       <w:r>
-        <w:t>.circom</w:t>
-      </w:r>
+        <w:t xml:space="preserve">. </w:t>
+      </w:r>
+      <w:proofErr w:type="spellStart"/>
+      <w:r>
+        <w:t>circom</w:t>
+      </w:r>
+      <w:proofErr w:type="spellEnd"/>
       <w:r>
         <w:t>”</w:t>
       </w:r>
@@ -3205,10 +3433,47 @@
         <w:pStyle w:val="Textoindependiente"/>
       </w:pPr>
       <w:r>
+        <w:t xml:space="preserve">The output has two forms, a r1cs file, and one or </w:t>
+      </w:r>
+      <w:r>
+        <w:t>witness calculator programs</w:t>
+      </w:r>
+      <w:r>
+        <w:t xml:space="preserve">. The r1cs file contains the full rank-1 constraint system that encodes the circuit. The </w:t>
+      </w:r>
+      <w:r>
+        <w:t xml:space="preserve">witness calculator programs (in C++ and/or </w:t>
+      </w:r>
+      <w:proofErr w:type="spellStart"/>
+      <w:r>
+        <w:t>WebAssembly</w:t>
+      </w:r>
+      <w:proofErr w:type="spellEnd"/>
+      <w:r>
+        <w:t>) compute all signal values that satisfy the constraint</w:t>
+      </w:r>
+      <w:r>
+        <w:t>s.</w:t>
+      </w:r>
+    </w:p>
+    <w:p>
+      <w:pPr>
+        <w:pStyle w:val="Textoindependiente"/>
+      </w:pPr>
+      <w:r>
+        <w:lastRenderedPageBreak/>
         <w:t>T</w:t>
       </w:r>
       <w:r>
-        <w:t xml:space="preserve">he Circom+SnarkJS ecosystem is widely used in both </w:t>
+        <w:t xml:space="preserve">he </w:t>
+      </w:r>
+      <w:proofErr w:type="spellStart"/>
+      <w:r>
+        <w:t>Circom+SnarkJS</w:t>
+      </w:r>
+      <w:proofErr w:type="spellEnd"/>
+      <w:r>
+        <w:t xml:space="preserve"> ecosystem is widely used in both </w:t>
       </w:r>
       <w:r>
         <w:t>Universities</w:t>
@@ -3250,14 +3515,13 @@
         <w:t xml:space="preserve"> </w:t>
       </w:r>
       <w:r>
-        <w:t xml:space="preserve">have all used Circom to describe circuits with millions of </w:t>
-      </w:r>
-      <w:r>
-        <w:t>constraints.</w:t>
-      </w:r>
-      <w:r>
-        <w:t xml:space="preserve"> </w:t>
-      </w:r>
+        <w:t xml:space="preserve">have all used Circom to describe circuits with millions of constraints. </w:t>
+      </w:r>
+    </w:p>
+    <w:p>
+      <w:pPr>
+        <w:pStyle w:val="Textoindependiente"/>
+      </w:pPr>
     </w:p>
     <w:p>
       <w:pPr>
@@ -3281,6 +3545,14 @@
         <w:pStyle w:val="Textoindependiente"/>
       </w:pPr>
       <w:r>
+        <w:t xml:space="preserve">Rust is a modern systems programming language designed to provide high performance while ensuring memory safety. Unlike traditional languages such as  C++, Rust enforces strict compile-time guarantees through its ownership and borrowing model, preventing common errors such as null pointer dereferencing, data races, and memory leaks. </w:t>
+      </w:r>
+    </w:p>
+    <w:p>
+      <w:pPr>
+        <w:pStyle w:val="Textoindependiente"/>
+      </w:pPr>
+      <w:r>
         <w:t xml:space="preserve">Rust’s safety and performance make it well-suited for a compiler managing large data structures (like constraint matrices). Some </w:t>
       </w:r>
       <w:r>
@@ -3313,19 +3585,7 @@
         <w:t>y</w:t>
       </w:r>
       <w:r>
-        <w:t xml:space="preserve">: Rust enforces memory safety at compile time, preventing use-after-free, buffer overruns, and data races, without any garbage collector </w:t>
-      </w:r>
-      <w:r>
-        <w:t>overhead.</w:t>
-      </w:r>
-      <w:r>
-        <w:t xml:space="preserve"> This means the compiler </w:t>
-      </w:r>
-      <w:r>
-        <w:t>avoids</w:t>
-      </w:r>
-      <w:r>
-        <w:t xml:space="preserve"> a whole class of bugs, increasing reliability</w:t>
+        <w:t>: Rust enforces memory safety at compile time, preventing use-after-free, buffer overruns, and data races, without any garbage collector overhead. This means the compiler avoids a whole class of bugs, increasing reliability</w:t>
       </w:r>
       <w:r>
         <w:t>.</w:t>
@@ -3347,7 +3607,6 @@
           <w:b/>
           <w:bCs/>
         </w:rPr>
-        <w:lastRenderedPageBreak/>
         <w:t>Zero-Cost Abstractions</w:t>
       </w:r>
       <w:r>
@@ -3396,6 +3655,36 @@
         <w:pStyle w:val="Textoindependiente"/>
       </w:pPr>
       <w:r>
+        <w:lastRenderedPageBreak/>
+        <w:t>My</w:t>
+      </w:r>
+      <w:r>
+        <w:t xml:space="preserve"> motivation for learning Rust in this project arises primarily from the need to understand and modify the Circom compiler, which is implemented in this language.</w:t>
+      </w:r>
+      <w:r>
+        <w:t xml:space="preserve"> Also</w:t>
+      </w:r>
+      <w:r>
+        <w:t xml:space="preserve">, Rust represents a valuable addition to </w:t>
+      </w:r>
+      <w:r>
+        <w:t>my</w:t>
+      </w:r>
+      <w:r>
+        <w:t xml:space="preserve"> skill set </w:t>
+      </w:r>
+      <w:r>
+        <w:t>as</w:t>
+      </w:r>
+      <w:r>
+        <w:t xml:space="preserve"> a computer science student. Its growing adoption in industry and its focus on safety and performance make it a differentiating technology in the job market. Therefore, this project also serves as an opportunity to gain experience with modern language systems that is increasingly relevant in both research and professional environments.</w:t>
+      </w:r>
+    </w:p>
+    <w:p>
+      <w:pPr>
+        <w:pStyle w:val="Textoindependiente"/>
+      </w:pPr>
+      <w:r>
         <w:br w:type="page"/>
       </w:r>
     </w:p>
@@ -3463,22 +3752,88 @@
     </w:p>
     <w:p>
       <w:pPr>
-        <w:rPr>
-          <w:highlight w:val="cyan"/>
-        </w:rPr>
-      </w:pPr>
-      <w:r>
-        <w:rPr>
-          <w:highlight w:val="cyan"/>
-        </w:rPr>
-        <w:t>Example with a Boolean signal.</w:t>
-      </w:r>
-    </w:p>
-    <w:p/>
+        <w:keepNext/>
+      </w:pPr>
+      <w:r>
+        <w:rPr>
+          <w:noProof/>
+        </w:rPr>
+        <w:drawing>
+          <wp:inline distT="0" distB="0" distL="0" distR="0" wp14:anchorId="315B72C7" wp14:editId="1FB517AD">
+            <wp:extent cx="1996613" cy="2118544"/>
+            <wp:effectExtent l="0" t="0" r="3810" b="0"/>
+            <wp:docPr id="1814477959" name="Imagen 1" descr="Pantalla de computadora con letras&#10;&#10;El contenido generado por IA puede ser incorrecto."/>
+            <wp:cNvGraphicFramePr>
+              <a:graphicFrameLocks xmlns:a="http://schemas.openxmlformats.org/drawingml/2006/main" noChangeAspect="1"/>
+            </wp:cNvGraphicFramePr>
+            <a:graphic xmlns:a="http://schemas.openxmlformats.org/drawingml/2006/main">
+              <a:graphicData uri="http://schemas.openxmlformats.org/drawingml/2006/picture">
+                <pic:pic xmlns:pic="http://schemas.openxmlformats.org/drawingml/2006/picture">
+                  <pic:nvPicPr>
+                    <pic:cNvPr id="1814477959" name="Imagen 1" descr="Pantalla de computadora con letras&#10;&#10;El contenido generado por IA puede ser incorrecto."/>
+                    <pic:cNvPicPr/>
+                  </pic:nvPicPr>
+                  <pic:blipFill>
+                    <a:blip r:embed="rId14"/>
+                    <a:stretch>
+                      <a:fillRect/>
+                    </a:stretch>
+                  </pic:blipFill>
+                  <pic:spPr>
+                    <a:xfrm>
+                      <a:off x="0" y="0"/>
+                      <a:ext cx="1996613" cy="2118544"/>
+                    </a:xfrm>
+                    <a:prstGeom prst="rect">
+                      <a:avLst/>
+                    </a:prstGeom>
+                  </pic:spPr>
+                </pic:pic>
+              </a:graphicData>
+            </a:graphic>
+          </wp:inline>
+        </w:drawing>
+      </w:r>
+    </w:p>
+    <w:p>
+      <w:pPr>
+        <w:pStyle w:val="Descripcin"/>
+        <w:jc w:val="both"/>
+      </w:pPr>
+      <w:r>
+        <w:t xml:space="preserve">Figure </w:t>
+      </w:r>
+      <w:r>
+        <w:fldChar w:fldCharType="begin"/>
+      </w:r>
+      <w:r>
+        <w:instrText xml:space="preserve"> SEQ Figure \* ARABIC </w:instrText>
+      </w:r>
+      <w:r>
+        <w:fldChar w:fldCharType="separate"/>
+      </w:r>
+      <w:r>
+        <w:rPr>
+          <w:noProof/>
+        </w:rPr>
+        <w:t>3</w:t>
+      </w:r>
+      <w:r>
+        <w:fldChar w:fldCharType="end"/>
+      </w:r>
+      <w:r>
+        <w:t xml:space="preserve"> from </w:t>
+      </w:r>
+      <w:proofErr w:type="spellStart"/>
+      <w:r>
+        <w:t>circomlib</w:t>
+      </w:r>
+      <w:proofErr w:type="spellEnd"/>
+    </w:p>
     <w:p>
       <w:pPr>
         <w:sectPr>
-          <w:footerReference w:type="default" r:id="rId13"/>
+          <w:footerReference w:type="default" r:id="rId15"/>
           <w:type w:val="oddPage"/>
           <w:pgSz w:w="12240" w:h="15840"/>
           <w:pgMar w:top="1440" w:right="1440" w:bottom="1440" w:left="1440" w:header="720" w:footer="720" w:gutter="0"/>
@@ -3512,13 +3867,25 @@
         <w:pStyle w:val="Textoindependiente"/>
       </w:pPr>
       <w:r>
-        <w:t xml:space="preserve">For the analysis we will study the bounds in which the operation or statement moves around. To do so, we </w:t>
-      </w:r>
-      <w:r>
-        <w:t>must</w:t>
-      </w:r>
-      <w:r>
-        <w:t xml:space="preserve"> keep in mind that the value is in the range [0,prime), being prime a huge prime number bigger than any value in the compiler.</w:t>
+        <w:t>The</w:t>
+      </w:r>
+      <w:r>
+        <w:t xml:space="preserve"> </w:t>
+      </w:r>
+      <w:r>
+        <w:t xml:space="preserve">objective of this analysis is to traverse the different instructions of a program and determine the range of values that each signal can take. By identifying these bounds, we aim to </w:t>
+      </w:r>
+      <w:r>
+        <w:t>have</w:t>
+      </w:r>
+      <w:r>
+        <w:t xml:space="preserve"> </w:t>
+      </w:r>
+      <w:r>
+        <w:t>smaller</w:t>
+      </w:r>
+      <w:r>
+        <w:t xml:space="preserve"> memory representations for variables, reducing their size without affecting correctness.</w:t>
       </w:r>
     </w:p>
     <w:p>
@@ -3526,6 +3893,29 @@
         <w:pStyle w:val="Textoindependiente"/>
       </w:pPr>
       <w:r>
+        <w:t>For the</w:t>
+      </w:r>
+      <w:r>
+        <w:t xml:space="preserve"> analysis, it is important to consider that all values are defined over a finite field, meaning they lie within the range [0,</w:t>
+      </w:r>
+      <w:r>
+        <w:t xml:space="preserve"> </w:t>
+      </w:r>
+      <w:r>
+        <w:t xml:space="preserve">p), where p is a large prime number greater than any value handled by the compiler. This assumption provides a global upper bound and serves as a reference for detecting and refining </w:t>
+      </w:r>
+      <w:r>
+        <w:t>smaller</w:t>
+      </w:r>
+      <w:r>
+        <w:t xml:space="preserve"> bounds during the analysis.</w:t>
+      </w:r>
+    </w:p>
+    <w:p>
+      <w:pPr>
+        <w:pStyle w:val="Textoindependiente"/>
+      </w:pPr>
+      <w:r>
         <w:t xml:space="preserve">The bounds </w:t>
       </w:r>
       <w:r>
@@ -3551,6 +3941,82 @@
       </w:r>
       <w:r>
         <w:t>.</w:t>
+      </w:r>
+    </w:p>
+    <w:p>
+      <w:pPr>
+        <w:pStyle w:val="Textoindependiente"/>
+        <w:keepNext/>
+      </w:pPr>
+      <w:r>
+        <w:rPr>
+          <w:noProof/>
+        </w:rPr>
+        <w:drawing>
+          <wp:inline distT="0" distB="0" distL="0" distR="0" wp14:anchorId="7BCE09AF" wp14:editId="2A568B5E">
+            <wp:extent cx="4549534" cy="190517"/>
+            <wp:effectExtent l="0" t="0" r="3810" b="0"/>
+            <wp:docPr id="1457302801" name="Imagen 1"/>
+            <wp:cNvGraphicFramePr>
+              <a:graphicFrameLocks xmlns:a="http://schemas.openxmlformats.org/drawingml/2006/main" noChangeAspect="1"/>
+            </wp:cNvGraphicFramePr>
+            <a:graphic xmlns:a="http://schemas.openxmlformats.org/drawingml/2006/main">
+              <a:graphicData uri="http://schemas.openxmlformats.org/drawingml/2006/picture">
+                <pic:pic xmlns:pic="http://schemas.openxmlformats.org/drawingml/2006/picture">
+                  <pic:nvPicPr>
+                    <pic:cNvPr id="1457302801" name=""/>
+                    <pic:cNvPicPr/>
+                  </pic:nvPicPr>
+                  <pic:blipFill>
+                    <a:blip r:embed="rId16"/>
+                    <a:stretch>
+                      <a:fillRect/>
+                    </a:stretch>
+                  </pic:blipFill>
+                  <pic:spPr>
+                    <a:xfrm>
+                      <a:off x="0" y="0"/>
+                      <a:ext cx="4549534" cy="190517"/>
+                    </a:xfrm>
+                    <a:prstGeom prst="rect">
+                      <a:avLst/>
+                    </a:prstGeom>
+                  </pic:spPr>
+                </pic:pic>
+              </a:graphicData>
+            </a:graphic>
+          </wp:inline>
+        </w:drawing>
+      </w:r>
+    </w:p>
+    <w:p>
+      <w:pPr>
+        <w:pStyle w:val="Descripcin"/>
+        <w:jc w:val="both"/>
+      </w:pPr>
+      <w:r>
+        <w:t xml:space="preserve">Figure </w:t>
+      </w:r>
+      <w:r>
+        <w:fldChar w:fldCharType="begin"/>
+      </w:r>
+      <w:r>
+        <w:instrText xml:space="preserve"> SEQ Figure \* ARABIC </w:instrText>
+      </w:r>
+      <w:r>
+        <w:fldChar w:fldCharType="separate"/>
+      </w:r>
+      <w:r>
+        <w:rPr>
+          <w:noProof/>
+        </w:rPr>
+        <w:t>4</w:t>
+      </w:r>
+      <w:r>
+        <w:fldChar w:fldCharType="end"/>
+      </w:r>
+      <w:r>
+        <w:t xml:space="preserve"> from compute_bouds.rs</w:t>
       </w:r>
     </w:p>
     <w:p>
@@ -3596,7 +4062,19 @@
         <w:t>The computing of bounds i</w:t>
       </w:r>
       <w:r>
-        <w:t>s a very sophisticated part of the program, in witch you get an expression, and depending on the kind of the expression, you have to carefully analyze what the minimum and maximum bound</w:t>
+        <w:t>s a very sophisticated part of the program, in w</w:t>
+      </w:r>
+      <w:r>
+        <w:t>h</w:t>
+      </w:r>
+      <w:r>
+        <w:t xml:space="preserve">ich you get an expression, and depending on the kind of the expression, you </w:t>
+      </w:r>
+      <w:r>
+        <w:t>must</w:t>
+      </w:r>
+      <w:r>
+        <w:t xml:space="preserve"> carefully analyze what the minimum and maximum bound</w:t>
       </w:r>
       <w:r>
         <w:t>s</w:t>
@@ -3606,10 +4084,21 @@
       </w:r>
     </w:p>
     <w:p>
+      <w:r>
+        <w:t>To do that I´m going to implement a function, that given the expression and the context, will give back the bounds.</w:t>
+      </w:r>
+    </w:p>
+    <w:p>
+      <w:r>
+        <w:t>Bounds(Expr, context) = {min, max}</w:t>
+      </w:r>
+    </w:p>
+    <w:p>
       <w:pPr>
         <w:pStyle w:val="Ttulo3"/>
       </w:pPr>
       <w:r>
+        <w:lastRenderedPageBreak/>
         <w:t>Infix operations</w:t>
       </w:r>
     </w:p>
@@ -3629,6 +4118,570 @@
         <w:pStyle w:val="Ttulo4"/>
       </w:pPr>
       <w:r>
+        <w:t>Arithmetic integer operations</w:t>
+      </w:r>
+    </w:p>
+    <w:p>
+      <w:pPr>
+        <w:pStyle w:val="Textoindependiente"/>
+      </w:pPr>
+      <w:r>
+        <w:t>These 3 operations (Add, Sub, and Mul) are very similar among them in the way their bounds are calculated.</w:t>
+      </w:r>
+    </w:p>
+    <w:p>
+      <w:pPr>
+        <w:pStyle w:val="Textoindependiente"/>
+      </w:pPr>
+      <w:r>
+        <w:t>For the Add operation you just have to add the bounds, min with min and max with max, and you will have the bounds of the whole expression.</w:t>
+      </w:r>
+    </w:p>
+    <w:p>
+      <w:pPr>
+        <w:pStyle w:val="Textoindependiente"/>
+      </w:pPr>
+      <w:r>
+        <w:t>For the Sub operation is a bit different but the same concept, you want the minimum to be the smallest possible result, so you subtract to the left min the right max, and with the maximum the other way around, subtract to the left max the right min.</w:t>
+      </w:r>
+    </w:p>
+    <w:p>
+      <w:pPr>
+        <w:pStyle w:val="Textoindependiente"/>
+      </w:pPr>
+      <w:r>
+        <w:t>And finally, the Mul operations works as the Add operation with th twist that now you multiply instead of summing.</w:t>
+      </w:r>
+    </w:p>
+    <w:p>
+      <w:pPr>
+        <w:pStyle w:val="Textoindependiente"/>
+      </w:pPr>
+      <w:r>
+        <w:t>If Bounds(e1) = (min1, max1) and Bounds(e2)= (min2, max2) then</w:t>
+      </w:r>
+    </w:p>
+    <w:p>
+      <w:pPr>
+        <w:pStyle w:val="Textoindependiente"/>
+      </w:pPr>
+      <w:r>
+        <w:t>Bounds(e1 +e2) = (min1+min2, max1+max2)</w:t>
+      </w:r>
+    </w:p>
+    <w:p>
+      <w:pPr>
+        <w:pStyle w:val="Textoindependiente"/>
+      </w:pPr>
+      <w:r>
+        <w:t xml:space="preserve">Bounds(e1 </w:t>
+      </w:r>
+      <w:r>
+        <w:t>-</w:t>
+      </w:r>
+      <w:r>
+        <w:t>e2) = (min1</w:t>
+      </w:r>
+      <w:r>
+        <w:t>-max2</w:t>
+      </w:r>
+      <w:r>
+        <w:t>, max1</w:t>
+      </w:r>
+      <w:r>
+        <w:t>-min2</w:t>
+      </w:r>
+      <w:r>
+        <w:t xml:space="preserve">) </w:t>
+      </w:r>
+    </w:p>
+    <w:p>
+      <w:pPr>
+        <w:pStyle w:val="Textoindependiente"/>
+      </w:pPr>
+      <w:r>
+        <w:t xml:space="preserve">Bounds(e1 </w:t>
+      </w:r>
+      <w:r>
+        <w:t>*</w:t>
+      </w:r>
+      <w:r>
+        <w:t>e2) = (min1</w:t>
+      </w:r>
+      <w:r>
+        <w:t>*</w:t>
+      </w:r>
+      <w:r>
+        <w:t>min2, max1</w:t>
+      </w:r>
+      <w:r>
+        <w:t>*</w:t>
+      </w:r>
+      <w:r>
+        <w:t>max2)</w:t>
+      </w:r>
+    </w:p>
+    <w:p>
+      <w:pPr>
+        <w:pStyle w:val="Textoindependiente"/>
+        <w:keepNext/>
+      </w:pPr>
+      <w:r>
+        <w:drawing>
+          <wp:inline distT="0" distB="0" distL="0" distR="0" wp14:anchorId="5794B3A3" wp14:editId="28023683">
+            <wp:extent cx="1309795" cy="2353742"/>
+            <wp:effectExtent l="0" t="0" r="5080" b="8890"/>
+            <wp:docPr id="1659767636" name="Imagen 1" descr="Texto&#10;&#10;El contenido generado por IA puede ser incorrecto."/>
+            <wp:cNvGraphicFramePr>
+              <a:graphicFrameLocks xmlns:a="http://schemas.openxmlformats.org/drawingml/2006/main" noChangeAspect="1"/>
+            </wp:cNvGraphicFramePr>
+            <a:graphic xmlns:a="http://schemas.openxmlformats.org/drawingml/2006/main">
+              <a:graphicData uri="http://schemas.openxmlformats.org/drawingml/2006/picture">
+                <pic:pic xmlns:pic="http://schemas.openxmlformats.org/drawingml/2006/picture">
+                  <pic:nvPicPr>
+                    <pic:cNvPr id="1659767636" name="Imagen 1" descr="Texto&#10;&#10;El contenido generado por IA puede ser incorrecto."/>
+                    <pic:cNvPicPr/>
+                  </pic:nvPicPr>
+                  <pic:blipFill>
+                    <a:blip r:embed="rId17"/>
+                    <a:stretch>
+                      <a:fillRect/>
+                    </a:stretch>
+                  </pic:blipFill>
+                  <pic:spPr>
+                    <a:xfrm>
+                      <a:off x="0" y="0"/>
+                      <a:ext cx="1316700" cy="2366151"/>
+                    </a:xfrm>
+                    <a:prstGeom prst="rect">
+                      <a:avLst/>
+                    </a:prstGeom>
+                  </pic:spPr>
+                </pic:pic>
+              </a:graphicData>
+            </a:graphic>
+          </wp:inline>
+        </w:drawing>
+      </w:r>
+      <w:r>
+        <w:drawing>
+          <wp:inline distT="0" distB="0" distL="0" distR="0" wp14:anchorId="7FBC2D00" wp14:editId="711756E0">
+            <wp:extent cx="2575783" cy="1089754"/>
+            <wp:effectExtent l="0" t="0" r="0" b="0"/>
+            <wp:docPr id="10419692" name="Imagen 1" descr="Imagen que contiene tabla, hecho de madera, sostener&#10;&#10;El contenido generado por IA puede ser incorrecto."/>
+            <wp:cNvGraphicFramePr>
+              <a:graphicFrameLocks xmlns:a="http://schemas.openxmlformats.org/drawingml/2006/main" noChangeAspect="1"/>
+            </wp:cNvGraphicFramePr>
+            <a:graphic xmlns:a="http://schemas.openxmlformats.org/drawingml/2006/main">
+              <a:graphicData uri="http://schemas.openxmlformats.org/drawingml/2006/picture">
+                <pic:pic xmlns:pic="http://schemas.openxmlformats.org/drawingml/2006/picture">
+                  <pic:nvPicPr>
+                    <pic:cNvPr id="10419692" name="Imagen 1" descr="Imagen que contiene tabla, hecho de madera, sostener&#10;&#10;El contenido generado por IA puede ser incorrecto."/>
+                    <pic:cNvPicPr/>
+                  </pic:nvPicPr>
+                  <pic:blipFill>
+                    <a:blip r:embed="rId18"/>
+                    <a:stretch>
+                      <a:fillRect/>
+                    </a:stretch>
+                  </pic:blipFill>
+                  <pic:spPr>
+                    <a:xfrm>
+                      <a:off x="0" y="0"/>
+                      <a:ext cx="2575783" cy="1089754"/>
+                    </a:xfrm>
+                    <a:prstGeom prst="rect">
+                      <a:avLst/>
+                    </a:prstGeom>
+                  </pic:spPr>
+                </pic:pic>
+              </a:graphicData>
+            </a:graphic>
+          </wp:inline>
+        </w:drawing>
+      </w:r>
+    </w:p>
+    <w:p>
+      <w:pPr>
+        <w:pStyle w:val="Descripcin"/>
+        <w:jc w:val="both"/>
+      </w:pPr>
+      <w:r>
+        <w:t xml:space="preserve">                     Figure </w:t>
+      </w:r>
+      <w:r>
+        <w:fldChar w:fldCharType="begin"/>
+      </w:r>
+      <w:r>
+        <w:instrText xml:space="preserve"> SEQ Figure \* ARABIC </w:instrText>
+      </w:r>
+      <w:r>
+        <w:fldChar w:fldCharType="separate"/>
+      </w:r>
+      <w:r>
+        <w:rPr>
+          <w:noProof/>
+        </w:rPr>
+        <w:t>5</w:t>
+      </w:r>
+      <w:r>
+        <w:fldChar w:fldCharType="end"/>
+      </w:r>
+      <w:r>
+        <w:t xml:space="preserve"> </w:t>
+      </w:r>
+      <w:r>
+        <w:t xml:space="preserve">                         </w:t>
+      </w:r>
+      <w:r>
+        <w:t xml:space="preserve">Figure </w:t>
+      </w:r>
+      <w:r>
+        <w:fldChar w:fldCharType="begin"/>
+      </w:r>
+      <w:r>
+        <w:instrText xml:space="preserve"> SEQ Figure \* ARABIC </w:instrText>
+      </w:r>
+      <w:r>
+        <w:fldChar w:fldCharType="separate"/>
+      </w:r>
+      <w:r>
+        <w:rPr>
+          <w:noProof/>
+        </w:rPr>
+        <w:t>6</w:t>
+      </w:r>
+      <w:r>
+        <w:fldChar w:fldCharType="end"/>
+      </w:r>
+    </w:p>
+    <w:p>
+      <w:pPr>
+        <w:pStyle w:val="Ttulo4"/>
+      </w:pPr>
+      <w:r>
+        <w:lastRenderedPageBreak/>
+        <w:t>Division operations</w:t>
+      </w:r>
+    </w:p>
+    <w:p>
+      <w:pPr>
+        <w:pStyle w:val="Textoindependiente"/>
+      </w:pPr>
+      <w:r>
+        <w:t xml:space="preserve">There are two kinds of divisions in Circom, the Divison and the Interger Division. The two of them have </w:t>
+      </w:r>
+      <w:r>
+        <w:t>very similar bounds, the minimum is going to be 0 for both of them, and the maximum is going to be the prime number for Division, and the max of the left expression for the Integer Division.</w:t>
+      </w:r>
+    </w:p>
+    <w:p>
+      <w:pPr>
+        <w:pStyle w:val="Textoindependiente"/>
+      </w:pPr>
+      <w:r>
+        <w:t>If Bounds(e1) = (min1, max1) and Bounds(e2)= (min2, max2) then</w:t>
+      </w:r>
+    </w:p>
+    <w:p>
+      <w:pPr>
+        <w:pStyle w:val="Textoindependiente"/>
+      </w:pPr>
+      <w:r>
+        <w:t xml:space="preserve">Bounds(e1 </w:t>
+      </w:r>
+      <w:r>
+        <w:t xml:space="preserve">/ </w:t>
+      </w:r>
+      <w:r>
+        <w:t>e2) = (</w:t>
+      </w:r>
+      <w:r>
+        <w:t>0</w:t>
+      </w:r>
+      <w:r>
+        <w:t>,</w:t>
+      </w:r>
+      <w:r>
+        <w:t xml:space="preserve"> prime</w:t>
+      </w:r>
+      <w:r>
+        <w:t>)</w:t>
+      </w:r>
+    </w:p>
+    <w:p>
+      <w:pPr>
+        <w:pStyle w:val="Textoindependiente"/>
+        <w:rPr>
+          <w:u w:val="single"/>
+        </w:rPr>
+      </w:pPr>
+      <w:r>
+        <w:t xml:space="preserve">Bounds(e1 </w:t>
+      </w:r>
+      <w:r>
+        <w:t>\</w:t>
+      </w:r>
+      <w:r>
+        <w:t xml:space="preserve"> </w:t>
+      </w:r>
+      <w:r>
+        <w:t>e2) = (</w:t>
+      </w:r>
+      <w:r>
+        <w:t>0</w:t>
+      </w:r>
+      <w:r>
+        <w:t>,</w:t>
+      </w:r>
+      <w:r>
+        <w:t xml:space="preserve"> </w:t>
+      </w:r>
+      <w:r>
+        <w:t>max1</w:t>
+      </w:r>
+      <w:r>
+        <w:t>)</w:t>
+      </w:r>
+    </w:p>
+    <w:p>
+      <w:pPr>
+        <w:pStyle w:val="Textoindependiente"/>
+        <w:rPr>
+          <w:u w:val="single"/>
+        </w:rPr>
+      </w:pPr>
+    </w:p>
+    <w:p>
+      <w:pPr>
+        <w:pStyle w:val="Ttulo4"/>
+      </w:pPr>
+      <w:r>
+        <w:t xml:space="preserve">Power </w:t>
+      </w:r>
+      <w:r>
+        <w:t xml:space="preserve">and modulus </w:t>
+      </w:r>
+      <w:r>
+        <w:t>operations</w:t>
+      </w:r>
+    </w:p>
+    <w:p>
+      <w:pPr>
+        <w:pStyle w:val="Textoindependiente"/>
+      </w:pPr>
+      <w:r>
+        <w:t>The</w:t>
+      </w:r>
+      <w:r>
+        <w:t xml:space="preserve">se </w:t>
+      </w:r>
+      <w:r>
+        <w:t>operation</w:t>
+      </w:r>
+      <w:r>
+        <w:t>s</w:t>
+      </w:r>
+      <w:r>
+        <w:t xml:space="preserve"> </w:t>
+      </w:r>
+      <w:r>
+        <w:t>have very easy bounds. For the power, we are going to keep the prime as maximum, and  0 for the minimum. And for the modulus, the minimum would be 0, and the maximum will be the expression on the right.</w:t>
+      </w:r>
+    </w:p>
+    <w:p>
+      <w:pPr>
+        <w:pStyle w:val="Textoindependiente"/>
+      </w:pPr>
+      <w:r>
+        <w:t>If Bounds(e1) = (min1, max1) and Bounds(e2)= (min2, max2) then</w:t>
+      </w:r>
+    </w:p>
+    <w:p>
+      <w:pPr>
+        <w:pStyle w:val="Textoindependiente"/>
+        <w:rPr>
+          <w:lang w:val="es-ES"/>
+        </w:rPr>
+      </w:pPr>
+      <w:r>
+        <w:rPr>
+          <w:lang w:val="es-ES"/>
+        </w:rPr>
+        <w:t>Bounds(e1</w:t>
+      </w:r>
+      <w:r>
+        <w:rPr>
+          <w:lang w:val="es-ES"/>
+        </w:rPr>
+        <w:t>%</w:t>
+      </w:r>
+      <w:r>
+        <w:rPr>
+          <w:lang w:val="es-ES"/>
+        </w:rPr>
+        <w:t xml:space="preserve">e2) = (0, </w:t>
+      </w:r>
+      <w:r>
+        <w:rPr>
+          <w:lang w:val="es-ES"/>
+        </w:rPr>
+        <w:t>max2</w:t>
+      </w:r>
+      <w:r>
+        <w:rPr>
+          <w:lang w:val="es-ES"/>
+        </w:rPr>
+        <w:t>)</w:t>
+      </w:r>
+    </w:p>
+    <w:p>
+      <w:pPr>
+        <w:pStyle w:val="Textoindependiente"/>
+        <w:rPr>
+          <w:u w:val="single"/>
+        </w:rPr>
+      </w:pPr>
+      <w:r>
+        <w:rPr>
+          <w:lang w:val="es-ES"/>
+        </w:rPr>
+        <w:t xml:space="preserve">Bounds(e1 </w:t>
+      </w:r>
+      <w:r>
+        <w:rPr>
+          <w:lang w:val="es-ES"/>
+        </w:rPr>
+        <w:t>**</w:t>
+      </w:r>
+      <w:r>
+        <w:rPr>
+          <w:lang w:val="es-ES"/>
+        </w:rPr>
+        <w:t>e2) = (</w:t>
+      </w:r>
+      <w:r>
+        <w:rPr>
+          <w:lang w:val="es-ES"/>
+        </w:rPr>
+        <w:t>0</w:t>
+      </w:r>
+      <w:r>
+        <w:t>,</w:t>
+      </w:r>
+      <w:r>
+        <w:t xml:space="preserve"> </w:t>
+      </w:r>
+      <w:r>
+        <w:t>prime</w:t>
+      </w:r>
+      <w:r>
+        <w:t>)</w:t>
+      </w:r>
+    </w:p>
+    <w:p>
+      <w:pPr>
+        <w:pStyle w:val="Ttulo4"/>
+      </w:pPr>
+      <w:r>
+        <w:t>Shift operations</w:t>
+      </w:r>
+    </w:p>
+    <w:p>
+      <w:pPr>
+        <w:pStyle w:val="Textoindependiente"/>
+      </w:pPr>
+      <w:r>
+        <w:t>For the shift left, the maximum and minimum will be shifted so we shall multiply them by 2 to the power of the minimum and maximum. As for the right shift, we will just keep the maximum of the left expression, and for the minimum we will have a 0.</w:t>
+      </w:r>
+    </w:p>
+    <w:p>
+      <w:pPr>
+        <w:pStyle w:val="Textoindependiente"/>
+      </w:pPr>
+      <w:r>
+        <w:t>If Bounds(e1) = (min1, max1) and Bounds(e2)= (min2, max2) then</w:t>
+      </w:r>
+    </w:p>
+    <w:p>
+      <w:pPr>
+        <w:pStyle w:val="Textoindependiente"/>
+      </w:pPr>
+      <w:r>
+        <w:t>Bounds(e1</w:t>
+      </w:r>
+      <w:r>
+        <w:t xml:space="preserve"> </w:t>
+      </w:r>
+      <w:r>
+        <w:t xml:space="preserve">&lt;&lt; </w:t>
+      </w:r>
+      <w:r>
+        <w:t>e2) = (</w:t>
+      </w:r>
+      <w:r>
+        <w:t>min1*2^min2</w:t>
+      </w:r>
+      <w:r>
+        <w:t xml:space="preserve">, </w:t>
+      </w:r>
+      <w:r>
+        <w:t>max1*2^max2</w:t>
+      </w:r>
+      <w:r>
+        <w:t>)</w:t>
+      </w:r>
+    </w:p>
+    <w:p>
+      <w:pPr>
+        <w:pStyle w:val="Textoindependiente"/>
+        <w:rPr>
+          <w:u w:val="single"/>
+        </w:rPr>
+      </w:pPr>
+      <w:r>
+        <w:t xml:space="preserve">Bounds(e1 </w:t>
+      </w:r>
+      <w:r>
+        <w:t xml:space="preserve">&gt;&gt; </w:t>
+      </w:r>
+      <w:r>
+        <w:t>e2) = (0</w:t>
+      </w:r>
+      <w:r>
+        <w:t>,</w:t>
+      </w:r>
+      <w:r>
+        <w:t xml:space="preserve"> </w:t>
+      </w:r>
+      <w:r>
+        <w:t>max1</w:t>
+      </w:r>
+      <w:r>
+        <w:t>)</w:t>
+      </w:r>
+    </w:p>
+    <w:p>
+      <w:pPr>
+        <w:pStyle w:val="Textoindependiente"/>
+      </w:pPr>
+    </w:p>
+    <w:p>
+      <w:pPr>
+        <w:pStyle w:val="Textoindependiente"/>
+      </w:pPr>
+    </w:p>
+    <w:p>
+      <w:pPr>
+        <w:pStyle w:val="Textoindependiente"/>
+      </w:pPr>
+    </w:p>
+    <w:p>
+      <w:pPr>
+        <w:pStyle w:val="Ttulo4"/>
+      </w:pPr>
+      <w:r>
+        <w:lastRenderedPageBreak/>
         <w:t>Boolean operations</w:t>
       </w:r>
     </w:p>
@@ -3644,17 +4697,47 @@
       <w:pPr>
         <w:pStyle w:val="Textoindependiente"/>
       </w:pPr>
+      <w:r>
+        <w:t>If Bounds(e1) = (min1, max1) and Bounds(e2)= (min2, max2) then</w:t>
+      </w:r>
+    </w:p>
+    <w:p>
+      <w:pPr>
+        <w:pStyle w:val="Textoindependiente"/>
+      </w:pPr>
+      <w:r>
+        <w:t xml:space="preserve">Bounds(e1 </w:t>
+      </w:r>
+      <w:r>
+        <w:t xml:space="preserve">“Boolean operation” </w:t>
+      </w:r>
+      <w:r>
+        <w:t>e2) = (</w:t>
+      </w:r>
+      <w:r>
+        <w:t>0</w:t>
+      </w:r>
+      <w:r>
+        <w:t xml:space="preserve">, </w:t>
+      </w:r>
+      <w:r>
+        <w:t>1</w:t>
+      </w:r>
+      <w:r>
+        <w:t>)</w:t>
+      </w:r>
+    </w:p>
+    <w:p>
+      <w:pPr>
+        <w:pStyle w:val="Textoindependiente"/>
+      </w:pPr>
     </w:p>
     <w:p>
       <w:pPr>
         <w:pStyle w:val="Ttulo4"/>
       </w:pPr>
       <w:r>
-        <w:lastRenderedPageBreak/>
-        <w:t xml:space="preserve">Arithmetic integer </w:t>
-      </w:r>
-      <w:r>
-        <w:t>operations</w:t>
+        <w:t>Bit operations</w:t>
       </w:r>
     </w:p>
     <w:p>
@@ -3662,7 +4745,46 @@
         <w:pStyle w:val="Textoindependiente"/>
       </w:pPr>
       <w:r>
-        <w:t>These 3 operations (Add, Sub, and Mul) are very similar among them in the way their bounds are calculated.</w:t>
+        <w:t xml:space="preserve">For the </w:t>
+      </w:r>
+      <w:r>
+        <w:t>“</w:t>
+      </w:r>
+      <w:r>
+        <w:t>O</w:t>
+      </w:r>
+      <w:r>
+        <w:t>r</w:t>
+      </w:r>
+      <w:r>
+        <w:t>”</w:t>
+      </w:r>
+      <w:r>
+        <w:t xml:space="preserve"> operation, we</w:t>
+      </w:r>
+      <w:r>
+        <w:t xml:space="preserve"> </w:t>
+      </w:r>
+      <w:r>
+        <w:t xml:space="preserve">just </w:t>
+      </w:r>
+      <w:r>
+        <w:t xml:space="preserve">must add the maximus and find the biggest minimum of both expressions. In the other hand, the </w:t>
+      </w:r>
+      <w:r>
+        <w:t>“</w:t>
+      </w:r>
+      <w:r>
+        <w:t>And</w:t>
+      </w:r>
+      <w:r>
+        <w:t>”</w:t>
+      </w:r>
+      <w:r>
+        <w:t xml:space="preserve"> operation</w:t>
+      </w:r>
+      <w:r>
+        <w:t xml:space="preserve"> keeps a 0 in its minimum, and the minimum max of both expressions as the maximus. And finally, the “Xor” operation has the minimum of the “And”, and the maximum of the “Or”.</w:t>
       </w:r>
     </w:p>
     <w:p>
@@ -3670,30 +4792,36 @@
         <w:pStyle w:val="Textoindependiente"/>
       </w:pPr>
       <w:r>
-        <w:t>For the Add operation you just have to add the bounds, min with min and max with max, and you will have the bounds of the whole expression.</w:t>
+        <w:t>If Bounds(e1) = (min1, max1) and Bounds(e2)= (min2, max2) then</w:t>
       </w:r>
     </w:p>
     <w:p>
       <w:pPr>
         <w:pStyle w:val="Textoindependiente"/>
-      </w:pPr>
-      <w:r>
-        <w:t xml:space="preserve">For the Sub operation is a bit different but the same concept, you want the minimum to be the smallest possible result, so you </w:t>
-      </w:r>
-      <w:r>
-        <w:t>subtract</w:t>
-      </w:r>
-      <w:r>
-        <w:t xml:space="preserve"> to the le</w:t>
-      </w:r>
-      <w:r>
-        <w:t>f</w:t>
-      </w:r>
-      <w:r>
-        <w:t xml:space="preserve">t min the right max, </w:t>
-      </w:r>
-      <w:r>
-        <w:t>and with the maximum the other way around, subtract to the left max the right min.</w:t>
+        <w:tabs>
+          <w:tab w:val="left" w:pos="7056"/>
+        </w:tabs>
+      </w:pPr>
+      <w:r>
+        <w:t xml:space="preserve">Bounds(e1 </w:t>
+      </w:r>
+      <w:r>
+        <w:t xml:space="preserve">| </w:t>
+      </w:r>
+      <w:r>
+        <w:t xml:space="preserve">e2) = </w:t>
+      </w:r>
+      <w:r>
+        <w:t>{max(min1,min2)</w:t>
+      </w:r>
+      <w:r>
+        <w:t xml:space="preserve">, </w:t>
+      </w:r>
+      <w:r>
+        <w:t xml:space="preserve"> max1+max2}</w:t>
+      </w:r>
+      <w:r>
+        <w:tab/>
       </w:r>
     </w:p>
     <w:p>
@@ -3701,15 +4829,46 @@
         <w:pStyle w:val="Textoindependiente"/>
       </w:pPr>
       <w:r>
-        <w:t>And finally, the Mul operations works as the Add operation with th twist that now you multiply instead of summing.</w:t>
-      </w:r>
-    </w:p>
-    <w:p>
-      <w:pPr>
-        <w:pStyle w:val="Ttulo4"/>
-      </w:pPr>
-      <w:r>
-        <w:t>Division operations</w:t>
+        <w:t xml:space="preserve">Bounds(e1 </w:t>
+      </w:r>
+      <w:r>
+        <w:t>&amp;</w:t>
+      </w:r>
+      <w:r>
+        <w:t xml:space="preserve"> </w:t>
+      </w:r>
+      <w:r>
+        <w:t xml:space="preserve">e2) = </w:t>
+      </w:r>
+      <w:r>
+        <w:t>{</w:t>
+      </w:r>
+      <w:r>
+        <w:t>0</w:t>
+      </w:r>
+      <w:r>
+        <w:t xml:space="preserve">, </w:t>
+      </w:r>
+      <w:r>
+        <w:t xml:space="preserve"> </w:t>
+      </w:r>
+      <w:r>
+        <w:t>min(</w:t>
+      </w:r>
+      <w:r>
+        <w:t>max1</w:t>
+      </w:r>
+      <w:r>
+        <w:t xml:space="preserve">, </w:t>
+      </w:r>
+      <w:r>
+        <w:t>max2</w:t>
+      </w:r>
+      <w:r>
+        <w:t>)</w:t>
+      </w:r>
+      <w:r>
+        <w:t>}</w:t>
       </w:r>
     </w:p>
     <w:p>
@@ -3717,118 +4876,106 @@
         <w:pStyle w:val="Textoindependiente"/>
       </w:pPr>
       <w:r>
-        <w:t xml:space="preserve">There are two kinds of divisions in Circom, the Divison and the Interger Division. The two of them have </w:t>
-      </w:r>
-      <w:r>
-        <w:t>very similar bounds, the minimum is going to be 0 for both of them, and the maximum is going to be the prime number for Division, and the max of the left expression for the Integer Division.</w:t>
-      </w:r>
-    </w:p>
-    <w:p>
-      <w:pPr>
-        <w:pStyle w:val="Ttulo4"/>
-      </w:pPr>
-      <w:r>
-        <w:t xml:space="preserve">Power </w:t>
-      </w:r>
-      <w:r>
-        <w:t xml:space="preserve">and modulus </w:t>
-      </w:r>
-      <w:r>
-        <w:t>operations</w:t>
+        <w:t xml:space="preserve">Bounds(e1 </w:t>
+      </w:r>
+      <w:r>
+        <w:t>^</w:t>
+      </w:r>
+      <w:r>
+        <w:t xml:space="preserve"> </w:t>
+      </w:r>
+      <w:r>
+        <w:t xml:space="preserve">e2) = </w:t>
+      </w:r>
+      <w:r>
+        <w:t>{0</w:t>
+      </w:r>
+      <w:r>
+        <w:t xml:space="preserve">, </w:t>
+      </w:r>
+      <w:r>
+        <w:t xml:space="preserve"> max1+max2</w:t>
+      </w:r>
+      <w:r>
+        <w:t>}</w:t>
       </w:r>
     </w:p>
     <w:p>
       <w:pPr>
         <w:pStyle w:val="Textoindependiente"/>
       </w:pPr>
-      <w:r>
-        <w:t>The</w:t>
-      </w:r>
-      <w:r>
-        <w:t xml:space="preserve">se </w:t>
-      </w:r>
-      <w:r>
-        <w:t>operation</w:t>
-      </w:r>
-      <w:r>
-        <w:t>s</w:t>
-      </w:r>
-      <w:r>
-        <w:t xml:space="preserve"> </w:t>
-      </w:r>
-      <w:r>
-        <w:t>have very easy bounds. For the power, we are going to keep the prime as maximum, and 1 or 0 for the minimum. And for the modulus, the minimum would be 0, and the maximum will be the expression on the right.</w:t>
-      </w:r>
-    </w:p>
-    <w:p>
-      <w:pPr>
-        <w:pStyle w:val="Ttulo4"/>
-      </w:pPr>
-      <w:r>
-        <w:t>Shift operations</w:t>
-      </w:r>
     </w:p>
     <w:p>
       <w:pPr>
         <w:pStyle w:val="Textoindependiente"/>
-      </w:pPr>
-      <w:r>
-        <w:t>For the shift left, the maximum and minimum will be shifted so we shall multiply them by 2 to the power of the minimum and maximum. As for the right shift, we will just keep the maximum of the left expression, and for the minimum we will have a 0.</w:t>
-      </w:r>
-    </w:p>
-    <w:p>
-      <w:pPr>
-        <w:pStyle w:val="Ttulo4"/>
-      </w:pPr>
-      <w:r>
-        <w:t>Bit operations</w:t>
-      </w:r>
-    </w:p>
-    <w:p>
-      <w:pPr>
-        <w:pStyle w:val="Textoindependiente"/>
-      </w:pPr>
-      <w:r>
-        <w:t xml:space="preserve">For the </w:t>
-      </w:r>
-      <w:r>
-        <w:t>“</w:t>
-      </w:r>
-      <w:r>
-        <w:t>O</w:t>
-      </w:r>
-      <w:r>
-        <w:t>r</w:t>
-      </w:r>
-      <w:r>
-        <w:t>”</w:t>
-      </w:r>
-      <w:r>
-        <w:t xml:space="preserve"> operation, we</w:t>
-      </w:r>
-      <w:r>
-        <w:t xml:space="preserve"> </w:t>
-      </w:r>
-      <w:r>
-        <w:t xml:space="preserve">just </w:t>
-      </w:r>
-      <w:r>
-        <w:t xml:space="preserve">must add the maximus and find the biggest minimum of both expressions. In the other hand, the </w:t>
-      </w:r>
-      <w:r>
-        <w:t>“</w:t>
-      </w:r>
-      <w:r>
-        <w:t>And</w:t>
-      </w:r>
-      <w:r>
-        <w:t>”</w:t>
-      </w:r>
-      <w:r>
-        <w:t xml:space="preserve"> operation</w:t>
-      </w:r>
-      <w:r>
-        <w:t xml:space="preserve"> keeps a 0 in its minimum, and the minimum max of both expressions as the maximus. And finally, the “Xor” operation has the minimum of the “And”, and the maximum of the “Or”.</w:t>
+        <w:keepNext/>
+        <w:tabs>
+          <w:tab w:val="left" w:pos="7056"/>
+        </w:tabs>
+      </w:pPr>
+      <w:r>
+        <w:drawing>
+          <wp:inline distT="0" distB="0" distL="0" distR="0" wp14:anchorId="4C90499B" wp14:editId="6FC970A4">
+            <wp:extent cx="1425063" cy="2362405"/>
+            <wp:effectExtent l="0" t="0" r="3810" b="0"/>
+            <wp:docPr id="631680208" name="Imagen 1" descr="Texto&#10;&#10;El contenido generado por IA puede ser incorrecto."/>
+            <wp:cNvGraphicFramePr>
+              <a:graphicFrameLocks xmlns:a="http://schemas.openxmlformats.org/drawingml/2006/main" noChangeAspect="1"/>
+            </wp:cNvGraphicFramePr>
+            <a:graphic xmlns:a="http://schemas.openxmlformats.org/drawingml/2006/main">
+              <a:graphicData uri="http://schemas.openxmlformats.org/drawingml/2006/picture">
+                <pic:pic xmlns:pic="http://schemas.openxmlformats.org/drawingml/2006/picture">
+                  <pic:nvPicPr>
+                    <pic:cNvPr id="631680208" name="Imagen 1" descr="Texto&#10;&#10;El contenido generado por IA puede ser incorrecto."/>
+                    <pic:cNvPicPr/>
+                  </pic:nvPicPr>
+                  <pic:blipFill>
+                    <a:blip r:embed="rId19"/>
+                    <a:stretch>
+                      <a:fillRect/>
+                    </a:stretch>
+                  </pic:blipFill>
+                  <pic:spPr>
+                    <a:xfrm>
+                      <a:off x="0" y="0"/>
+                      <a:ext cx="1425063" cy="2362405"/>
+                    </a:xfrm>
+                    <a:prstGeom prst="rect">
+                      <a:avLst/>
+                    </a:prstGeom>
+                  </pic:spPr>
+                </pic:pic>
+              </a:graphicData>
+            </a:graphic>
+          </wp:inline>
+        </w:drawing>
+      </w:r>
+    </w:p>
+    <w:p>
+      <w:pPr>
+        <w:pStyle w:val="Descripcin"/>
+        <w:jc w:val="both"/>
+      </w:pPr>
+      <w:r>
+        <w:t xml:space="preserve">Figure </w:t>
+      </w:r>
+      <w:r>
+        <w:fldChar w:fldCharType="begin"/>
+      </w:r>
+      <w:r>
+        <w:instrText xml:space="preserve"> SEQ Figure \* ARABIC </w:instrText>
+      </w:r>
+      <w:r>
+        <w:fldChar w:fldCharType="separate"/>
+      </w:r>
+      <w:r>
+        <w:rPr>
+          <w:noProof/>
+        </w:rPr>
+        <w:t>7</w:t>
+      </w:r>
+      <w:r>
+        <w:fldChar w:fldCharType="end"/>
       </w:r>
     </w:p>
     <w:p>
@@ -3866,6 +5013,31 @@
     </w:p>
     <w:p>
       <w:pPr>
+        <w:pStyle w:val="Textoindependiente"/>
+      </w:pPr>
+      <w:r>
+        <w:t>If Bounds(e1) = (min1, max1) then</w:t>
+      </w:r>
+    </w:p>
+    <w:p>
+      <w:pPr>
+        <w:pStyle w:val="Textoindependiente"/>
+      </w:pPr>
+      <w:r>
+        <w:t>Bounds(</w:t>
+      </w:r>
+      <w:r>
+        <w:t>-</w:t>
+      </w:r>
+      <w:r>
+        <w:t xml:space="preserve">e1) = </w:t>
+      </w:r>
+      <w:r>
+        <w:t>(-max1 + prime-1, -min1 + prime-1)</w:t>
+      </w:r>
+    </w:p>
+    <w:p>
+      <w:pPr>
         <w:pStyle w:val="Ttulo4"/>
       </w:pPr>
       <w:r>
@@ -3882,6 +5054,40 @@
     </w:p>
     <w:p>
       <w:pPr>
+        <w:pStyle w:val="Textoindependiente"/>
+      </w:pPr>
+      <w:r>
+        <w:t>If Bounds(e1) = (min1, max1) then</w:t>
+      </w:r>
+    </w:p>
+    <w:p>
+      <w:pPr>
+        <w:pStyle w:val="Textoindependiente"/>
+      </w:pPr>
+      <w:r>
+        <w:t>Bounds(</w:t>
+      </w:r>
+      <w:r>
+        <w:t>!</w:t>
+      </w:r>
+      <w:r>
+        <w:t xml:space="preserve">e1) = </w:t>
+      </w:r>
+      <w:r>
+        <w:t>(0</w:t>
+      </w:r>
+      <w:r>
+        <w:t xml:space="preserve">, </w:t>
+      </w:r>
+      <w:r>
+        <w:t>1</w:t>
+      </w:r>
+      <w:r>
+        <w:t>)</w:t>
+      </w:r>
+    </w:p>
+    <w:p>
+      <w:pPr>
         <w:pStyle w:val="Ttulo4"/>
       </w:pPr>
       <w:r>
@@ -3906,22 +5112,147 @@
       <w:pPr>
         <w:pStyle w:val="Textoindependiente"/>
       </w:pPr>
+      <w:r>
+        <w:t>If Bounds(e1) = (min1, max1) then</w:t>
+      </w:r>
     </w:p>
     <w:p>
       <w:pPr>
         <w:pStyle w:val="Textoindependiente"/>
       </w:pPr>
+      <w:r>
+        <w:t>Bounds(</w:t>
+      </w:r>
+      <w:r>
+        <w:t>~</w:t>
+      </w:r>
+      <w:r>
+        <w:t xml:space="preserve">e1) = </w:t>
+      </w:r>
+      <w:r>
+        <w:t>(0,</w:t>
+      </w:r>
+      <w:r>
+        <w:t>max1*2</w:t>
+      </w:r>
+      <w:r>
+        <w:t>)</w:t>
+      </w:r>
+    </w:p>
+    <w:p>
+      <w:pPr>
+        <w:pStyle w:val="Textoindependiente"/>
+      </w:pPr>
+    </w:p>
+    <w:p>
+      <w:pPr>
+        <w:pStyle w:val="Textoindependiente"/>
+      </w:pPr>
+    </w:p>
+    <w:p>
+      <w:pPr>
+        <w:pStyle w:val="Textoindependiente"/>
+      </w:pPr>
+    </w:p>
+    <w:p>
+      <w:pPr>
+        <w:pStyle w:val="Textoindependiente"/>
+      </w:pPr>
     </w:p>
     <w:p>
       <w:pPr>
         <w:pStyle w:val="Ttulo3"/>
       </w:pPr>
       <w:r>
+        <w:lastRenderedPageBreak/>
         <w:t>Switch operations</w:t>
       </w:r>
     </w:p>
     <w:p>
       <w:pPr>
+        <w:pStyle w:val="Textoindependiente"/>
+      </w:pPr>
+      <w:r>
+        <w:t xml:space="preserve">The switch operation works as an if else operation, so we will have two expressions and the context. To calculate the bounds of the switch operation, we will first calculate the bounds of both expressions, and then, we will keep the minimum value of both </w:t>
+      </w:r>
+      <w:r>
+        <w:t>expressions</w:t>
+      </w:r>
+      <w:r>
+        <w:t xml:space="preserve">’ </w:t>
+      </w:r>
+      <w:r>
+        <w:t>minimums</w:t>
+      </w:r>
+      <w:r>
+        <w:t>, and the maximum value between both expressions</w:t>
+      </w:r>
+      <w:r>
+        <w:t>’</w:t>
+      </w:r>
+      <w:r>
+        <w:t xml:space="preserve"> </w:t>
+      </w:r>
+      <w:proofErr w:type="spellStart"/>
+      <w:r>
+        <w:t>maximus.ç</w:t>
+      </w:r>
+      <w:proofErr w:type="spellEnd"/>
+    </w:p>
+    <w:p>
+      <w:pPr>
+        <w:pStyle w:val="Textoindependiente"/>
+      </w:pPr>
+      <w:r>
+        <w:t>If Bounds(e1) = (min1, max1) and Bounds(e2)= (min2, max2) then</w:t>
+      </w:r>
+    </w:p>
+    <w:p>
+      <w:pPr>
+        <w:pStyle w:val="Textoindependiente"/>
+      </w:pPr>
+      <w:r>
+        <w:t>Bounds(</w:t>
+      </w:r>
+      <w:r>
+        <w:t>Switch :</w:t>
+      </w:r>
+      <w:r>
+        <w:t>e1</w:t>
+      </w:r>
+      <w:r>
+        <w:t>,</w:t>
+      </w:r>
+      <w:r>
+        <w:t xml:space="preserve"> </w:t>
+      </w:r>
+      <w:r>
+        <w:t xml:space="preserve">e2) = </w:t>
+      </w:r>
+      <w:r>
+        <w:t>{</w:t>
+      </w:r>
+      <w:r>
+        <w:t>min</w:t>
+      </w:r>
+      <w:r>
+        <w:t>(min1,min2)</w:t>
+      </w:r>
+      <w:r>
+        <w:t xml:space="preserve">, </w:t>
+      </w:r>
+      <w:r>
+        <w:t xml:space="preserve"> </w:t>
+      </w:r>
+      <w:r>
+        <w:t>max(max1.max2)</w:t>
+      </w:r>
+      <w:r>
+        <w:t>}</w:t>
+      </w:r>
+    </w:p>
+    <w:p>
+      <w:pPr>
         <w:pStyle w:val="Ttulo3"/>
       </w:pPr>
       <w:r>
@@ -3930,6 +5261,30 @@
     </w:p>
     <w:p>
       <w:pPr>
+        <w:pStyle w:val="Textoindependiente"/>
+      </w:pPr>
+      <w:r>
+        <w:t xml:space="preserve">For the variables, we will receive an String and the context, and to obtain the bounds of the variables, we will just have to </w:t>
+      </w:r>
+      <w:proofErr w:type="spellStart"/>
+      <w:r>
+        <w:t>rearch</w:t>
+      </w:r>
+      <w:proofErr w:type="spellEnd"/>
+      <w:r>
+        <w:t xml:space="preserve"> in the context if the </w:t>
+      </w:r>
+      <w:proofErr w:type="spellStart"/>
+      <w:r>
+        <w:t>varible</w:t>
+      </w:r>
+      <w:proofErr w:type="spellEnd"/>
+      <w:r>
+        <w:t xml:space="preserve"> already exists, and clone its bounds, or if it doesn’t exist on the contest, we just have to create its bounds which will be [0, prime).</w:t>
+      </w:r>
+    </w:p>
+    <w:p>
+      <w:pPr>
         <w:pStyle w:val="Ttulo3"/>
       </w:pPr>
       <w:r>
@@ -3938,6 +5293,14 @@
     </w:p>
     <w:p>
       <w:pPr>
+        <w:pStyle w:val="Textoindependiente"/>
+      </w:pPr>
+      <w:r>
+        <w:t>For the numbers, it will be much easier than any other operation, because its maximum and minimum bounds will have as value the given number.</w:t>
+      </w:r>
+    </w:p>
+    <w:p>
+      <w:pPr>
         <w:pStyle w:val="Ttulo3"/>
       </w:pPr>
       <w:r>
@@ -3946,9 +5309,158 @@
     </w:p>
     <w:p>
       <w:pPr>
+        <w:pStyle w:val="Textoindependiente"/>
+      </w:pPr>
+      <w:r>
+        <w:t xml:space="preserve">In the case of the array in line, we want to find the minimum bound between all the elements of the array, and also the maximum </w:t>
+      </w:r>
+      <w:r>
+        <w:t>bound of the same elements, so we will have to traverse the array trying to find those values.</w:t>
+      </w:r>
+    </w:p>
+    <w:p>
+      <w:pPr>
+        <w:pStyle w:val="Textoindependiente"/>
+        <w:keepNext/>
+      </w:pPr>
+      <w:r>
+        <w:drawing>
+          <wp:inline distT="0" distB="0" distL="0" distR="0" wp14:anchorId="519D970C" wp14:editId="322A543C">
+            <wp:extent cx="1447925" cy="929721"/>
+            <wp:effectExtent l="0" t="0" r="0" b="3810"/>
+            <wp:docPr id="990891243" name="Imagen 1" descr="Texto&#10;&#10;El contenido generado por IA puede ser incorrecto."/>
+            <wp:cNvGraphicFramePr>
+              <a:graphicFrameLocks xmlns:a="http://schemas.openxmlformats.org/drawingml/2006/main" noChangeAspect="1"/>
+            </wp:cNvGraphicFramePr>
+            <a:graphic xmlns:a="http://schemas.openxmlformats.org/drawingml/2006/main">
+              <a:graphicData uri="http://schemas.openxmlformats.org/drawingml/2006/picture">
+                <pic:pic xmlns:pic="http://schemas.openxmlformats.org/drawingml/2006/picture">
+                  <pic:nvPicPr>
+                    <pic:cNvPr id="990891243" name="Imagen 1" descr="Texto&#10;&#10;El contenido generado por IA puede ser incorrecto."/>
+                    <pic:cNvPicPr/>
+                  </pic:nvPicPr>
+                  <pic:blipFill>
+                    <a:blip r:embed="rId20"/>
+                    <a:stretch>
+                      <a:fillRect/>
+                    </a:stretch>
+                  </pic:blipFill>
+                  <pic:spPr>
+                    <a:xfrm>
+                      <a:off x="0" y="0"/>
+                      <a:ext cx="1447925" cy="929721"/>
+                    </a:xfrm>
+                    <a:prstGeom prst="rect">
+                      <a:avLst/>
+                    </a:prstGeom>
+                  </pic:spPr>
+                </pic:pic>
+              </a:graphicData>
+            </a:graphic>
+          </wp:inline>
+        </w:drawing>
+      </w:r>
+      <w:r>
+        <w:drawing>
+          <wp:inline distT="0" distB="0" distL="0" distR="0" wp14:anchorId="735FCBE5" wp14:editId="3D1E0FF2">
+            <wp:extent cx="2400508" cy="129551"/>
+            <wp:effectExtent l="0" t="0" r="0" b="3810"/>
+            <wp:docPr id="665536635" name="Imagen 1"/>
+            <wp:cNvGraphicFramePr>
+              <a:graphicFrameLocks xmlns:a="http://schemas.openxmlformats.org/drawingml/2006/main" noChangeAspect="1"/>
+            </wp:cNvGraphicFramePr>
+            <a:graphic xmlns:a="http://schemas.openxmlformats.org/drawingml/2006/main">
+              <a:graphicData uri="http://schemas.openxmlformats.org/drawingml/2006/picture">
+                <pic:pic xmlns:pic="http://schemas.openxmlformats.org/drawingml/2006/picture">
+                  <pic:nvPicPr>
+                    <pic:cNvPr id="665536635" name=""/>
+                    <pic:cNvPicPr/>
+                  </pic:nvPicPr>
+                  <pic:blipFill>
+                    <a:blip r:embed="rId21"/>
+                    <a:stretch>
+                      <a:fillRect/>
+                    </a:stretch>
+                  </pic:blipFill>
+                  <pic:spPr>
+                    <a:xfrm>
+                      <a:off x="0" y="0"/>
+                      <a:ext cx="2400508" cy="129551"/>
+                    </a:xfrm>
+                    <a:prstGeom prst="rect">
+                      <a:avLst/>
+                    </a:prstGeom>
+                  </pic:spPr>
+                </pic:pic>
+              </a:graphicData>
+            </a:graphic>
+          </wp:inline>
+        </w:drawing>
+      </w:r>
+    </w:p>
+    <w:p>
+      <w:pPr>
+        <w:pStyle w:val="Descripcin"/>
+        <w:ind w:firstLine="720"/>
+        <w:jc w:val="both"/>
+      </w:pPr>
+      <w:r>
+        <w:t xml:space="preserve">Figure </w:t>
+      </w:r>
+      <w:r>
+        <w:fldChar w:fldCharType="begin"/>
+      </w:r>
+      <w:r>
+        <w:instrText xml:space="preserve"> SEQ Figure \* ARABIC </w:instrText>
+      </w:r>
+      <w:r>
+        <w:fldChar w:fldCharType="separate"/>
+      </w:r>
+      <w:r>
+        <w:rPr>
+          <w:noProof/>
+        </w:rPr>
+        <w:t>8</w:t>
+      </w:r>
+      <w:r>
+        <w:fldChar w:fldCharType="end"/>
+      </w:r>
+      <w:r>
+        <w:t xml:space="preserve"> </w:t>
+      </w:r>
+      <w:r>
+        <w:tab/>
+      </w:r>
+      <w:r>
+        <w:tab/>
+        <w:t xml:space="preserve">Figure </w:t>
+      </w:r>
+      <w:r>
+        <w:fldChar w:fldCharType="begin"/>
+      </w:r>
+      <w:r>
+        <w:instrText xml:space="preserve"> SEQ Figure \* ARABIC </w:instrText>
+      </w:r>
+      <w:r>
+        <w:fldChar w:fldCharType="separate"/>
+      </w:r>
+      <w:r>
+        <w:rPr>
+          <w:noProof/>
+        </w:rPr>
+        <w:t>9</w:t>
+      </w:r>
+      <w:r>
+        <w:fldChar w:fldCharType="end"/>
+      </w:r>
+    </w:p>
+    <w:p/>
+    <w:p>
+      <w:pPr>
         <w:pStyle w:val="Ttulo3"/>
       </w:pPr>
       <w:r>
+        <w:lastRenderedPageBreak/>
         <w:t>Uniform array</w:t>
       </w:r>
     </w:p>
@@ -3956,6 +5468,9 @@
       <w:pPr>
         <w:pStyle w:val="Textoindependiente"/>
       </w:pPr>
+      <w:r>
+        <w:t>In the calculation of the bounds of the uniform array, we will receive a Box&lt;&gt; and the context. We will have to calculate the bounds of that Box&lt;&gt;, and then we will keep those same values as result of the bounds of the uniform array.</w:t>
+      </w:r>
     </w:p>
     <w:p>
       <w:pPr>
@@ -3967,8 +5482,15 @@
         <w:pStyle w:val="Ttulo2"/>
       </w:pPr>
       <w:r>
-        <w:lastRenderedPageBreak/>
         <w:t>Treat statements</w:t>
+      </w:r>
+    </w:p>
+    <w:p>
+      <w:pPr>
+        <w:pStyle w:val="Textoindependiente"/>
+      </w:pPr>
+      <w:r>
+        <w:t xml:space="preserve">Statements englobe many signals and variables, and you have to be very careful when treating an statement because </w:t>
       </w:r>
     </w:p>
     <w:p>
@@ -4259,6 +5781,7 @@
         <w:rPr>
           <w:lang w:val="es-ES"/>
         </w:rPr>
+        <w:lastRenderedPageBreak/>
         <w:t xml:space="preserve">En caso de listas con varios niveles se recomienda hacer uso de las opciones de creación de listas multinivel que proporciona Word y que ayudan a gestionar el aspecto y los estilos de numeración de cada uno de los niveles. </w:t>
       </w:r>
     </w:p>
@@ -4336,14 +5859,7 @@
         <w:rPr>
           <w:lang w:val="es-ES"/>
         </w:rPr>
-        <w:t xml:space="preserve"> Todas las figuras que se añadan han de estar referenciadas desde el texto (como acabamos de hacer) </w:t>
-      </w:r>
-      <w:r>
-        <w:rPr>
-          <w:lang w:val="es-ES"/>
-        </w:rPr>
-        <w:lastRenderedPageBreak/>
-        <w:t>por lo que se recomienda que, cada vez que se inserte una imagen, se sigan los pasos que se detallan a continuación.</w:t>
+        <w:t xml:space="preserve"> Todas las figuras que se añadan han de estar referenciadas desde el texto (como acabamos de hacer) por lo que se recomienda que, cada vez que se inserte una imagen, se sigan los pasos que se detallan a continuación.</w:t>
       </w:r>
     </w:p>
     <w:p>
@@ -4645,7 +6161,7 @@
                     <pic:cNvPicPr/>
                   </pic:nvPicPr>
                   <pic:blipFill>
-                    <a:blip r:embed="rId14">
+                    <a:blip r:embed="rId22">
                       <a:extLst>
                         <a:ext uri="{28A0092B-C50C-407E-A947-70E740481C1C}">
                           <a14:useLocalDpi xmlns:a14="http://schemas.microsoft.com/office/drawing/2010/main" val="0"/>
@@ -4849,6 +6365,7 @@
               <w:pStyle w:val="Textotabla"/>
             </w:pPr>
             <w:r>
+              <w:lastRenderedPageBreak/>
               <w:t>A-D</w:t>
             </w:r>
           </w:p>
@@ -5178,7 +6695,6 @@
         <w:rPr>
           <w:lang w:val="es-ES"/>
         </w:rPr>
-        <w:lastRenderedPageBreak/>
         <w:t xml:space="preserve">Al igual que con las figuras, es recomendable insertar un pie de tabla explicativo. El título de la tabla se añade con la opción </w:t>
       </w:r>
       <w:r>
@@ -5466,7 +6982,14 @@
         <w:rPr>
           <w:lang w:val="es-ES"/>
         </w:rPr>
-        <w:t xml:space="preserve">Hemos perdido la configuración de la tabla de contenidos. Se ha detectado que, en algunas ocasiones, la tabla de contenidos no muestra lo que debe porque deja de presentar los estilos correctos. Para solucionarlo es necesario situar el ratón en la tabla de contenidos, seleccionar la opción Referencias &gt; Tabla de contenido &gt; Tabla de contenido personalizada y pulsar en el botón Opciones. Aparecerá </w:t>
+        <w:t xml:space="preserve">Hemos perdido la configuración de la tabla de contenidos. Se ha detectado que, en algunas ocasiones, la tabla de contenidos no muestra lo que debe porque deja </w:t>
+      </w:r>
+      <w:r>
+        <w:rPr>
+          <w:lang w:val="es-ES"/>
+        </w:rPr>
+        <w:lastRenderedPageBreak/>
+        <w:t xml:space="preserve">de presentar los estilos correctos. Para solucionarlo es necesario situar el ratón en la tabla de contenidos, seleccionar la opción Referencias &gt; Tabla de contenido &gt; Tabla de contenido personalizada y pulsar en el botón Opciones. Aparecerá </w:t>
       </w:r>
       <w:r>
         <w:rPr>
@@ -5536,7 +7059,6 @@
         <w:rPr>
           <w:lang w:val="es-ES"/>
         </w:rPr>
-        <w:lastRenderedPageBreak/>
         <w:t>Page Heading TOC / 1</w:t>
       </w:r>
     </w:p>
@@ -5632,7 +7154,7 @@
                     <pic:cNvPicPr/>
                   </pic:nvPicPr>
                   <pic:blipFill>
-                    <a:blip r:embed="rId15">
+                    <a:blip r:embed="rId23">
                       <a:extLst>
                         <a:ext uri="{28A0092B-C50C-407E-A947-70E740481C1C}">
                           <a14:useLocalDpi xmlns:a14="http://schemas.microsoft.com/office/drawing/2010/main" val="0"/>
@@ -5843,6 +7365,7 @@
       <w:r>
         <w:t>“</w:t>
       </w:r>
+      <w:proofErr w:type="spellStart"/>
       <w:r>
         <w:fldChar w:fldCharType="begin"/>
       </w:r>
@@ -5855,6 +7378,7 @@
       <w:r>
         <w:t>Introducción</w:t>
       </w:r>
+      <w:proofErr w:type="spellEnd"/>
       <w:r>
         <w:fldChar w:fldCharType="end"/>
       </w:r>
@@ -6005,6 +7529,7 @@
       <w:r>
         <w:t>“</w:t>
       </w:r>
+      <w:proofErr w:type="spellStart"/>
       <w:r>
         <w:fldChar w:fldCharType="begin"/>
       </w:r>
@@ -6015,8 +7540,25 @@
         <w:fldChar w:fldCharType="separate"/>
       </w:r>
       <w:r>
-        <w:t>Conclusiones y trabajo futuro</w:t>
-      </w:r>
+        <w:t>Conclusiones</w:t>
+      </w:r>
+      <w:proofErr w:type="spellEnd"/>
+      <w:r>
+        <w:t xml:space="preserve"> y </w:t>
+      </w:r>
+      <w:proofErr w:type="spellStart"/>
+      <w:r>
+        <w:t>trabajo</w:t>
+      </w:r>
+      <w:proofErr w:type="spellEnd"/>
+      <w:r>
+        <w:t xml:space="preserve"> </w:t>
+      </w:r>
+      <w:proofErr w:type="spellStart"/>
+      <w:r>
+        <w:t>futuro</w:t>
+      </w:r>
+      <w:proofErr w:type="spellEnd"/>
       <w:r>
         <w:fldChar w:fldCharType="end"/>
       </w:r>
@@ -6293,7 +7835,7 @@
         </w:trPr>
         <w:tc>
           <w:tcPr>
-            <w:tcW w:w="50" w:type="pct"/>
+            <w:tcW w:w="164" w:type="pct"/>
             <w:hideMark/>
           </w:tcPr>
           <w:p>
@@ -6318,7 +7860,10 @@
               <w:pStyle w:val="Bibliografa"/>
             </w:pPr>
             <w:r>
-              <w:t xml:space="preserve">L. A. Bucki, Word 2013 Bible, John Wiley &amp; Sons, 2013. </w:t>
+              <w:t>CIRCOM: A Robust and Scalable Language for Building Complex Zero-Knowledge Circuits</w:t>
+            </w:r>
+            <w:r>
+              <w:t xml:space="preserve"> upcommons.upc.edu</w:t>
             </w:r>
           </w:p>
         </w:tc>
@@ -6329,7 +7874,7 @@
         </w:trPr>
         <w:tc>
           <w:tcPr>
-            <w:tcW w:w="50" w:type="pct"/>
+            <w:tcW w:w="164" w:type="pct"/>
             <w:hideMark/>
           </w:tcPr>
           <w:p>
@@ -6357,25 +7902,97 @@
               <w:rPr>
                 <w:lang w:val="es-ES"/>
               </w:rPr>
-              <w:t>CFI, «Cursos de Formación en Informática,» [En línea]. Available: http://cursosinformatica.ucm.es. [Último acceso: 01 06 2019].</w:t>
+              <w:t>Circom 2 Documentation</w:t>
+            </w:r>
+            <w:r>
+              <w:rPr>
+                <w:lang w:val="es-ES"/>
+              </w:rPr>
+              <w:t xml:space="preserve"> docs.circom.io</w:t>
+            </w:r>
+          </w:p>
+          <w:p>
+            <w:pPr>
+              <w:rPr>
+                <w:lang w:val="es-ES"/>
+              </w:rPr>
+            </w:pPr>
+          </w:p>
+        </w:tc>
+      </w:tr>
+      <w:tr>
+        <w:trPr>
+          <w:tblCellSpacing w:w="15" w:type="dxa"/>
+        </w:trPr>
+        <w:tc>
+          <w:tcPr>
+            <w:tcW w:w="164" w:type="pct"/>
+          </w:tcPr>
+          <w:p>
+            <w:pPr>
+              <w:pStyle w:val="Bibliografa"/>
+            </w:pPr>
+            <w:r>
+              <w:t>[3]</w:t>
+            </w:r>
+          </w:p>
+        </w:tc>
+        <w:tc>
+          <w:tcPr>
+            <w:tcW w:w="0" w:type="auto"/>
+          </w:tcPr>
+          <w:p>
+            <w:pPr>
+              <w:pStyle w:val="Bibliografa"/>
+            </w:pPr>
+            <w:r>
+              <w:t>Circom ReadMe github.com/iden3/circom/blob/master/README.md</w:t>
+            </w:r>
+          </w:p>
+        </w:tc>
+      </w:tr>
+      <w:tr>
+        <w:trPr>
+          <w:tblCellSpacing w:w="15" w:type="dxa"/>
+        </w:trPr>
+        <w:tc>
+          <w:tcPr>
+            <w:tcW w:w="164" w:type="pct"/>
+          </w:tcPr>
+          <w:p>
+            <w:pPr>
+              <w:pStyle w:val="Bibliografa"/>
+            </w:pPr>
+            <w:r>
+              <w:t>[4]</w:t>
+            </w:r>
+          </w:p>
+        </w:tc>
+        <w:tc>
+          <w:tcPr>
+            <w:tcW w:w="0" w:type="auto"/>
+          </w:tcPr>
+          <w:p>
+            <w:pPr>
+              <w:pStyle w:val="Bibliografa"/>
+            </w:pPr>
+            <w:r>
+              <w:t>Rust’s Strategic Advantage</w:t>
+            </w:r>
+            <w:r>
+              <w:t xml:space="preserve"> </w:t>
+            </w:r>
+            <w:r>
+              <w:t>sysid.github.io/</w:t>
             </w:r>
           </w:p>
         </w:tc>
       </w:tr>
     </w:tbl>
-    <w:p>
-      <w:pPr>
-        <w:rPr>
-          <w:lang w:val="es-ES"/>
-        </w:rPr>
-      </w:pPr>
-    </w:p>
+    <w:p/>
     <w:p>
       <w:pPr>
         <w:pStyle w:val="PageHeading"/>
-        <w:rPr>
-          <w:lang w:val="es-ES"/>
-        </w:rPr>
         <w:sectPr>
           <w:type w:val="oddPage"/>
           <w:pgSz w:w="12240" w:h="15840"/>
@@ -6851,56 +8468,6 @@
 </w:ftr>
 </file>
 
-<file path=word/footer5.xml><?xml version="1.0" encoding="utf-8"?>
-<w:ftr xmlns:wpc="http://schemas.microsoft.com/office/word/2010/wordprocessingCanvas" xmlns:cx="http://schemas.microsoft.com/office/drawing/2014/chartex" xmlns:cx1="http://schemas.microsoft.com/office/drawing/2015/9/8/chartex" xmlns:cx2="http://schemas.microsoft.com/office/drawing/2015/10/21/chartex" xmlns:cx3="http://schemas.microsoft.com/office/drawing/2016/5/9/chartex" xmlns:cx4="http://schemas.microsoft.com/office/drawing/2016/5/10/chartex" xmlns:cx5="http://schemas.microsoft.com/office/drawing/2016/5/11/chartex" xmlns:cx6="http://schemas.microsoft.com/office/drawing/2016/5/12/chartex" xmlns:cx7="http://schemas.microsoft.com/office/drawing/2016/5/13/chartex" xmlns:cx8="http://schemas.microsoft.com/office/drawing/2016/5/14/chartex" xmlns:mc="http://schemas.openxmlformats.org/markup-compatibility/2006" xmlns:aink="http://schemas.microsoft.com/office/drawing/2016/ink" xmlns:am3d="http://schemas.microsoft.com/office/drawing/2017/model3d" xmlns:o="urn:schemas-microsoft-com:office:office" xmlns:oel="http://schemas.microsoft.com/office/2019/extlst" xmlns:r="http://schemas.openxmlformats.org/officeDocument/2006/relationships" xmlns:m="http://schemas.openxmlformats.org/officeDocument/2006/math" xmlns:v="urn:schemas-microsoft-com:vml" xmlns:wp14="http://schemas.microsoft.com/office/word/2010/wordprocessingDrawing" xmlns:wp="http://schemas.openxmlformats.org/drawingml/2006/wordprocessingDrawing" xmlns:w10="urn:schemas-microsoft-com:office:word" xmlns:w="http://schemas.openxmlformats.org/wordprocessingml/2006/main" xmlns:w14="http://schemas.microsoft.com/office/word/2010/wordml" xmlns:w15="http://schemas.microsoft.com/office/word/2012/wordml" xmlns:w16cex="http://schemas.microsoft.com/office/word/2018/wordml/cex" xmlns:w16cid="http://schemas.microsoft.com/office/word/2016/wordml/cid" xmlns:w16="http://schemas.microsoft.com/office/word/2018/wordml" xmlns:w16du="http://schemas.microsoft.com/office/word/2023/wordml/word16du" xmlns:w16sdtdh="http://schemas.microsoft.com/office/word/2020/wordml/sdtdatahash" xmlns:w16sdtfl="http://schemas.microsoft.com/office/word/2024/wordml/sdtformatlock" xmlns:w16se="http://schemas.microsoft.com/office/word/2015/wordml/symex" xmlns:wpg="http://schemas.microsoft.com/office/word/2010/wordprocessingGroup" xmlns:wpi="http://schemas.microsoft.com/office/word/2010/wordprocessingInk" xmlns:wne="http://schemas.microsoft.com/office/word/2006/wordml" xmlns:wps="http://schemas.microsoft.com/office/word/2010/wordprocessingShape" mc:Ignorable="w14 w15 w16se w16cid w16 w16cex w16sdtdh w16sdtfl w16du wp14">
-  <w:p>
-    <w:pPr>
-      <w:pStyle w:val="Piedepgina"/>
-      <w:framePr w:wrap="none" w:vAnchor="text" w:hAnchor="margin" w:xAlign="outside" w:y="1"/>
-      <w:rPr>
-        <w:rStyle w:val="Nmerodepgina"/>
-      </w:rPr>
-    </w:pPr>
-    <w:r>
-      <w:rPr>
-        <w:rStyle w:val="Nmerodepgina"/>
-      </w:rPr>
-      <w:fldChar w:fldCharType="begin"/>
-    </w:r>
-    <w:r>
-      <w:rPr>
-        <w:rStyle w:val="Nmerodepgina"/>
-      </w:rPr>
-      <w:instrText xml:space="preserve">PAGE  </w:instrText>
-    </w:r>
-    <w:r>
-      <w:rPr>
-        <w:rStyle w:val="Nmerodepgina"/>
-      </w:rPr>
-      <w:fldChar w:fldCharType="separate"/>
-    </w:r>
-    <w:r>
-      <w:rPr>
-        <w:rStyle w:val="Nmerodepgina"/>
-      </w:rPr>
-      <w:t>21</w:t>
-    </w:r>
-    <w:r>
-      <w:rPr>
-        <w:rStyle w:val="Nmerodepgina"/>
-      </w:rPr>
-      <w:fldChar w:fldCharType="end"/>
-    </w:r>
-  </w:p>
-  <w:p>
-    <w:pPr>
-      <w:pStyle w:val="Piedepgina"/>
-      <w:ind w:right="360"/>
-    </w:pPr>
-  </w:p>
-</w:ftr>
-</file>
-
 <file path=word/footnotes.xml><?xml version="1.0" encoding="utf-8"?>
 <w:footnotes xmlns:wpc="http://schemas.microsoft.com/office/word/2010/wordprocessingCanvas" xmlns:cx="http://schemas.microsoft.com/office/drawing/2014/chartex" xmlns:cx1="http://schemas.microsoft.com/office/drawing/2015/9/8/chartex" xmlns:cx2="http://schemas.microsoft.com/office/drawing/2015/10/21/chartex" xmlns:cx3="http://schemas.microsoft.com/office/drawing/2016/5/9/chartex" xmlns:cx4="http://schemas.microsoft.com/office/drawing/2016/5/10/chartex" xmlns:cx5="http://schemas.microsoft.com/office/drawing/2016/5/11/chartex" xmlns:cx6="http://schemas.microsoft.com/office/drawing/2016/5/12/chartex" xmlns:cx7="http://schemas.microsoft.com/office/drawing/2016/5/13/chartex" xmlns:cx8="http://schemas.microsoft.com/office/drawing/2016/5/14/chartex" xmlns:mc="http://schemas.openxmlformats.org/markup-compatibility/2006" xmlns:aink="http://schemas.microsoft.com/office/drawing/2016/ink" xmlns:am3d="http://schemas.microsoft.com/office/drawing/2017/model3d" xmlns:o="urn:schemas-microsoft-com:office:office" xmlns:oel="http://schemas.microsoft.com/office/2019/extlst" xmlns:r="http://schemas.openxmlformats.org/officeDocument/2006/relationships" xmlns:m="http://schemas.openxmlformats.org/officeDocument/2006/math" xmlns:v="urn:schemas-microsoft-com:vml" xmlns:wp14="http://schemas.microsoft.com/office/word/2010/wordprocessingDrawing" xmlns:wp="http://schemas.openxmlformats.org/drawingml/2006/wordprocessingDrawing" xmlns:w10="urn:schemas-microsoft-com:office:word" xmlns:w="http://schemas.openxmlformats.org/wordprocessingml/2006/main" xmlns:w14="http://schemas.microsoft.com/office/word/2010/wordml" xmlns:w15="http://schemas.microsoft.com/office/word/2012/wordml" xmlns:w16cex="http://schemas.microsoft.com/office/word/2018/wordml/cex" xmlns:w16cid="http://schemas.microsoft.com/office/word/2016/wordml/cid" xmlns:w16="http://schemas.microsoft.com/office/word/2018/wordml" xmlns:w16du="http://schemas.microsoft.com/office/word/2023/wordml/word16du" xmlns:w16sdtdh="http://schemas.microsoft.com/office/word/2020/wordml/sdtdatahash" xmlns:w16sdtfl="http://schemas.microsoft.com/office/word/2024/wordml/sdtformatlock" xmlns:w16se="http://schemas.microsoft.com/office/word/2015/wordml/symex" xmlns:wpg="http://schemas.microsoft.com/office/word/2010/wordprocessingGroup" xmlns:wpi="http://schemas.microsoft.com/office/word/2010/wordprocessingInk" xmlns:wne="http://schemas.microsoft.com/office/word/2006/wordml" xmlns:wps="http://schemas.microsoft.com/office/word/2010/wordprocessingShape" mc:Ignorable="w14 w15 w16se w16cid w16 w16cex w16sdtdh w16sdtfl w16du wp14">
   <w:footnote w:type="separator" w:id="-1">
@@ -9015,7 +10582,7 @@
         <w:rFonts w:ascii="Symbol" w:hAnsi="Symbol" w:hint="default"/>
       </w:rPr>
     </w:lvl>
-    <w:lvl w:ilvl="1" w:tplc="0C0A0003" w:tentative="1">
+    <w:lvl w:ilvl="1" w:tplc="0C0A0003">
       <w:start w:val="1"/>
       <w:numFmt w:val="bullet"/>
       <w:lvlText w:val="o"/>
@@ -10782,6 +12349,7 @@
   <w:style w:type="character" w:default="1" w:styleId="Fuentedeprrafopredeter">
     <w:name w:val="Default Paragraph Font"/>
     <w:uiPriority w:val="1"/>
+    <w:semiHidden/>
     <w:unhideWhenUsed/>
   </w:style>
   <w:style w:type="table" w:default="1" w:styleId="Tablanormal">

</xml_diff>

<commit_message>
Hasta los operadores infijos corregido
</commit_message>
<xml_diff>
--- a/Optimization of the circom compiler.docx
+++ b/Optimization of the circom compiler.docx
@@ -2795,69 +2795,63 @@
       <w:pPr>
         <w:pStyle w:val="Textoindependiente"/>
       </w:pPr>
-      <w:r>
-        <w:t xml:space="preserve">Circom </w:t>
-      </w:r>
-      <w:r>
-        <w:t>was o</w:t>
-      </w:r>
-      <w:r>
-        <w:t>riginally developed at the Universidad Complutense de Madrid in collaboration with the company iden3</w:t>
-      </w:r>
-      <w:r>
-        <w:t>.</w:t>
-      </w:r>
-      <w:r>
-        <w:t xml:space="preserve"> Circom is currently used both in academic and practical contexts. It is taught in several universities as part of applied cryptography courses</w:t>
-      </w:r>
-      <w:r>
-        <w:t>, such as Stanford,</w:t>
-      </w:r>
-      <w:r>
-        <w:t xml:space="preserve"> and is also widely used in applications where privacy is a key requirement, such as digital identity, voting systems, and blockchain-based solutions. In these scenarios, the efficiency of the compiler becomes critical, especially when working with large circuits where memory usage can significantly impact performance. </w:t>
-      </w:r>
-    </w:p>
-    <w:p>
-      <w:pPr>
-        <w:pStyle w:val="Textoindependiente"/>
-      </w:pPr>
-      <w:r>
-        <w:t xml:space="preserve">The Circom compiler is implemented in Rust, a systems programming language that provides high performance while ensuring memory safety. This makes it particularly suitable for implementing a compiler, where large data structures and complex transformations must be handled efficiently and reliably. Rust also allows fine-grained control over memory representation, which is essential for optimizing </w:t>
-      </w:r>
-      <w:r>
-        <w:t>memory</w:t>
-      </w:r>
-      <w:r>
-        <w:t xml:space="preserve"> usage. </w:t>
-      </w:r>
-    </w:p>
-    <w:p>
-      <w:pPr>
-        <w:pStyle w:val="Textoindependiente"/>
-      </w:pPr>
-      <w:r>
-        <w:t xml:space="preserve">This project focuses on improving the memory efficiency of the Circom compiler. Currently, many internal values are represented using uniform data sizes, which may be larger than necessary. The goal of this work is to analyze the range of values that variables can take and </w:t>
-      </w:r>
-      <w:r>
-        <w:t xml:space="preserve">depending on that, </w:t>
-      </w:r>
-      <w:r>
-        <w:t xml:space="preserve">adjust their memory </w:t>
-      </w:r>
-      <w:r>
-        <w:t>size</w:t>
-      </w:r>
-      <w:r>
-        <w:t xml:space="preserve">, reducing overall memory usage without affecting correctness. </w:t>
-      </w:r>
-    </w:p>
-    <w:p>
-      <w:pPr>
-        <w:pStyle w:val="Ttulo2"/>
-      </w:pPr>
       <w:bookmarkStart w:id="8" w:name="_Toc116636437"/>
       <w:bookmarkStart w:id="9" w:name="_Toc221452907"/>
       <w:r>
+        <w:t xml:space="preserve">Zero-knowledge cryptography allows one party to prove that a statement is true without revealing any additional information beyond the validity of the statement itself. In this context, zk-SNARKs are one of the most widely used constructions, since they provide short proofs that can be verified efficiently. To generate the constraint systems required by these protocols, several domain-specific languages have been developed. These languages make it easier for users to describe arithmetic circuits and other cryptographic computations in a high-level way, without having to deal directly with the low-level representation of constraints. </w:t>
+      </w:r>
+    </w:p>
+    <w:p>
+      <w:pPr>
+        <w:pStyle w:val="Textoindependiente"/>
+      </w:pPr>
+      <w:r>
+        <w:t>Among these languages, Circom stands out as one of the most relevant and widely used. It was originally developed at the Universidad Complutense de Madrid in collaboration with the company iden3. Circom is currently used</w:t>
+      </w:r>
+      <w:r>
+        <w:t xml:space="preserve"> by tens of thousands of users in</w:t>
+      </w:r>
+      <w:r>
+        <w:t xml:space="preserve"> both academic and practical contexts, and it is taught in several universities as part of applied cryptography courses. It is also widely used in privacy-oriented applications such as digital identity, voting systems, and blockchain-based solutions. In these scenarios, the efficiency of the compiler becomes critical, especially when working with large circuits, since both memory usage and execution time can significantly affect performance. Circom not only generates the constraint system of the circuit, but also produces executable code in both C++ and WebAssembly to compute the witness. </w:t>
+      </w:r>
+    </w:p>
+    <w:p>
+      <w:pPr>
+        <w:pStyle w:val="Textoindependiente"/>
+      </w:pPr>
+      <w:r>
+        <w:t>The Circom compiler is implemented in Rust, a systems programming language that combines high performance with memory safety. This makes Rust a suitable choice for a compiler, where large data structures and complex transformations must be handled efficiently and reliably. In addition, Rust provides fine</w:t>
+      </w:r>
+      <w:r>
+        <w:t xml:space="preserve"> </w:t>
+      </w:r>
+      <w:r>
+        <w:t xml:space="preserve">grained control over memory representation, which is especially valuable in this project, since improving memory usage can </w:t>
+      </w:r>
+      <w:r>
+        <w:t>improve</w:t>
+      </w:r>
+      <w:r>
+        <w:t xml:space="preserve"> both the compiler and the generated executable code. Smaller internal representations can reduce memory consumption and improve execution time, because operations over smaller values are generally easier and faster to process. </w:t>
+      </w:r>
+    </w:p>
+    <w:p>
+      <w:pPr>
+        <w:pStyle w:val="Textoindependiente"/>
+      </w:pPr>
+      <w:r>
+        <w:t>The objective of this work is to analyze the range of values that variables can take and, depending on those bounds, adjust their memory size accordingly, reducing overall memory usage without affecting correctness</w:t>
+      </w:r>
+      <w:r>
+        <w:t>.</w:t>
+      </w:r>
+    </w:p>
+    <w:p>
+      <w:pPr>
+        <w:pStyle w:val="Ttulo2"/>
+      </w:pPr>
+      <w:r>
+        <w:lastRenderedPageBreak/>
         <w:t>Moti</w:t>
       </w:r>
       <w:bookmarkEnd w:id="8"/>
@@ -2898,7 +2892,13 @@
         <w:t>because</w:t>
       </w:r>
       <w:r>
-        <w:t xml:space="preserve"> it directly impacts the compiler's scalability and its ability to handle large circuits more efficiently. Furthermore, the project allows </w:t>
+        <w:t xml:space="preserve"> it directly impacts the</w:t>
+      </w:r>
+      <w:r>
+        <w:t xml:space="preserve"> generated code, which will require less memory usage and will run faster</w:t>
+      </w:r>
+      <w:r>
+        <w:t xml:space="preserve">. Furthermore, the project allows </w:t>
       </w:r>
       <w:r>
         <w:t>me</w:t>
@@ -2916,204 +2916,7 @@
       <w:pPr>
         <w:pStyle w:val="Ttulo2"/>
       </w:pPr>
-      <w:bookmarkStart w:id="10" w:name="_Toc116636438"/>
-      <w:bookmarkStart w:id="11" w:name="_Toc221452908"/>
-      <w:r>
-        <w:lastRenderedPageBreak/>
-        <w:t>Obj</w:t>
-      </w:r>
-      <w:bookmarkEnd w:id="10"/>
-      <w:r>
-        <w:t>ectives</w:t>
-      </w:r>
-      <w:bookmarkEnd w:id="11"/>
-    </w:p>
-    <w:p>
-      <w:pPr>
-        <w:pStyle w:val="Textoindependiente"/>
-      </w:pPr>
-      <w:r>
-        <w:t xml:space="preserve">The overall objective of this </w:t>
-      </w:r>
-      <w:r>
-        <w:t xml:space="preserve">TFG </w:t>
-      </w:r>
-      <w:r>
-        <w:t>is to analyze the memory usage behavior of the Circom compiler and propose an improvement to the representation of its internal variables.</w:t>
-      </w:r>
-      <w:r>
-        <w:t xml:space="preserve"> </w:t>
-      </w:r>
-      <w:r>
-        <w:t>To</w:t>
-      </w:r>
-      <w:r>
-        <w:t xml:space="preserve"> achieve it</w:t>
-      </w:r>
-      <w:r>
-        <w:t xml:space="preserve">, the different types of </w:t>
-      </w:r>
-      <w:r>
-        <w:t xml:space="preserve">operations </w:t>
-      </w:r>
-      <w:r>
-        <w:t xml:space="preserve">and </w:t>
-      </w:r>
-      <w:r>
-        <w:t>statements</w:t>
-      </w:r>
-      <w:r>
-        <w:t xml:space="preserve"> in the </w:t>
-      </w:r>
-      <w:r>
-        <w:t xml:space="preserve">Circom </w:t>
-      </w:r>
-      <w:r>
-        <w:t xml:space="preserve">language will be studied </w:t>
-      </w:r>
-      <w:r>
-        <w:t>to</w:t>
-      </w:r>
-      <w:r>
-        <w:t xml:space="preserve"> </w:t>
-      </w:r>
-      <w:r>
-        <w:t>find</w:t>
-      </w:r>
-      <w:r>
-        <w:t xml:space="preserve"> the range of values </w:t>
-      </w:r>
-      <w:r>
-        <w:rPr>
-          <w:rFonts w:ascii="Arial" w:hAnsi="Arial" w:cs="Arial"/>
-        </w:rPr>
-        <w:t>​​</w:t>
-      </w:r>
-      <w:r>
-        <w:t>that signals and variables can take. Based on this analysis, an attempt will be made to replace generic and oversized representations with others better suited to the actual needs of each case. The aim is to reduce the compiler's memory consumption without compromising the correctness of the compilation process.</w:t>
-      </w:r>
-    </w:p>
-    <w:p>
-      <w:pPr>
-        <w:pStyle w:val="Textoindependiente"/>
-      </w:pPr>
-    </w:p>
-    <w:p>
-      <w:pPr>
-        <w:pStyle w:val="Textoindependiente"/>
-      </w:pPr>
-    </w:p>
-    <w:p>
-      <w:pPr>
-        <w:pStyle w:val="Ttulo2"/>
-      </w:pPr>
-      <w:bookmarkStart w:id="12" w:name="_Toc221452909"/>
-      <w:r>
-        <w:t>Work Plan</w:t>
-      </w:r>
-      <w:bookmarkEnd w:id="12"/>
-    </w:p>
-    <w:p>
-      <w:pPr>
-        <w:pStyle w:val="Textoindependiente"/>
-      </w:pPr>
-      <w:r>
-        <w:t xml:space="preserve">The work </w:t>
-      </w:r>
-      <w:r>
-        <w:t>is</w:t>
-      </w:r>
-      <w:r>
-        <w:t xml:space="preserve"> carried out in several phases. </w:t>
-      </w:r>
-    </w:p>
-    <w:p>
-      <w:pPr>
-        <w:pStyle w:val="Textoindependiente"/>
-      </w:pPr>
-      <w:r>
-        <w:t xml:space="preserve">First, it </w:t>
-      </w:r>
-      <w:r>
-        <w:t>is</w:t>
-      </w:r>
-      <w:r>
-        <w:t xml:space="preserve"> necessary to become familiar with Rust and the fundamentals of the Circom compiler, as well as how circuits and constraints are represented. </w:t>
-      </w:r>
-    </w:p>
-    <w:p>
-      <w:pPr>
-        <w:pStyle w:val="Textoindependiente"/>
-      </w:pPr>
-      <w:r>
-        <w:t>T</w:t>
-      </w:r>
-      <w:r>
-        <w:t>he next stage involve</w:t>
-      </w:r>
-      <w:r>
-        <w:t>s</w:t>
-      </w:r>
-      <w:r>
-        <w:t xml:space="preserve"> analyzing the source code to identify areas where memory usage could be optimized. </w:t>
-      </w:r>
-    </w:p>
-    <w:p>
-      <w:pPr>
-        <w:pStyle w:val="Textoindependiente"/>
-      </w:pPr>
-      <w:r>
-        <w:t xml:space="preserve">Finally, the necessary modifications </w:t>
-      </w:r>
-      <w:r>
-        <w:t>are</w:t>
-      </w:r>
-      <w:r>
-        <w:t xml:space="preserve"> implemented, and their impact on the compiler's behavior </w:t>
-      </w:r>
-      <w:r>
-        <w:t>is</w:t>
-      </w:r>
-      <w:r>
-        <w:t xml:space="preserve"> evaluated.</w:t>
-      </w:r>
-    </w:p>
-    <w:p>
-      <w:pPr>
-        <w:pStyle w:val="Textoindependiente"/>
-      </w:pPr>
-    </w:p>
-    <w:p>
-      <w:pPr>
-        <w:pStyle w:val="Textoindependiente"/>
-      </w:pPr>
-    </w:p>
-    <w:p>
-      <w:pPr>
-        <w:pStyle w:val="Textoindependiente"/>
-      </w:pPr>
-    </w:p>
-    <w:p>
-      <w:pPr>
-        <w:pStyle w:val="Textoindependiente"/>
-      </w:pPr>
-    </w:p>
-    <w:p>
-      <w:pPr>
-        <w:pStyle w:val="Textoindependiente"/>
-      </w:pPr>
-    </w:p>
-    <w:p>
-      <w:pPr>
-        <w:pStyle w:val="Textoindependiente"/>
-      </w:pPr>
-    </w:p>
-    <w:p>
-      <w:pPr>
-        <w:pStyle w:val="Ttulo2"/>
-      </w:pPr>
-      <w:r>
-        <w:lastRenderedPageBreak/>
+      <w:r>
         <w:t>Circom</w:t>
       </w:r>
     </w:p>
@@ -3189,7 +2992,7 @@
           <w:noProof/>
         </w:rPr>
         <w:drawing>
-          <wp:inline distT="0" distB="0" distL="0" distR="0" wp14:anchorId="2B6DB6B5" wp14:editId="49211F66">
+          <wp:inline distT="0" distB="0" distL="0" distR="0" wp14:anchorId="2AB607CD" wp14:editId="2456100D">
             <wp:extent cx="3010161" cy="2149026"/>
             <wp:effectExtent l="0" t="0" r="0" b="3810"/>
             <wp:docPr id="2039023271" name="Imagen 1" descr="Texto&#10;&#10;El contenido generado por IA puede ser incorrecto."/>
@@ -3229,7 +3032,7 @@
           <w:noProof/>
         </w:rPr>
         <w:drawing>
-          <wp:inline distT="0" distB="0" distL="0" distR="0" wp14:anchorId="2E1414AA" wp14:editId="3981E19D">
+          <wp:inline distT="0" distB="0" distL="0" distR="0" wp14:anchorId="14B28EA1" wp14:editId="21166A0B">
             <wp:extent cx="2320636" cy="2156440"/>
             <wp:effectExtent l="0" t="0" r="3810" b="0"/>
             <wp:docPr id="768596320" name="Imagen 1" descr="Texto&#10;&#10;El contenido generado por IA puede ser incorrecto."/>
@@ -3292,19 +3095,8 @@
         <w:fldChar w:fldCharType="end"/>
       </w:r>
       <w:r>
-        <w:t xml:space="preserve"> </w:t>
-      </w:r>
-      <w:r>
-        <w:t>from</w:t>
-      </w:r>
-      <w:r>
-        <w:t xml:space="preserve"> </w:t>
-      </w:r>
-      <w:proofErr w:type="spellStart"/>
-      <w:r>
-        <w:t>circomlib</w:t>
-      </w:r>
-      <w:proofErr w:type="spellEnd"/>
+        <w:t xml:space="preserve"> from circomlib</w:t>
+      </w:r>
     </w:p>
     <w:p>
       <w:pPr>
@@ -3333,19 +3125,8 @@
         <w:fldChar w:fldCharType="end"/>
       </w:r>
       <w:r>
-        <w:t xml:space="preserve"> </w:t>
-      </w:r>
-      <w:r>
-        <w:t>from</w:t>
-      </w:r>
-      <w:r>
-        <w:t xml:space="preserve"> </w:t>
-      </w:r>
-      <w:proofErr w:type="spellStart"/>
-      <w:r>
-        <w:t>circomlib</w:t>
-      </w:r>
-      <w:proofErr w:type="spellEnd"/>
+        <w:t xml:space="preserve"> from circomlib</w:t>
+      </w:r>
     </w:p>
     <w:p>
       <w:r>
@@ -3356,6 +3137,22 @@
       </w:r>
     </w:p>
     <w:p>
+      <w:r>
+        <w:lastRenderedPageBreak/>
+        <w:t>“&lt;==” is used to assing a value and create a constraint.</w:t>
+      </w:r>
+    </w:p>
+    <w:p>
+      <w:r>
+        <w:t>“&lt;--” is used to only assing a value.</w:t>
+      </w:r>
+    </w:p>
+    <w:p>
+      <w:r>
+        <w:t>“===” is used to only create a constraint.</w:t>
+      </w:r>
+    </w:p>
+    <w:p>
       <w:pPr>
         <w:pStyle w:val="Textoindependiente"/>
       </w:pPr>
@@ -3366,13 +3163,8 @@
         <w:t>“</w:t>
       </w:r>
       <w:r>
-        <w:t xml:space="preserve">. </w:t>
-      </w:r>
-      <w:proofErr w:type="spellStart"/>
-      <w:r>
-        <w:t>circom</w:t>
-      </w:r>
-      <w:proofErr w:type="spellEnd"/>
+        <w:t>. circom</w:t>
+      </w:r>
       <w:r>
         <w:t>”</w:t>
       </w:r>
@@ -3433,110 +3225,68 @@
         <w:pStyle w:val="Textoindependiente"/>
       </w:pPr>
       <w:r>
-        <w:t xml:space="preserve">The output has two forms, a r1cs file, and one or </w:t>
-      </w:r>
-      <w:r>
-        <w:t>witness calculator programs</w:t>
-      </w:r>
-      <w:r>
-        <w:t xml:space="preserve">. The r1cs file contains the full rank-1 constraint system that encodes the circuit. The </w:t>
-      </w:r>
-      <w:r>
-        <w:t xml:space="preserve">witness calculator programs (in C++ and/or </w:t>
-      </w:r>
-      <w:proofErr w:type="spellStart"/>
-      <w:r>
-        <w:t>WebAssembly</w:t>
-      </w:r>
-      <w:proofErr w:type="spellEnd"/>
-      <w:r>
-        <w:t>) compute all signal values that satisfy the constraint</w:t>
-      </w:r>
-      <w:r>
-        <w:t>s.</w:t>
+        <w:t xml:space="preserve">The </w:t>
+      </w:r>
+      <w:r>
+        <w:t xml:space="preserve">Circom compiler produces two main outputs: </w:t>
       </w:r>
     </w:p>
     <w:p>
       <w:pPr>
         <w:pStyle w:val="Textoindependiente"/>
-      </w:pPr>
-      <w:r>
-        <w:lastRenderedPageBreak/>
-        <w:t>T</w:t>
-      </w:r>
-      <w:r>
-        <w:t xml:space="preserve">he </w:t>
-      </w:r>
-      <w:proofErr w:type="spellStart"/>
-      <w:r>
-        <w:t>Circom+SnarkJS</w:t>
-      </w:r>
-      <w:proofErr w:type="spellEnd"/>
-      <w:r>
-        <w:t xml:space="preserve"> ecosystem is widely used in both </w:t>
-      </w:r>
-      <w:r>
-        <w:t>Universities</w:t>
-      </w:r>
-      <w:r>
-        <w:t xml:space="preserve"> and industry. Developers write circuits and proofs that decouple application logic from ZK implementation. Circom lets designers focus on arithmetic correctness, while SNARKJS and other tools handle proof generation and verification. </w:t>
-      </w:r>
-      <w:r>
-        <w:t>Some</w:t>
-      </w:r>
-      <w:r>
-        <w:t xml:space="preserve"> projects have </w:t>
-      </w:r>
-      <w:r>
-        <w:t>taken advantage</w:t>
-      </w:r>
-      <w:r>
-        <w:t xml:space="preserve"> </w:t>
-      </w:r>
-      <w:r>
-        <w:t xml:space="preserve">on </w:t>
-      </w:r>
-      <w:r>
-        <w:t>Circom for massive circuits</w:t>
-      </w:r>
-      <w:r>
-        <w:t xml:space="preserve"> such as:</w:t>
-      </w:r>
-      <w:r>
-        <w:t xml:space="preserve"> Tornado Cash, Semaphore,</w:t>
-      </w:r>
-      <w:r>
-        <w:t xml:space="preserve"> and</w:t>
-      </w:r>
-      <w:r>
-        <w:t xml:space="preserve"> Zeropool</w:t>
-      </w:r>
-      <w:r>
-        <w:t xml:space="preserve"> </w:t>
-      </w:r>
-      <w:r>
-        <w:t xml:space="preserve">have all used Circom to describe circuits with millions of constraints. </w:t>
-      </w:r>
-    </w:p>
-    <w:p>
-      <w:pPr>
-        <w:pStyle w:val="Textoindependiente"/>
-      </w:pPr>
-    </w:p>
-    <w:p>
-      <w:pPr>
-        <w:pStyle w:val="Ttulo2"/>
         <w:numPr>
           <w:ilvl w:val="0"/>
-          <w:numId w:val="0"/>
+          <w:numId w:val="38"/>
         </w:numPr>
       </w:pPr>
+      <w:r>
+        <w:t xml:space="preserve">An .r1cs file, which contains the full rank-1 constraint system that encodes the circuit. </w:t>
+      </w:r>
+    </w:p>
+    <w:p>
+      <w:pPr>
+        <w:pStyle w:val="Textoindependiente"/>
+        <w:numPr>
+          <w:ilvl w:val="0"/>
+          <w:numId w:val="38"/>
+        </w:numPr>
+      </w:pPr>
+      <w:r>
+        <w:t xml:space="preserve">A witness calculator program, generated in C++ or WebAssembly, which computes all the signal values that satisfy those constraints. </w:t>
+      </w:r>
+    </w:p>
+    <w:p>
+      <w:pPr>
+        <w:pStyle w:val="Textoindependiente"/>
+      </w:pPr>
+      <w:r>
+        <w:t xml:space="preserve">The .r1cs file stores the constraints derived from the circuit. For example, in the AND template, the statement out &lt;== a * b; generates both the assignment and the corresponding constraint that enforces out = a * b. In the Edwards2Montgomery template, the lines with === generate explicit constraints, while the lines with &lt;-- only compute intermediate values without adding constraints. In this case, the witness calculator uses the assignments to compute the values of out[0] and out[1], and the .r1cs file stores the equations that those values must satisfy. </w:t>
+      </w:r>
+    </w:p>
+    <w:p>
+      <w:pPr>
+        <w:pStyle w:val="Textoindependiente"/>
+      </w:pPr>
+      <w:r>
+        <w:t xml:space="preserve">The witness calculator is responsible for computing all intermediate and final signal values from the circuit inputs. Once this witness is generated, it can be combined with the .r1cs file and passed to tools such as SnarkJS, which are used to generate and verify zero-knowledge proofs. In this way, Circom separates the description of the arithmetic circuit from the cryptographic machinery required to produce proofs. </w:t>
+      </w:r>
+    </w:p>
+    <w:p>
+      <w:pPr>
+        <w:pStyle w:val="Textoindependiente"/>
+      </w:pPr>
+    </w:p>
+    <w:p>
+      <w:pPr>
+        <w:pStyle w:val="Textoindependiente"/>
+      </w:pPr>
     </w:p>
     <w:p>
       <w:pPr>
         <w:pStyle w:val="Ttulo2"/>
       </w:pPr>
       <w:r>
+        <w:lastRenderedPageBreak/>
         <w:t>Rust</w:t>
       </w:r>
     </w:p>
@@ -3545,7 +3295,7 @@
         <w:pStyle w:val="Textoindependiente"/>
       </w:pPr>
       <w:r>
-        <w:t xml:space="preserve">Rust is a modern systems programming language designed to provide high performance while ensuring memory safety. Unlike traditional languages such as  C++, Rust enforces strict compile-time guarantees through its ownership and borrowing model, preventing common errors such as null pointer dereferencing, data races, and memory leaks. </w:t>
+        <w:t xml:space="preserve">Rust is a modern systems programming language designed to provide high performance while ensuring memory safety. Unlike traditional languages such as C++, Rust enforces strict compile-time guarantees through its ownership and borrowing model, preventing common errors such as null pointer dereferencing, data races, and memory leaks. </w:t>
       </w:r>
     </w:p>
     <w:p>
@@ -3654,31 +3404,228 @@
       <w:pPr>
         <w:pStyle w:val="Textoindependiente"/>
       </w:pPr>
+    </w:p>
+    <w:p>
+      <w:pPr>
+        <w:pStyle w:val="Textoindependiente"/>
+      </w:pPr>
+    </w:p>
+    <w:p>
+      <w:pPr>
+        <w:pStyle w:val="Textoindependiente"/>
+      </w:pPr>
+    </w:p>
+    <w:p>
+      <w:pPr>
+        <w:pStyle w:val="Textoindependiente"/>
+      </w:pPr>
+    </w:p>
+    <w:p>
+      <w:pPr>
+        <w:pStyle w:val="Textoindependiente"/>
+      </w:pPr>
+    </w:p>
+    <w:p>
+      <w:pPr>
+        <w:pStyle w:val="Ttulo2"/>
+      </w:pPr>
+      <w:bookmarkStart w:id="10" w:name="_Toc116636438"/>
+      <w:bookmarkStart w:id="11" w:name="_Toc221452908"/>
       <w:r>
         <w:lastRenderedPageBreak/>
-        <w:t>My</w:t>
-      </w:r>
-      <w:r>
-        <w:t xml:space="preserve"> motivation for learning Rust in this project arises primarily from the need to understand and modify the Circom compiler, which is implemented in this language.</w:t>
-      </w:r>
-      <w:r>
-        <w:t xml:space="preserve"> Also</w:t>
-      </w:r>
-      <w:r>
-        <w:t xml:space="preserve">, Rust represents a valuable addition to </w:t>
-      </w:r>
-      <w:r>
-        <w:t>my</w:t>
-      </w:r>
-      <w:r>
-        <w:t xml:space="preserve"> skill set </w:t>
-      </w:r>
-      <w:r>
-        <w:t>as</w:t>
-      </w:r>
-      <w:r>
-        <w:t xml:space="preserve"> a computer science student. Its growing adoption in industry and its focus on safety and performance make it a differentiating technology in the job market. Therefore, this project also serves as an opportunity to gain experience with modern language systems that is increasingly relevant in both research and professional environments.</w:t>
-      </w:r>
+        <w:t>Obj</w:t>
+      </w:r>
+      <w:bookmarkEnd w:id="10"/>
+      <w:r>
+        <w:t>ectives</w:t>
+      </w:r>
+      <w:bookmarkEnd w:id="11"/>
+    </w:p>
+    <w:p>
+      <w:pPr>
+        <w:pStyle w:val="Textoindependiente"/>
+      </w:pPr>
+      <w:r>
+        <w:t xml:space="preserve">The overall objective of this </w:t>
+      </w:r>
+      <w:r>
+        <w:t xml:space="preserve">TFG </w:t>
+      </w:r>
+      <w:r>
+        <w:t>is to analyze the memory usage behavior of the Circom compiler and propose an improvement to the representation of its internal variables.</w:t>
+      </w:r>
+      <w:r>
+        <w:t xml:space="preserve"> </w:t>
+      </w:r>
+      <w:r>
+        <w:t>To</w:t>
+      </w:r>
+      <w:r>
+        <w:t xml:space="preserve"> achieve it</w:t>
+      </w:r>
+      <w:r>
+        <w:t xml:space="preserve">, the different types of </w:t>
+      </w:r>
+      <w:r>
+        <w:t xml:space="preserve">operations </w:t>
+      </w:r>
+      <w:r>
+        <w:t xml:space="preserve">and </w:t>
+      </w:r>
+      <w:r>
+        <w:t>statements</w:t>
+      </w:r>
+      <w:r>
+        <w:t xml:space="preserve"> in the </w:t>
+      </w:r>
+      <w:r>
+        <w:t xml:space="preserve">Circom </w:t>
+      </w:r>
+      <w:r>
+        <w:t xml:space="preserve">language will be studied </w:t>
+      </w:r>
+      <w:r>
+        <w:t>to</w:t>
+      </w:r>
+      <w:r>
+        <w:t xml:space="preserve"> </w:t>
+      </w:r>
+      <w:r>
+        <w:t>find</w:t>
+      </w:r>
+      <w:r>
+        <w:t xml:space="preserve"> the range of values </w:t>
+      </w:r>
+      <w:r>
+        <w:rPr>
+          <w:rFonts w:ascii="Arial" w:hAnsi="Arial" w:cs="Arial"/>
+        </w:rPr>
+        <w:t>​​</w:t>
+      </w:r>
+      <w:r>
+        <w:t xml:space="preserve">that signals and variables can take. Based on this analysis, an attempt will be made to replace generic and oversized representations with others better suited to the actual needs of each case. The aim is to reduce the </w:t>
+      </w:r>
+      <w:r>
+        <w:t xml:space="preserve">memory sizes in the generated code </w:t>
+      </w:r>
+      <w:r>
+        <w:t>without compromising the correctness of the compilation process.</w:t>
+      </w:r>
+    </w:p>
+    <w:p>
+      <w:pPr>
+        <w:pStyle w:val="Textoindependiente"/>
+      </w:pPr>
+    </w:p>
+    <w:p>
+      <w:pPr>
+        <w:pStyle w:val="Textoindependiente"/>
+      </w:pPr>
+    </w:p>
+    <w:p>
+      <w:pPr>
+        <w:pStyle w:val="Ttulo2"/>
+      </w:pPr>
+      <w:bookmarkStart w:id="12" w:name="_Toc221452909"/>
+      <w:r>
+        <w:t>Work Plan</w:t>
+      </w:r>
+      <w:bookmarkEnd w:id="12"/>
+    </w:p>
+    <w:p>
+      <w:pPr>
+        <w:pStyle w:val="Textoindependiente"/>
+      </w:pPr>
+      <w:r>
+        <w:t xml:space="preserve">The work </w:t>
+      </w:r>
+      <w:r>
+        <w:t>is</w:t>
+      </w:r>
+      <w:r>
+        <w:t xml:space="preserve"> carried out in several phases. </w:t>
+      </w:r>
+    </w:p>
+    <w:p>
+      <w:pPr>
+        <w:pStyle w:val="Textoindependiente"/>
+      </w:pPr>
+      <w:r>
+        <w:t xml:space="preserve">First, it </w:t>
+      </w:r>
+      <w:r>
+        <w:t>is</w:t>
+      </w:r>
+      <w:r>
+        <w:t xml:space="preserve"> necessary to become familiar with Rust and the fundamentals of the Circom compiler, as well as how circuits and constraints are represented. </w:t>
+      </w:r>
+    </w:p>
+    <w:p>
+      <w:pPr>
+        <w:pStyle w:val="Textoindependiente"/>
+      </w:pPr>
+      <w:r>
+        <w:t>T</w:t>
+      </w:r>
+      <w:r>
+        <w:t>he next stage involve</w:t>
+      </w:r>
+      <w:r>
+        <w:t>s</w:t>
+      </w:r>
+      <w:r>
+        <w:t xml:space="preserve"> analyzing the source code to identify areas where memory usage could be optimized. </w:t>
+      </w:r>
+    </w:p>
+    <w:p>
+      <w:pPr>
+        <w:pStyle w:val="Textoindependiente"/>
+      </w:pPr>
+      <w:r>
+        <w:t xml:space="preserve">Finally, the necessary modifications </w:t>
+      </w:r>
+      <w:r>
+        <w:t>are</w:t>
+      </w:r>
+      <w:r>
+        <w:t xml:space="preserve"> implemented, and their impact on the compiler's behavior </w:t>
+      </w:r>
+      <w:r>
+        <w:t>is</w:t>
+      </w:r>
+      <w:r>
+        <w:t xml:space="preserve"> evaluated.</w:t>
+      </w:r>
+    </w:p>
+    <w:p>
+      <w:pPr>
+        <w:pStyle w:val="Textoindependiente"/>
+      </w:pPr>
+    </w:p>
+    <w:p>
+      <w:pPr>
+        <w:pStyle w:val="Textoindependiente"/>
+      </w:pPr>
+    </w:p>
+    <w:p>
+      <w:pPr>
+        <w:pStyle w:val="Textoindependiente"/>
+      </w:pPr>
+    </w:p>
+    <w:p>
+      <w:pPr>
+        <w:pStyle w:val="Textoindependiente"/>
+      </w:pPr>
+    </w:p>
+    <w:p>
+      <w:pPr>
+        <w:pStyle w:val="Textoindependiente"/>
+      </w:pPr>
+    </w:p>
+    <w:p>
+      <w:pPr>
+        <w:pStyle w:val="Textoindependiente"/>
+      </w:pPr>
     </w:p>
     <w:p>
       <w:pPr>
@@ -3698,68 +3645,94 @@
       </w:r>
     </w:p>
     <w:p>
-      <w:r>
-        <w:t xml:space="preserve">The Circom </w:t>
-      </w:r>
-      <w:r>
-        <w:t>compiler,</w:t>
+      <w:pPr>
+        <w:keepNext/>
+      </w:pPr>
+      <w:r>
+        <w:t>Unlike many other compilers, Circom does not work with several primitive variable types. Instead, its signals are elements of a finite field. In practice, these fields are very large, and their modulus is usually a prime number with a size of</w:t>
+      </w:r>
+      <w:r>
+        <w:t xml:space="preserve"> at most</w:t>
+      </w:r>
+      <w:r>
+        <w:t xml:space="preserve"> 256 bits. This means that every signal is, by default, represented using a much larger range than most circuit values require. </w:t>
+      </w:r>
+    </w:p>
+    <w:p>
+      <w:pPr>
+        <w:keepNext/>
+      </w:pPr>
+      <w:r>
+        <w:t xml:space="preserve">This also creates </w:t>
+      </w:r>
+      <w:r>
+        <w:t>inefficiency</w:t>
+      </w:r>
+      <w:r>
+        <w:t xml:space="preserve"> not only when generating C code, but also when targeting </w:t>
+      </w:r>
+      <w:r>
+        <w:t>WebAssembly</w:t>
+      </w:r>
+      <w:r>
+        <w:t xml:space="preserve">. Since all values are treated as large field elements, the generated code must handle them using representations that are often larger and more expensive than necessary. As a </w:t>
+      </w:r>
+      <w:r>
+        <w:t>result,</w:t>
+      </w:r>
+      <w:r>
+        <w:t xml:space="preserve"> memory consumption and execution time can increase, especially in circuits with many intermediate values. </w:t>
+      </w:r>
+    </w:p>
+    <w:p>
+      <w:pPr>
+        <w:keepNext/>
+      </w:pPr>
+      <w:r>
+        <w:t xml:space="preserve">A simple example of this situation is the </w:t>
+      </w:r>
+      <w:r>
+        <w:t>“</w:t>
+      </w:r>
+      <w:r>
+        <w:t>IsZero</w:t>
+      </w:r>
+      <w:r>
+        <w:t>”</w:t>
+      </w:r>
+      <w:r>
+        <w:t xml:space="preserve"> template. In this circuit, the output signal can only take two possible values, 0 or 1. Even so, without any additional analysis, it is still represented as a full field element. If the compiler </w:t>
+      </w:r>
+      <w:r>
+        <w:t>can</w:t>
       </w:r>
       <w:r>
         <w:t xml:space="preserve"> </w:t>
       </w:r>
       <w:r>
-        <w:t>like</w:t>
-      </w:r>
-      <w:r>
-        <w:t xml:space="preserve"> many other </w:t>
-      </w:r>
-      <w:r>
-        <w:t>compilers,</w:t>
-      </w:r>
-      <w:r>
-        <w:t xml:space="preserve"> uses signals to transmit information between different parts of the code.</w:t>
-      </w:r>
-      <w:r>
-        <w:t xml:space="preserve"> These signals are </w:t>
-      </w:r>
-      <w:r>
-        <w:t>assigned to</w:t>
-      </w:r>
-      <w:r>
-        <w:t xml:space="preserve"> a value in the range [0, prime), being prime a prime number with a 256 bits size.</w:t>
-      </w:r>
-    </w:p>
-    <w:p>
-      <w:pPr>
-        <w:rPr>
-          <w:highlight w:val="cyan"/>
-        </w:rPr>
-      </w:pPr>
-      <w:r>
-        <w:t xml:space="preserve">Due that the signals are all 256 bits of size, this creates a problem when translating to C, because in C you would need an external library and pointers to access the value in </w:t>
-      </w:r>
-      <w:r>
-        <w:t>those signals, which comes as a huge inefficiency in memory and time.</w:t>
-      </w:r>
-    </w:p>
-    <w:p>
-      <w:r>
-        <w:t>In the</w:t>
-      </w:r>
-      <w:r>
-        <w:t xml:space="preserve"> following example we can see a small circuit that only uses one signal, and this signal can have only two values, “1” or “0”. By optimizing the size of the signal, we can save up to 255 bits and make its translation to C code more efficient.</w:t>
-      </w:r>
-    </w:p>
-    <w:p>
-      <w:pPr>
-        <w:keepNext/>
+        <w:t>find</w:t>
+      </w:r>
+      <w:r>
+        <w:t xml:space="preserve"> that the signal is Boolean, it can use that information to reduce the amount of memory needed</w:t>
+      </w:r>
+      <w:r>
+        <w:t>,</w:t>
+      </w:r>
+      <w:r>
+        <w:t xml:space="preserve"> and to generate more efficient code. </w:t>
+      </w:r>
+    </w:p>
+    <w:p>
+      <w:pPr>
+        <w:pStyle w:val="Descripcin"/>
+        <w:jc w:val="both"/>
       </w:pPr>
       <w:r>
         <w:rPr>
           <w:noProof/>
         </w:rPr>
         <w:drawing>
-          <wp:inline distT="0" distB="0" distL="0" distR="0" wp14:anchorId="315B72C7" wp14:editId="1FB517AD">
+          <wp:inline distT="0" distB="0" distL="0" distR="0" wp14:anchorId="46EF787F" wp14:editId="6BEE6DFC">
             <wp:extent cx="1996613" cy="2118544"/>
             <wp:effectExtent l="0" t="0" r="3810" b="0"/>
             <wp:docPr id="1814477959" name="Imagen 1" descr="Pantalla de computadora con letras&#10;&#10;El contenido generado por IA puede ser incorrecto."/>
@@ -3794,6 +3767,9 @@
           </wp:inline>
         </w:drawing>
       </w:r>
+      <w:r>
+        <w:t xml:space="preserve"> </w:t>
+      </w:r>
     </w:p>
     <w:p>
       <w:pPr>
@@ -3822,13 +3798,36 @@
         <w:fldChar w:fldCharType="end"/>
       </w:r>
       <w:r>
-        <w:t xml:space="preserve"> from </w:t>
-      </w:r>
-      <w:proofErr w:type="spellStart"/>
-      <w:r>
-        <w:t>circomlib</w:t>
-      </w:r>
-      <w:proofErr w:type="spellEnd"/>
+        <w:t xml:space="preserve"> from circomlib</w:t>
+      </w:r>
+    </w:p>
+    <w:p>
+      <w:pPr>
+        <w:keepNext/>
+      </w:pPr>
+    </w:p>
+    <w:p>
+      <w:pPr>
+        <w:keepNext/>
+      </w:pPr>
+      <w:r>
+        <w:t xml:space="preserve">The work presented in this project is divided into two main phases. First, the bounds of the different signals are detected by analyzing the operations and statements that define them. Once these bounds are known, they can be used in two ways: to generate </w:t>
+      </w:r>
+      <w:r>
+        <w:lastRenderedPageBreak/>
+        <w:t>more efficient C or WebAssembly code,</w:t>
+      </w:r>
+      <w:r>
+        <w:t xml:space="preserve"> and</w:t>
+      </w:r>
+      <w:r>
+        <w:t xml:space="preserve"> to verify that the constraints produced by the circuit are sufficient to guarantee that those bounds always hold. </w:t>
+      </w:r>
+    </w:p>
+    <w:p>
+      <w:pPr>
+        <w:keepNext/>
+      </w:pPr>
     </w:p>
     <w:p>
       <w:pPr>
@@ -3859,7 +3858,19 @@
         <w:pStyle w:val="Textoindependiente"/>
       </w:pPr>
       <w:r>
-        <w:t>In this chapter I will explain the methodology of the analysis of the size of the variables for each kind of operation and statement.</w:t>
+        <w:t xml:space="preserve">This chapter describes the methodology used to analyze the size requirements of the variables and signals handled by the compiler. The goal of this analysis is to traverse the different instructions of a program and </w:t>
+      </w:r>
+      <w:r>
+        <w:t>find</w:t>
+      </w:r>
+      <w:r>
+        <w:t xml:space="preserve"> the range of values that each signal can take. Once these bounds are known, they can be used to reduce the memory representation of </w:t>
+      </w:r>
+      <w:r>
+        <w:t>variables,</w:t>
+      </w:r>
+      <w:r>
+        <w:t xml:space="preserve"> when possible, without changing the correctness of the compilation process. </w:t>
       </w:r>
     </w:p>
     <w:p>
@@ -3867,25 +3878,34 @@
         <w:pStyle w:val="Textoindependiente"/>
       </w:pPr>
       <w:r>
-        <w:t>The</w:t>
+        <w:t>Since Circom operates over a finite field, every value is always within the range</w:t>
       </w:r>
       <w:r>
         <w:t xml:space="preserve"> </w:t>
       </w:r>
       <w:r>
-        <w:t xml:space="preserve">objective of this analysis is to traverse the different instructions of a program and determine the range of values that each signal can take. By identifying these bounds, we aim to </w:t>
-      </w:r>
-      <w:r>
-        <w:t>have</w:t>
+        <w:t xml:space="preserve"> [</w:t>
+      </w:r>
+      <w:r>
+        <w:t>0,</w:t>
+      </w:r>
+      <w:r>
+        <w:t xml:space="preserve"> p</w:t>
+      </w:r>
+      <w:r>
+        <w:t>), where</w:t>
+      </w:r>
+      <w:r>
+        <w:t xml:space="preserve"> p</w:t>
+      </w:r>
+      <w:r>
+        <w:t xml:space="preserve"> is a large prime number. This range acts as a general upper bound for all expressions, but in many cases the actual values are much smaller. The purpose of the analysis is</w:t>
       </w:r>
       <w:r>
         <w:t xml:space="preserve"> </w:t>
       </w:r>
       <w:r>
-        <w:t>smaller</w:t>
-      </w:r>
-      <w:r>
-        <w:t xml:space="preserve"> memory representations for variables, reducing their size without affecting correctness.</w:t>
+        <w:t xml:space="preserve">to detect these tighter bounds and exploit them when generating more efficient representations. </w:t>
       </w:r>
     </w:p>
     <w:p>
@@ -3893,153 +3913,8 @@
         <w:pStyle w:val="Textoindependiente"/>
       </w:pPr>
       <w:r>
-        <w:t>For the</w:t>
-      </w:r>
-      <w:r>
-        <w:t xml:space="preserve"> analysis, it is important to consider that all values are defined over a finite field, meaning they lie within the range [0,</w:t>
-      </w:r>
-      <w:r>
-        <w:t xml:space="preserve"> </w:t>
-      </w:r>
-      <w:r>
-        <w:t xml:space="preserve">p), where p is a large prime number greater than any value handled by the compiler. This assumption provides a global upper bound and serves as a reference for detecting and refining </w:t>
-      </w:r>
-      <w:r>
-        <w:t>smaller</w:t>
-      </w:r>
-      <w:r>
-        <w:t xml:space="preserve"> bounds during the analysis.</w:t>
-      </w:r>
-    </w:p>
-    <w:p>
-      <w:pPr>
-        <w:pStyle w:val="Textoindependiente"/>
-      </w:pPr>
-      <w:r>
-        <w:t xml:space="preserve">The bounds </w:t>
-      </w:r>
-      <w:r>
-        <w:t>consist</w:t>
-      </w:r>
-      <w:r>
-        <w:t xml:space="preserve"> </w:t>
-      </w:r>
-      <w:r>
-        <w:t>of</w:t>
-      </w:r>
-      <w:r>
-        <w:t xml:space="preserve"> two numbers</w:t>
-      </w:r>
-      <w:r>
-        <w:t xml:space="preserve"> of the type BigInt</w:t>
-      </w:r>
-      <w:r>
-        <w:t xml:space="preserve">, </w:t>
-      </w:r>
-      <w:r>
-        <w:t>min and max, which will keep the minimum and maximum value that the operation or statement can take</w:t>
-      </w:r>
-      <w:r>
-        <w:t>.</w:t>
-      </w:r>
-    </w:p>
-    <w:p>
-      <w:pPr>
-        <w:pStyle w:val="Textoindependiente"/>
-        <w:keepNext/>
-      </w:pPr>
-      <w:r>
-        <w:rPr>
-          <w:noProof/>
-        </w:rPr>
-        <w:drawing>
-          <wp:inline distT="0" distB="0" distL="0" distR="0" wp14:anchorId="7BCE09AF" wp14:editId="2A568B5E">
-            <wp:extent cx="4549534" cy="190517"/>
-            <wp:effectExtent l="0" t="0" r="3810" b="0"/>
-            <wp:docPr id="1457302801" name="Imagen 1"/>
-            <wp:cNvGraphicFramePr>
-              <a:graphicFrameLocks xmlns:a="http://schemas.openxmlformats.org/drawingml/2006/main" noChangeAspect="1"/>
-            </wp:cNvGraphicFramePr>
-            <a:graphic xmlns:a="http://schemas.openxmlformats.org/drawingml/2006/main">
-              <a:graphicData uri="http://schemas.openxmlformats.org/drawingml/2006/picture">
-                <pic:pic xmlns:pic="http://schemas.openxmlformats.org/drawingml/2006/picture">
-                  <pic:nvPicPr>
-                    <pic:cNvPr id="1457302801" name=""/>
-                    <pic:cNvPicPr/>
-                  </pic:nvPicPr>
-                  <pic:blipFill>
-                    <a:blip r:embed="rId16"/>
-                    <a:stretch>
-                      <a:fillRect/>
-                    </a:stretch>
-                  </pic:blipFill>
-                  <pic:spPr>
-                    <a:xfrm>
-                      <a:off x="0" y="0"/>
-                      <a:ext cx="4549534" cy="190517"/>
-                    </a:xfrm>
-                    <a:prstGeom prst="rect">
-                      <a:avLst/>
-                    </a:prstGeom>
-                  </pic:spPr>
-                </pic:pic>
-              </a:graphicData>
-            </a:graphic>
-          </wp:inline>
-        </w:drawing>
-      </w:r>
-    </w:p>
-    <w:p>
-      <w:pPr>
-        <w:pStyle w:val="Descripcin"/>
-        <w:jc w:val="both"/>
-      </w:pPr>
-      <w:r>
-        <w:t xml:space="preserve">Figure </w:t>
-      </w:r>
-      <w:r>
-        <w:fldChar w:fldCharType="begin"/>
-      </w:r>
-      <w:r>
-        <w:instrText xml:space="preserve"> SEQ Figure \* ARABIC </w:instrText>
-      </w:r>
-      <w:r>
-        <w:fldChar w:fldCharType="separate"/>
-      </w:r>
-      <w:r>
-        <w:rPr>
-          <w:noProof/>
-        </w:rPr>
-        <w:t>4</w:t>
-      </w:r>
-      <w:r>
-        <w:fldChar w:fldCharType="end"/>
-      </w:r>
-      <w:r>
-        <w:t xml:space="preserve"> from compute_bouds.rs</w:t>
-      </w:r>
-    </w:p>
-    <w:p>
-      <w:pPr>
-        <w:pStyle w:val="Textoindependiente"/>
-      </w:pPr>
-      <w:r>
-        <w:t>For the statements we will also have a hash map, called context, to keep the bounds of a</w:t>
-      </w:r>
-      <w:r>
-        <w:t xml:space="preserve"> signal </w:t>
-      </w:r>
-      <w:r>
-        <w:t>by the string of its name.</w:t>
-      </w:r>
-      <w:r>
-        <w:t xml:space="preserve"> The purpose of the hash map is to keep the compiler from calculating the bounds of a signal each time that it needs its bounds.</w:t>
-      </w:r>
-    </w:p>
-    <w:p>
-      <w:pPr>
-        <w:pStyle w:val="Textoindependiente"/>
-      </w:pPr>
+        <w:t>The analysis is divided into two main tasks. First, we need to compute the bounds of expressions, which is presented in Section 3.1. Second, we need to update and maintain the current state of the known bounds during the traversal of statements, which is described in Section 3.2. To support this process, the compiler stores a context structure in the form of a hash map, where each signal name is associated with its founded bounds. This allows the compiler to reuse previously computed information when processing statements, instead of recomputing the bounds of the same signal every time they are needed.</w:t>
+      </w:r>
     </w:p>
     <w:p>
       <w:pPr>
@@ -4085,7 +3960,13 @@
     </w:p>
     <w:p>
       <w:r>
-        <w:t>To do that I´m going to implement a function, that given the expression and the context, will give back the bounds.</w:t>
+        <w:t>To do that I</w:t>
+      </w:r>
+      <w:r>
+        <w:t xml:space="preserve"> a</w:t>
+      </w:r>
+      <w:r>
+        <w:t>m going to implement a function, that given the expression and the context, will give back the bounds.</w:t>
       </w:r>
     </w:p>
     <w:p>
@@ -4107,10 +3988,22 @@
         <w:pStyle w:val="Textoindependiente"/>
       </w:pPr>
       <w:r>
-        <w:t>In this kind of operations we are going to have two expressions and an operand, so first of all we need to calculate the bounds of both expressions and then, depending on the operand, we will have different ways to calculate the</w:t>
-      </w:r>
-      <w:r>
-        <w:t xml:space="preserve"> resulting bounds.</w:t>
+        <w:t>In this section, we consider the infix operators</w:t>
+      </w:r>
+      <w:r>
+        <w:t xml:space="preserve">, </w:t>
+      </w:r>
+      <w:r>
+        <w:t xml:space="preserve">that is, operations written between two expressions. These include arithmetic operators such as addition, subtraction, and multiplication, as well as logical and bitwise operators. Since each of these operators combines two operands, the first step is to compute the bounds of both expressions. Then, depending on the operator, the resulting bounds are </w:t>
+      </w:r>
+      <w:r>
+        <w:t>calculated</w:t>
+      </w:r>
+      <w:r>
+        <w:t xml:space="preserve"> using the corresponding rule</w:t>
+      </w:r>
+      <w:r>
+        <w:t>.</w:t>
       </w:r>
     </w:p>
     <w:p>
@@ -4224,136 +4117,97 @@
     <w:p>
       <w:pPr>
         <w:pStyle w:val="Textoindependiente"/>
-        <w:keepNext/>
-      </w:pPr>
-      <w:r>
-        <w:drawing>
-          <wp:inline distT="0" distB="0" distL="0" distR="0" wp14:anchorId="5794B3A3" wp14:editId="28023683">
-            <wp:extent cx="1309795" cy="2353742"/>
-            <wp:effectExtent l="0" t="0" r="5080" b="8890"/>
-            <wp:docPr id="1659767636" name="Imagen 1" descr="Texto&#10;&#10;El contenido generado por IA puede ser incorrecto."/>
-            <wp:cNvGraphicFramePr>
-              <a:graphicFrameLocks xmlns:a="http://schemas.openxmlformats.org/drawingml/2006/main" noChangeAspect="1"/>
-            </wp:cNvGraphicFramePr>
-            <a:graphic xmlns:a="http://schemas.openxmlformats.org/drawingml/2006/main">
-              <a:graphicData uri="http://schemas.openxmlformats.org/drawingml/2006/picture">
-                <pic:pic xmlns:pic="http://schemas.openxmlformats.org/drawingml/2006/picture">
-                  <pic:nvPicPr>
-                    <pic:cNvPr id="1659767636" name="Imagen 1" descr="Texto&#10;&#10;El contenido generado por IA puede ser incorrecto."/>
-                    <pic:cNvPicPr/>
-                  </pic:nvPicPr>
-                  <pic:blipFill>
-                    <a:blip r:embed="rId17"/>
-                    <a:stretch>
-                      <a:fillRect/>
-                    </a:stretch>
-                  </pic:blipFill>
-                  <pic:spPr>
-                    <a:xfrm>
-                      <a:off x="0" y="0"/>
-                      <a:ext cx="1316700" cy="2366151"/>
-                    </a:xfrm>
-                    <a:prstGeom prst="rect">
-                      <a:avLst/>
-                    </a:prstGeom>
-                  </pic:spPr>
-                </pic:pic>
-              </a:graphicData>
-            </a:graphic>
-          </wp:inline>
-        </w:drawing>
-      </w:r>
-      <w:r>
-        <w:drawing>
-          <wp:inline distT="0" distB="0" distL="0" distR="0" wp14:anchorId="7FBC2D00" wp14:editId="711756E0">
-            <wp:extent cx="2575783" cy="1089754"/>
-            <wp:effectExtent l="0" t="0" r="0" b="0"/>
-            <wp:docPr id="10419692" name="Imagen 1" descr="Imagen que contiene tabla, hecho de madera, sostener&#10;&#10;El contenido generado por IA puede ser incorrecto."/>
-            <wp:cNvGraphicFramePr>
-              <a:graphicFrameLocks xmlns:a="http://schemas.openxmlformats.org/drawingml/2006/main" noChangeAspect="1"/>
-            </wp:cNvGraphicFramePr>
-            <a:graphic xmlns:a="http://schemas.openxmlformats.org/drawingml/2006/main">
-              <a:graphicData uri="http://schemas.openxmlformats.org/drawingml/2006/picture">
-                <pic:pic xmlns:pic="http://schemas.openxmlformats.org/drawingml/2006/picture">
-                  <pic:nvPicPr>
-                    <pic:cNvPr id="10419692" name="Imagen 1" descr="Imagen que contiene tabla, hecho de madera, sostener&#10;&#10;El contenido generado por IA puede ser incorrecto."/>
-                    <pic:cNvPicPr/>
-                  </pic:nvPicPr>
-                  <pic:blipFill>
-                    <a:blip r:embed="rId18"/>
-                    <a:stretch>
-                      <a:fillRect/>
-                    </a:stretch>
-                  </pic:blipFill>
-                  <pic:spPr>
-                    <a:xfrm>
-                      <a:off x="0" y="0"/>
-                      <a:ext cx="2575783" cy="1089754"/>
-                    </a:xfrm>
-                    <a:prstGeom prst="rect">
-                      <a:avLst/>
-                    </a:prstGeom>
-                  </pic:spPr>
-                </pic:pic>
-              </a:graphicData>
-            </a:graphic>
-          </wp:inline>
-        </w:drawing>
-      </w:r>
-    </w:p>
-    <w:p>
-      <w:pPr>
-        <w:pStyle w:val="Descripcin"/>
-        <w:jc w:val="both"/>
-      </w:pPr>
-      <w:r>
-        <w:t xml:space="preserve">                     Figure </w:t>
-      </w:r>
-      <w:r>
-        <w:fldChar w:fldCharType="begin"/>
-      </w:r>
-      <w:r>
-        <w:instrText xml:space="preserve"> SEQ Figure \* ARABIC </w:instrText>
-      </w:r>
-      <w:r>
-        <w:fldChar w:fldCharType="separate"/>
-      </w:r>
-      <w:r>
-        <w:rPr>
-          <w:noProof/>
-        </w:rPr>
-        <w:t>5</w:t>
-      </w:r>
-      <w:r>
-        <w:fldChar w:fldCharType="end"/>
-      </w:r>
-      <w:r>
-        <w:t xml:space="preserve"> </w:t>
-      </w:r>
-      <w:r>
-        <w:t xml:space="preserve">                         </w:t>
-      </w:r>
-      <w:r>
-        <w:t xml:space="preserve">Figure </w:t>
-      </w:r>
-      <w:r>
-        <w:fldChar w:fldCharType="begin"/>
-      </w:r>
-      <w:r>
-        <w:instrText xml:space="preserve"> SEQ Figure \* ARABIC </w:instrText>
-      </w:r>
-      <w:r>
-        <w:fldChar w:fldCharType="separate"/>
-      </w:r>
-      <w:r>
-        <w:rPr>
-          <w:noProof/>
-        </w:rPr>
-        <w:t>6</w:t>
-      </w:r>
-      <w:r>
-        <w:fldChar w:fldCharType="end"/>
-      </w:r>
+      </w:pPr>
+    </w:p>
+    <w:p>
+      <w:pPr>
+        <w:pStyle w:val="Textoindependiente"/>
+      </w:pPr>
+      <w:r>
+        <w:t xml:space="preserve">As an example, </w:t>
+      </w:r>
+      <w:r>
+        <w:t xml:space="preserve">suppose that x0 </w:t>
+      </w:r>
+      <w:r>
+        <w:rPr>
+          <w:rFonts w:ascii="Cambria Math" w:hAnsi="Cambria Math" w:cs="Cambria Math"/>
+        </w:rPr>
+        <w:t>∈</w:t>
+      </w:r>
+      <w:r>
+        <w:t xml:space="preserve"> [0, 5] and x1 </w:t>
+      </w:r>
+      <w:r>
+        <w:rPr>
+          <w:rFonts w:ascii="Cambria Math" w:hAnsi="Cambria Math" w:cs="Cambria Math"/>
+        </w:rPr>
+        <w:t>∈</w:t>
+      </w:r>
+      <w:r>
+        <w:t xml:space="preserve"> [2, 3]. Then:</w:t>
+      </w:r>
+    </w:p>
+    <w:p>
+      <w:pPr>
+        <w:ind w:firstLine="0"/>
+        <w:rPr>
+          <w:rFonts w:ascii="Cambria Math" w:hAnsi="Cambria Math" w:cs="Cambria Math"/>
+        </w:rPr>
+      </w:pPr>
+      <w:r>
+        <w:tab/>
+      </w:r>
+      <w:r>
+        <w:t>Bounds(x0+x1)=(0+2,5+3)=(2,8)</w:t>
+      </w:r>
+    </w:p>
+    <w:p>
+      <w:pPr>
+        <w:rPr>
+          <w:rFonts w:ascii="Cambria Math" w:hAnsi="Cambria Math" w:cs="Cambria Math"/>
+        </w:rPr>
+      </w:pPr>
+      <w:r>
+        <w:t>Bounds(x0−x1)=(0−3,5−2)=(−3,3)</w:t>
+      </w:r>
+    </w:p>
+    <w:p>
+      <w:r>
+        <w:t>Bounds(x0</w:t>
+      </w:r>
+      <w:r>
+        <w:rPr>
+          <w:rFonts w:ascii="Cambria Math" w:hAnsi="Cambria Math" w:cs="Cambria Math"/>
+        </w:rPr>
+        <w:t>⋅</w:t>
+      </w:r>
+      <w:r>
+        <w:t>x1)=(0</w:t>
+      </w:r>
+      <w:r>
+        <w:rPr>
+          <w:rFonts w:ascii="Cambria Math" w:hAnsi="Cambria Math" w:cs="Cambria Math"/>
+        </w:rPr>
+        <w:t>⋅</w:t>
+      </w:r>
+      <w:r>
+        <w:t>2,5</w:t>
+      </w:r>
+      <w:r>
+        <w:rPr>
+          <w:rFonts w:ascii="Cambria Math" w:hAnsi="Cambria Math" w:cs="Cambria Math"/>
+        </w:rPr>
+        <w:t>⋅</w:t>
+      </w:r>
+      <w:r>
+        <w:t>3)=(0,15)</w:t>
+      </w:r>
+    </w:p>
+    <w:p>
+      <w:pPr>
+        <w:ind w:left="720"/>
+      </w:pPr>
     </w:p>
     <w:p>
       <w:pPr>
@@ -4369,10 +4223,7 @@
         <w:pStyle w:val="Textoindependiente"/>
       </w:pPr>
       <w:r>
-        <w:t xml:space="preserve">There are two kinds of divisions in Circom, the Divison and the Interger Division. The two of them have </w:t>
-      </w:r>
-      <w:r>
-        <w:t>very similar bounds, the minimum is going to be 0 for both of them, and the maximum is going to be the prime number for Division, and the max of the left expression for the Integer Division.</w:t>
+        <w:t xml:space="preserve">There are two kinds of divisions in Circom, the Divison and the Interger Division. </w:t>
       </w:r>
     </w:p>
     <w:p>
@@ -4380,6 +4231,25 @@
         <w:pStyle w:val="Textoindependiente"/>
       </w:pPr>
       <w:r>
+        <w:t xml:space="preserve">For the Division </w:t>
+      </w:r>
+      <w:r>
+        <w:t xml:space="preserve">Since the quotient may vary widely, the analysis uses the most conservative bound and assumes that the result can range over the whole field. </w:t>
+      </w:r>
+    </w:p>
+    <w:p>
+      <w:pPr>
+        <w:pStyle w:val="Textoindependiente"/>
+      </w:pPr>
+      <w:r>
+        <w:t>For integer division, the result is always truncated, so its value cannot be larger than the numerator. For this reason, the upper bound is taken from the left operand:</w:t>
+      </w:r>
+    </w:p>
+    <w:p>
+      <w:pPr>
+        <w:pStyle w:val="Textoindependiente"/>
+      </w:pPr>
+      <w:r>
         <w:t>If Bounds(e1) = (min1, max1) and Bounds(e2)= (min2, max2) then</w:t>
       </w:r>
     </w:p>
@@ -4435,10 +4305,118 @@
         <w:t>,</w:t>
       </w:r>
       <w:r>
+        <w:t xml:space="preserve"> max1</w:t>
+      </w:r>
+      <w:r>
+        <w:t>)</w:t>
+      </w:r>
+    </w:p>
+    <w:p>
+      <w:pPr>
+        <w:pStyle w:val="Textoindependiente"/>
+        <w:rPr>
+          <w:u w:val="single"/>
+        </w:rPr>
+      </w:pPr>
+    </w:p>
+    <w:p>
+      <w:pPr>
+        <w:pStyle w:val="Ttulo4"/>
+      </w:pPr>
+      <w:r>
+        <w:t xml:space="preserve">Power </w:t>
+      </w:r>
+      <w:r>
+        <w:t xml:space="preserve">and modulus </w:t>
+      </w:r>
+      <w:r>
+        <w:t>operations</w:t>
+      </w:r>
+    </w:p>
+    <w:p>
+      <w:pPr>
+        <w:pStyle w:val="Textoindependiente"/>
+      </w:pPr>
+      <w:r>
+        <w:t>The</w:t>
+      </w:r>
+      <w:r>
+        <w:t xml:space="preserve">se </w:t>
+      </w:r>
+      <w:r>
+        <w:t>operation</w:t>
+      </w:r>
+      <w:r>
+        <w:t>s</w:t>
+      </w:r>
+      <w:r>
         <w:t xml:space="preserve"> </w:t>
       </w:r>
       <w:r>
-        <w:t>max1</w:t>
+        <w:t>have very easy bounds. For the power, we are going to keep the prime as maximum, and  0 for the minimum. And for the modulus, the minimum would be 0, and the maximum will be the expression on the right.</w:t>
+      </w:r>
+    </w:p>
+    <w:p>
+      <w:pPr>
+        <w:pStyle w:val="Textoindependiente"/>
+      </w:pPr>
+      <w:r>
+        <w:t>If Bounds(e1) = (min1, max1) and Bounds(e2)= (min2, max2) then</w:t>
+      </w:r>
+    </w:p>
+    <w:p>
+      <w:pPr>
+        <w:pStyle w:val="Textoindependiente"/>
+        <w:rPr>
+          <w:lang w:val="es-ES"/>
+        </w:rPr>
+      </w:pPr>
+      <w:r>
+        <w:rPr>
+          <w:lang w:val="es-ES"/>
+        </w:rPr>
+        <w:t>Bounds(e1%e2) = (0, max2)</w:t>
+      </w:r>
+    </w:p>
+    <w:p>
+      <w:pPr>
+        <w:pStyle w:val="Textoindependiente"/>
+        <w:rPr>
+          <w:u w:val="single"/>
+        </w:rPr>
+      </w:pPr>
+      <w:r>
+        <w:rPr>
+          <w:lang w:val="es-ES"/>
+        </w:rPr>
+        <w:t xml:space="preserve">Bounds(e1 </w:t>
+      </w:r>
+      <w:r>
+        <w:rPr>
+          <w:lang w:val="es-ES"/>
+        </w:rPr>
+        <w:t>**</w:t>
+      </w:r>
+      <w:r>
+        <w:rPr>
+          <w:lang w:val="es-ES"/>
+        </w:rPr>
+        <w:t>e2) = (</w:t>
+      </w:r>
+      <w:r>
+        <w:rPr>
+          <w:lang w:val="es-ES"/>
+        </w:rPr>
+        <w:t>0</w:t>
+      </w:r>
+      <w:r>
+        <w:t>,</w:t>
+      </w:r>
+      <w:r>
+        <w:t xml:space="preserve"> </w:t>
+      </w:r>
+      <w:r>
+        <w:t>prime</w:t>
       </w:r>
       <w:r>
         <w:t>)</w:t>
@@ -4446,24 +4424,95 @@
     </w:p>
     <w:p>
       <w:pPr>
+        <w:pStyle w:val="Ttulo4"/>
+      </w:pPr>
+      <w:r>
+        <w:t>Shift operations</w:t>
+      </w:r>
+    </w:p>
+    <w:p>
+      <w:pPr>
         <w:pStyle w:val="Textoindependiente"/>
+      </w:pPr>
+      <w:r>
+        <w:t>For the shift left, the maximum and minimum will be shifted so we shall multiply them by 2 to the power of the minimum and maximum. As for the right shift, we will just keep the maximum of the left expression, and for the minimum we will have a 0.</w:t>
+      </w:r>
+    </w:p>
+    <w:p>
+      <w:pPr>
+        <w:pStyle w:val="Textoindependiente"/>
+      </w:pPr>
+      <w:r>
+        <w:t>If Bounds(e1) = (min1, max1) and Bounds(e2)= (min2, max2) then</w:t>
+      </w:r>
+    </w:p>
+    <w:p>
+      <w:pPr>
+        <w:pStyle w:val="Textoindependiente"/>
+      </w:pPr>
+      <w:r>
+        <w:t xml:space="preserve">Bounds(e1 </w:t>
+      </w:r>
+      <w:r>
+        <w:t xml:space="preserve">&lt;&lt; </w:t>
+      </w:r>
+      <w:r>
+        <w:t xml:space="preserve">e2) = (min1*2^min2, </w:t>
+      </w:r>
+      <w:r>
+        <w:t>max1*2^max2</w:t>
+      </w:r>
+      <w:r>
+        <w:t>)</w:t>
+      </w:r>
+    </w:p>
+    <w:p>
+      <w:pPr>
+        <w:pStyle w:val="Textoindependiente"/>
         <w:rPr>
           <w:u w:val="single"/>
         </w:rPr>
       </w:pPr>
+      <w:r>
+        <w:t xml:space="preserve">Bounds(e1 </w:t>
+      </w:r>
+      <w:r>
+        <w:t xml:space="preserve">&gt;&gt; </w:t>
+      </w:r>
+      <w:r>
+        <w:t>e2) = (0</w:t>
+      </w:r>
+      <w:r>
+        <w:t>,</w:t>
+      </w:r>
+      <w:r>
+        <w:t xml:space="preserve"> max1</w:t>
+      </w:r>
+      <w:r>
+        <w:t>)</w:t>
+      </w:r>
+    </w:p>
+    <w:p>
+      <w:pPr>
+        <w:pStyle w:val="Textoindependiente"/>
+      </w:pPr>
+    </w:p>
+    <w:p>
+      <w:pPr>
+        <w:pStyle w:val="Textoindependiente"/>
+      </w:pPr>
+    </w:p>
+    <w:p>
+      <w:pPr>
+        <w:pStyle w:val="Textoindependiente"/>
+      </w:pPr>
     </w:p>
     <w:p>
       <w:pPr>
         <w:pStyle w:val="Ttulo4"/>
       </w:pPr>
       <w:r>
-        <w:t xml:space="preserve">Power </w:t>
-      </w:r>
-      <w:r>
-        <w:t xml:space="preserve">and modulus </w:t>
-      </w:r>
-      <w:r>
-        <w:t>operations</w:t>
+        <w:t>Boolean operations</w:t>
       </w:r>
     </w:p>
     <w:p>
@@ -4471,226 +4520,49 @@
         <w:pStyle w:val="Textoindependiente"/>
       </w:pPr>
       <w:r>
-        <w:t>The</w:t>
-      </w:r>
-      <w:r>
-        <w:t xml:space="preserve">se </w:t>
-      </w:r>
-      <w:r>
-        <w:t>operation</w:t>
-      </w:r>
-      <w:r>
-        <w:t>s</w:t>
-      </w:r>
-      <w:r>
-        <w:t xml:space="preserve"> </w:t>
-      </w:r>
-      <w:r>
-        <w:t>have very easy bounds. For the power, we are going to keep the prime as maximum, and  0 for the minimum. And for the modulus, the minimum would be 0, and the maximum will be the expression on the right.</w:t>
-      </w:r>
-    </w:p>
-    <w:p>
-      <w:pPr>
-        <w:pStyle w:val="Textoindependiente"/>
-      </w:pPr>
-      <w:r>
-        <w:t>If Bounds(e1) = (min1, max1) and Bounds(e2)= (min2, max2) then</w:t>
-      </w:r>
-    </w:p>
-    <w:p>
-      <w:pPr>
-        <w:pStyle w:val="Textoindependiente"/>
-        <w:rPr>
-          <w:lang w:val="es-ES"/>
-        </w:rPr>
-      </w:pPr>
-      <w:r>
-        <w:rPr>
-          <w:lang w:val="es-ES"/>
-        </w:rPr>
-        <w:t>Bounds(e1</w:t>
-      </w:r>
-      <w:r>
-        <w:rPr>
-          <w:lang w:val="es-ES"/>
-        </w:rPr>
-        <w:t>%</w:t>
-      </w:r>
-      <w:r>
-        <w:rPr>
-          <w:lang w:val="es-ES"/>
-        </w:rPr>
-        <w:t xml:space="preserve">e2) = (0, </w:t>
-      </w:r>
-      <w:r>
-        <w:rPr>
-          <w:lang w:val="es-ES"/>
-        </w:rPr>
-        <w:t>max2</w:t>
-      </w:r>
-      <w:r>
-        <w:rPr>
-          <w:lang w:val="es-ES"/>
-        </w:rPr>
-        <w:t>)</w:t>
-      </w:r>
-    </w:p>
-    <w:p>
-      <w:pPr>
-        <w:pStyle w:val="Textoindependiente"/>
-        <w:rPr>
-          <w:u w:val="single"/>
-        </w:rPr>
-      </w:pPr>
-      <w:r>
-        <w:rPr>
-          <w:lang w:val="es-ES"/>
-        </w:rPr>
-        <w:t xml:space="preserve">Bounds(e1 </w:t>
-      </w:r>
-      <w:r>
-        <w:rPr>
-          <w:lang w:val="es-ES"/>
-        </w:rPr>
-        <w:t>**</w:t>
-      </w:r>
-      <w:r>
-        <w:rPr>
-          <w:lang w:val="es-ES"/>
-        </w:rPr>
-        <w:t>e2) = (</w:t>
-      </w:r>
-      <w:r>
-        <w:rPr>
-          <w:lang w:val="es-ES"/>
-        </w:rPr>
-        <w:t>0</w:t>
-      </w:r>
-      <w:r>
-        <w:t>,</w:t>
-      </w:r>
-      <w:r>
-        <w:t xml:space="preserve"> </w:t>
-      </w:r>
-      <w:r>
-        <w:t>prime</w:t>
-      </w:r>
-      <w:r>
-        <w:t>)</w:t>
-      </w:r>
-    </w:p>
-    <w:p>
-      <w:pPr>
-        <w:pStyle w:val="Ttulo4"/>
-      </w:pPr>
-      <w:r>
-        <w:t>Shift operations</w:t>
-      </w:r>
-    </w:p>
-    <w:p>
-      <w:pPr>
-        <w:pStyle w:val="Textoindependiente"/>
-      </w:pPr>
-      <w:r>
-        <w:t>For the shift left, the maximum and minimum will be shifted so we shall multiply them by 2 to the power of the minimum and maximum. As for the right shift, we will just keep the maximum of the left expression, and for the minimum we will have a 0.</w:t>
-      </w:r>
-    </w:p>
-    <w:p>
-      <w:pPr>
-        <w:pStyle w:val="Textoindependiente"/>
-      </w:pPr>
-      <w:r>
-        <w:t>If Bounds(e1) = (min1, max1) and Bounds(e2)= (min2, max2) then</w:t>
-      </w:r>
-    </w:p>
-    <w:p>
-      <w:pPr>
-        <w:pStyle w:val="Textoindependiente"/>
-      </w:pPr>
-      <w:r>
-        <w:t>Bounds(e1</w:t>
-      </w:r>
-      <w:r>
-        <w:t xml:space="preserve"> </w:t>
-      </w:r>
-      <w:r>
-        <w:t xml:space="preserve">&lt;&lt; </w:t>
-      </w:r>
-      <w:r>
-        <w:t>e2) = (</w:t>
-      </w:r>
-      <w:r>
-        <w:t>min1*2^min2</w:t>
+        <w:t xml:space="preserve">The operators considered in this group are </w:t>
+      </w:r>
+      <w:r>
+        <w:t>Lesser</w:t>
       </w:r>
       <w:r>
         <w:t xml:space="preserve">, </w:t>
       </w:r>
       <w:r>
-        <w:t>max1*2^max2</w:t>
-      </w:r>
-      <w:r>
-        <w:t>)</w:t>
-      </w:r>
-    </w:p>
-    <w:p>
-      <w:pPr>
-        <w:pStyle w:val="Textoindependiente"/>
-        <w:rPr>
-          <w:u w:val="single"/>
-        </w:rPr>
-      </w:pPr>
-      <w:r>
-        <w:t xml:space="preserve">Bounds(e1 </w:t>
-      </w:r>
-      <w:r>
-        <w:t xml:space="preserve">&gt;&gt; </w:t>
-      </w:r>
-      <w:r>
-        <w:t>e2) = (0</w:t>
-      </w:r>
-      <w:r>
-        <w:t>,</w:t>
-      </w:r>
-      <w:r>
-        <w:t xml:space="preserve"> </w:t>
-      </w:r>
-      <w:r>
-        <w:t>max1</w:t>
-      </w:r>
-      <w:r>
-        <w:t>)</w:t>
-      </w:r>
-    </w:p>
-    <w:p>
-      <w:pPr>
-        <w:pStyle w:val="Textoindependiente"/>
-      </w:pPr>
-    </w:p>
-    <w:p>
-      <w:pPr>
-        <w:pStyle w:val="Textoindependiente"/>
-      </w:pPr>
-    </w:p>
-    <w:p>
-      <w:pPr>
-        <w:pStyle w:val="Textoindependiente"/>
-      </w:pPr>
-    </w:p>
-    <w:p>
-      <w:pPr>
-        <w:pStyle w:val="Ttulo4"/>
-      </w:pPr>
-      <w:r>
-        <w:lastRenderedPageBreak/>
-        <w:t>Boolean operations</w:t>
-      </w:r>
-    </w:p>
-    <w:p>
-      <w:pPr>
-        <w:pStyle w:val="Textoindependiente"/>
-      </w:pPr>
-      <w:r>
-        <w:t>This operations have a common characteristic, which is that the result is always going to be either “1” or “0”. This gives as an easy calculation of the bounds of the expressions because the maximum will always be “1”, and the minimum will always be “0”.</w:t>
+        <w:t>LesserEq</w:t>
+      </w:r>
+      <w:r>
+        <w:t xml:space="preserve">, </w:t>
+      </w:r>
+      <w:r>
+        <w:t>Greater</w:t>
+      </w:r>
+      <w:r>
+        <w:t xml:space="preserve">, </w:t>
+      </w:r>
+      <w:r>
+        <w:t>GreaterEq</w:t>
+      </w:r>
+      <w:r>
+        <w:t xml:space="preserve">, </w:t>
+      </w:r>
+      <w:r>
+        <w:t>Eq</w:t>
+      </w:r>
+      <w:r>
+        <w:t xml:space="preserve">, </w:t>
+      </w:r>
+      <w:r>
+        <w:t xml:space="preserve">NotEq, </w:t>
+      </w:r>
+      <w:r>
+        <w:t>BoolOr, and BoolAnd. Their common characteristic is that they always produce a boolean result, that is, either 0 or 1</w:t>
+      </w:r>
+      <w:r>
+        <w:t>. Because of that</w:t>
+      </w:r>
+      <w:r>
+        <w:t>, the bounds of any expression using one of these operators are always:</w:t>
       </w:r>
     </w:p>
     <w:p>
@@ -4841,34 +4713,434 @@
         <w:t xml:space="preserve">e2) = </w:t>
       </w:r>
       <w:r>
+        <w:t>{0</w:t>
+      </w:r>
+      <w:r>
+        <w:t xml:space="preserve">, </w:t>
+      </w:r>
+      <w:r>
+        <w:t xml:space="preserve"> min(max1, max2)}</w:t>
+      </w:r>
+    </w:p>
+    <w:p>
+      <w:pPr>
+        <w:pStyle w:val="Textoindependiente"/>
+      </w:pPr>
+      <w:r>
+        <w:t xml:space="preserve">Bounds(e1 </w:t>
+      </w:r>
+      <w:r>
+        <w:t>^</w:t>
+      </w:r>
+      <w:r>
+        <w:t xml:space="preserve"> </w:t>
+      </w:r>
+      <w:r>
+        <w:t xml:space="preserve">e2) = </w:t>
+      </w:r>
+      <w:r>
+        <w:t>{0</w:t>
+      </w:r>
+      <w:r>
+        <w:t xml:space="preserve">, </w:t>
+      </w:r>
+      <w:r>
+        <w:t xml:space="preserve"> max1+max2}</w:t>
+      </w:r>
+    </w:p>
+    <w:p>
+      <w:pPr>
+        <w:pStyle w:val="Textoindependiente"/>
+      </w:pPr>
+      <w:r>
+        <w:t xml:space="preserve">As an example, </w:t>
+      </w:r>
+      <w:r>
+        <w:t xml:space="preserve">suppose that x0 </w:t>
+      </w:r>
+      <w:r>
+        <w:rPr>
+          <w:rFonts w:ascii="Cambria Math" w:hAnsi="Cambria Math" w:cs="Cambria Math"/>
+        </w:rPr>
+        <w:t>∈</w:t>
+      </w:r>
+      <w:r>
+        <w:t xml:space="preserve"> [0, 5] and x1 </w:t>
+      </w:r>
+      <w:r>
+        <w:rPr>
+          <w:rFonts w:ascii="Cambria Math" w:hAnsi="Cambria Math" w:cs="Cambria Math"/>
+        </w:rPr>
+        <w:t>∈</w:t>
+      </w:r>
+      <w:r>
+        <w:t xml:space="preserve"> [2, 3]. Then:</w:t>
+      </w:r>
+    </w:p>
+    <w:p>
+      <w:pPr>
+        <w:ind w:firstLine="0"/>
+        <w:rPr>
+          <w:rFonts w:ascii="Cambria Math" w:hAnsi="Cambria Math" w:cs="Cambria Math"/>
+        </w:rPr>
+      </w:pPr>
+      <w:r>
+        <w:tab/>
+      </w:r>
+      <w:r>
+        <w:t>Bounds(x0</w:t>
+      </w:r>
+      <w:r>
+        <w:t>|</w:t>
+      </w:r>
+      <w:r>
+        <w:t>x1)=</w:t>
+      </w:r>
+      <w:r>
+        <w:t>{max(</w:t>
+      </w:r>
+      <w:r>
+        <w:t>0</w:t>
+      </w:r>
+      <w:r>
+        <w:t>,</w:t>
+      </w:r>
+      <w:r>
+        <w:t>2</w:t>
+      </w:r>
+      <w:r>
+        <w:t>)</w:t>
+      </w:r>
+      <w:r>
+        <w:t>,5+3</w:t>
+      </w:r>
+      <w:r>
+        <w:t>}</w:t>
+      </w:r>
+      <w:r>
+        <w:t>=(2,8)</w:t>
+      </w:r>
+    </w:p>
+    <w:p>
+      <w:pPr>
+        <w:rPr>
+          <w:rFonts w:ascii="Cambria Math" w:hAnsi="Cambria Math" w:cs="Cambria Math"/>
+        </w:rPr>
+      </w:pPr>
+      <w:r>
+        <w:t>Bounds(x0</w:t>
+      </w:r>
+      <w:r>
+        <w:t>&amp;</w:t>
+      </w:r>
+      <w:r>
+        <w:t>x1)=</w:t>
+      </w:r>
+      <w:r>
         <w:t>{</w:t>
       </w:r>
       <w:r>
+        <w:t>0,</w:t>
+      </w:r>
+      <w:r>
+        <w:t xml:space="preserve"> min(5,3)}</w:t>
+      </w:r>
+      <w:r>
+        <w:t>=(</w:t>
+      </w:r>
+      <w:r>
         <w:t>0</w:t>
       </w:r>
       <w:r>
+        <w:t>,3)</w:t>
+      </w:r>
+    </w:p>
+    <w:p>
+      <w:r>
+        <w:t>Bounds(x0</w:t>
+      </w:r>
+      <w:r>
+        <w:rPr>
+          <w:rFonts w:ascii="Cambria Math" w:hAnsi="Cambria Math" w:cs="Cambria Math"/>
+        </w:rPr>
+        <w:t>^</w:t>
+      </w:r>
+      <w:r>
+        <w:t>x1)=(0,5</w:t>
+      </w:r>
+      <w:r>
+        <w:rPr>
+          <w:rFonts w:ascii="Cambria Math" w:hAnsi="Cambria Math" w:cs="Cambria Math"/>
+        </w:rPr>
+        <w:t>+</w:t>
+      </w:r>
+      <w:r>
+        <w:t>3)=(0,</w:t>
+      </w:r>
+      <w:r>
+        <w:t>8</w:t>
+      </w:r>
+      <w:r>
+        <w:t>)</w:t>
+      </w:r>
+    </w:p>
+    <w:p>
+      <w:pPr>
+        <w:pStyle w:val="Textoindependiente"/>
+      </w:pPr>
+    </w:p>
+    <w:p>
+      <w:pPr>
+        <w:pStyle w:val="Textoindependiente"/>
+      </w:pPr>
+    </w:p>
+    <w:p>
+      <w:pPr>
+        <w:pStyle w:val="Ttulo3"/>
+      </w:pPr>
+      <w:r>
+        <w:lastRenderedPageBreak/>
+        <w:t>Prefix operations</w:t>
+      </w:r>
+    </w:p>
+    <w:p>
+      <w:pPr>
+        <w:pStyle w:val="Textoindependiente"/>
+      </w:pPr>
+      <w:r>
+        <w:t>This kind of operation consists of only one expression and one operand, which makes them easier than the previous ones. Also, in this category there are only three different operands, which bounds are calculated as follows:</w:t>
+      </w:r>
+    </w:p>
+    <w:p>
+      <w:pPr>
+        <w:pStyle w:val="Ttulo4"/>
+      </w:pPr>
+      <w:r>
+        <w:t>Subtraction</w:t>
+      </w:r>
+    </w:p>
+    <w:p>
+      <w:pPr>
+        <w:pStyle w:val="Textoindependiente"/>
+      </w:pPr>
+      <w:r>
+        <w:t>This operation denominated as “Sub”, consists of a minus before the expression, and because of that, the minimum is -max, ad the maximus is -min. As we want values between [0, prime), we will add prime-1 to both.</w:t>
+      </w:r>
+    </w:p>
+    <w:p>
+      <w:pPr>
+        <w:pStyle w:val="Textoindependiente"/>
+      </w:pPr>
+      <w:r>
+        <w:t>If Bounds(e1) = (min1, max1) then</w:t>
+      </w:r>
+    </w:p>
+    <w:p>
+      <w:pPr>
+        <w:pStyle w:val="Textoindependiente"/>
+      </w:pPr>
+      <w:r>
+        <w:t>Bounds(</w:t>
+      </w:r>
+      <w:r>
+        <w:t>-</w:t>
+      </w:r>
+      <w:r>
+        <w:t xml:space="preserve">e1) = </w:t>
+      </w:r>
+      <w:r>
+        <w:t>(-max1 + prime-1, -min1 + prime-1)</w:t>
+      </w:r>
+    </w:p>
+    <w:p>
+      <w:pPr>
+        <w:pStyle w:val="Ttulo4"/>
+      </w:pPr>
+      <w:r>
+        <w:t>Not</w:t>
+      </w:r>
+    </w:p>
+    <w:p>
+      <w:pPr>
+        <w:pStyle w:val="Textoindependiente"/>
+      </w:pPr>
+      <w:r>
+        <w:t>This operation denominated as “BoolNot” is used for Boolean expressions, and because of that, its bounds are easier as they are [0, 1].</w:t>
+      </w:r>
+    </w:p>
+    <w:p>
+      <w:pPr>
+        <w:pStyle w:val="Textoindependiente"/>
+      </w:pPr>
+      <w:r>
+        <w:t>If Bounds(e1) = (min1, max1) then</w:t>
+      </w:r>
+    </w:p>
+    <w:p>
+      <w:pPr>
+        <w:pStyle w:val="Textoindependiente"/>
+      </w:pPr>
+      <w:r>
+        <w:t>Bounds(</w:t>
+      </w:r>
+      <w:r>
+        <w:t>!</w:t>
+      </w:r>
+      <w:r>
+        <w:t xml:space="preserve">e1) = </w:t>
+      </w:r>
+      <w:r>
+        <w:t>(0, 1)</w:t>
+      </w:r>
+    </w:p>
+    <w:p>
+      <w:pPr>
+        <w:pStyle w:val="Ttulo4"/>
+      </w:pPr>
+      <w:r>
+        <w:t>Complement</w:t>
+      </w:r>
+    </w:p>
+    <w:p>
+      <w:pPr>
+        <w:pStyle w:val="Textoindependiente"/>
+      </w:pPr>
+      <w:r>
+        <w:t>This binary operations converts all 1s to 0s and vice versa, therefore, the minumun will be 0, and the maximum will be</w:t>
+      </w:r>
+      <w:r>
+        <w:t xml:space="preserve"> twice</w:t>
+      </w:r>
+      <w:r>
+        <w:t xml:space="preserve"> the max values of the expression. </w:t>
+      </w:r>
+    </w:p>
+    <w:p>
+      <w:pPr>
+        <w:pStyle w:val="Textoindependiente"/>
+      </w:pPr>
+      <w:r>
+        <w:t>If Bounds(e1) = (min1, max1) then</w:t>
+      </w:r>
+    </w:p>
+    <w:p>
+      <w:pPr>
+        <w:pStyle w:val="Textoindependiente"/>
+      </w:pPr>
+      <w:r>
+        <w:t>Bounds(</w:t>
+      </w:r>
+      <w:r>
+        <w:t>~</w:t>
+      </w:r>
+      <w:r>
+        <w:t xml:space="preserve">e1) = </w:t>
+      </w:r>
+      <w:r>
+        <w:t>(0,max1*2)</w:t>
+      </w:r>
+    </w:p>
+    <w:p>
+      <w:pPr>
+        <w:pStyle w:val="Textoindependiente"/>
+      </w:pPr>
+    </w:p>
+    <w:p>
+      <w:pPr>
+        <w:pStyle w:val="Textoindependiente"/>
+      </w:pPr>
+    </w:p>
+    <w:p>
+      <w:pPr>
+        <w:pStyle w:val="Textoindependiente"/>
+      </w:pPr>
+    </w:p>
+    <w:p>
+      <w:pPr>
+        <w:pStyle w:val="Textoindependiente"/>
+      </w:pPr>
+    </w:p>
+    <w:p>
+      <w:pPr>
+        <w:pStyle w:val="Ttulo3"/>
+      </w:pPr>
+      <w:r>
+        <w:lastRenderedPageBreak/>
+        <w:t>Switch operations</w:t>
+      </w:r>
+    </w:p>
+    <w:p>
+      <w:pPr>
+        <w:pStyle w:val="Textoindependiente"/>
+      </w:pPr>
+      <w:r>
+        <w:t xml:space="preserve">The switch operation works as an if else operation, so we will have two expressions and the context. To calculate the bounds of the switch operation, we will first calculate the bounds of both expressions, and then, we will keep the minimum value of both </w:t>
+      </w:r>
+      <w:r>
+        <w:t>expressions</w:t>
+      </w:r>
+      <w:r>
+        <w:t xml:space="preserve">’ </w:t>
+      </w:r>
+      <w:r>
+        <w:t>minimums</w:t>
+      </w:r>
+      <w:r>
+        <w:t>, and the maximum value between both expressions</w:t>
+      </w:r>
+      <w:r>
+        <w:t>’</w:t>
+      </w:r>
+      <w:r>
+        <w:t xml:space="preserve"> </w:t>
+      </w:r>
+      <w:r>
+        <w:t>maximus.ç</w:t>
+      </w:r>
+    </w:p>
+    <w:p>
+      <w:pPr>
+        <w:pStyle w:val="Textoindependiente"/>
+      </w:pPr>
+      <w:r>
+        <w:t>If Bounds(e1) = (min1, max1) and Bounds(e2)= (min2, max2) then</w:t>
+      </w:r>
+    </w:p>
+    <w:p>
+      <w:pPr>
+        <w:pStyle w:val="Textoindependiente"/>
+      </w:pPr>
+      <w:r>
+        <w:t>Bounds(</w:t>
+      </w:r>
+      <w:r>
+        <w:t>Switch :</w:t>
+      </w:r>
+      <w:r>
+        <w:t>e1</w:t>
+      </w:r>
+      <w:r>
         <w:t xml:space="preserve">, </w:t>
       </w:r>
       <w:r>
-        <w:t xml:space="preserve"> </w:t>
-      </w:r>
-      <w:r>
-        <w:t>min(</w:t>
-      </w:r>
-      <w:r>
-        <w:t>max1</w:t>
+        <w:t xml:space="preserve">e2) = </w:t>
+      </w:r>
+      <w:r>
+        <w:t>{min(min1,min2)</w:t>
       </w:r>
       <w:r>
         <w:t xml:space="preserve">, </w:t>
       </w:r>
       <w:r>
-        <w:t>max2</w:t>
-      </w:r>
-      <w:r>
-        <w:t>)</w:t>
-      </w:r>
-      <w:r>
-        <w:t>}</w:t>
+        <w:t xml:space="preserve"> max(max1.max2)}</w:t>
+      </w:r>
+    </w:p>
+    <w:p>
+      <w:pPr>
+        <w:pStyle w:val="Ttulo3"/>
+      </w:pPr>
+      <w:r>
+        <w:t>Variables</w:t>
       </w:r>
     </w:p>
     <w:p>
@@ -4876,454 +5148,53 @@
         <w:pStyle w:val="Textoindependiente"/>
       </w:pPr>
       <w:r>
-        <w:t xml:space="preserve">Bounds(e1 </w:t>
-      </w:r>
-      <w:r>
-        <w:t>^</w:t>
-      </w:r>
-      <w:r>
-        <w:t xml:space="preserve"> </w:t>
-      </w:r>
-      <w:r>
-        <w:t xml:space="preserve">e2) = </w:t>
-      </w:r>
-      <w:r>
-        <w:t>{0</w:t>
-      </w:r>
-      <w:r>
-        <w:t xml:space="preserve">, </w:t>
-      </w:r>
-      <w:r>
-        <w:t xml:space="preserve"> max1+max2</w:t>
-      </w:r>
-      <w:r>
-        <w:t>}</w:t>
+        <w:t>For the variables, we will receive an String and the context, and to obtain the bounds of the variables, we will just have to rearch in the context if the varible already exists, and clone its bounds, or if it doesn’t exist on the contest, we just have to create its bounds which will be [0, prime).</w:t>
+      </w:r>
+    </w:p>
+    <w:p>
+      <w:pPr>
+        <w:pStyle w:val="Ttulo3"/>
+      </w:pPr>
+      <w:r>
+        <w:t>Numbers</w:t>
       </w:r>
     </w:p>
     <w:p>
       <w:pPr>
         <w:pStyle w:val="Textoindependiente"/>
       </w:pPr>
+      <w:r>
+        <w:t>For the numbers, it will be much easier than any other operation, because its maximum and minimum bounds will have as value the given number.</w:t>
+      </w:r>
+    </w:p>
+    <w:p>
+      <w:pPr>
+        <w:pStyle w:val="Ttulo3"/>
+      </w:pPr>
+      <w:r>
+        <w:t>Array in line</w:t>
+      </w:r>
+    </w:p>
+    <w:p>
+      <w:pPr>
+        <w:pStyle w:val="Textoindependiente"/>
+      </w:pPr>
+      <w:r>
+        <w:t xml:space="preserve">In the case of the array in line, we want to find the minimum bound between all the elements of the array, and also the maximum </w:t>
+      </w:r>
+      <w:r>
+        <w:t>bound of the same elements, so we will have to traverse the array trying to find those values.</w:t>
+      </w:r>
     </w:p>
     <w:p>
       <w:pPr>
         <w:pStyle w:val="Textoindependiente"/>
         <w:keepNext/>
-        <w:tabs>
-          <w:tab w:val="left" w:pos="7056"/>
-        </w:tabs>
-      </w:pPr>
-      <w:r>
-        <w:drawing>
-          <wp:inline distT="0" distB="0" distL="0" distR="0" wp14:anchorId="4C90499B" wp14:editId="6FC970A4">
-            <wp:extent cx="1425063" cy="2362405"/>
-            <wp:effectExtent l="0" t="0" r="3810" b="0"/>
-            <wp:docPr id="631680208" name="Imagen 1" descr="Texto&#10;&#10;El contenido generado por IA puede ser incorrecto."/>
-            <wp:cNvGraphicFramePr>
-              <a:graphicFrameLocks xmlns:a="http://schemas.openxmlformats.org/drawingml/2006/main" noChangeAspect="1"/>
-            </wp:cNvGraphicFramePr>
-            <a:graphic xmlns:a="http://schemas.openxmlformats.org/drawingml/2006/main">
-              <a:graphicData uri="http://schemas.openxmlformats.org/drawingml/2006/picture">
-                <pic:pic xmlns:pic="http://schemas.openxmlformats.org/drawingml/2006/picture">
-                  <pic:nvPicPr>
-                    <pic:cNvPr id="631680208" name="Imagen 1" descr="Texto&#10;&#10;El contenido generado por IA puede ser incorrecto."/>
-                    <pic:cNvPicPr/>
-                  </pic:nvPicPr>
-                  <pic:blipFill>
-                    <a:blip r:embed="rId19"/>
-                    <a:stretch>
-                      <a:fillRect/>
-                    </a:stretch>
-                  </pic:blipFill>
-                  <pic:spPr>
-                    <a:xfrm>
-                      <a:off x="0" y="0"/>
-                      <a:ext cx="1425063" cy="2362405"/>
-                    </a:xfrm>
-                    <a:prstGeom prst="rect">
-                      <a:avLst/>
-                    </a:prstGeom>
-                  </pic:spPr>
-                </pic:pic>
-              </a:graphicData>
-            </a:graphic>
-          </wp:inline>
-        </w:drawing>
-      </w:r>
-    </w:p>
-    <w:p>
-      <w:pPr>
-        <w:pStyle w:val="Descripcin"/>
-        <w:jc w:val="both"/>
-      </w:pPr>
-      <w:r>
-        <w:t xml:space="preserve">Figure </w:t>
-      </w:r>
-      <w:r>
-        <w:fldChar w:fldCharType="begin"/>
-      </w:r>
-      <w:r>
-        <w:instrText xml:space="preserve"> SEQ Figure \* ARABIC </w:instrText>
-      </w:r>
-      <w:r>
-        <w:fldChar w:fldCharType="separate"/>
-      </w:r>
+      </w:pPr>
       <w:r>
         <w:rPr>
           <w:noProof/>
         </w:rPr>
-        <w:t>7</w:t>
-      </w:r>
-      <w:r>
-        <w:fldChar w:fldCharType="end"/>
-      </w:r>
-    </w:p>
-    <w:p>
-      <w:pPr>
-        <w:pStyle w:val="Ttulo3"/>
-      </w:pPr>
-      <w:r>
-        <w:lastRenderedPageBreak/>
-        <w:t>Prefix operations</w:t>
-      </w:r>
-    </w:p>
-    <w:p>
-      <w:pPr>
-        <w:pStyle w:val="Textoindependiente"/>
-      </w:pPr>
-      <w:r>
-        <w:t>This kind of operation consists of only one expression and one operand, which makes them easier than the previous ones. Also, in this category there are only three different operands, which bounds are calculated as follows:</w:t>
-      </w:r>
-    </w:p>
-    <w:p>
-      <w:pPr>
-        <w:pStyle w:val="Ttulo4"/>
-      </w:pPr>
-      <w:r>
-        <w:t>Subtraction</w:t>
-      </w:r>
-    </w:p>
-    <w:p>
-      <w:pPr>
-        <w:pStyle w:val="Textoindependiente"/>
-      </w:pPr>
-      <w:r>
-        <w:t>This operation denominated as “Sub”, consists of a minus before the expression, and because of that, the minimum is -max, ad the maximus is -min. As we want values between [0, prime), we will add prime-1 to both.</w:t>
-      </w:r>
-    </w:p>
-    <w:p>
-      <w:pPr>
-        <w:pStyle w:val="Textoindependiente"/>
-      </w:pPr>
-      <w:r>
-        <w:t>If Bounds(e1) = (min1, max1) then</w:t>
-      </w:r>
-    </w:p>
-    <w:p>
-      <w:pPr>
-        <w:pStyle w:val="Textoindependiente"/>
-      </w:pPr>
-      <w:r>
-        <w:t>Bounds(</w:t>
-      </w:r>
-      <w:r>
-        <w:t>-</w:t>
-      </w:r>
-      <w:r>
-        <w:t xml:space="preserve">e1) = </w:t>
-      </w:r>
-      <w:r>
-        <w:t>(-max1 + prime-1, -min1 + prime-1)</w:t>
-      </w:r>
-    </w:p>
-    <w:p>
-      <w:pPr>
-        <w:pStyle w:val="Ttulo4"/>
-      </w:pPr>
-      <w:r>
-        <w:t>Not</w:t>
-      </w:r>
-    </w:p>
-    <w:p>
-      <w:pPr>
-        <w:pStyle w:val="Textoindependiente"/>
-      </w:pPr>
-      <w:r>
-        <w:t>This operation denominated as “BoolNot” is used for Boolean expressions, and because of that, its bounds are easier as they are [0, 1].</w:t>
-      </w:r>
-    </w:p>
-    <w:p>
-      <w:pPr>
-        <w:pStyle w:val="Textoindependiente"/>
-      </w:pPr>
-      <w:r>
-        <w:t>If Bounds(e1) = (min1, max1) then</w:t>
-      </w:r>
-    </w:p>
-    <w:p>
-      <w:pPr>
-        <w:pStyle w:val="Textoindependiente"/>
-      </w:pPr>
-      <w:r>
-        <w:t>Bounds(</w:t>
-      </w:r>
-      <w:r>
-        <w:t>!</w:t>
-      </w:r>
-      <w:r>
-        <w:t xml:space="preserve">e1) = </w:t>
-      </w:r>
-      <w:r>
-        <w:t>(0</w:t>
-      </w:r>
-      <w:r>
-        <w:t xml:space="preserve">, </w:t>
-      </w:r>
-      <w:r>
-        <w:t>1</w:t>
-      </w:r>
-      <w:r>
-        <w:t>)</w:t>
-      </w:r>
-    </w:p>
-    <w:p>
-      <w:pPr>
-        <w:pStyle w:val="Ttulo4"/>
-      </w:pPr>
-      <w:r>
-        <w:t>Complement</w:t>
-      </w:r>
-    </w:p>
-    <w:p>
-      <w:pPr>
-        <w:pStyle w:val="Textoindependiente"/>
-      </w:pPr>
-      <w:r>
-        <w:t>This binary operations converts all 1s to 0s and vice versa, therefore, the minumun will be 0, and the maximum will be</w:t>
-      </w:r>
-      <w:r>
-        <w:t xml:space="preserve"> twice</w:t>
-      </w:r>
-      <w:r>
-        <w:t xml:space="preserve"> the max values of the expression. </w:t>
-      </w:r>
-    </w:p>
-    <w:p>
-      <w:pPr>
-        <w:pStyle w:val="Textoindependiente"/>
-      </w:pPr>
-      <w:r>
-        <w:t>If Bounds(e1) = (min1, max1) then</w:t>
-      </w:r>
-    </w:p>
-    <w:p>
-      <w:pPr>
-        <w:pStyle w:val="Textoindependiente"/>
-      </w:pPr>
-      <w:r>
-        <w:t>Bounds(</w:t>
-      </w:r>
-      <w:r>
-        <w:t>~</w:t>
-      </w:r>
-      <w:r>
-        <w:t xml:space="preserve">e1) = </w:t>
-      </w:r>
-      <w:r>
-        <w:t>(0,</w:t>
-      </w:r>
-      <w:r>
-        <w:t>max1*2</w:t>
-      </w:r>
-      <w:r>
-        <w:t>)</w:t>
-      </w:r>
-    </w:p>
-    <w:p>
-      <w:pPr>
-        <w:pStyle w:val="Textoindependiente"/>
-      </w:pPr>
-    </w:p>
-    <w:p>
-      <w:pPr>
-        <w:pStyle w:val="Textoindependiente"/>
-      </w:pPr>
-    </w:p>
-    <w:p>
-      <w:pPr>
-        <w:pStyle w:val="Textoindependiente"/>
-      </w:pPr>
-    </w:p>
-    <w:p>
-      <w:pPr>
-        <w:pStyle w:val="Textoindependiente"/>
-      </w:pPr>
-    </w:p>
-    <w:p>
-      <w:pPr>
-        <w:pStyle w:val="Ttulo3"/>
-      </w:pPr>
-      <w:r>
-        <w:lastRenderedPageBreak/>
-        <w:t>Switch operations</w:t>
-      </w:r>
-    </w:p>
-    <w:p>
-      <w:pPr>
-        <w:pStyle w:val="Textoindependiente"/>
-      </w:pPr>
-      <w:r>
-        <w:t xml:space="preserve">The switch operation works as an if else operation, so we will have two expressions and the context. To calculate the bounds of the switch operation, we will first calculate the bounds of both expressions, and then, we will keep the minimum value of both </w:t>
-      </w:r>
-      <w:r>
-        <w:t>expressions</w:t>
-      </w:r>
-      <w:r>
-        <w:t xml:space="preserve">’ </w:t>
-      </w:r>
-      <w:r>
-        <w:t>minimums</w:t>
-      </w:r>
-      <w:r>
-        <w:t>, and the maximum value between both expressions</w:t>
-      </w:r>
-      <w:r>
-        <w:t>’</w:t>
-      </w:r>
-      <w:r>
-        <w:t xml:space="preserve"> </w:t>
-      </w:r>
-      <w:proofErr w:type="spellStart"/>
-      <w:r>
-        <w:t>maximus.ç</w:t>
-      </w:r>
-      <w:proofErr w:type="spellEnd"/>
-    </w:p>
-    <w:p>
-      <w:pPr>
-        <w:pStyle w:val="Textoindependiente"/>
-      </w:pPr>
-      <w:r>
-        <w:t>If Bounds(e1) = (min1, max1) and Bounds(e2)= (min2, max2) then</w:t>
-      </w:r>
-    </w:p>
-    <w:p>
-      <w:pPr>
-        <w:pStyle w:val="Textoindependiente"/>
-      </w:pPr>
-      <w:r>
-        <w:t>Bounds(</w:t>
-      </w:r>
-      <w:r>
-        <w:t>Switch :</w:t>
-      </w:r>
-      <w:r>
-        <w:t>e1</w:t>
-      </w:r>
-      <w:r>
-        <w:t>,</w:t>
-      </w:r>
-      <w:r>
-        <w:t xml:space="preserve"> </w:t>
-      </w:r>
-      <w:r>
-        <w:t xml:space="preserve">e2) = </w:t>
-      </w:r>
-      <w:r>
-        <w:t>{</w:t>
-      </w:r>
-      <w:r>
-        <w:t>min</w:t>
-      </w:r>
-      <w:r>
-        <w:t>(min1,min2)</w:t>
-      </w:r>
-      <w:r>
-        <w:t xml:space="preserve">, </w:t>
-      </w:r>
-      <w:r>
-        <w:t xml:space="preserve"> </w:t>
-      </w:r>
-      <w:r>
-        <w:t>max(max1.max2)</w:t>
-      </w:r>
-      <w:r>
-        <w:t>}</w:t>
-      </w:r>
-    </w:p>
-    <w:p>
-      <w:pPr>
-        <w:pStyle w:val="Ttulo3"/>
-      </w:pPr>
-      <w:r>
-        <w:t>Variables</w:t>
-      </w:r>
-    </w:p>
-    <w:p>
-      <w:pPr>
-        <w:pStyle w:val="Textoindependiente"/>
-      </w:pPr>
-      <w:r>
-        <w:t xml:space="preserve">For the variables, we will receive an String and the context, and to obtain the bounds of the variables, we will just have to </w:t>
-      </w:r>
-      <w:proofErr w:type="spellStart"/>
-      <w:r>
-        <w:t>rearch</w:t>
-      </w:r>
-      <w:proofErr w:type="spellEnd"/>
-      <w:r>
-        <w:t xml:space="preserve"> in the context if the </w:t>
-      </w:r>
-      <w:proofErr w:type="spellStart"/>
-      <w:r>
-        <w:t>varible</w:t>
-      </w:r>
-      <w:proofErr w:type="spellEnd"/>
-      <w:r>
-        <w:t xml:space="preserve"> already exists, and clone its bounds, or if it doesn’t exist on the contest, we just have to create its bounds which will be [0, prime).</w:t>
-      </w:r>
-    </w:p>
-    <w:p>
-      <w:pPr>
-        <w:pStyle w:val="Ttulo3"/>
-      </w:pPr>
-      <w:r>
-        <w:t>Numbers</w:t>
-      </w:r>
-    </w:p>
-    <w:p>
-      <w:pPr>
-        <w:pStyle w:val="Textoindependiente"/>
-      </w:pPr>
-      <w:r>
-        <w:t>For the numbers, it will be much easier than any other operation, because its maximum and minimum bounds will have as value the given number.</w:t>
-      </w:r>
-    </w:p>
-    <w:p>
-      <w:pPr>
-        <w:pStyle w:val="Ttulo3"/>
-      </w:pPr>
-      <w:r>
-        <w:t>Array in line</w:t>
-      </w:r>
-    </w:p>
-    <w:p>
-      <w:pPr>
-        <w:pStyle w:val="Textoindependiente"/>
-      </w:pPr>
-      <w:r>
-        <w:t xml:space="preserve">In the case of the array in line, we want to find the minimum bound between all the elements of the array, and also the maximum </w:t>
-      </w:r>
-      <w:r>
-        <w:t>bound of the same elements, so we will have to traverse the array trying to find those values.</w:t>
-      </w:r>
-    </w:p>
-    <w:p>
-      <w:pPr>
-        <w:pStyle w:val="Textoindependiente"/>
-        <w:keepNext/>
-      </w:pPr>
-      <w:r>
         <w:drawing>
           <wp:inline distT="0" distB="0" distL="0" distR="0" wp14:anchorId="519D970C" wp14:editId="322A543C">
             <wp:extent cx="1447925" cy="929721"/>
@@ -5340,7 +5211,7 @@
                     <pic:cNvPicPr/>
                   </pic:nvPicPr>
                   <pic:blipFill>
-                    <a:blip r:embed="rId20"/>
+                    <a:blip r:embed="rId16"/>
                     <a:stretch>
                       <a:fillRect/>
                     </a:stretch>
@@ -5361,6 +5232,9 @@
         </w:drawing>
       </w:r>
       <w:r>
+        <w:rPr>
+          <w:noProof/>
+        </w:rPr>
         <w:drawing>
           <wp:inline distT="0" distB="0" distL="0" distR="0" wp14:anchorId="735FCBE5" wp14:editId="3D1E0FF2">
             <wp:extent cx="2400508" cy="129551"/>
@@ -5377,7 +5251,7 @@
                     <pic:cNvPicPr/>
                   </pic:nvPicPr>
                   <pic:blipFill>
-                    <a:blip r:embed="rId21"/>
+                    <a:blip r:embed="rId17"/>
                     <a:stretch>
                       <a:fillRect/>
                     </a:stretch>
@@ -6161,7 +6035,7 @@
                     <pic:cNvPicPr/>
                   </pic:nvPicPr>
                   <pic:blipFill>
-                    <a:blip r:embed="rId22">
+                    <a:blip r:embed="rId18">
                       <a:extLst>
                         <a:ext uri="{28A0092B-C50C-407E-A947-70E740481C1C}">
                           <a14:useLocalDpi xmlns:a14="http://schemas.microsoft.com/office/drawing/2010/main" val="0"/>
@@ -7154,7 +7028,7 @@
                     <pic:cNvPicPr/>
                   </pic:nvPicPr>
                   <pic:blipFill>
-                    <a:blip r:embed="rId23">
+                    <a:blip r:embed="rId19">
                       <a:extLst>
                         <a:ext uri="{28A0092B-C50C-407E-A947-70E740481C1C}">
                           <a14:useLocalDpi xmlns:a14="http://schemas.microsoft.com/office/drawing/2010/main" val="0"/>
@@ -7365,7 +7239,6 @@
       <w:r>
         <w:t>“</w:t>
       </w:r>
-      <w:proofErr w:type="spellStart"/>
       <w:r>
         <w:fldChar w:fldCharType="begin"/>
       </w:r>
@@ -7378,7 +7251,6 @@
       <w:r>
         <w:t>Introducción</w:t>
       </w:r>
-      <w:proofErr w:type="spellEnd"/>
       <w:r>
         <w:fldChar w:fldCharType="end"/>
       </w:r>
@@ -7529,7 +7401,6 @@
       <w:r>
         <w:t>“</w:t>
       </w:r>
-      <w:proofErr w:type="spellStart"/>
       <w:r>
         <w:fldChar w:fldCharType="begin"/>
       </w:r>
@@ -7540,25 +7411,8 @@
         <w:fldChar w:fldCharType="separate"/>
       </w:r>
       <w:r>
-        <w:t>Conclusiones</w:t>
-      </w:r>
-      <w:proofErr w:type="spellEnd"/>
-      <w:r>
-        <w:t xml:space="preserve"> y </w:t>
-      </w:r>
-      <w:proofErr w:type="spellStart"/>
-      <w:r>
-        <w:t>trabajo</w:t>
-      </w:r>
-      <w:proofErr w:type="spellEnd"/>
-      <w:r>
-        <w:t xml:space="preserve"> </w:t>
-      </w:r>
-      <w:proofErr w:type="spellStart"/>
-      <w:r>
-        <w:t>futuro</w:t>
-      </w:r>
-      <w:proofErr w:type="spellEnd"/>
+        <w:t>Conclusiones y trabajo futuro</w:t>
+      </w:r>
       <w:r>
         <w:fldChar w:fldCharType="end"/>
       </w:r>
@@ -8911,6 +8765,119 @@
     </w:lvl>
   </w:abstractNum>
   <w:abstractNum w:abstractNumId="12" w15:restartNumberingAfterBreak="0">
+    <w:nsid w:val="02312DA9"/>
+    <w:multiLevelType w:val="hybridMultilevel"/>
+    <w:tmpl w:val="AC1C2880"/>
+    <w:lvl w:ilvl="0" w:tplc="0C0A0001">
+      <w:start w:val="1"/>
+      <w:numFmt w:val="bullet"/>
+      <w:lvlText w:val=""/>
+      <w:lvlJc w:val="left"/>
+      <w:pPr>
+        <w:ind w:left="1440" w:hanging="360"/>
+      </w:pPr>
+      <w:rPr>
+        <w:rFonts w:ascii="Symbol" w:hAnsi="Symbol" w:hint="default"/>
+      </w:rPr>
+    </w:lvl>
+    <w:lvl w:ilvl="1" w:tplc="0C0A0003" w:tentative="1">
+      <w:start w:val="1"/>
+      <w:numFmt w:val="bullet"/>
+      <w:lvlText w:val="o"/>
+      <w:lvlJc w:val="left"/>
+      <w:pPr>
+        <w:ind w:left="2160" w:hanging="360"/>
+      </w:pPr>
+      <w:rPr>
+        <w:rFonts w:ascii="Courier New" w:hAnsi="Courier New" w:cs="Courier New" w:hint="default"/>
+      </w:rPr>
+    </w:lvl>
+    <w:lvl w:ilvl="2" w:tplc="0C0A0005" w:tentative="1">
+      <w:start w:val="1"/>
+      <w:numFmt w:val="bullet"/>
+      <w:lvlText w:val=""/>
+      <w:lvlJc w:val="left"/>
+      <w:pPr>
+        <w:ind w:left="2880" w:hanging="360"/>
+      </w:pPr>
+      <w:rPr>
+        <w:rFonts w:ascii="Wingdings" w:hAnsi="Wingdings" w:hint="default"/>
+      </w:rPr>
+    </w:lvl>
+    <w:lvl w:ilvl="3" w:tplc="0C0A0001" w:tentative="1">
+      <w:start w:val="1"/>
+      <w:numFmt w:val="bullet"/>
+      <w:lvlText w:val=""/>
+      <w:lvlJc w:val="left"/>
+      <w:pPr>
+        <w:ind w:left="3600" w:hanging="360"/>
+      </w:pPr>
+      <w:rPr>
+        <w:rFonts w:ascii="Symbol" w:hAnsi="Symbol" w:hint="default"/>
+      </w:rPr>
+    </w:lvl>
+    <w:lvl w:ilvl="4" w:tplc="0C0A0003" w:tentative="1">
+      <w:start w:val="1"/>
+      <w:numFmt w:val="bullet"/>
+      <w:lvlText w:val="o"/>
+      <w:lvlJc w:val="left"/>
+      <w:pPr>
+        <w:ind w:left="4320" w:hanging="360"/>
+      </w:pPr>
+      <w:rPr>
+        <w:rFonts w:ascii="Courier New" w:hAnsi="Courier New" w:cs="Courier New" w:hint="default"/>
+      </w:rPr>
+    </w:lvl>
+    <w:lvl w:ilvl="5" w:tplc="0C0A0005" w:tentative="1">
+      <w:start w:val="1"/>
+      <w:numFmt w:val="bullet"/>
+      <w:lvlText w:val=""/>
+      <w:lvlJc w:val="left"/>
+      <w:pPr>
+        <w:ind w:left="5040" w:hanging="360"/>
+      </w:pPr>
+      <w:rPr>
+        <w:rFonts w:ascii="Wingdings" w:hAnsi="Wingdings" w:hint="default"/>
+      </w:rPr>
+    </w:lvl>
+    <w:lvl w:ilvl="6" w:tplc="0C0A0001" w:tentative="1">
+      <w:start w:val="1"/>
+      <w:numFmt w:val="bullet"/>
+      <w:lvlText w:val=""/>
+      <w:lvlJc w:val="left"/>
+      <w:pPr>
+        <w:ind w:left="5760" w:hanging="360"/>
+      </w:pPr>
+      <w:rPr>
+        <w:rFonts w:ascii="Symbol" w:hAnsi="Symbol" w:hint="default"/>
+      </w:rPr>
+    </w:lvl>
+    <w:lvl w:ilvl="7" w:tplc="0C0A0003" w:tentative="1">
+      <w:start w:val="1"/>
+      <w:numFmt w:val="bullet"/>
+      <w:lvlText w:val="o"/>
+      <w:lvlJc w:val="left"/>
+      <w:pPr>
+        <w:ind w:left="6480" w:hanging="360"/>
+      </w:pPr>
+      <w:rPr>
+        <w:rFonts w:ascii="Courier New" w:hAnsi="Courier New" w:cs="Courier New" w:hint="default"/>
+      </w:rPr>
+    </w:lvl>
+    <w:lvl w:ilvl="8" w:tplc="0C0A0005" w:tentative="1">
+      <w:start w:val="1"/>
+      <w:numFmt w:val="bullet"/>
+      <w:lvlText w:val=""/>
+      <w:lvlJc w:val="left"/>
+      <w:pPr>
+        <w:ind w:left="7200" w:hanging="360"/>
+      </w:pPr>
+      <w:rPr>
+        <w:rFonts w:ascii="Wingdings" w:hAnsi="Wingdings" w:hint="default"/>
+      </w:rPr>
+    </w:lvl>
+  </w:abstractNum>
+  <w:abstractNum w:abstractNumId="13" w15:restartNumberingAfterBreak="0">
     <w:nsid w:val="037C65F7"/>
     <w:multiLevelType w:val="multilevel"/>
     <w:tmpl w:val="7B246FA4"/>
@@ -9040,7 +9007,7 @@
       </w:rPr>
     </w:lvl>
   </w:abstractNum>
-  <w:abstractNum w:abstractNumId="13" w15:restartNumberingAfterBreak="0">
+  <w:abstractNum w:abstractNumId="14" w15:restartNumberingAfterBreak="0">
     <w:nsid w:val="04B41DBE"/>
     <w:multiLevelType w:val="multilevel"/>
     <w:tmpl w:val="040A001D"/>
@@ -9126,7 +9093,7 @@
       </w:pPr>
     </w:lvl>
   </w:abstractNum>
-  <w:abstractNum w:abstractNumId="14" w15:restartNumberingAfterBreak="0">
+  <w:abstractNum w:abstractNumId="15" w15:restartNumberingAfterBreak="0">
     <w:nsid w:val="050B21E0"/>
     <w:multiLevelType w:val="multilevel"/>
     <w:tmpl w:val="BD480CCC"/>
@@ -9255,7 +9222,7 @@
       </w:rPr>
     </w:lvl>
   </w:abstractNum>
-  <w:abstractNum w:abstractNumId="15" w15:restartNumberingAfterBreak="0">
+  <w:abstractNum w:abstractNumId="16" w15:restartNumberingAfterBreak="0">
     <w:nsid w:val="0C3A4D66"/>
     <w:multiLevelType w:val="multilevel"/>
     <w:tmpl w:val="AA562C7C"/>
@@ -9385,7 +9352,7 @@
       </w:rPr>
     </w:lvl>
   </w:abstractNum>
-  <w:abstractNum w:abstractNumId="16" w15:restartNumberingAfterBreak="0">
+  <w:abstractNum w:abstractNumId="17" w15:restartNumberingAfterBreak="0">
     <w:nsid w:val="0EA63C0C"/>
     <w:multiLevelType w:val="multilevel"/>
     <w:tmpl w:val="AA562C7C"/>
@@ -9515,7 +9482,7 @@
       </w:rPr>
     </w:lvl>
   </w:abstractNum>
-  <w:abstractNum w:abstractNumId="17" w15:restartNumberingAfterBreak="0">
+  <w:abstractNum w:abstractNumId="18" w15:restartNumberingAfterBreak="0">
     <w:nsid w:val="17BB27E3"/>
     <w:multiLevelType w:val="multilevel"/>
     <w:tmpl w:val="A8D47B9C"/>
@@ -9645,7 +9612,7 @@
       </w:rPr>
     </w:lvl>
   </w:abstractNum>
-  <w:abstractNum w:abstractNumId="18" w15:restartNumberingAfterBreak="0">
+  <w:abstractNum w:abstractNumId="19" w15:restartNumberingAfterBreak="0">
     <w:nsid w:val="18BE7767"/>
     <w:multiLevelType w:val="multilevel"/>
     <w:tmpl w:val="AAE46A2C"/>
@@ -9775,7 +9742,7 @@
       </w:rPr>
     </w:lvl>
   </w:abstractNum>
-  <w:abstractNum w:abstractNumId="19" w15:restartNumberingAfterBreak="0">
+  <w:abstractNum w:abstractNumId="20" w15:restartNumberingAfterBreak="0">
     <w:nsid w:val="1CCF6661"/>
     <w:multiLevelType w:val="multilevel"/>
     <w:tmpl w:val="C948882C"/>
@@ -9862,7 +9829,7 @@
       </w:pPr>
     </w:lvl>
   </w:abstractNum>
-  <w:abstractNum w:abstractNumId="20" w15:restartNumberingAfterBreak="0">
+  <w:abstractNum w:abstractNumId="21" w15:restartNumberingAfterBreak="0">
     <w:nsid w:val="233156BA"/>
     <w:multiLevelType w:val="multilevel"/>
     <w:tmpl w:val="29F6372C"/>
@@ -9992,7 +9959,7 @@
       </w:rPr>
     </w:lvl>
   </w:abstractNum>
-  <w:abstractNum w:abstractNumId="21" w15:restartNumberingAfterBreak="0">
+  <w:abstractNum w:abstractNumId="22" w15:restartNumberingAfterBreak="0">
     <w:nsid w:val="250F6CC7"/>
     <w:multiLevelType w:val="multilevel"/>
     <w:tmpl w:val="1B084830"/>
@@ -10119,7 +10086,7 @@
       </w:rPr>
     </w:lvl>
   </w:abstractNum>
-  <w:abstractNum w:abstractNumId="22" w15:restartNumberingAfterBreak="0">
+  <w:abstractNum w:abstractNumId="23" w15:restartNumberingAfterBreak="0">
     <w:nsid w:val="2FFC21B7"/>
     <w:multiLevelType w:val="hybridMultilevel"/>
     <w:tmpl w:val="4336DDD2"/>
@@ -10259,7 +10226,7 @@
       </w:rPr>
     </w:lvl>
   </w:abstractNum>
-  <w:abstractNum w:abstractNumId="23" w15:restartNumberingAfterBreak="0">
+  <w:abstractNum w:abstractNumId="24" w15:restartNumberingAfterBreak="0">
     <w:nsid w:val="321C0D15"/>
     <w:multiLevelType w:val="multilevel"/>
     <w:tmpl w:val="54140BA4"/>
@@ -10394,7 +10361,7 @@
       </w:rPr>
     </w:lvl>
   </w:abstractNum>
-  <w:abstractNum w:abstractNumId="24" w15:restartNumberingAfterBreak="0">
+  <w:abstractNum w:abstractNumId="25" w15:restartNumberingAfterBreak="0">
     <w:nsid w:val="330865B5"/>
     <w:multiLevelType w:val="multilevel"/>
     <w:tmpl w:val="040A001D"/>
@@ -10480,7 +10447,7 @@
       </w:pPr>
     </w:lvl>
   </w:abstractNum>
-  <w:abstractNum w:abstractNumId="25" w15:restartNumberingAfterBreak="0">
+  <w:abstractNum w:abstractNumId="26" w15:restartNumberingAfterBreak="0">
     <w:nsid w:val="3521773B"/>
     <w:multiLevelType w:val="hybridMultilevel"/>
     <w:tmpl w:val="EC8C53F0"/>
@@ -10566,7 +10533,7 @@
       </w:pPr>
     </w:lvl>
   </w:abstractNum>
-  <w:abstractNum w:abstractNumId="26" w15:restartNumberingAfterBreak="0">
+  <w:abstractNum w:abstractNumId="27" w15:restartNumberingAfterBreak="0">
     <w:nsid w:val="40F1284A"/>
     <w:multiLevelType w:val="hybridMultilevel"/>
     <w:tmpl w:val="D208296E"/>
@@ -10679,7 +10646,7 @@
       </w:rPr>
     </w:lvl>
   </w:abstractNum>
-  <w:abstractNum w:abstractNumId="27" w15:restartNumberingAfterBreak="0">
+  <w:abstractNum w:abstractNumId="28" w15:restartNumberingAfterBreak="0">
     <w:nsid w:val="59957CE0"/>
     <w:multiLevelType w:val="multilevel"/>
     <w:tmpl w:val="AA562C7C"/>
@@ -10809,7 +10776,7 @@
       </w:rPr>
     </w:lvl>
   </w:abstractNum>
-  <w:abstractNum w:abstractNumId="28" w15:restartNumberingAfterBreak="0">
+  <w:abstractNum w:abstractNumId="29" w15:restartNumberingAfterBreak="0">
     <w:nsid w:val="64F42C83"/>
     <w:multiLevelType w:val="multilevel"/>
     <w:tmpl w:val="AA562C7C"/>
@@ -10939,7 +10906,7 @@
       </w:rPr>
     </w:lvl>
   </w:abstractNum>
-  <w:abstractNum w:abstractNumId="29" w15:restartNumberingAfterBreak="0">
+  <w:abstractNum w:abstractNumId="30" w15:restartNumberingAfterBreak="0">
     <w:nsid w:val="67B85907"/>
     <w:multiLevelType w:val="hybridMultilevel"/>
     <w:tmpl w:val="6E6E04D6"/>
@@ -11025,7 +10992,7 @@
       </w:pPr>
     </w:lvl>
   </w:abstractNum>
-  <w:abstractNum w:abstractNumId="30" w15:restartNumberingAfterBreak="0">
+  <w:abstractNum w:abstractNumId="31" w15:restartNumberingAfterBreak="0">
     <w:nsid w:val="6FBF4159"/>
     <w:multiLevelType w:val="multilevel"/>
     <w:tmpl w:val="982674FA"/>
@@ -11155,7 +11122,7 @@
       </w:rPr>
     </w:lvl>
   </w:abstractNum>
-  <w:abstractNum w:abstractNumId="31" w15:restartNumberingAfterBreak="0">
+  <w:abstractNum w:abstractNumId="32" w15:restartNumberingAfterBreak="0">
     <w:nsid w:val="70301EDE"/>
     <w:multiLevelType w:val="multilevel"/>
     <w:tmpl w:val="DFFA0438"/>
@@ -11285,7 +11252,7 @@
       </w:rPr>
     </w:lvl>
   </w:abstractNum>
-  <w:abstractNum w:abstractNumId="32" w15:restartNumberingAfterBreak="0">
+  <w:abstractNum w:abstractNumId="33" w15:restartNumberingAfterBreak="0">
     <w:nsid w:val="736F4A0D"/>
     <w:multiLevelType w:val="multilevel"/>
     <w:tmpl w:val="040A001D"/>
@@ -11371,7 +11338,7 @@
       </w:pPr>
     </w:lvl>
   </w:abstractNum>
-  <w:abstractNum w:abstractNumId="33" w15:restartNumberingAfterBreak="0">
+  <w:abstractNum w:abstractNumId="34" w15:restartNumberingAfterBreak="0">
     <w:nsid w:val="76864434"/>
     <w:multiLevelType w:val="multilevel"/>
     <w:tmpl w:val="040A001D"/>
@@ -11457,7 +11424,7 @@
       </w:pPr>
     </w:lvl>
   </w:abstractNum>
-  <w:abstractNum w:abstractNumId="34" w15:restartNumberingAfterBreak="0">
+  <w:abstractNum w:abstractNumId="35" w15:restartNumberingAfterBreak="0">
     <w:nsid w:val="78622BFC"/>
     <w:multiLevelType w:val="multilevel"/>
     <w:tmpl w:val="473C4EE0"/>
@@ -11570,7 +11537,7 @@
       </w:pPr>
     </w:lvl>
   </w:abstractNum>
-  <w:abstractNum w:abstractNumId="35" w15:restartNumberingAfterBreak="0">
+  <w:abstractNum w:abstractNumId="36" w15:restartNumberingAfterBreak="0">
     <w:nsid w:val="79E81350"/>
     <w:multiLevelType w:val="multilevel"/>
     <w:tmpl w:val="D89EC2BE"/>
@@ -11701,7 +11668,7 @@
     </w:lvl>
   </w:abstractNum>
   <w:num w:numId="1" w16cid:durableId="962927342">
-    <w:abstractNumId w:val="22"/>
+    <w:abstractNumId w:val="23"/>
   </w:num>
   <w:num w:numId="2" w16cid:durableId="1200972430">
     <w:abstractNumId w:val="10"/>
@@ -11734,73 +11701,73 @@
     <w:abstractNumId w:val="1"/>
   </w:num>
   <w:num w:numId="12" w16cid:durableId="923101083">
-    <w:abstractNumId w:val="17"/>
+    <w:abstractNumId w:val="18"/>
   </w:num>
   <w:num w:numId="13" w16cid:durableId="1519850972">
-    <w:abstractNumId w:val="23"/>
+    <w:abstractNumId w:val="24"/>
   </w:num>
   <w:num w:numId="14" w16cid:durableId="1283880269">
+    <w:abstractNumId w:val="22"/>
+  </w:num>
+  <w:num w:numId="15" w16cid:durableId="1646739723">
+    <w:abstractNumId w:val="36"/>
+  </w:num>
+  <w:num w:numId="16" w16cid:durableId="466629650">
+    <w:abstractNumId w:val="25"/>
+  </w:num>
+  <w:num w:numId="17" w16cid:durableId="1079012301">
     <w:abstractNumId w:val="21"/>
   </w:num>
-  <w:num w:numId="15" w16cid:durableId="1646739723">
-    <w:abstractNumId w:val="35"/>
-  </w:num>
-  <w:num w:numId="16" w16cid:durableId="466629650">
-    <w:abstractNumId w:val="24"/>
-  </w:num>
-  <w:num w:numId="17" w16cid:durableId="1079012301">
-    <w:abstractNumId w:val="20"/>
-  </w:num>
   <w:num w:numId="18" w16cid:durableId="1163817943">
-    <w:abstractNumId w:val="14"/>
+    <w:abstractNumId w:val="15"/>
   </w:num>
   <w:num w:numId="19" w16cid:durableId="1434395498">
-    <w:abstractNumId w:val="30"/>
+    <w:abstractNumId w:val="31"/>
   </w:num>
   <w:num w:numId="20" w16cid:durableId="1893346169">
-    <w:abstractNumId w:val="12"/>
+    <w:abstractNumId w:val="13"/>
   </w:num>
   <w:num w:numId="21" w16cid:durableId="1509711991">
-    <w:abstractNumId w:val="31"/>
+    <w:abstractNumId w:val="32"/>
   </w:num>
   <w:num w:numId="22" w16cid:durableId="1149319704">
-    <w:abstractNumId w:val="15"/>
+    <w:abstractNumId w:val="16"/>
   </w:num>
   <w:num w:numId="23" w16cid:durableId="53814836">
-    <w:abstractNumId w:val="27"/>
+    <w:abstractNumId w:val="28"/>
   </w:num>
   <w:num w:numId="24" w16cid:durableId="858156727">
-    <w:abstractNumId w:val="28"/>
+    <w:abstractNumId w:val="29"/>
   </w:num>
   <w:num w:numId="25" w16cid:durableId="1782651091">
     <w:abstractNumId w:val="0"/>
   </w:num>
   <w:num w:numId="26" w16cid:durableId="1087188752">
+    <w:abstractNumId w:val="35"/>
+  </w:num>
+  <w:num w:numId="27" w16cid:durableId="524753162">
+    <w:abstractNumId w:val="17"/>
+  </w:num>
+  <w:num w:numId="28" w16cid:durableId="1237086538">
+    <w:abstractNumId w:val="19"/>
+  </w:num>
+  <w:num w:numId="29" w16cid:durableId="960769819">
+    <w:abstractNumId w:val="14"/>
+  </w:num>
+  <w:num w:numId="30" w16cid:durableId="358169484">
     <w:abstractNumId w:val="34"/>
   </w:num>
-  <w:num w:numId="27" w16cid:durableId="524753162">
-    <w:abstractNumId w:val="16"/>
-  </w:num>
-  <w:num w:numId="28" w16cid:durableId="1237086538">
-    <w:abstractNumId w:val="18"/>
-  </w:num>
-  <w:num w:numId="29" w16cid:durableId="960769819">
-    <w:abstractNumId w:val="13"/>
-  </w:num>
-  <w:num w:numId="30" w16cid:durableId="358169484">
+  <w:num w:numId="31" w16cid:durableId="1628580751">
     <w:abstractNumId w:val="33"/>
   </w:num>
-  <w:num w:numId="31" w16cid:durableId="1628580751">
-    <w:abstractNumId w:val="32"/>
-  </w:num>
   <w:num w:numId="32" w16cid:durableId="792945128">
-    <w:abstractNumId w:val="29"/>
+    <w:abstractNumId w:val="30"/>
   </w:num>
   <w:num w:numId="33" w16cid:durableId="959652879">
-    <w:abstractNumId w:val="19"/>
+    <w:abstractNumId w:val="20"/>
   </w:num>
   <w:num w:numId="34" w16cid:durableId="1607956114">
-    <w:abstractNumId w:val="19"/>
+    <w:abstractNumId w:val="20"/>
     <w:lvlOverride w:ilvl="0">
       <w:startOverride w:val="1"/>
     </w:lvlOverride>
@@ -11830,13 +11797,16 @@
     </w:lvlOverride>
   </w:num>
   <w:num w:numId="35" w16cid:durableId="1983190024">
-    <w:abstractNumId w:val="25"/>
+    <w:abstractNumId w:val="26"/>
   </w:num>
   <w:num w:numId="36" w16cid:durableId="216741931">
     <w:abstractNumId w:val="11"/>
   </w:num>
   <w:num w:numId="37" w16cid:durableId="748650492">
-    <w:abstractNumId w:val="26"/>
+    <w:abstractNumId w:val="27"/>
+  </w:num>
+  <w:num w:numId="38" w16cid:durableId="2102067826">
+    <w:abstractNumId w:val="12"/>
   </w:num>
   <w:numIdMacAtCleanup w:val="13"/>
 </w:numbering>
@@ -12349,7 +12319,6 @@
   <w:style w:type="character" w:default="1" w:styleId="Fuentedeprrafopredeter">
     <w:name w:val="Default Paragraph Font"/>
     <w:uiPriority w:val="1"/>
-    <w:semiHidden/>
     <w:unhideWhenUsed/>
   </w:style>
   <w:style w:type="table" w:default="1" w:styleId="Tablanormal">

</xml_diff>

<commit_message>
Memoria hecha la parte de analisis
</commit_message>
<xml_diff>
--- a/Optimization of the circom compiler.docx
+++ b/Optimization of the circom compiler.docx
@@ -3663,25 +3663,7 @@
         <w:keepNext/>
       </w:pPr>
       <w:r>
-        <w:t xml:space="preserve">This also creates </w:t>
-      </w:r>
-      <w:r>
-        <w:t>inefficiency</w:t>
-      </w:r>
-      <w:r>
-        <w:t xml:space="preserve"> not only when generating C code, but also when targeting </w:t>
-      </w:r>
-      <w:r>
-        <w:t>WebAssembly</w:t>
-      </w:r>
-      <w:r>
-        <w:t xml:space="preserve">. Since all values are treated as large field elements, the generated code must handle them using representations that are often larger and more expensive than necessary. As a </w:t>
-      </w:r>
-      <w:r>
-        <w:t>result,</w:t>
-      </w:r>
-      <w:r>
-        <w:t xml:space="preserve"> memory consumption and execution time can increase, especially in circuits with many intermediate values. </w:t>
+        <w:t xml:space="preserve">This also creates inefficiency not only when generating C code, but also when targeting WebAssembly. Since all values are treated as large field elements, the generated code must handle them using representations that are often larger and more expensive than necessary. As a result, memory consumption and execution time can increase, especially in circuits with many intermediate values. </w:t>
       </w:r>
     </w:p>
     <w:p>
@@ -3701,13 +3683,7 @@
         <w:t>”</w:t>
       </w:r>
       <w:r>
-        <w:t xml:space="preserve"> template. In this circuit, the output signal can only take two possible values, 0 or 1. Even so, without any additional analysis, it is still represented as a full field element. If the compiler </w:t>
-      </w:r>
-      <w:r>
-        <w:t>can</w:t>
-      </w:r>
-      <w:r>
-        <w:t xml:space="preserve"> </w:t>
+        <w:t xml:space="preserve"> template. In this circuit, the output signal can only take two possible values, 0 or 1. Even so, without any additional analysis, it is still represented as a full field element. If the compiler can </w:t>
       </w:r>
       <w:r>
         <w:t>find</w:t>
@@ -3864,13 +3840,7 @@
         <w:t>find</w:t>
       </w:r>
       <w:r>
-        <w:t xml:space="preserve"> the range of values that each signal can take. Once these bounds are known, they can be used to reduce the memory representation of </w:t>
-      </w:r>
-      <w:r>
-        <w:t>variables,</w:t>
-      </w:r>
-      <w:r>
-        <w:t xml:space="preserve"> when possible, without changing the correctness of the compilation process. </w:t>
+        <w:t xml:space="preserve"> the range of values that each signal can take. Once these bounds are known, they can be used to reduce the memory representation of variables, when possible, without changing the correctness of the compilation process. </w:t>
       </w:r>
     </w:p>
     <w:p>
@@ -3884,10 +3854,7 @@
         <w:t xml:space="preserve"> </w:t>
       </w:r>
       <w:r>
-        <w:t xml:space="preserve"> [</w:t>
-      </w:r>
-      <w:r>
-        <w:t>0,</w:t>
+        <w:t xml:space="preserve"> [0,</w:t>
       </w:r>
       <w:r>
         <w:t xml:space="preserve"> p</w:t>
@@ -5169,6 +5136,22 @@
     </w:p>
     <w:p>
       <w:pPr>
+        <w:pStyle w:val="Textoindependiente"/>
+      </w:pPr>
+    </w:p>
+    <w:p>
+      <w:pPr>
+        <w:pStyle w:val="Textoindependiente"/>
+      </w:pPr>
+      <w:r>
+        <w:rPr>
+          <w:highlight w:val="cyan"/>
+        </w:rPr>
+        <w:t>REordenar?</w:t>
+      </w:r>
+    </w:p>
+    <w:p>
+      <w:pPr>
         <w:pStyle w:val="Ttulo3"/>
       </w:pPr>
       <w:r>
@@ -5189,143 +5172,128 @@
     <w:p>
       <w:pPr>
         <w:pStyle w:val="Textoindependiente"/>
-        <w:keepNext/>
-      </w:pPr>
-      <w:r>
-        <w:rPr>
-          <w:noProof/>
-        </w:rPr>
-        <w:drawing>
-          <wp:inline distT="0" distB="0" distL="0" distR="0" wp14:anchorId="519D970C" wp14:editId="322A543C">
-            <wp:extent cx="1447925" cy="929721"/>
-            <wp:effectExtent l="0" t="0" r="0" b="3810"/>
-            <wp:docPr id="990891243" name="Imagen 1" descr="Texto&#10;&#10;El contenido generado por IA puede ser incorrecto."/>
-            <wp:cNvGraphicFramePr>
-              <a:graphicFrameLocks xmlns:a="http://schemas.openxmlformats.org/drawingml/2006/main" noChangeAspect="1"/>
-            </wp:cNvGraphicFramePr>
-            <a:graphic xmlns:a="http://schemas.openxmlformats.org/drawingml/2006/main">
-              <a:graphicData uri="http://schemas.openxmlformats.org/drawingml/2006/picture">
-                <pic:pic xmlns:pic="http://schemas.openxmlformats.org/drawingml/2006/picture">
-                  <pic:nvPicPr>
-                    <pic:cNvPr id="990891243" name="Imagen 1" descr="Texto&#10;&#10;El contenido generado por IA puede ser incorrecto."/>
-                    <pic:cNvPicPr/>
-                  </pic:nvPicPr>
-                  <pic:blipFill>
-                    <a:blip r:embed="rId16"/>
-                    <a:stretch>
-                      <a:fillRect/>
-                    </a:stretch>
-                  </pic:blipFill>
-                  <pic:spPr>
-                    <a:xfrm>
-                      <a:off x="0" y="0"/>
-                      <a:ext cx="1447925" cy="929721"/>
-                    </a:xfrm>
-                    <a:prstGeom prst="rect">
-                      <a:avLst/>
-                    </a:prstGeom>
-                  </pic:spPr>
-                </pic:pic>
-              </a:graphicData>
-            </a:graphic>
-          </wp:inline>
-        </w:drawing>
-      </w:r>
-      <w:r>
-        <w:rPr>
-          <w:noProof/>
-        </w:rPr>
-        <w:drawing>
-          <wp:inline distT="0" distB="0" distL="0" distR="0" wp14:anchorId="735FCBE5" wp14:editId="3D1E0FF2">
-            <wp:extent cx="2400508" cy="129551"/>
-            <wp:effectExtent l="0" t="0" r="0" b="3810"/>
-            <wp:docPr id="665536635" name="Imagen 1"/>
-            <wp:cNvGraphicFramePr>
-              <a:graphicFrameLocks xmlns:a="http://schemas.openxmlformats.org/drawingml/2006/main" noChangeAspect="1"/>
-            </wp:cNvGraphicFramePr>
-            <a:graphic xmlns:a="http://schemas.openxmlformats.org/drawingml/2006/main">
-              <a:graphicData uri="http://schemas.openxmlformats.org/drawingml/2006/picture">
-                <pic:pic xmlns:pic="http://schemas.openxmlformats.org/drawingml/2006/picture">
-                  <pic:nvPicPr>
-                    <pic:cNvPr id="665536635" name=""/>
-                    <pic:cNvPicPr/>
-                  </pic:nvPicPr>
-                  <pic:blipFill>
-                    <a:blip r:embed="rId17"/>
-                    <a:stretch>
-                      <a:fillRect/>
-                    </a:stretch>
-                  </pic:blipFill>
-                  <pic:spPr>
-                    <a:xfrm>
-                      <a:off x="0" y="0"/>
-                      <a:ext cx="2400508" cy="129551"/>
-                    </a:xfrm>
-                    <a:prstGeom prst="rect">
-                      <a:avLst/>
-                    </a:prstGeom>
-                  </pic:spPr>
-                </pic:pic>
-              </a:graphicData>
-            </a:graphic>
-          </wp:inline>
-        </w:drawing>
-      </w:r>
-    </w:p>
-    <w:p>
-      <w:pPr>
-        <w:pStyle w:val="Descripcin"/>
-        <w:ind w:firstLine="720"/>
-        <w:jc w:val="both"/>
-      </w:pPr>
-      <w:r>
-        <w:t xml:space="preserve">Figure </w:t>
-      </w:r>
-      <w:r>
-        <w:fldChar w:fldCharType="begin"/>
-      </w:r>
-      <w:r>
-        <w:instrText xml:space="preserve"> SEQ Figure \* ARABIC </w:instrText>
-      </w:r>
-      <w:r>
-        <w:fldChar w:fldCharType="separate"/>
-      </w:r>
-      <w:r>
-        <w:rPr>
-          <w:noProof/>
-        </w:rPr>
-        <w:t>8</w:t>
-      </w:r>
-      <w:r>
-        <w:fldChar w:fldCharType="end"/>
+      </w:pPr>
+      <w:r>
+        <w:t xml:space="preserve">As an example, </w:t>
+      </w:r>
+      <w:r>
+        <w:t>suppose that x</w:t>
+      </w:r>
+      <w:r>
+        <w:t>[0]</w:t>
       </w:r>
       <w:r>
         <w:t xml:space="preserve"> </w:t>
       </w:r>
       <w:r>
+        <w:rPr>
+          <w:rFonts w:ascii="Cambria Math" w:hAnsi="Cambria Math" w:cs="Cambria Math"/>
+        </w:rPr>
+        <w:t>∈</w:t>
+      </w:r>
+      <w:r>
+        <w:t xml:space="preserve"> [0, 5]</w:t>
+      </w:r>
+      <w:r>
+        <w:t>,</w:t>
+      </w:r>
+      <w:r>
+        <w:t xml:space="preserve"> x</w:t>
+      </w:r>
+      <w:r>
+        <w:t>[1]</w:t>
+      </w:r>
+      <w:r>
+        <w:t xml:space="preserve"> </w:t>
+      </w:r>
+      <w:r>
+        <w:rPr>
+          <w:rFonts w:ascii="Cambria Math" w:hAnsi="Cambria Math" w:cs="Cambria Math"/>
+        </w:rPr>
+        <w:t>∈</w:t>
+      </w:r>
+      <w:r>
+        <w:t xml:space="preserve"> [2, </w:t>
+      </w:r>
+      <w:r>
+        <w:t>7</w:t>
+      </w:r>
+      <w:r>
+        <w:t>]</w:t>
+      </w:r>
+      <w:r>
+        <w:t xml:space="preserve"> and x[2] </w:t>
+      </w:r>
+      <w:r>
+        <w:rPr>
+          <w:rFonts w:ascii="Cambria Math" w:hAnsi="Cambria Math" w:cs="Cambria Math"/>
+        </w:rPr>
+        <w:t>∈</w:t>
+      </w:r>
+      <w:r>
+        <w:rPr>
+          <w:rFonts w:ascii="Cambria Math" w:hAnsi="Cambria Math" w:cs="Cambria Math"/>
+        </w:rPr>
+        <w:t xml:space="preserve"> [1,4]</w:t>
+      </w:r>
+      <w:r>
+        <w:t>. Then:</w:t>
+      </w:r>
+    </w:p>
+    <w:p>
+      <w:pPr>
+        <w:ind w:firstLine="0"/>
+        <w:rPr>
+          <w:rFonts w:ascii="Cambria Math" w:hAnsi="Cambria Math" w:cs="Cambria Math"/>
+        </w:rPr>
+      </w:pPr>
+      <w:r>
         <w:tab/>
       </w:r>
       <w:r>
-        <w:tab/>
-        <w:t xml:space="preserve">Figure </w:t>
-      </w:r>
-      <w:r>
-        <w:fldChar w:fldCharType="begin"/>
-      </w:r>
-      <w:r>
-        <w:instrText xml:space="preserve"> SEQ Figure \* ARABIC </w:instrText>
-      </w:r>
-      <w:r>
-        <w:fldChar w:fldCharType="separate"/>
-      </w:r>
-      <w:r>
-        <w:rPr>
-          <w:noProof/>
-        </w:rPr>
-        <w:t>9</w:t>
-      </w:r>
-      <w:r>
-        <w:fldChar w:fldCharType="end"/>
+        <w:t>Bounds(</w:t>
+      </w:r>
+      <w:r>
+        <w:t>x[]</w:t>
+      </w:r>
+      <w:r>
+        <w:t>)=</w:t>
+      </w:r>
+      <w:r>
+        <w:t>{min(</w:t>
+      </w:r>
+      <w:r>
+        <w:t>0</w:t>
+      </w:r>
+      <w:r>
+        <w:t>,</w:t>
+      </w:r>
+      <w:r>
+        <w:t>2</w:t>
+      </w:r>
+      <w:r>
+        <w:t>,1)</w:t>
+      </w:r>
+      <w:r>
+        <w:t>,</w:t>
+      </w:r>
+      <w:r>
+        <w:t xml:space="preserve"> max(5,7,4)}</w:t>
+      </w:r>
+      <w:r>
+        <w:t>=(</w:t>
+      </w:r>
+      <w:r>
+        <w:t>0</w:t>
+      </w:r>
+      <w:r>
+        <w:t>,</w:t>
+      </w:r>
+      <w:r>
+        <w:t>7</w:t>
+      </w:r>
+      <w:r>
+        <w:t>)</w:t>
       </w:r>
     </w:p>
     <w:p/>
@@ -5343,13 +5311,38 @@
         <w:pStyle w:val="Textoindependiente"/>
       </w:pPr>
       <w:r>
-        <w:t>In the calculation of the bounds of the uniform array, we will receive a Box&lt;&gt; and the context. We will have to calculate the bounds of that Box&lt;&gt;, and then we will keep those same values as result of the bounds of the uniform array.</w:t>
+        <w:t>A</w:t>
+      </w:r>
+      <w:r>
+        <w:t xml:space="preserve"> uniform array represents a collection of values that are all computed from a single expression</w:t>
+      </w:r>
+      <w:r>
+        <w:t>.</w:t>
+      </w:r>
+      <w:r>
+        <w:t xml:space="preserve"> When computing the bounds of a uniform array, the key idea is that all its elements will have identical bounds, since they are generated from the same expression. For this reason, the analysis only needs to compute the bounds of that expression once.</w:t>
       </w:r>
     </w:p>
     <w:p>
       <w:pPr>
         <w:pStyle w:val="Textoindependiente"/>
       </w:pPr>
+      <w:r>
+        <w:t xml:space="preserve">Given an expression value, the bounds of the uniform array are defined as: </w:t>
+      </w:r>
+    </w:p>
+    <w:p>
+      <w:pPr>
+        <w:pStyle w:val="Textoindependiente"/>
+      </w:pPr>
+      <w:r>
+        <w:t>Bounds (UniformArray (value)) = Bounds(value)</w:t>
+      </w:r>
+    </w:p>
+    <w:p>
+      <w:pPr>
+        <w:pStyle w:val="Textoindependiente"/>
+      </w:pPr>
     </w:p>
     <w:p>
       <w:pPr>
@@ -5364,7 +5357,24 @@
         <w:pStyle w:val="Textoindependiente"/>
       </w:pPr>
       <w:r>
-        <w:t xml:space="preserve">Statements englobe many signals and variables, and you have to be very careful when treating an statement because </w:t>
+        <w:t xml:space="preserve">In the previous section, we described how to compute the bounds of individual expressions. However, programs are not composed only of expressions, but also of statements that modify the state of the computation. </w:t>
+      </w:r>
+    </w:p>
+    <w:p>
+      <w:pPr>
+        <w:pStyle w:val="Textoindependiente"/>
+      </w:pPr>
+      <w:r>
+        <w:t xml:space="preserve">The goal of this part is to maintain updated bounds of all signals throughout the execution of the program. To </w:t>
+      </w:r>
+      <w:r>
+        <w:t>do that</w:t>
+      </w:r>
+      <w:r>
+        <w:t>, the analysis keeps a context, implemented as a hash map, where each variable is associated with its current bounds.</w:t>
+      </w:r>
+      <w:r>
+        <w:t xml:space="preserve"> </w:t>
       </w:r>
     </w:p>
     <w:p>
@@ -5372,9 +5382,6 @@
         <w:pStyle w:val="Ttulo3"/>
       </w:pPr>
       <w:r>
-        <w:t xml:space="preserve"> </w:t>
-      </w:r>
-      <w:r>
         <w:t>Treat conditional</w:t>
       </w:r>
       <w:r>
@@ -5383,16 +5390,180 @@
     </w:p>
     <w:p>
       <w:pPr>
+        <w:pStyle w:val="Textoindependiente"/>
+      </w:pPr>
+      <w:r>
+        <w:t xml:space="preserve">Conditional statements (if-then-else) require analyzing multiple possible execution paths. </w:t>
+      </w:r>
+      <w:r>
+        <w:t>T</w:t>
+      </w:r>
+      <w:r>
+        <w:t xml:space="preserve">he analysis must consider both branches as potentially executable. </w:t>
+      </w:r>
+    </w:p>
+    <w:p>
+      <w:pPr>
+        <w:pStyle w:val="Textoindependiente"/>
+      </w:pPr>
+      <w:r>
+        <w:t xml:space="preserve">To </w:t>
+      </w:r>
+      <w:r>
+        <w:t>do</w:t>
+      </w:r>
+      <w:r>
+        <w:t xml:space="preserve"> this, the analysis creates two copies of the current context: one for the if branch and one for the else branch. Each branch is then analyzed independently, updating its context based on the statements it contains. </w:t>
+      </w:r>
+    </w:p>
+    <w:p>
+      <w:pPr>
+        <w:pStyle w:val="Textoindependiente"/>
+      </w:pPr>
+      <w:r>
+        <w:t xml:space="preserve">Once both branches have been </w:t>
+      </w:r>
+      <w:r>
+        <w:t>analyzed</w:t>
+      </w:r>
+      <w:r>
+        <w:t>, the resulting contexts are merged. For each variable, if it appears in both contexts, the final bounds are computed by taking the minimum of the lower bounds and the maximum of the upper bounds:</w:t>
+      </w:r>
+    </w:p>
+    <w:p>
+      <w:pPr>
+        <w:pStyle w:val="Textoindependiente"/>
+      </w:pPr>
+      <w:r>
+        <w:t xml:space="preserve"> min=min(min</w:t>
+      </w:r>
+      <w:r>
+        <w:t xml:space="preserve"> i</w:t>
+      </w:r>
+      <w:r>
+        <w:t xml:space="preserve">f </w:t>
+      </w:r>
+      <w:r>
+        <w:rPr>
+          <w:rFonts w:ascii="Arial" w:hAnsi="Arial" w:cs="Arial"/>
+        </w:rPr>
+        <w:t>​</w:t>
+      </w:r>
+      <w:r>
+        <w:t xml:space="preserve"> ,min else </w:t>
+      </w:r>
+      <w:r>
+        <w:rPr>
+          <w:rFonts w:ascii="Arial" w:hAnsi="Arial" w:cs="Arial"/>
+        </w:rPr>
+        <w:t>​</w:t>
+      </w:r>
+      <w:r>
+        <w:t xml:space="preserve"> ),max=max(max if </w:t>
+      </w:r>
+      <w:r>
+        <w:rPr>
+          <w:rFonts w:ascii="Arial" w:hAnsi="Arial" w:cs="Arial"/>
+        </w:rPr>
+        <w:t>​</w:t>
+      </w:r>
+      <w:r>
+        <w:t xml:space="preserve"> ,max else </w:t>
+      </w:r>
+      <w:r>
+        <w:rPr>
+          <w:rFonts w:ascii="Arial" w:hAnsi="Arial" w:cs="Arial"/>
+        </w:rPr>
+        <w:t>​</w:t>
+      </w:r>
+      <w:r>
+        <w:t xml:space="preserve"> ) </w:t>
+      </w:r>
+    </w:p>
+    <w:p>
+      <w:pPr>
+        <w:pStyle w:val="Textoindependiente"/>
+      </w:pPr>
+      <w:r>
+        <w:t>If a variable appears only in one branch, its bounds</w:t>
+      </w:r>
+      <w:r>
+        <w:t xml:space="preserve"> will be transferred to the final context</w:t>
+      </w:r>
+      <w:r>
+        <w:t>.</w:t>
+      </w:r>
+    </w:p>
+    <w:p>
+      <w:pPr>
         <w:pStyle w:val="Ttulo3"/>
       </w:pPr>
       <w:r>
+        <w:lastRenderedPageBreak/>
         <w:t xml:space="preserve">Treat </w:t>
       </w:r>
       <w:r>
-        <w:t xml:space="preserve"> </w:t>
-      </w:r>
-      <w:r>
-        <w:t>while loops</w:t>
+        <w:t>while</w:t>
+      </w:r>
+      <w:r>
+        <w:t xml:space="preserve"> loops</w:t>
+      </w:r>
+    </w:p>
+    <w:p>
+      <w:pPr>
+        <w:pStyle w:val="Textoindependiente"/>
+      </w:pPr>
+      <w:r>
+        <w:t>While loops are more challenging to analyze</w:t>
+      </w:r>
+      <w:r>
+        <w:t>,</w:t>
+      </w:r>
+      <w:r>
+        <w:t xml:space="preserve"> because the number of iterations is not known </w:t>
+      </w:r>
+      <w:r>
+        <w:t>for us.</w:t>
+      </w:r>
+      <w:r>
+        <w:t xml:space="preserve"> This makes it difficult to precisely determine how the bounds of variables evolve during execution. </w:t>
+      </w:r>
+    </w:p>
+    <w:p>
+      <w:pPr>
+        <w:pStyle w:val="Textoindependiente"/>
+      </w:pPr>
+      <w:r>
+        <w:t xml:space="preserve">To address this, the analysis adopts a conservative approach. First, the body of the loop is analyzed once using a temporary context, </w:t>
+      </w:r>
+      <w:r>
+        <w:t>to</w:t>
+      </w:r>
+      <w:r>
+        <w:t xml:space="preserve"> detect which variables are modified inside the loop. Then, for each of these variables, the bounds in the original context are updated to the widest possible range, namely the full finite field [0,p−1]. </w:t>
+      </w:r>
+    </w:p>
+    <w:p>
+      <w:pPr>
+        <w:pStyle w:val="Textoindependiente"/>
+      </w:pPr>
+      <w:r>
+        <w:t>W</w:t>
+      </w:r>
+      <w:r>
+        <w:t xml:space="preserve">ithout additional information about the number of iterations or loop invariants, a variable modified inside a loop could potentially take any value in the field. </w:t>
+      </w:r>
+      <w:r>
+        <w:t xml:space="preserve">This </w:t>
+      </w:r>
+      <w:r>
+        <w:t>approach sacrifices precision,</w:t>
+      </w:r>
+      <w:r>
+        <w:t xml:space="preserve"> but</w:t>
+      </w:r>
+      <w:r>
+        <w:t xml:space="preserve"> it guarantees that the analysis remains sound.</w:t>
       </w:r>
     </w:p>
     <w:p>
@@ -5402,25 +5573,16 @@
           <w:ilvl w:val="0"/>
           <w:numId w:val="0"/>
         </w:numPr>
-        <w:rPr>
-          <w:lang w:val="es-ES"/>
-        </w:rPr>
       </w:pPr>
     </w:p>
     <w:p>
       <w:pPr>
         <w:pStyle w:val="Textoindependiente"/>
-        <w:rPr>
-          <w:lang w:val="es-ES"/>
-        </w:rPr>
       </w:pPr>
     </w:p>
     <w:p>
       <w:pPr>
         <w:ind w:firstLine="0"/>
-        <w:rPr>
-          <w:lang w:val="es-ES"/>
-        </w:rPr>
       </w:pPr>
     </w:p>
     <w:p>
@@ -6035,7 +6197,7 @@
                     <pic:cNvPicPr/>
                   </pic:nvPicPr>
                   <pic:blipFill>
-                    <a:blip r:embed="rId18">
+                    <a:blip r:embed="rId16">
                       <a:extLst>
                         <a:ext uri="{28A0092B-C50C-407E-A947-70E740481C1C}">
                           <a14:useLocalDpi xmlns:a14="http://schemas.microsoft.com/office/drawing/2010/main" val="0"/>
@@ -7028,7 +7190,7 @@
                     <pic:cNvPicPr/>
                   </pic:nvPicPr>
                   <pic:blipFill>
-                    <a:blip r:embed="rId19">
+                    <a:blip r:embed="rId17">
                       <a:extLst>
                         <a:ext uri="{28A0092B-C50C-407E-A947-70E740481C1C}">
                           <a14:useLocalDpi xmlns:a14="http://schemas.microsoft.com/office/drawing/2010/main" val="0"/>
@@ -12319,6 +12481,7 @@
   <w:style w:type="character" w:default="1" w:styleId="Fuentedeprrafopredeter">
     <w:name w:val="Default Paragraph Font"/>
     <w:uiPriority w:val="1"/>
+    <w:semiHidden/>
     <w:unhideWhenUsed/>
   </w:style>
   <w:style w:type="table" w:default="1" w:styleId="Tablanormal">

</xml_diff>

<commit_message>
Cambiada la cota superior en las integer division
</commit_message>
<xml_diff>
--- a/Optimization of the circom compiler.docx
+++ b/Optimization of the circom compiler.docx
@@ -2481,21 +2481,11 @@
         <w:pStyle w:val="PageHeading"/>
       </w:pPr>
       <w:bookmarkStart w:id="2" w:name="IndiceFiguras"/>
-      <w:proofErr w:type="spellStart"/>
       <w:r>
         <w:lastRenderedPageBreak/>
-        <w:t>Índice</w:t>
-      </w:r>
-      <w:proofErr w:type="spellEnd"/>
-      <w:r>
-        <w:t xml:space="preserve"> de </w:t>
-      </w:r>
-      <w:proofErr w:type="spellStart"/>
-      <w:r>
-        <w:t>figuras</w:t>
+        <w:t>Índice de figuras</w:t>
       </w:r>
       <w:bookmarkEnd w:id="2"/>
-      <w:proofErr w:type="spellEnd"/>
     </w:p>
     <w:p>
       <w:pPr>
@@ -2672,21 +2662,11 @@
           <w:u w:val="single"/>
         </w:rPr>
       </w:pPr>
-      <w:proofErr w:type="spellStart"/>
       <w:r>
         <w:lastRenderedPageBreak/>
-        <w:t>Índice</w:t>
-      </w:r>
-      <w:proofErr w:type="spellEnd"/>
-      <w:r>
-        <w:t xml:space="preserve"> de </w:t>
-      </w:r>
-      <w:proofErr w:type="spellStart"/>
-      <w:r>
-        <w:t>tablas</w:t>
+        <w:t>Índice de tablas</w:t>
       </w:r>
       <w:bookmarkEnd w:id="3"/>
-      <w:proofErr w:type="spellEnd"/>
     </w:p>
     <w:p>
       <w:pPr>
@@ -2818,15 +2798,7 @@
       <w:bookmarkStart w:id="8" w:name="_Toc116636437"/>
       <w:bookmarkStart w:id="9" w:name="_Toc221452907"/>
       <w:r>
-        <w:t xml:space="preserve">Zero-knowledge cryptography allows one party to prove that a statement is true without revealing any additional information beyond the validity of the statement itself. In this context, </w:t>
-      </w:r>
-      <w:proofErr w:type="spellStart"/>
-      <w:r>
-        <w:t>zk</w:t>
-      </w:r>
-      <w:proofErr w:type="spellEnd"/>
-      <w:r>
-        <w:t xml:space="preserve">-SNARKs are one of the most widely used constructions, since they provide short proofs that can be verified efficiently. To generate the constraint systems required by these protocols, several domain-specific languages have been developed. These languages make it easier for users to describe arithmetic circuits and other cryptographic computations in a high-level way, without having to deal directly with the low-level representation of constraints. </w:t>
+        <w:t xml:space="preserve">Zero-knowledge cryptography allows one party to prove that a statement is true without revealing any additional information beyond the validity of the statement itself. In this context, zk-SNARKs are one of the most widely used constructions, since they provide short proofs that can be verified efficiently. To generate the constraint systems required by these protocols, several domain-specific languages have been developed. These languages make it easier for users to describe arithmetic circuits and other cryptographic computations in a high-level way, without having to deal directly with the low-level representation of constraints. </w:t>
       </w:r>
     </w:p>
     <w:p>
@@ -2840,23 +2812,7 @@
         <w:t xml:space="preserve"> by tens of thousands of users in</w:t>
       </w:r>
       <w:r>
-        <w:t xml:space="preserve"> both academic and practical contexts, and it is taught in several universities as part of applied cryptography courses. It is also widely used in privacy-oriented applications such as digital identity, voting systems, and blockchain-based solutions. In these scenarios, the efficiency of the compiler becomes critical, especially when working with large circuits, since both memory usage and execution time can significantly affect performance. Circom not only generates the constraint system of the </w:t>
-      </w:r>
-      <w:proofErr w:type="gramStart"/>
-      <w:r>
-        <w:t>circuit, but</w:t>
-      </w:r>
-      <w:proofErr w:type="gramEnd"/>
-      <w:r>
-        <w:t xml:space="preserve"> also produces executable code in both C++ and </w:t>
-      </w:r>
-      <w:proofErr w:type="spellStart"/>
-      <w:r>
-        <w:t>WebAssembly</w:t>
-      </w:r>
-      <w:proofErr w:type="spellEnd"/>
-      <w:r>
-        <w:t xml:space="preserve"> to compute the witness. </w:t>
+        <w:t xml:space="preserve"> both academic and practical contexts, and it is taught in several universities as part of applied cryptography courses. It is also widely used in privacy-oriented applications such as digital identity, voting systems, and blockchain-based solutions. In these scenarios, the efficiency of the compiler becomes critical, especially when working with large circuits, since both memory usage and execution time can significantly affect performance. Circom not only generates the constraint system of the circuit, but also produces executable code in both C++ and WebAssembly to compute the witness. </w:t>
       </w:r>
     </w:p>
     <w:p>
@@ -2884,15 +2840,7 @@
         <w:pStyle w:val="Textoindependiente"/>
       </w:pPr>
       <w:r>
-        <w:t xml:space="preserve">The objective of this work is to analyze the range of values that variables can take and, depending on those bounds, adjust their memory </w:t>
-      </w:r>
-      <w:proofErr w:type="gramStart"/>
-      <w:r>
-        <w:t>size</w:t>
-      </w:r>
-      <w:proofErr w:type="gramEnd"/>
-      <w:r>
-        <w:t xml:space="preserve"> accordingly, reducing overall memory usage without affecting correctness</w:t>
+        <w:t>The objective of this work is to analyze the range of values that variables can take and, depending on those bounds, adjust their memory size accordingly, reducing overall memory usage without affecting correctness</w:t>
       </w:r>
       <w:r>
         <w:t>.</w:t>
@@ -3007,15 +2955,7 @@
         <w:t>L</w:t>
       </w:r>
       <w:r>
-        <w:t xml:space="preserve">anguage (DSL) for describing arithmetic circuits used in </w:t>
-      </w:r>
-      <w:proofErr w:type="spellStart"/>
-      <w:r>
-        <w:t>zk</w:t>
-      </w:r>
-      <w:proofErr w:type="spellEnd"/>
-      <w:r>
-        <w:t>-SNARK systems. Circuits consist of addition and multiplication gates over a finite field. A typical Circom program defines signals</w:t>
+        <w:t>anguage (DSL) for describing arithmetic circuits used in zk-SNARK systems. Circuits consist of addition and multiplication gates over a finite field. A typical Circom program defines signals</w:t>
       </w:r>
       <w:r>
         <w:t>,</w:t>
@@ -3155,13 +3095,8 @@
         <w:fldChar w:fldCharType="end"/>
       </w:r>
       <w:r>
-        <w:t xml:space="preserve"> from </w:t>
-      </w:r>
-      <w:proofErr w:type="spellStart"/>
-      <w:r>
-        <w:t>circomlib</w:t>
-      </w:r>
-      <w:proofErr w:type="spellEnd"/>
+        <w:t xml:space="preserve"> from circomlib</w:t>
+      </w:r>
     </w:p>
     <w:p>
       <w:pPr>
@@ -3190,13 +3125,8 @@
         <w:fldChar w:fldCharType="end"/>
       </w:r>
       <w:r>
-        <w:t xml:space="preserve"> from </w:t>
-      </w:r>
-      <w:proofErr w:type="spellStart"/>
-      <w:r>
-        <w:t>circomlib</w:t>
-      </w:r>
-      <w:proofErr w:type="spellEnd"/>
+        <w:t xml:space="preserve"> from circomlib</w:t>
+      </w:r>
     </w:p>
     <w:p>
       <w:r>
@@ -3209,28 +3139,12 @@
     <w:p>
       <w:r>
         <w:lastRenderedPageBreak/>
-        <w:t xml:space="preserve">“&lt;==” is used to </w:t>
-      </w:r>
-      <w:proofErr w:type="spellStart"/>
-      <w:r>
-        <w:t>assing</w:t>
-      </w:r>
-      <w:proofErr w:type="spellEnd"/>
-      <w:r>
-        <w:t xml:space="preserve"> a value and create a constraint.</w:t>
-      </w:r>
-    </w:p>
-    <w:p>
-      <w:r>
-        <w:t xml:space="preserve">“&lt;--” is used to only </w:t>
-      </w:r>
-      <w:proofErr w:type="spellStart"/>
-      <w:r>
-        <w:t>assing</w:t>
-      </w:r>
-      <w:proofErr w:type="spellEnd"/>
-      <w:r>
-        <w:t xml:space="preserve"> a value.</w:t>
+        <w:t>“&lt;==” is used to assing a value and create a constraint.</w:t>
+      </w:r>
+    </w:p>
+    <w:p>
+      <w:r>
+        <w:t>“&lt;--” is used to only assing a value.</w:t>
       </w:r>
     </w:p>
     <w:p>
@@ -3249,13 +3163,8 @@
         <w:t>“</w:t>
       </w:r>
       <w:r>
-        <w:t xml:space="preserve">. </w:t>
-      </w:r>
-      <w:proofErr w:type="spellStart"/>
-      <w:r>
-        <w:t>circom</w:t>
-      </w:r>
-      <w:proofErr w:type="spellEnd"/>
+        <w:t>. circom</w:t>
+      </w:r>
       <w:r>
         <w:t>”</w:t>
       </w:r>
@@ -3308,31 +3217,7 @@
         <w:t>”</w:t>
       </w:r>
       <w:r>
-        <w:t>) is translated into one or more rank-1 constraints of the form (</w:t>
-      </w:r>
-      <w:proofErr w:type="spellStart"/>
-      <w:r>
-        <w:t>linear_combination_A</w:t>
-      </w:r>
-      <w:proofErr w:type="spellEnd"/>
-      <w:r>
-        <w:t>) * (</w:t>
-      </w:r>
-      <w:proofErr w:type="spellStart"/>
-      <w:r>
-        <w:t>linear_combination_B</w:t>
-      </w:r>
-      <w:proofErr w:type="spellEnd"/>
-      <w:r>
-        <w:t>) = (</w:t>
-      </w:r>
-      <w:proofErr w:type="spellStart"/>
-      <w:r>
-        <w:t>linear_combination_C</w:t>
-      </w:r>
-      <w:proofErr w:type="spellEnd"/>
-      <w:r>
-        <w:t xml:space="preserve">). </w:t>
+        <w:t xml:space="preserve">) is translated into one or more rank-1 constraints of the form (linear_combination_A) * (linear_combination_B) = (linear_combination_C). </w:t>
       </w:r>
     </w:p>
     <w:p>
@@ -3367,15 +3252,7 @@
         </w:numPr>
       </w:pPr>
       <w:r>
-        <w:t xml:space="preserve">A witness calculator program, generated in C++ or </w:t>
-      </w:r>
-      <w:proofErr w:type="spellStart"/>
-      <w:r>
-        <w:t>WebAssembly</w:t>
-      </w:r>
-      <w:proofErr w:type="spellEnd"/>
-      <w:r>
-        <w:t xml:space="preserve">, which computes all the signal values that satisfy those constraints. </w:t>
+        <w:t xml:space="preserve">A witness calculator program, generated in C++ or WebAssembly, which computes all the signal values that satisfy those constraints. </w:t>
       </w:r>
     </w:p>
     <w:p>
@@ -3391,15 +3268,7 @@
         <w:pStyle w:val="Textoindependiente"/>
       </w:pPr>
       <w:r>
-        <w:t xml:space="preserve">The witness calculator is responsible for computing all intermediate and final signal values from the circuit inputs. Once this witness is generated, it can be combined with the .r1cs file and passed to tools such as </w:t>
-      </w:r>
-      <w:proofErr w:type="spellStart"/>
-      <w:r>
-        <w:t>SnarkJS</w:t>
-      </w:r>
-      <w:proofErr w:type="spellEnd"/>
-      <w:r>
-        <w:t xml:space="preserve">, which are used to generate and verify zero-knowledge proofs. In this way, Circom separates the description of the arithmetic circuit from the cryptographic machinery required to produce proofs. </w:t>
+        <w:t xml:space="preserve">The witness calculator is responsible for computing all intermediate and final signal values from the circuit inputs. Once this witness is generated, it can be combined with the .r1cs file and passed to tools such as SnarkJS, which are used to generate and verify zero-knowledge proofs. In this way, Circom separates the description of the arithmetic circuit from the cryptographic machinery required to produce proofs. </w:t>
       </w:r>
     </w:p>
     <w:p>
@@ -3525,15 +3394,7 @@
         <w:t>’</w:t>
       </w:r>
       <w:r>
-        <w:t xml:space="preserve">s rich type system aids in writing compiler code. For example, signals, components, and constraints can be modeled with Rust </w:t>
-      </w:r>
-      <w:proofErr w:type="spellStart"/>
-      <w:r>
-        <w:t>enums</w:t>
-      </w:r>
-      <w:proofErr w:type="spellEnd"/>
-      <w:r>
-        <w:t xml:space="preserve"> and checked exhaustively by the compiler. This reduces bugs in handling complex cases</w:t>
+        <w:t>s rich type system aids in writing compiler code. For example, signals, components, and constraints can be modeled with Rust enums and checked exhaustively by the compiler. This reduces bugs in handling complex cases</w:t>
       </w:r>
       <w:r>
         <w:t>.</w:t>
@@ -3802,15 +3663,7 @@
         <w:keepNext/>
       </w:pPr>
       <w:r>
-        <w:t xml:space="preserve">This also creates inefficiency not only when generating C code, but also when targeting </w:t>
-      </w:r>
-      <w:proofErr w:type="spellStart"/>
-      <w:r>
-        <w:t>WebAssembly</w:t>
-      </w:r>
-      <w:proofErr w:type="spellEnd"/>
-      <w:r>
-        <w:t xml:space="preserve">. Since all values are treated as large field elements, the generated code must handle them using representations that are often larger and more expensive than necessary. As a result, memory consumption and execution time can increase, especially in circuits with many intermediate values. </w:t>
+        <w:t xml:space="preserve">This also creates inefficiency not only when generating C code, but also when targeting WebAssembly. Since all values are treated as large field elements, the generated code must handle them using representations that are often larger and more expensive than necessary. As a result, memory consumption and execution time can increase, especially in circuits with many intermediate values. </w:t>
       </w:r>
     </w:p>
     <w:p>
@@ -3823,11 +3676,9 @@
       <w:r>
         <w:t>“</w:t>
       </w:r>
-      <w:proofErr w:type="spellStart"/>
       <w:r>
         <w:t>IsZero</w:t>
       </w:r>
-      <w:proofErr w:type="spellEnd"/>
       <w:r>
         <w:t>”</w:t>
       </w:r>
@@ -3923,13 +3774,8 @@
         <w:fldChar w:fldCharType="end"/>
       </w:r>
       <w:r>
-        <w:t xml:space="preserve"> from </w:t>
-      </w:r>
-      <w:proofErr w:type="spellStart"/>
-      <w:r>
-        <w:t>circomlib</w:t>
-      </w:r>
-      <w:proofErr w:type="spellEnd"/>
+        <w:t xml:space="preserve"> from circomlib</w:t>
+      </w:r>
     </w:p>
     <w:p>
       <w:pPr>
@@ -3945,15 +3791,7 @@
       </w:r>
       <w:r>
         <w:lastRenderedPageBreak/>
-        <w:t xml:space="preserve">more efficient C or </w:t>
-      </w:r>
-      <w:proofErr w:type="spellStart"/>
-      <w:r>
-        <w:t>WebAssembly</w:t>
-      </w:r>
-      <w:proofErr w:type="spellEnd"/>
-      <w:r>
-        <w:t xml:space="preserve"> code,</w:t>
+        <w:t>more efficient C or WebAssembly code,</w:t>
       </w:r>
       <w:r>
         <w:t xml:space="preserve"> and</w:t>
@@ -4095,33 +3933,12 @@
         <w:t xml:space="preserve"> a</w:t>
       </w:r>
       <w:r>
-        <w:t xml:space="preserve">m going to implement a </w:t>
-      </w:r>
-      <w:proofErr w:type="gramStart"/>
-      <w:r>
-        <w:t>function,</w:t>
-      </w:r>
-      <w:proofErr w:type="gramEnd"/>
-      <w:r>
-        <w:t xml:space="preserve"> that </w:t>
-      </w:r>
-      <w:proofErr w:type="gramStart"/>
-      <w:r>
-        <w:t>given</w:t>
-      </w:r>
-      <w:proofErr w:type="gramEnd"/>
-      <w:r>
-        <w:t xml:space="preserve"> the expression and the context, will give back the bounds.</w:t>
-      </w:r>
-    </w:p>
-    <w:p>
-      <w:proofErr w:type="gramStart"/>
-      <w:r>
-        <w:t>Bounds(</w:t>
-      </w:r>
-      <w:proofErr w:type="gramEnd"/>
-      <w:r>
-        <w:t>Expr, context) = {min, max}</w:t>
+        <w:t>m going to implement a function, that given the expression and the context, will give back the bounds.</w:t>
+      </w:r>
+    </w:p>
+    <w:p>
+      <w:r>
+        <w:t>Bounds(Expr, context) = {min, max}</w:t>
       </w:r>
     </w:p>
     <w:p>
@@ -4177,15 +3994,7 @@
         <w:pStyle w:val="Textoindependiente"/>
       </w:pPr>
       <w:r>
-        <w:t xml:space="preserve">For the Add operation you just </w:t>
-      </w:r>
-      <w:proofErr w:type="gramStart"/>
-      <w:r>
-        <w:t>have to</w:t>
-      </w:r>
-      <w:proofErr w:type="gramEnd"/>
-      <w:r>
-        <w:t xml:space="preserve"> add the bounds, min with min and max with max, and you will have the bounds of the whole expression.</w:t>
+        <w:t>For the Add operation you just have to add the bounds, min with min and max with max, and you will have the bounds of the whole expression.</w:t>
       </w:r>
     </w:p>
     <w:p>
@@ -4201,15 +4010,7 @@
         <w:pStyle w:val="Textoindependiente"/>
       </w:pPr>
       <w:r>
-        <w:t xml:space="preserve">And finally, the Mul operations works as the Add operation with </w:t>
-      </w:r>
-      <w:proofErr w:type="spellStart"/>
-      <w:r>
-        <w:t>th</w:t>
-      </w:r>
-      <w:proofErr w:type="spellEnd"/>
-      <w:r>
-        <w:t xml:space="preserve"> twist that now you multiply instead of summing.</w:t>
+        <w:t>And finally, the Mul operations works as the Add operation with th twist that now you multiply instead of summing.</w:t>
       </w:r>
     </w:p>
     <w:p>
@@ -4217,41 +4018,23 @@
         <w:pStyle w:val="Textoindependiente"/>
       </w:pPr>
       <w:r>
-        <w:t>If Bounds(e1) = (min1, max1) and Bounds(e</w:t>
-      </w:r>
-      <w:proofErr w:type="gramStart"/>
-      <w:r>
-        <w:t>2)=</w:t>
-      </w:r>
-      <w:proofErr w:type="gramEnd"/>
-      <w:r>
-        <w:t xml:space="preserve"> (min2, max2) then</w:t>
+        <w:t>If Bounds(e1) = (min1, max1) and Bounds(e2)= (min2, max2) then</w:t>
       </w:r>
     </w:p>
     <w:p>
       <w:pPr>
         <w:pStyle w:val="Textoindependiente"/>
       </w:pPr>
-      <w:proofErr w:type="gramStart"/>
-      <w:r>
-        <w:t>Bounds(</w:t>
-      </w:r>
-      <w:proofErr w:type="gramEnd"/>
-      <w:r>
-        <w:t>e1 +e2) = (min1+min2, max1+max2)</w:t>
+      <w:r>
+        <w:t>Bounds(e1 +e2) = (min1+min2, max1+max2)</w:t>
       </w:r>
     </w:p>
     <w:p>
       <w:pPr>
         <w:pStyle w:val="Textoindependiente"/>
       </w:pPr>
-      <w:proofErr w:type="gramStart"/>
-      <w:r>
-        <w:t>Bounds(</w:t>
-      </w:r>
-      <w:proofErr w:type="gramEnd"/>
-      <w:r>
-        <w:t xml:space="preserve">e1 </w:t>
+      <w:r>
+        <w:t xml:space="preserve">Bounds(e1 </w:t>
       </w:r>
       <w:r>
         <w:t>-</w:t>
@@ -4276,13 +4059,8 @@
       <w:pPr>
         <w:pStyle w:val="Textoindependiente"/>
       </w:pPr>
-      <w:proofErr w:type="gramStart"/>
-      <w:r>
-        <w:t>Bounds(</w:t>
-      </w:r>
-      <w:proofErr w:type="gramEnd"/>
-      <w:r>
-        <w:t xml:space="preserve">e1 </w:t>
+      <w:r>
+        <w:t xml:space="preserve">Bounds(e1 </w:t>
       </w:r>
       <w:r>
         <w:t>*</w:t>
@@ -4348,23 +4126,7 @@
         <w:tab/>
       </w:r>
       <w:r>
-        <w:t>Bounds(x0+x</w:t>
-      </w:r>
-      <w:proofErr w:type="gramStart"/>
-      <w:r>
-        <w:t>1)=</w:t>
-      </w:r>
-      <w:proofErr w:type="gramEnd"/>
-      <w:r>
-        <w:t>(0+2,5+</w:t>
-      </w:r>
-      <w:proofErr w:type="gramStart"/>
-      <w:r>
-        <w:t>3)=</w:t>
-      </w:r>
-      <w:proofErr w:type="gramEnd"/>
-      <w:r>
-        <w:t>(2,8)</w:t>
+        <w:t>Bounds(x0+x1)=(0+2,5+3)=(2,8)</w:t>
       </w:r>
     </w:p>
     <w:p>
@@ -4374,23 +4136,7 @@
         </w:rPr>
       </w:pPr>
       <w:r>
-        <w:t>Bounds(x0−x</w:t>
-      </w:r>
-      <w:proofErr w:type="gramStart"/>
-      <w:r>
-        <w:t>1)=</w:t>
-      </w:r>
-      <w:proofErr w:type="gramEnd"/>
-      <w:r>
-        <w:t>(0−3,5−</w:t>
-      </w:r>
-      <w:proofErr w:type="gramStart"/>
-      <w:r>
-        <w:t>2)=</w:t>
-      </w:r>
-      <w:proofErr w:type="gramEnd"/>
-      <w:r>
-        <w:t>(−3,3)</w:t>
+        <w:t>Bounds(x0−x1)=(0−3,5−2)=(−3,3)</w:t>
       </w:r>
     </w:p>
     <w:p>
@@ -4404,15 +4150,7 @@
         <w:t>⋅</w:t>
       </w:r>
       <w:r>
-        <w:t>x</w:t>
-      </w:r>
-      <w:proofErr w:type="gramStart"/>
-      <w:r>
-        <w:t>1)=</w:t>
-      </w:r>
-      <w:proofErr w:type="gramEnd"/>
-      <w:r>
-        <w:t>(0</w:t>
+        <w:t>x1)=(0</w:t>
       </w:r>
       <w:r>
         <w:rPr>
@@ -4429,13 +4167,8 @@
         </w:rPr>
         <w:t>⋅</w:t>
       </w:r>
-      <w:proofErr w:type="gramStart"/>
-      <w:r>
-        <w:t>3)=</w:t>
-      </w:r>
-      <w:proofErr w:type="gramEnd"/>
-      <w:r>
-        <w:t>(0,15)</w:t>
+      <w:r>
+        <w:t>3)=(0,15)</w:t>
       </w:r>
     </w:p>
     <w:p>
@@ -4457,23 +4190,7 @@
         <w:pStyle w:val="Textoindependiente"/>
       </w:pPr>
       <w:r>
-        <w:t xml:space="preserve">There are two kinds of divisions in Circom, the </w:t>
-      </w:r>
-      <w:proofErr w:type="spellStart"/>
-      <w:r>
-        <w:t>Divison</w:t>
-      </w:r>
-      <w:proofErr w:type="spellEnd"/>
-      <w:r>
-        <w:t xml:space="preserve"> and the </w:t>
-      </w:r>
-      <w:proofErr w:type="spellStart"/>
-      <w:r>
-        <w:t>Interger</w:t>
-      </w:r>
-      <w:proofErr w:type="spellEnd"/>
-      <w:r>
-        <w:t xml:space="preserve"> Division. </w:t>
+        <w:t xml:space="preserve">There are two kinds of divisions in Circom, the Divison and the Interger Division. </w:t>
       </w:r>
     </w:p>
     <w:p>
@@ -4492,7 +4209,13 @@
         <w:pStyle w:val="Textoindependiente"/>
       </w:pPr>
       <w:r>
-        <w:t>For integer division, the result is always truncated, so its value cannot be larger than the numerator. For this reason, the upper bound is taken from the left operand:</w:t>
+        <w:t>For integer division,</w:t>
+      </w:r>
+      <w:r>
+        <w:t xml:space="preserve"> we can at least define the maximum value, and that because in the left operand we cannot have a number below 1</w:t>
+      </w:r>
+      <w:r>
+        <w:t>:</w:t>
       </w:r>
     </w:p>
     <w:p>
@@ -4500,28 +4223,15 @@
         <w:pStyle w:val="Textoindependiente"/>
       </w:pPr>
       <w:r>
-        <w:t>If Bounds(e1) = (min1, max1) and Bounds(e</w:t>
-      </w:r>
-      <w:proofErr w:type="gramStart"/>
-      <w:r>
-        <w:t>2)=</w:t>
-      </w:r>
-      <w:proofErr w:type="gramEnd"/>
-      <w:r>
-        <w:t xml:space="preserve"> (min2, max2) then</w:t>
+        <w:t>If Bounds(e1) = (min1, max1) and Bounds(e2)= (min2, max2) then</w:t>
       </w:r>
     </w:p>
     <w:p>
       <w:pPr>
         <w:pStyle w:val="Textoindependiente"/>
       </w:pPr>
-      <w:proofErr w:type="gramStart"/>
-      <w:r>
-        <w:t>Bounds(</w:t>
-      </w:r>
-      <w:proofErr w:type="gramEnd"/>
-      <w:r>
-        <w:t xml:space="preserve">e1 </w:t>
+      <w:r>
+        <w:t xml:space="preserve">Bounds(e1 </w:t>
       </w:r>
       <w:r>
         <w:t xml:space="preserve">/ </w:t>
@@ -4549,13 +4259,8 @@
           <w:u w:val="single"/>
         </w:rPr>
       </w:pPr>
-      <w:proofErr w:type="gramStart"/>
-      <w:r>
-        <w:t>Bounds(</w:t>
-      </w:r>
-      <w:proofErr w:type="gramEnd"/>
-      <w:r>
-        <w:t xml:space="preserve">e1 </w:t>
+      <w:r>
+        <w:t xml:space="preserve">Bounds(e1 </w:t>
       </w:r>
       <w:r>
         <w:t>\</w:t>
@@ -4576,6 +4281,9 @@
         <w:t xml:space="preserve"> max1</w:t>
       </w:r>
       <w:r>
+        <w:t>/min2</w:t>
+      </w:r>
+      <w:r>
         <w:t>)</w:t>
       </w:r>
     </w:p>
@@ -4621,15 +4329,7 @@
         <w:t xml:space="preserve"> </w:t>
       </w:r>
       <w:r>
-        <w:t xml:space="preserve">have very easy bounds. For the power, we are going to keep the prime as maximum, </w:t>
-      </w:r>
-      <w:proofErr w:type="gramStart"/>
-      <w:r>
-        <w:t>and  0</w:t>
-      </w:r>
-      <w:proofErr w:type="gramEnd"/>
-      <w:r>
-        <w:t xml:space="preserve"> for the minimum. And for the modulus, the minimum would be 0, and the maximum will be the expression on the right.</w:t>
+        <w:t>have very easy bounds. For the power, we are going to keep the prime as maximum, and  0 for the minimum. And for the modulus, the minimum would be 0, and the maximum will be the expression on the right.</w:t>
       </w:r>
     </w:p>
     <w:p>
@@ -4637,15 +4337,7 @@
         <w:pStyle w:val="Textoindependiente"/>
       </w:pPr>
       <w:r>
-        <w:t>If Bounds(e1) = (min1, max1) and Bounds(e</w:t>
-      </w:r>
-      <w:proofErr w:type="gramStart"/>
-      <w:r>
-        <w:t>2)=</w:t>
-      </w:r>
-      <w:proofErr w:type="gramEnd"/>
-      <w:r>
-        <w:t xml:space="preserve"> (min2, max2) then</w:t>
+        <w:t>If Bounds(e1) = (min1, max1) and Bounds(e2)= (min2, max2) then</w:t>
       </w:r>
     </w:p>
     <w:p>
@@ -4669,19 +4361,11 @@
           <w:u w:val="single"/>
         </w:rPr>
       </w:pPr>
-      <w:proofErr w:type="gramStart"/>
-      <w:r>
-        <w:rPr>
-          <w:lang w:val="es-ES"/>
-        </w:rPr>
-        <w:t>Bounds(</w:t>
-      </w:r>
-      <w:proofErr w:type="gramEnd"/>
-      <w:r>
-        <w:rPr>
-          <w:lang w:val="es-ES"/>
-        </w:rPr>
-        <w:t xml:space="preserve">e1 </w:t>
+      <w:r>
+        <w:rPr>
+          <w:lang w:val="es-ES"/>
+        </w:rPr>
+        <w:t xml:space="preserve">Bounds(e1 </w:t>
       </w:r>
       <w:r>
         <w:rPr>
@@ -4735,28 +4419,15 @@
         <w:pStyle w:val="Textoindependiente"/>
       </w:pPr>
       <w:r>
-        <w:t>If Bounds(e1) = (min1, max1) and Bounds(e</w:t>
-      </w:r>
-      <w:proofErr w:type="gramStart"/>
-      <w:r>
-        <w:t>2)=</w:t>
-      </w:r>
-      <w:proofErr w:type="gramEnd"/>
-      <w:r>
-        <w:t xml:space="preserve"> (min2, max2) then</w:t>
+        <w:t>If Bounds(e1) = (min1, max1) and Bounds(e2)= (min2, max2) then</w:t>
       </w:r>
     </w:p>
     <w:p>
       <w:pPr>
         <w:pStyle w:val="Textoindependiente"/>
       </w:pPr>
-      <w:proofErr w:type="gramStart"/>
-      <w:r>
-        <w:t>Bounds(</w:t>
-      </w:r>
-      <w:proofErr w:type="gramEnd"/>
-      <w:r>
-        <w:t xml:space="preserve">e1 </w:t>
+      <w:r>
+        <w:t xml:space="preserve">Bounds(e1 </w:t>
       </w:r>
       <w:r>
         <w:t xml:space="preserve">&lt;&lt; </w:t>
@@ -4778,13 +4449,8 @@
           <w:u w:val="single"/>
         </w:rPr>
       </w:pPr>
-      <w:proofErr w:type="gramStart"/>
-      <w:r>
-        <w:t>Bounds(</w:t>
-      </w:r>
-      <w:proofErr w:type="gramEnd"/>
-      <w:r>
-        <w:t xml:space="preserve">e1 </w:t>
+      <w:r>
+        <w:t xml:space="preserve">Bounds(e1 </w:t>
       </w:r>
       <w:r>
         <w:t xml:space="preserve">&gt;&gt; </w:t>
@@ -4838,11 +4504,9 @@
       <w:r>
         <w:t xml:space="preserve">, </w:t>
       </w:r>
-      <w:proofErr w:type="spellStart"/>
       <w:r>
         <w:t>LesserEq</w:t>
       </w:r>
-      <w:proofErr w:type="spellEnd"/>
       <w:r>
         <w:t xml:space="preserve">, </w:t>
       </w:r>
@@ -4852,11 +4516,9 @@
       <w:r>
         <w:t xml:space="preserve">, </w:t>
       </w:r>
-      <w:proofErr w:type="spellStart"/>
       <w:r>
         <w:t>GreaterEq</w:t>
       </w:r>
-      <w:proofErr w:type="spellEnd"/>
       <w:r>
         <w:t xml:space="preserve">, </w:t>
       </w:r>
@@ -4866,174 +4528,119 @@
       <w:r>
         <w:t xml:space="preserve">, </w:t>
       </w:r>
-      <w:proofErr w:type="spellStart"/>
-      <w:r>
-        <w:t>NotEq</w:t>
-      </w:r>
-      <w:proofErr w:type="spellEnd"/>
+      <w:r>
+        <w:t xml:space="preserve">NotEq, </w:t>
+      </w:r>
+      <w:r>
+        <w:t>BoolOr, and BoolAnd. Their common characteristic is that they always produce a boolean result, that is, either 0 or 1</w:t>
+      </w:r>
+      <w:r>
+        <w:t>. Because of that</w:t>
+      </w:r>
+      <w:r>
+        <w:t>, the bounds of any expression using one of these operators are always:</w:t>
+      </w:r>
+    </w:p>
+    <w:p>
+      <w:pPr>
+        <w:pStyle w:val="Textoindependiente"/>
+      </w:pPr>
+      <w:r>
+        <w:t>If Bounds(e1) = (min1, max1) and Bounds(e2)= (min2, max2) then</w:t>
+      </w:r>
+    </w:p>
+    <w:p>
+      <w:pPr>
+        <w:pStyle w:val="Textoindependiente"/>
+      </w:pPr>
+      <w:r>
+        <w:t xml:space="preserve">Bounds(e1 </w:t>
+      </w:r>
+      <w:r>
+        <w:t xml:space="preserve">“Boolean operation” </w:t>
+      </w:r>
+      <w:r>
+        <w:t>e2) = (</w:t>
+      </w:r>
+      <w:r>
+        <w:t>0</w:t>
+      </w:r>
       <w:r>
         <w:t xml:space="preserve">, </w:t>
       </w:r>
-      <w:proofErr w:type="spellStart"/>
-      <w:r>
-        <w:t>BoolOr</w:t>
-      </w:r>
-      <w:proofErr w:type="spellEnd"/>
-      <w:r>
-        <w:t xml:space="preserve">, and </w:t>
-      </w:r>
-      <w:proofErr w:type="spellStart"/>
-      <w:r>
-        <w:t>BoolAnd</w:t>
-      </w:r>
-      <w:proofErr w:type="spellEnd"/>
-      <w:r>
-        <w:t xml:space="preserve">. Their common characteristic is that they always produce a </w:t>
-      </w:r>
-      <w:proofErr w:type="spellStart"/>
-      <w:r>
-        <w:t>boolean</w:t>
-      </w:r>
-      <w:proofErr w:type="spellEnd"/>
-      <w:r>
-        <w:t xml:space="preserve"> result, that is, either 0 or 1</w:t>
-      </w:r>
-      <w:r>
-        <w:t>. Because of that</w:t>
-      </w:r>
-      <w:r>
-        <w:t>, the bounds of any expression using one of these operators are always:</w:t>
+      <w:r>
+        <w:t>1</w:t>
+      </w:r>
+      <w:r>
+        <w:t>)</w:t>
       </w:r>
     </w:p>
     <w:p>
       <w:pPr>
         <w:pStyle w:val="Textoindependiente"/>
       </w:pPr>
-      <w:r>
-        <w:t>If Bounds(e1) = (min1, max1) and Bounds(e</w:t>
-      </w:r>
-      <w:proofErr w:type="gramStart"/>
-      <w:r>
-        <w:t>2)=</w:t>
-      </w:r>
-      <w:proofErr w:type="gramEnd"/>
-      <w:r>
-        <w:t xml:space="preserve"> (min2, max2) then</w:t>
+    </w:p>
+    <w:p>
+      <w:pPr>
+        <w:pStyle w:val="Ttulo4"/>
+      </w:pPr>
+      <w:r>
+        <w:t>Bit operations</w:t>
       </w:r>
     </w:p>
     <w:p>
       <w:pPr>
         <w:pStyle w:val="Textoindependiente"/>
       </w:pPr>
-      <w:proofErr w:type="gramStart"/>
-      <w:r>
-        <w:t>Bounds(</w:t>
-      </w:r>
-      <w:proofErr w:type="gramEnd"/>
-      <w:r>
-        <w:t xml:space="preserve">e1 </w:t>
-      </w:r>
-      <w:r>
-        <w:t xml:space="preserve">“Boolean operation” </w:t>
-      </w:r>
-      <w:r>
-        <w:t>e2) = (</w:t>
-      </w:r>
-      <w:r>
-        <w:t>0</w:t>
-      </w:r>
-      <w:r>
-        <w:t xml:space="preserve">, </w:t>
-      </w:r>
-      <w:r>
-        <w:t>1</w:t>
-      </w:r>
-      <w:r>
-        <w:t>)</w:t>
+      <w:r>
+        <w:t xml:space="preserve">For the </w:t>
+      </w:r>
+      <w:r>
+        <w:t>“</w:t>
+      </w:r>
+      <w:r>
+        <w:t>O</w:t>
+      </w:r>
+      <w:r>
+        <w:t>r</w:t>
+      </w:r>
+      <w:r>
+        <w:t>”</w:t>
+      </w:r>
+      <w:r>
+        <w:t xml:space="preserve"> operation, we</w:t>
+      </w:r>
+      <w:r>
+        <w:t xml:space="preserve"> </w:t>
+      </w:r>
+      <w:r>
+        <w:t xml:space="preserve">just </w:t>
+      </w:r>
+      <w:r>
+        <w:t xml:space="preserve">must add the maximus and find the biggest minimum of both expressions. In the other hand, the </w:t>
+      </w:r>
+      <w:r>
+        <w:t>“</w:t>
+      </w:r>
+      <w:r>
+        <w:t>And</w:t>
+      </w:r>
+      <w:r>
+        <w:t>”</w:t>
+      </w:r>
+      <w:r>
+        <w:t xml:space="preserve"> operation</w:t>
+      </w:r>
+      <w:r>
+        <w:t xml:space="preserve"> keeps a 0 in its minimum, and the minimum max of both expressions as the maximus. And finally, the “Xor” operation has the minimum of the “And”, and the maximum of the “Or”.</w:t>
       </w:r>
     </w:p>
     <w:p>
       <w:pPr>
         <w:pStyle w:val="Textoindependiente"/>
       </w:pPr>
-    </w:p>
-    <w:p>
-      <w:pPr>
-        <w:pStyle w:val="Ttulo4"/>
-      </w:pPr>
-      <w:r>
-        <w:t>Bit operations</w:t>
-      </w:r>
-    </w:p>
-    <w:p>
-      <w:pPr>
-        <w:pStyle w:val="Textoindependiente"/>
-      </w:pPr>
-      <w:r>
-        <w:t xml:space="preserve">For the </w:t>
-      </w:r>
-      <w:r>
-        <w:t>“</w:t>
-      </w:r>
-      <w:r>
-        <w:t>O</w:t>
-      </w:r>
-      <w:r>
-        <w:t>r</w:t>
-      </w:r>
-      <w:r>
-        <w:t>”</w:t>
-      </w:r>
-      <w:r>
-        <w:t xml:space="preserve"> operation, we</w:t>
-      </w:r>
-      <w:r>
-        <w:t xml:space="preserve"> </w:t>
-      </w:r>
-      <w:r>
-        <w:t xml:space="preserve">just </w:t>
-      </w:r>
-      <w:r>
-        <w:t xml:space="preserve">must add the maximus and find the biggest minimum of both expressions. In the other hand, the </w:t>
-      </w:r>
-      <w:r>
-        <w:t>“</w:t>
-      </w:r>
-      <w:r>
-        <w:t>And</w:t>
-      </w:r>
-      <w:r>
-        <w:t>”</w:t>
-      </w:r>
-      <w:r>
-        <w:t xml:space="preserve"> operation</w:t>
-      </w:r>
-      <w:r>
-        <w:t xml:space="preserve"> keeps a 0 in its minimum, and the minimum max of both expressions as the maximus. And finally, the “</w:t>
-      </w:r>
-      <w:proofErr w:type="spellStart"/>
-      <w:r>
-        <w:t>Xor</w:t>
-      </w:r>
-      <w:proofErr w:type="spellEnd"/>
-      <w:r>
-        <w:t>” operation has the minimum of the “And”, and the maximum of the “Or”.</w:t>
-      </w:r>
-    </w:p>
-    <w:p>
-      <w:pPr>
-        <w:pStyle w:val="Textoindependiente"/>
-      </w:pPr>
-      <w:r>
-        <w:t>If Bounds(e1) = (min1, max1) and Bounds(e</w:t>
-      </w:r>
-      <w:proofErr w:type="gramStart"/>
-      <w:r>
-        <w:t>2)=</w:t>
-      </w:r>
-      <w:proofErr w:type="gramEnd"/>
-      <w:r>
-        <w:t xml:space="preserve"> (min2, max2) then</w:t>
+      <w:r>
+        <w:t>If Bounds(e1) = (min1, max1) and Bounds(e2)= (min2, max2) then</w:t>
       </w:r>
     </w:p>
     <w:p>
@@ -5043,13 +4650,8 @@
           <w:tab w:val="left" w:pos="7056"/>
         </w:tabs>
       </w:pPr>
-      <w:proofErr w:type="gramStart"/>
-      <w:r>
-        <w:t>Bounds(</w:t>
-      </w:r>
-      <w:proofErr w:type="gramEnd"/>
-      <w:r>
-        <w:t xml:space="preserve">e1 </w:t>
+      <w:r>
+        <w:t xml:space="preserve">Bounds(e1 </w:t>
       </w:r>
       <w:r>
         <w:t xml:space="preserve">| </w:t>
@@ -5058,297 +4660,198 @@
         <w:t xml:space="preserve">e2) = </w:t>
       </w:r>
       <w:r>
-        <w:t>{max(min</w:t>
-      </w:r>
-      <w:proofErr w:type="gramStart"/>
-      <w:r>
-        <w:t>1,min</w:t>
-      </w:r>
-      <w:proofErr w:type="gramEnd"/>
+        <w:t>{max(min1,min2)</w:t>
+      </w:r>
+      <w:r>
+        <w:t xml:space="preserve">, </w:t>
+      </w:r>
+      <w:r>
+        <w:t xml:space="preserve"> max1+max2}</w:t>
+      </w:r>
+      <w:r>
+        <w:tab/>
+      </w:r>
+    </w:p>
+    <w:p>
+      <w:pPr>
+        <w:pStyle w:val="Textoindependiente"/>
+      </w:pPr>
+      <w:r>
+        <w:t xml:space="preserve">Bounds(e1 </w:t>
+      </w:r>
+      <w:r>
+        <w:t>&amp;</w:t>
+      </w:r>
+      <w:r>
+        <w:t xml:space="preserve"> </w:t>
+      </w:r>
+      <w:r>
+        <w:t xml:space="preserve">e2) = </w:t>
+      </w:r>
+      <w:r>
+        <w:t>{0</w:t>
+      </w:r>
+      <w:r>
+        <w:t xml:space="preserve">, </w:t>
+      </w:r>
+      <w:r>
+        <w:t xml:space="preserve"> min(max1, max2)}</w:t>
+      </w:r>
+    </w:p>
+    <w:p>
+      <w:pPr>
+        <w:pStyle w:val="Textoindependiente"/>
+      </w:pPr>
+      <w:r>
+        <w:t xml:space="preserve">Bounds(e1 </w:t>
+      </w:r>
+      <w:r>
+        <w:t>^</w:t>
+      </w:r>
+      <w:r>
+        <w:t xml:space="preserve"> </w:t>
+      </w:r>
+      <w:r>
+        <w:t xml:space="preserve">e2) = </w:t>
+      </w:r>
+      <w:r>
+        <w:t>{0</w:t>
+      </w:r>
+      <w:r>
+        <w:t xml:space="preserve">, </w:t>
+      </w:r>
+      <w:r>
+        <w:t xml:space="preserve"> max1+max2}</w:t>
+      </w:r>
+    </w:p>
+    <w:p>
+      <w:pPr>
+        <w:pStyle w:val="Textoindependiente"/>
+      </w:pPr>
+      <w:r>
+        <w:t xml:space="preserve">As an example, </w:t>
+      </w:r>
+      <w:r>
+        <w:t xml:space="preserve">suppose that x0 </w:t>
+      </w:r>
+      <w:r>
+        <w:rPr>
+          <w:rFonts w:ascii="Cambria Math" w:hAnsi="Cambria Math" w:cs="Cambria Math"/>
+        </w:rPr>
+        <w:t>∈</w:t>
+      </w:r>
+      <w:r>
+        <w:t xml:space="preserve"> [0, 5] and x1 </w:t>
+      </w:r>
+      <w:r>
+        <w:rPr>
+          <w:rFonts w:ascii="Cambria Math" w:hAnsi="Cambria Math" w:cs="Cambria Math"/>
+        </w:rPr>
+        <w:t>∈</w:t>
+      </w:r>
+      <w:r>
+        <w:t xml:space="preserve"> [2, 3]. Then:</w:t>
+      </w:r>
+    </w:p>
+    <w:p>
+      <w:pPr>
+        <w:ind w:firstLine="0"/>
+        <w:rPr>
+          <w:rFonts w:ascii="Cambria Math" w:hAnsi="Cambria Math" w:cs="Cambria Math"/>
+        </w:rPr>
+      </w:pPr>
+      <w:r>
+        <w:tab/>
+      </w:r>
+      <w:r>
+        <w:t>Bounds(x0</w:t>
+      </w:r>
+      <w:r>
+        <w:t>|</w:t>
+      </w:r>
+      <w:r>
+        <w:t>x1)=</w:t>
+      </w:r>
+      <w:r>
+        <w:t>{max(</w:t>
+      </w:r>
+      <w:r>
+        <w:t>0</w:t>
+      </w:r>
+      <w:r>
+        <w:t>,</w:t>
+      </w:r>
       <w:r>
         <w:t>2</w:t>
       </w:r>
-      <w:proofErr w:type="gramStart"/>
       <w:r>
         <w:t>)</w:t>
       </w:r>
       <w:r>
-        <w:t xml:space="preserve">, </w:t>
-      </w:r>
-      <w:r>
-        <w:t xml:space="preserve"> max</w:t>
-      </w:r>
-      <w:proofErr w:type="gramEnd"/>
-      <w:r>
-        <w:t>1+max2}</w:t>
-      </w:r>
-      <w:r>
-        <w:tab/>
-      </w:r>
-    </w:p>
-    <w:p>
-      <w:pPr>
-        <w:pStyle w:val="Textoindependiente"/>
-      </w:pPr>
-      <w:proofErr w:type="gramStart"/>
-      <w:r>
-        <w:t>Bounds(</w:t>
-      </w:r>
-      <w:proofErr w:type="gramEnd"/>
-      <w:r>
-        <w:t xml:space="preserve">e1 </w:t>
+        <w:t>,5+3</w:t>
+      </w:r>
+      <w:r>
+        <w:t>}</w:t>
+      </w:r>
+      <w:r>
+        <w:t>=(2,8)</w:t>
+      </w:r>
+    </w:p>
+    <w:p>
+      <w:pPr>
+        <w:rPr>
+          <w:rFonts w:ascii="Cambria Math" w:hAnsi="Cambria Math" w:cs="Cambria Math"/>
+        </w:rPr>
+      </w:pPr>
+      <w:r>
+        <w:t>Bounds(x0</w:t>
       </w:r>
       <w:r>
         <w:t>&amp;</w:t>
       </w:r>
       <w:r>
-        <w:t xml:space="preserve"> </w:t>
-      </w:r>
-      <w:r>
-        <w:t xml:space="preserve">e2) = </w:t>
+        <w:t>x1)=</w:t>
       </w:r>
       <w:r>
         <w:t>{</w:t>
       </w:r>
-      <w:proofErr w:type="gramStart"/>
+      <w:r>
+        <w:t>0,</w:t>
+      </w:r>
+      <w:r>
+        <w:t xml:space="preserve"> min(5,3)}</w:t>
+      </w:r>
+      <w:r>
+        <w:t>=(</w:t>
+      </w:r>
       <w:r>
         <w:t>0</w:t>
       </w:r>
       <w:r>
-        <w:t xml:space="preserve">, </w:t>
-      </w:r>
-      <w:r>
-        <w:t xml:space="preserve"> min</w:t>
-      </w:r>
-      <w:proofErr w:type="gramEnd"/>
-      <w:r>
-        <w:t xml:space="preserve">(max1, </w:t>
-      </w:r>
-      <w:proofErr w:type="gramStart"/>
-      <w:r>
-        <w:t>max2)}</w:t>
-      </w:r>
-      <w:proofErr w:type="gramEnd"/>
-    </w:p>
-    <w:p>
-      <w:pPr>
-        <w:pStyle w:val="Textoindependiente"/>
-      </w:pPr>
-      <w:proofErr w:type="gramStart"/>
-      <w:r>
-        <w:t>Bounds(</w:t>
-      </w:r>
-      <w:proofErr w:type="gramEnd"/>
-      <w:r>
-        <w:t xml:space="preserve">e1 </w:t>
-      </w:r>
-      <w:r>
+        <w:t>,3)</w:t>
+      </w:r>
+    </w:p>
+    <w:p>
+      <w:r>
+        <w:t>Bounds(x0</w:t>
+      </w:r>
+      <w:r>
+        <w:rPr>
+          <w:rFonts w:ascii="Cambria Math" w:hAnsi="Cambria Math" w:cs="Cambria Math"/>
+        </w:rPr>
         <w:t>^</w:t>
       </w:r>
       <w:r>
-        <w:t xml:space="preserve"> </w:t>
-      </w:r>
-      <w:r>
-        <w:t xml:space="preserve">e2) = </w:t>
-      </w:r>
-      <w:r>
-        <w:t>{</w:t>
-      </w:r>
-      <w:proofErr w:type="gramStart"/>
-      <w:r>
-        <w:t>0</w:t>
-      </w:r>
-      <w:r>
-        <w:t xml:space="preserve">, </w:t>
-      </w:r>
-      <w:r>
-        <w:t xml:space="preserve"> max</w:t>
-      </w:r>
-      <w:proofErr w:type="gramEnd"/>
-      <w:r>
-        <w:t>1+max2}</w:t>
-      </w:r>
-    </w:p>
-    <w:p>
-      <w:pPr>
-        <w:pStyle w:val="Textoindependiente"/>
-      </w:pPr>
-      <w:r>
-        <w:t xml:space="preserve">As an example, </w:t>
-      </w:r>
-      <w:r>
-        <w:t xml:space="preserve">suppose that x0 </w:t>
+        <w:t>x1)=(0,5</w:t>
       </w:r>
       <w:r>
         <w:rPr>
           <w:rFonts w:ascii="Cambria Math" w:hAnsi="Cambria Math" w:cs="Cambria Math"/>
         </w:rPr>
-        <w:t>∈</w:t>
-      </w:r>
-      <w:r>
-        <w:t xml:space="preserve"> [0, 5] and x1 </w:t>
-      </w:r>
-      <w:r>
-        <w:rPr>
-          <w:rFonts w:ascii="Cambria Math" w:hAnsi="Cambria Math" w:cs="Cambria Math"/>
-        </w:rPr>
-        <w:t>∈</w:t>
-      </w:r>
-      <w:r>
-        <w:t xml:space="preserve"> [2, 3]. Then:</w:t>
-      </w:r>
-    </w:p>
-    <w:p>
-      <w:pPr>
-        <w:ind w:firstLine="0"/>
-        <w:rPr>
-          <w:rFonts w:ascii="Cambria Math" w:hAnsi="Cambria Math" w:cs="Cambria Math"/>
-        </w:rPr>
-      </w:pPr>
-      <w:r>
-        <w:tab/>
-      </w:r>
-      <w:r>
-        <w:t>Bounds(x0</w:t>
-      </w:r>
-      <w:r>
-        <w:t>|</w:t>
-      </w:r>
-      <w:r>
-        <w:t>x</w:t>
-      </w:r>
-      <w:proofErr w:type="gramStart"/>
-      <w:r>
-        <w:t>1)=</w:t>
-      </w:r>
-      <w:proofErr w:type="gramEnd"/>
-      <w:r>
-        <w:t>{</w:t>
-      </w:r>
-      <w:proofErr w:type="gramStart"/>
-      <w:r>
-        <w:t>max(</w:t>
-      </w:r>
-      <w:proofErr w:type="gramEnd"/>
-      <w:r>
-        <w:t>0</w:t>
-      </w:r>
-      <w:r>
-        <w:t>,</w:t>
-      </w:r>
-      <w:r>
-        <w:t>2</w:t>
-      </w:r>
-      <w:r>
-        <w:t>)</w:t>
-      </w:r>
-      <w:r>
-        <w:t>,5+</w:t>
-      </w:r>
-      <w:proofErr w:type="gramStart"/>
-      <w:r>
-        <w:t>3</w:t>
-      </w:r>
-      <w:r>
-        <w:t>}</w:t>
-      </w:r>
-      <w:r>
-        <w:t>=</w:t>
-      </w:r>
-      <w:proofErr w:type="gramEnd"/>
-      <w:r>
-        <w:t>(2,8)</w:t>
-      </w:r>
-    </w:p>
-    <w:p>
-      <w:pPr>
-        <w:rPr>
-          <w:rFonts w:ascii="Cambria Math" w:hAnsi="Cambria Math" w:cs="Cambria Math"/>
-        </w:rPr>
-      </w:pPr>
-      <w:r>
-        <w:t>Bounds(x0</w:t>
-      </w:r>
-      <w:r>
-        <w:t>&amp;</w:t>
-      </w:r>
-      <w:r>
-        <w:t>x</w:t>
-      </w:r>
-      <w:proofErr w:type="gramStart"/>
-      <w:r>
-        <w:t>1)=</w:t>
-      </w:r>
-      <w:proofErr w:type="gramEnd"/>
-      <w:r>
-        <w:t>{</w:t>
-      </w:r>
-      <w:r>
-        <w:t>0,</w:t>
-      </w:r>
-      <w:r>
-        <w:t xml:space="preserve"> </w:t>
-      </w:r>
-      <w:proofErr w:type="gramStart"/>
-      <w:r>
-        <w:t>min(</w:t>
-      </w:r>
-      <w:proofErr w:type="gramEnd"/>
-      <w:r>
-        <w:t>5,3</w:t>
-      </w:r>
-      <w:proofErr w:type="gramStart"/>
-      <w:r>
-        <w:t>)}</w:t>
-      </w:r>
-      <w:r>
-        <w:t>=</w:t>
-      </w:r>
-      <w:proofErr w:type="gramEnd"/>
-      <w:r>
-        <w:t>(</w:t>
-      </w:r>
-      <w:r>
-        <w:t>0</w:t>
-      </w:r>
-      <w:r>
-        <w:t>,3)</w:t>
-      </w:r>
-    </w:p>
-    <w:p>
-      <w:r>
-        <w:t>Bounds(x0</w:t>
-      </w:r>
-      <w:r>
-        <w:rPr>
-          <w:rFonts w:ascii="Cambria Math" w:hAnsi="Cambria Math" w:cs="Cambria Math"/>
-        </w:rPr>
-        <w:t>^</w:t>
-      </w:r>
-      <w:r>
-        <w:t>x</w:t>
-      </w:r>
-      <w:proofErr w:type="gramStart"/>
-      <w:r>
-        <w:t>1)=</w:t>
-      </w:r>
-      <w:proofErr w:type="gramEnd"/>
-      <w:r>
-        <w:t>(0,5</w:t>
-      </w:r>
-      <w:r>
-        <w:rPr>
-          <w:rFonts w:ascii="Cambria Math" w:hAnsi="Cambria Math" w:cs="Cambria Math"/>
-        </w:rPr>
         <w:t>+</w:t>
       </w:r>
-      <w:proofErr w:type="gramStart"/>
-      <w:r>
-        <w:t>3)=</w:t>
-      </w:r>
-      <w:proofErr w:type="gramEnd"/>
-      <w:r>
-        <w:t>(0,</w:t>
+      <w:r>
+        <w:t>3)=(0,</w:t>
       </w:r>
       <w:r>
         <w:t>8</w:t>
@@ -5381,15 +4884,7 @@
         <w:pStyle w:val="Textoindependiente"/>
       </w:pPr>
       <w:r>
-        <w:t xml:space="preserve">This kind of operation consists of only one expression and one operand, which makes them easier than the previous ones. Also, in this category there are only three different </w:t>
-      </w:r>
-      <w:proofErr w:type="gramStart"/>
-      <w:r>
-        <w:t>operands</w:t>
-      </w:r>
-      <w:proofErr w:type="gramEnd"/>
-      <w:r>
-        <w:t>, which bounds are calculated as follows:</w:t>
+        <w:t>This kind of operation consists of only one expression and one operand, which makes them easier than the previous ones. Also, in this category there are only three different operands, which bounds are calculated as follows:</w:t>
       </w:r>
     </w:p>
     <w:p>
@@ -5405,15 +4900,7 @@
         <w:pStyle w:val="Textoindependiente"/>
       </w:pPr>
       <w:r>
-        <w:t xml:space="preserve">This operation denominated as “Sub”, consists of a minus before the expression, and because of that, the minimum is -max, </w:t>
-      </w:r>
-      <w:proofErr w:type="spellStart"/>
-      <w:r>
-        <w:t>ad</w:t>
-      </w:r>
-      <w:proofErr w:type="spellEnd"/>
-      <w:r>
-        <w:t xml:space="preserve"> the maximus is -min. As we want values between [0, prime), we will add prime-1 to both.</w:t>
+        <w:t>This operation denominated as “Sub”, consists of a minus before the expression, and because of that, the minimum is -max, ad the maximus is -min. As we want values between [0, prime), we will add prime-1 to both.</w:t>
       </w:r>
     </w:p>
     <w:p>
@@ -5454,15 +4941,7 @@
         <w:pStyle w:val="Textoindependiente"/>
       </w:pPr>
       <w:r>
-        <w:t>This operation denominated as “</w:t>
-      </w:r>
-      <w:proofErr w:type="spellStart"/>
-      <w:r>
-        <w:t>BoolNot</w:t>
-      </w:r>
-      <w:proofErr w:type="spellEnd"/>
-      <w:r>
-        <w:t>” is used for Boolean expressions, and because of that, its bounds are easier as they are [0, 1].</w:t>
+        <w:t>This operation denominated as “BoolNot” is used for Boolean expressions, and because of that, its bounds are easier as they are [0, 1].</w:t>
       </w:r>
     </w:p>
     <w:p>
@@ -5478,21 +4957,13 @@
         <w:pStyle w:val="Textoindependiente"/>
       </w:pPr>
       <w:r>
-        <w:t>Bounds</w:t>
-      </w:r>
-      <w:proofErr w:type="gramStart"/>
-      <w:r>
-        <w:t>(</w:t>
+        <w:t>Bounds(</w:t>
       </w:r>
       <w:r>
         <w:t>!</w:t>
       </w:r>
       <w:r>
-        <w:t>e</w:t>
-      </w:r>
-      <w:proofErr w:type="gramEnd"/>
-      <w:r>
-        <w:t xml:space="preserve">1) = </w:t>
+        <w:t xml:space="preserve">e1) = </w:t>
       </w:r>
       <w:r>
         <w:t>(0, 1)</w:t>
@@ -5511,15 +4982,7 @@
         <w:pStyle w:val="Textoindependiente"/>
       </w:pPr>
       <w:r>
-        <w:t xml:space="preserve">This binary operations converts all 1s to 0s and vice versa, therefore, the </w:t>
-      </w:r>
-      <w:proofErr w:type="spellStart"/>
-      <w:r>
-        <w:t>minumun</w:t>
-      </w:r>
-      <w:proofErr w:type="spellEnd"/>
-      <w:r>
-        <w:t xml:space="preserve"> will be 0, and the maximum will be</w:t>
+        <w:t>This binary operations converts all 1s to 0s and vice versa, therefore, the minumun will be 0, and the maximum will be</w:t>
       </w:r>
       <w:r>
         <w:t xml:space="preserve"> twice</w:t>
@@ -5550,15 +5013,7 @@
         <w:t xml:space="preserve">e1) = </w:t>
       </w:r>
       <w:r>
-        <w:t>(</w:t>
-      </w:r>
-      <w:proofErr w:type="gramStart"/>
-      <w:r>
-        <w:t>0,max</w:t>
-      </w:r>
-      <w:proofErr w:type="gramEnd"/>
-      <w:r>
-        <w:t>1*2)</w:t>
+        <w:t>(0,max1*2)</w:t>
       </w:r>
     </w:p>
     <w:p>
@@ -5615,35 +5070,22 @@
       <w:r>
         <w:t xml:space="preserve"> </w:t>
       </w:r>
-      <w:proofErr w:type="spellStart"/>
-      <w:proofErr w:type="gramStart"/>
       <w:r>
         <w:t>maximus.ç</w:t>
       </w:r>
-      <w:proofErr w:type="spellEnd"/>
-      <w:proofErr w:type="gramEnd"/>
     </w:p>
     <w:p>
       <w:pPr>
         <w:pStyle w:val="Textoindependiente"/>
       </w:pPr>
       <w:r>
-        <w:t>If Bounds(e1) = (min1, max1) and Bounds(e</w:t>
-      </w:r>
-      <w:proofErr w:type="gramStart"/>
-      <w:r>
-        <w:t>2)=</w:t>
-      </w:r>
-      <w:proofErr w:type="gramEnd"/>
-      <w:r>
-        <w:t xml:space="preserve"> (min2, max2) then</w:t>
+        <w:t>If Bounds(e1) = (min1, max1) and Bounds(e2)= (min2, max2) then</w:t>
       </w:r>
     </w:p>
     <w:p>
       <w:pPr>
         <w:pStyle w:val="Textoindependiente"/>
       </w:pPr>
-      <w:proofErr w:type="gramStart"/>
       <w:r>
         <w:t>Bounds(</w:t>
       </w:r>
@@ -5651,11 +5093,7 @@
         <w:t>Switch :</w:t>
       </w:r>
       <w:r>
-        <w:t>e</w:t>
-      </w:r>
-      <w:proofErr w:type="gramEnd"/>
-      <w:r>
-        <w:t>1</w:t>
+        <w:t>e1</w:t>
       </w:r>
       <w:r>
         <w:t xml:space="preserve">, </w:t>
@@ -5664,35 +5102,14 @@
         <w:t xml:space="preserve">e2) = </w:t>
       </w:r>
       <w:r>
-        <w:t>{min(min</w:t>
-      </w:r>
-      <w:proofErr w:type="gramStart"/>
-      <w:r>
-        <w:t>1,min</w:t>
-      </w:r>
-      <w:proofErr w:type="gramEnd"/>
-      <w:r>
-        <w:t>2</w:t>
-      </w:r>
-      <w:proofErr w:type="gramStart"/>
-      <w:r>
-        <w:t>)</w:t>
+        <w:t>{min(min1,min2)</w:t>
       </w:r>
       <w:r>
         <w:t xml:space="preserve">, </w:t>
       </w:r>
       <w:r>
-        <w:t xml:space="preserve"> max</w:t>
-      </w:r>
-      <w:proofErr w:type="gramEnd"/>
-      <w:r>
-        <w:t>(max1.</w:t>
-      </w:r>
-      <w:proofErr w:type="gramStart"/>
-      <w:r>
-        <w:t>max2)}</w:t>
-      </w:r>
-      <w:proofErr w:type="gramEnd"/>
+        <w:t xml:space="preserve"> max(max1.max2)}</w:t>
+      </w:r>
     </w:p>
     <w:p>
       <w:pPr>
@@ -5715,23 +5132,7 @@
         <w:t>With</w:t>
       </w:r>
       <w:r>
-        <w:t xml:space="preserve"> the variables, we will receive an String and the context, and to obtain the bounds of the variables, we will just have to </w:t>
-      </w:r>
-      <w:proofErr w:type="spellStart"/>
-      <w:r>
-        <w:t>rearch</w:t>
-      </w:r>
-      <w:proofErr w:type="spellEnd"/>
-      <w:r>
-        <w:t xml:space="preserve"> in the context if the </w:t>
-      </w:r>
-      <w:proofErr w:type="spellStart"/>
-      <w:r>
-        <w:t>varible</w:t>
-      </w:r>
-      <w:proofErr w:type="spellEnd"/>
-      <w:r>
-        <w:t xml:space="preserve"> already exists, and clone its bounds, or if it doesn’t exist on the contest, we just have to create its bounds which will be [0, prime).</w:t>
+        <w:t xml:space="preserve"> the variables, we will receive an String and the context, and to obtain the bounds of the variables, we will just have to rearch in the context if the varible already exists, and clone its bounds, or if it doesn’t exist on the contest, we just have to create its bounds which will be [0, prime).</w:t>
       </w:r>
     </w:p>
     <w:p>
@@ -5755,15 +5156,7 @@
         <w:t>With</w:t>
       </w:r>
       <w:r>
-        <w:t xml:space="preserve"> the numbers, it will be much easier than any other operation, because its maximum and minimum bounds will have as </w:t>
-      </w:r>
-      <w:proofErr w:type="gramStart"/>
-      <w:r>
-        <w:t>value</w:t>
-      </w:r>
-      <w:proofErr w:type="gramEnd"/>
-      <w:r>
-        <w:t xml:space="preserve"> the given number.</w:t>
+        <w:t xml:space="preserve"> the numbers, it will be much easier than any other operation, because its maximum and minimum bounds will have as value the given number.</w:t>
       </w:r>
     </w:p>
     <w:p>
@@ -5957,15 +5350,7 @@
         <w:pStyle w:val="Textoindependiente"/>
       </w:pPr>
       <w:r>
-        <w:t>Bounds (</w:t>
-      </w:r>
-      <w:proofErr w:type="spellStart"/>
-      <w:r>
-        <w:t>UniformArray</w:t>
-      </w:r>
-      <w:proofErr w:type="spellEnd"/>
-      <w:r>
-        <w:t xml:space="preserve"> (value)) = Bounds(value)</w:t>
+        <w:t>Bounds (UniformArray (value)) = Bounds(value)</w:t>
       </w:r>
     </w:p>
     <w:p>
@@ -6064,15 +5449,7 @@
         <w:pStyle w:val="Textoindependiente"/>
       </w:pPr>
       <w:r>
-        <w:t xml:space="preserve"> min=</w:t>
-      </w:r>
-      <w:proofErr w:type="gramStart"/>
-      <w:r>
-        <w:t>min(</w:t>
-      </w:r>
-      <w:proofErr w:type="gramEnd"/>
-      <w:r>
-        <w:t>min</w:t>
+        <w:t xml:space="preserve"> min=min(min</w:t>
       </w:r>
       <w:r>
         <w:t xml:space="preserve"> i</w:t>
@@ -6080,7 +5457,6 @@
       <w:r>
         <w:t xml:space="preserve">f </w:t>
       </w:r>
-      <w:proofErr w:type="gramStart"/>
       <w:r>
         <w:rPr>
           <w:rFonts w:ascii="Arial" w:hAnsi="Arial" w:cs="Arial"/>
@@ -6088,13 +5464,8 @@
         <w:t>​</w:t>
       </w:r>
       <w:r>
-        <w:t xml:space="preserve"> ,min</w:t>
-      </w:r>
-      <w:proofErr w:type="gramEnd"/>
-      <w:r>
-        <w:t xml:space="preserve"> else </w:t>
-      </w:r>
-      <w:proofErr w:type="gramStart"/>
+        <w:t xml:space="preserve"> ,min else </w:t>
+      </w:r>
       <w:r>
         <w:rPr>
           <w:rFonts w:ascii="Arial" w:hAnsi="Arial" w:cs="Arial"/>
@@ -6102,21 +5473,8 @@
         <w:t>​</w:t>
       </w:r>
       <w:r>
-        <w:t xml:space="preserve"> ),max</w:t>
-      </w:r>
-      <w:proofErr w:type="gramEnd"/>
-      <w:r>
-        <w:t>=</w:t>
-      </w:r>
-      <w:proofErr w:type="gramStart"/>
-      <w:r>
-        <w:t>max(</w:t>
-      </w:r>
-      <w:proofErr w:type="gramEnd"/>
-      <w:r>
-        <w:t xml:space="preserve">max if </w:t>
-      </w:r>
-      <w:proofErr w:type="gramStart"/>
+        <w:t xml:space="preserve"> ),max=max(max if </w:t>
+      </w:r>
       <w:r>
         <w:rPr>
           <w:rFonts w:ascii="Arial" w:hAnsi="Arial" w:cs="Arial"/>
@@ -6124,13 +5482,8 @@
         <w:t>​</w:t>
       </w:r>
       <w:r>
-        <w:t xml:space="preserve"> ,max</w:t>
-      </w:r>
-      <w:proofErr w:type="gramEnd"/>
-      <w:r>
-        <w:t xml:space="preserve"> else </w:t>
-      </w:r>
-      <w:proofErr w:type="gramStart"/>
+        <w:t xml:space="preserve"> ,max else </w:t>
+      </w:r>
       <w:r>
         <w:rPr>
           <w:rFonts w:ascii="Arial" w:hAnsi="Arial" w:cs="Arial"/>
@@ -6138,11 +5491,7 @@
         <w:t>​</w:t>
       </w:r>
       <w:r>
-        <w:t xml:space="preserve"> )</w:t>
-      </w:r>
-      <w:proofErr w:type="gramEnd"/>
-      <w:r>
-        <w:t xml:space="preserve"> </w:t>
+        <w:t xml:space="preserve"> ) </w:t>
       </w:r>
     </w:p>
     <w:p>
@@ -6202,13 +5551,7 @@
         <w:pStyle w:val="Textoindependiente"/>
       </w:pPr>
       <w:r>
-        <w:t xml:space="preserve">To address this, the analysis adopts a conservative approach. First, the body of the loop is analyzed once using a temporary context, </w:t>
-      </w:r>
-      <w:r>
-        <w:t>to</w:t>
-      </w:r>
-      <w:r>
-        <w:t xml:space="preserve"> detect which variables are modified inside the loop. Then, for each of these variables, the bounds in the original context are updated to the widest possible range, namely the full finite field [0,</w:t>
+        <w:t>To address this, the analysis adopts a conservative approach. First, the body of the loop is analyzed once using a temporary context, to detect which variables are modified inside the loop. Then, for each of these variables, the bounds in the original context are updated to the widest possible range, namely the full finite field [0,</w:t>
       </w:r>
       <w:r>
         <w:t xml:space="preserve"> </w:t>
@@ -6265,21 +5608,8 @@
       </w:pPr>
       <w:bookmarkStart w:id="15" w:name="_Toc116636443"/>
       <w:bookmarkStart w:id="16" w:name="_Toc221452913"/>
-      <w:proofErr w:type="spellStart"/>
-      <w:r>
-        <w:t>Subsecciones</w:t>
-      </w:r>
-      <w:proofErr w:type="spellEnd"/>
-      <w:r>
-        <w:t xml:space="preserve"> (</w:t>
-      </w:r>
-      <w:proofErr w:type="spellStart"/>
-      <w:r>
-        <w:t>Título</w:t>
-      </w:r>
-      <w:proofErr w:type="spellEnd"/>
-      <w:r>
-        <w:t xml:space="preserve"> 3)</w:t>
+      <w:r>
+        <w:t>Subsecciones (Título 3)</w:t>
       </w:r>
       <w:bookmarkEnd w:id="15"/>
       <w:bookmarkEnd w:id="16"/>
@@ -6318,21 +5648,7 @@
         <w:rPr>
           <w:lang w:val="es-ES"/>
         </w:rPr>
-        <w:t xml:space="preserve">subsecciones usan el estilo Título 3. Es posible que una subsección tenga también </w:t>
-      </w:r>
-      <w:proofErr w:type="spellStart"/>
-      <w:r>
-        <w:rPr>
-          <w:lang w:val="es-ES"/>
-        </w:rPr>
-        <w:t>sub-subsecciones</w:t>
-      </w:r>
-      <w:proofErr w:type="spellEnd"/>
-      <w:r>
-        <w:rPr>
-          <w:lang w:val="es-ES"/>
-        </w:rPr>
-        <w:t>, como veremos a continuación.</w:t>
+        <w:t>subsecciones usan el estilo Título 3. Es posible que una subsección tenga también sub-subsecciones, como veremos a continuación.</w:t>
       </w:r>
     </w:p>
     <w:p>
@@ -6340,56 +5656,26 @@
         <w:pStyle w:val="Ttulo4"/>
       </w:pPr>
       <w:r>
-        <w:t>Sub-</w:t>
-      </w:r>
-      <w:proofErr w:type="spellStart"/>
-      <w:r>
-        <w:t>subsecciones</w:t>
-      </w:r>
-      <w:proofErr w:type="spellEnd"/>
-      <w:r>
-        <w:t xml:space="preserve"> (</w:t>
-      </w:r>
-      <w:proofErr w:type="spellStart"/>
-      <w:r>
-        <w:t>Título</w:t>
-      </w:r>
-      <w:proofErr w:type="spellEnd"/>
-      <w:r>
-        <w:t xml:space="preserve"> 4)</w:t>
-      </w:r>
-    </w:p>
-    <w:p>
-      <w:pPr>
-        <w:rPr>
-          <w:lang w:val="es-ES"/>
-        </w:rPr>
-      </w:pPr>
-      <w:r>
-        <w:rPr>
-          <w:lang w:val="es-ES"/>
-        </w:rPr>
-        <w:t xml:space="preserve">Las </w:t>
-      </w:r>
-      <w:proofErr w:type="spellStart"/>
-      <w:r>
-        <w:rPr>
-          <w:lang w:val="es-ES"/>
-        </w:rPr>
-        <w:t>sub-subseccion</w:t>
-      </w:r>
-      <w:r>
-        <w:rPr>
-          <w:lang w:val="es-ES"/>
-        </w:rPr>
-        <w:t>es</w:t>
-      </w:r>
-      <w:proofErr w:type="spellEnd"/>
-      <w:r>
-        <w:rPr>
-          <w:lang w:val="es-ES"/>
-        </w:rPr>
-        <w:t xml:space="preserve"> utilizan el estilo Título 4. </w:t>
+        <w:t>Sub-subsecciones (Título 4)</w:t>
+      </w:r>
+    </w:p>
+    <w:p>
+      <w:pPr>
+        <w:rPr>
+          <w:lang w:val="es-ES"/>
+        </w:rPr>
+      </w:pPr>
+      <w:r>
+        <w:rPr>
+          <w:lang w:val="es-ES"/>
+        </w:rPr>
+        <w:t>Las sub-subseccion</w:t>
+      </w:r>
+      <w:r>
+        <w:rPr>
+          <w:lang w:val="es-ES"/>
+        </w:rPr>
+        <w:t xml:space="preserve">es utilizan el estilo Título 4. </w:t>
       </w:r>
       <w:r>
         <w:rPr>
@@ -6491,29 +5777,11 @@
       </w:pPr>
       <w:bookmarkStart w:id="17" w:name="_Toc116636444"/>
       <w:bookmarkStart w:id="18" w:name="_Toc221452914"/>
-      <w:proofErr w:type="spellStart"/>
-      <w:r>
-        <w:t>Listas</w:t>
-      </w:r>
-      <w:proofErr w:type="spellEnd"/>
-      <w:r>
-        <w:t xml:space="preserve"> </w:t>
-      </w:r>
-      <w:proofErr w:type="spellStart"/>
-      <w:r>
-        <w:t>numeradas</w:t>
-      </w:r>
-      <w:proofErr w:type="spellEnd"/>
-      <w:r>
-        <w:t xml:space="preserve"> y con </w:t>
-      </w:r>
-      <w:proofErr w:type="spellStart"/>
-      <w:r>
-        <w:t>viñetas</w:t>
+      <w:r>
+        <w:t>Listas numeradas y con viñetas</w:t>
       </w:r>
       <w:bookmarkEnd w:id="17"/>
       <w:bookmarkEnd w:id="18"/>
-      <w:proofErr w:type="spellEnd"/>
     </w:p>
     <w:p>
       <w:pPr>
@@ -6576,21 +5844,11 @@
       </w:pPr>
       <w:bookmarkStart w:id="19" w:name="_Toc116636445"/>
       <w:bookmarkStart w:id="20" w:name="_Toc221452915"/>
-      <w:proofErr w:type="spellStart"/>
-      <w:r>
-        <w:t>Figuras</w:t>
-      </w:r>
-      <w:proofErr w:type="spellEnd"/>
-      <w:r>
-        <w:t xml:space="preserve"> y </w:t>
-      </w:r>
-      <w:proofErr w:type="spellStart"/>
-      <w:r>
-        <w:t>tablas</w:t>
+      <w:r>
+        <w:t>Figuras y tablas</w:t>
       </w:r>
       <w:bookmarkEnd w:id="19"/>
       <w:bookmarkEnd w:id="20"/>
-      <w:proofErr w:type="spellEnd"/>
     </w:p>
     <w:p>
       <w:pPr>
@@ -7435,129 +6693,111 @@
       </w:pPr>
       <w:bookmarkStart w:id="23" w:name="_Ref11681936"/>
       <w:bookmarkStart w:id="24" w:name="_Toc11912424"/>
-      <w:proofErr w:type="spellStart"/>
-      <w:r>
-        <w:t>Tabla</w:t>
-      </w:r>
-      <w:proofErr w:type="spellEnd"/>
+      <w:r>
+        <w:t xml:space="preserve">Tabla </w:t>
+      </w:r>
+      <w:r>
+        <w:fldChar w:fldCharType="begin"/>
+      </w:r>
+      <w:r>
+        <w:instrText xml:space="preserve"> STYLEREF 1 \s </w:instrText>
+      </w:r>
+      <w:r>
+        <w:fldChar w:fldCharType="separate"/>
+      </w:r>
+      <w:r>
+        <w:t>3</w:t>
+      </w:r>
+      <w:r>
+        <w:fldChar w:fldCharType="end"/>
+      </w:r>
+      <w:r>
+        <w:noBreakHyphen/>
+      </w:r>
+      <w:r>
+        <w:fldChar w:fldCharType="begin"/>
+      </w:r>
+      <w:r>
+        <w:instrText xml:space="preserve"> SEQ Tabla \* ARABIC \s 1 </w:instrText>
+      </w:r>
+      <w:r>
+        <w:fldChar w:fldCharType="separate"/>
+      </w:r>
+      <w:r>
+        <w:t>1</w:t>
+      </w:r>
+      <w:r>
+        <w:fldChar w:fldCharType="end"/>
+      </w:r>
+      <w:bookmarkEnd w:id="23"/>
+      <w:r>
+        <w:t>. Ejemplo de tabla</w:t>
+      </w:r>
+      <w:bookmarkEnd w:id="24"/>
       <w:r>
         <w:t xml:space="preserve"> </w:t>
       </w:r>
+    </w:p>
+    <w:p>
+      <w:pPr>
+        <w:rPr>
+          <w:lang w:val="es-ES"/>
+        </w:rPr>
+      </w:pPr>
+      <w:r>
+        <w:rPr>
+          <w:lang w:val="es-ES"/>
+        </w:rPr>
+        <w:t xml:space="preserve">Al igual que con las figuras, es recomendable insertar un pie de tabla explicativo. El título de la tabla se añade con la opción </w:t>
+      </w:r>
+      <w:r>
+        <w:rPr>
+          <w:i/>
+          <w:lang w:val="es-ES"/>
+        </w:rPr>
+        <w:t>Insertar Título</w:t>
+      </w:r>
+      <w:r>
+        <w:rPr>
+          <w:lang w:val="es-ES"/>
+        </w:rPr>
+        <w:t xml:space="preserve"> del menú </w:t>
+      </w:r>
+      <w:r>
+        <w:rPr>
+          <w:i/>
+          <w:lang w:val="es-ES"/>
+        </w:rPr>
+        <w:t>Referencias – Títulos</w:t>
+      </w:r>
+      <w:r>
+        <w:rPr>
+          <w:lang w:val="es-ES"/>
+        </w:rPr>
+        <w:t xml:space="preserve">. Al igual que antes, este título aparecerá con el estilo Descripción. Podremos hacer referencias a las tablas desde el texto utilizando para ello las Referencias cruzadas. Por último, todas las tablas aparecerán referenciadas automáticamente en el </w:t>
+      </w:r>
       <w:r>
         <w:fldChar w:fldCharType="begin"/>
       </w:r>
       <w:r>
-        <w:instrText xml:space="preserve"> STYLEREF 1 \s </w:instrText>
+        <w:rPr>
+          <w:lang w:val="es-ES"/>
+        </w:rPr>
+        <w:instrText xml:space="preserve"> REF IndiceTablas \h </w:instrText>
       </w:r>
       <w:r>
         <w:fldChar w:fldCharType="separate"/>
       </w:r>
       <w:r>
-        <w:t>3</w:t>
+        <w:rPr>
+          <w:lang w:val="es-ES"/>
+        </w:rPr>
+        <w:t>Índice de tablas</w:t>
       </w:r>
       <w:r>
         <w:fldChar w:fldCharType="end"/>
       </w:r>
       <w:r>
-        <w:noBreakHyphen/>
-      </w:r>
-      <w:r>
-        <w:fldChar w:fldCharType="begin"/>
-      </w:r>
-      <w:r>
-        <w:instrText xml:space="preserve"> SEQ Tabla \* ARABIC \s 1 </w:instrText>
-      </w:r>
-      <w:r>
-        <w:fldChar w:fldCharType="separate"/>
-      </w:r>
-      <w:r>
-        <w:t>1</w:t>
-      </w:r>
-      <w:r>
-        <w:fldChar w:fldCharType="end"/>
-      </w:r>
-      <w:bookmarkEnd w:id="23"/>
-      <w:r>
-        <w:t xml:space="preserve">. </w:t>
-      </w:r>
-      <w:proofErr w:type="spellStart"/>
-      <w:r>
-        <w:t>Ejemplo</w:t>
-      </w:r>
-      <w:proofErr w:type="spellEnd"/>
-      <w:r>
-        <w:t xml:space="preserve"> de </w:t>
-      </w:r>
-      <w:proofErr w:type="spellStart"/>
-      <w:r>
-        <w:t>tabla</w:t>
-      </w:r>
-      <w:bookmarkEnd w:id="24"/>
-      <w:proofErr w:type="spellEnd"/>
-      <w:r>
-        <w:t xml:space="preserve"> </w:t>
-      </w:r>
-    </w:p>
-    <w:p>
-      <w:pPr>
-        <w:rPr>
-          <w:lang w:val="es-ES"/>
-        </w:rPr>
-      </w:pPr>
-      <w:r>
-        <w:rPr>
-          <w:lang w:val="es-ES"/>
-        </w:rPr>
-        <w:t xml:space="preserve">Al igual que con las figuras, es recomendable insertar un pie de tabla explicativo. El título de la tabla se añade con la opción </w:t>
-      </w:r>
-      <w:r>
-        <w:rPr>
-          <w:i/>
-          <w:lang w:val="es-ES"/>
-        </w:rPr>
-        <w:t>Insertar Título</w:t>
-      </w:r>
-      <w:r>
-        <w:rPr>
-          <w:lang w:val="es-ES"/>
-        </w:rPr>
-        <w:t xml:space="preserve"> del menú </w:t>
-      </w:r>
-      <w:r>
-        <w:rPr>
-          <w:i/>
-          <w:lang w:val="es-ES"/>
-        </w:rPr>
-        <w:t>Referencias – Títulos</w:t>
-      </w:r>
-      <w:r>
-        <w:rPr>
-          <w:lang w:val="es-ES"/>
-        </w:rPr>
-        <w:t xml:space="preserve">. Al igual que antes, este título aparecerá con el estilo Descripción. Podremos hacer referencias a las tablas desde el texto utilizando para ello las Referencias cruzadas. Por último, todas las tablas aparecerán referenciadas automáticamente en el </w:t>
-      </w:r>
-      <w:r>
-        <w:fldChar w:fldCharType="begin"/>
-      </w:r>
-      <w:r>
-        <w:rPr>
-          <w:lang w:val="es-ES"/>
-        </w:rPr>
-        <w:instrText xml:space="preserve"> REF IndiceTablas \h </w:instrText>
-      </w:r>
-      <w:r>
-        <w:fldChar w:fldCharType="separate"/>
-      </w:r>
-      <w:r>
-        <w:rPr>
-          <w:lang w:val="es-ES"/>
-        </w:rPr>
-        <w:t>Índice de tablas</w:t>
-      </w:r>
-      <w:r>
-        <w:fldChar w:fldCharType="end"/>
-      </w:r>
-      <w:r>
         <w:rPr>
           <w:lang w:val="es-ES"/>
         </w:rPr>
@@ -7569,20 +6809,10 @@
         <w:pStyle w:val="Ttulo2"/>
       </w:pPr>
       <w:bookmarkStart w:id="25" w:name="_Toc221452916"/>
-      <w:proofErr w:type="spellStart"/>
-      <w:r>
-        <w:t>Problemas</w:t>
-      </w:r>
-      <w:proofErr w:type="spellEnd"/>
-      <w:r>
-        <w:t xml:space="preserve"> </w:t>
-      </w:r>
-      <w:proofErr w:type="spellStart"/>
-      <w:r>
-        <w:t>conocidos</w:t>
+      <w:r>
+        <w:t>Problemas conocidos</w:t>
       </w:r>
       <w:bookmarkEnd w:id="25"/>
-      <w:proofErr w:type="spellEnd"/>
     </w:p>
     <w:p>
       <w:pPr>
@@ -7777,31 +7007,7 @@
         <w:t xml:space="preserve">. </w:t>
       </w:r>
       <w:r>
-        <w:t xml:space="preserve">Esto se </w:t>
-      </w:r>
-      <w:proofErr w:type="spellStart"/>
-      <w:r>
-        <w:t>puede</w:t>
-      </w:r>
-      <w:proofErr w:type="spellEnd"/>
-      <w:r>
-        <w:t xml:space="preserve"> </w:t>
-      </w:r>
-      <w:proofErr w:type="spellStart"/>
-      <w:r>
-        <w:t>deber</w:t>
-      </w:r>
-      <w:proofErr w:type="spellEnd"/>
-      <w:r>
-        <w:t xml:space="preserve"> a dos </w:t>
-      </w:r>
-      <w:proofErr w:type="spellStart"/>
-      <w:r>
-        <w:t>motivos</w:t>
-      </w:r>
-      <w:proofErr w:type="spellEnd"/>
-      <w:r>
-        <w:t>:</w:t>
+        <w:t>Esto se puede deber a dos motivos:</w:t>
       </w:r>
     </w:p>
     <w:p>
@@ -7892,13 +7098,8 @@
         <w:pStyle w:val="Lista2"/>
       </w:pPr>
       <w:r>
-        <w:t xml:space="preserve">Page Heading / </w:t>
-      </w:r>
-      <w:proofErr w:type="spellStart"/>
-      <w:r>
-        <w:t>vacío</w:t>
-      </w:r>
-      <w:proofErr w:type="spellEnd"/>
+        <w:t>Page Heading / vacío</w:t>
+      </w:r>
     </w:p>
     <w:p>
       <w:pPr>
@@ -7960,39 +7161,24 @@
       <w:pPr>
         <w:pStyle w:val="Lista2"/>
       </w:pPr>
-      <w:proofErr w:type="spellStart"/>
-      <w:r>
-        <w:t>Título</w:t>
-      </w:r>
-      <w:proofErr w:type="spellEnd"/>
-      <w:r>
-        <w:t xml:space="preserve"> 3 / 3</w:t>
+      <w:r>
+        <w:t>Título 3 / 3</w:t>
       </w:r>
     </w:p>
     <w:p>
       <w:pPr>
         <w:pStyle w:val="Lista2"/>
       </w:pPr>
-      <w:proofErr w:type="spellStart"/>
-      <w:r>
-        <w:t>Título</w:t>
-      </w:r>
-      <w:proofErr w:type="spellEnd"/>
-      <w:r>
-        <w:t xml:space="preserve"> 5 / 1</w:t>
+      <w:r>
+        <w:t>Título 5 / 1</w:t>
       </w:r>
     </w:p>
     <w:p>
       <w:pPr>
         <w:pStyle w:val="Lista2"/>
       </w:pPr>
-      <w:proofErr w:type="spellStart"/>
-      <w:r>
-        <w:t>Título</w:t>
-      </w:r>
-      <w:proofErr w:type="spellEnd"/>
-      <w:r>
-        <w:t xml:space="preserve"> 6 / 1</w:t>
+      <w:r>
+        <w:t>Título 6 / 1</w:t>
       </w:r>
     </w:p>
     <w:p>
@@ -8148,31 +7334,13 @@
       <w:bookmarkStart w:id="28" w:name="_Ref11684775"/>
       <w:bookmarkStart w:id="29" w:name="_Toc116636446"/>
       <w:bookmarkStart w:id="30" w:name="_Toc221452917"/>
-      <w:proofErr w:type="spellStart"/>
       <w:r>
         <w:lastRenderedPageBreak/>
-        <w:t>Conclusiones</w:t>
-      </w:r>
-      <w:proofErr w:type="spellEnd"/>
-      <w:r>
-        <w:t xml:space="preserve"> y </w:t>
-      </w:r>
-      <w:proofErr w:type="spellStart"/>
-      <w:r>
-        <w:t>trabajo</w:t>
-      </w:r>
-      <w:proofErr w:type="spellEnd"/>
-      <w:r>
-        <w:t xml:space="preserve"> </w:t>
-      </w:r>
-      <w:proofErr w:type="spellStart"/>
-      <w:r>
-        <w:t>futuro</w:t>
+        <w:t>Conclusiones y trabajo futuro</w:t>
       </w:r>
       <w:bookmarkEnd w:id="28"/>
       <w:bookmarkEnd w:id="29"/>
       <w:bookmarkEnd w:id="30"/>
-      <w:proofErr w:type="spellEnd"/>
     </w:p>
     <w:p>
       <w:pPr>
@@ -8250,7 +7418,6 @@
       <w:r>
         <w:t>“</w:t>
       </w:r>
-      <w:proofErr w:type="spellStart"/>
       <w:r>
         <w:fldChar w:fldCharType="begin"/>
       </w:r>
@@ -8263,7 +7430,6 @@
       <w:r>
         <w:t>Introducción</w:t>
       </w:r>
-      <w:proofErr w:type="spellEnd"/>
       <w:r>
         <w:fldChar w:fldCharType="end"/>
       </w:r>
@@ -8307,21 +7473,7 @@
         <w:rPr>
           <w:lang w:val="es-ES"/>
         </w:rPr>
-        <w:t>Los títulos de las subsecciones de esta sección (</w:t>
-      </w:r>
-      <w:proofErr w:type="spellStart"/>
-      <w:r>
-        <w:rPr>
-          <w:lang w:val="es-ES"/>
-        </w:rPr>
-        <w:t>Introduction</w:t>
-      </w:r>
-      <w:proofErr w:type="spellEnd"/>
-      <w:r>
-        <w:rPr>
-          <w:lang w:val="es-ES"/>
-        </w:rPr>
-        <w:t xml:space="preserve">) usan el estilo </w:t>
+        <w:t xml:space="preserve">Los títulos de las subsecciones de esta sección (Introduction) usan el estilo </w:t>
       </w:r>
       <w:r>
         <w:rPr>
@@ -8428,7 +7580,6 @@
       <w:r>
         <w:t>“</w:t>
       </w:r>
-      <w:proofErr w:type="spellStart"/>
       <w:r>
         <w:fldChar w:fldCharType="begin"/>
       </w:r>
@@ -8439,37 +7590,20 @@
         <w:fldChar w:fldCharType="separate"/>
       </w:r>
       <w:r>
-        <w:t>Conclusiones</w:t>
-      </w:r>
-      <w:proofErr w:type="spellEnd"/>
-      <w:r>
-        <w:t xml:space="preserve"> y </w:t>
-      </w:r>
-      <w:proofErr w:type="spellStart"/>
-      <w:r>
-        <w:t>trabajo</w:t>
-      </w:r>
-      <w:proofErr w:type="spellEnd"/>
+        <w:t>Conclusiones y trabajo futuro</w:t>
+      </w:r>
+      <w:r>
+        <w:fldChar w:fldCharType="end"/>
+      </w:r>
+      <w:r>
+        <w:t>” section must be translated to English if th</w:t>
+      </w:r>
+      <w:r>
+        <w:t>is</w:t>
+      </w:r>
       <w:r>
         <w:t xml:space="preserve"> </w:t>
       </w:r>
-      <w:proofErr w:type="spellStart"/>
-      <w:r>
-        <w:t>futuro</w:t>
-      </w:r>
-      <w:proofErr w:type="spellEnd"/>
-      <w:r>
-        <w:fldChar w:fldCharType="end"/>
-      </w:r>
-      <w:r>
-        <w:t>” section must be translated to English if th</w:t>
-      </w:r>
-      <w:r>
-        <w:t>is</w:t>
-      </w:r>
-      <w:r>
-        <w:t xml:space="preserve"> </w:t>
-      </w:r>
       <w:r>
         <w:t>Bachelor</w:t>
       </w:r>
@@ -8501,35 +7635,7 @@
         <w:rPr>
           <w:lang w:val="es-ES"/>
         </w:rPr>
-        <w:t>Los títulos de las subsecciones de esta sección (</w:t>
-      </w:r>
-      <w:proofErr w:type="spellStart"/>
-      <w:r>
-        <w:rPr>
-          <w:lang w:val="es-ES"/>
-        </w:rPr>
-        <w:t>Conclusions</w:t>
-      </w:r>
-      <w:proofErr w:type="spellEnd"/>
-      <w:r>
-        <w:rPr>
-          <w:lang w:val="es-ES"/>
-        </w:rPr>
-        <w:t xml:space="preserve"> and future </w:t>
-      </w:r>
-      <w:proofErr w:type="spellStart"/>
-      <w:r>
-        <w:rPr>
-          <w:lang w:val="es-ES"/>
-        </w:rPr>
-        <w:t>work</w:t>
-      </w:r>
-      <w:proofErr w:type="spellEnd"/>
-      <w:r>
-        <w:rPr>
-          <w:lang w:val="es-ES"/>
-        </w:rPr>
-        <w:t xml:space="preserve">) usan el estilo </w:t>
+        <w:t xml:space="preserve">Los títulos de las subsecciones de esta sección (Conclusions and future work) usan el estilo </w:t>
       </w:r>
       <w:r>
         <w:rPr>
@@ -8715,7 +7821,6 @@
       </w:pPr>
       <w:bookmarkStart w:id="39" w:name="_Toc116636450"/>
       <w:bookmarkStart w:id="40" w:name="_Toc221452921"/>
-      <w:proofErr w:type="spellStart"/>
       <w:r>
         <w:lastRenderedPageBreak/>
         <w:t>Bibliografía</w:t>
@@ -8723,7 +7828,6 @@
       <w:bookmarkEnd w:id="35"/>
       <w:bookmarkEnd w:id="39"/>
       <w:bookmarkEnd w:id="40"/>
-      <w:proofErr w:type="spellEnd"/>
       <w:r>
         <w:rPr>
           <w:sz w:val="22"/>
@@ -8938,14 +8042,12 @@
       <w:pPr>
         <w:pStyle w:val="PageHeading"/>
       </w:pPr>
-      <w:proofErr w:type="spellStart"/>
       <w:r>
         <w:lastRenderedPageBreak/>
         <w:t>Apéndices</w:t>
       </w:r>
       <w:bookmarkStart w:id="41" w:name="_Toc267562109"/>
       <w:bookmarkEnd w:id="36"/>
-      <w:proofErr w:type="spellEnd"/>
     </w:p>
     <w:p>
       <w:pPr>
@@ -8953,26 +8055,16 @@
       </w:pPr>
       <w:bookmarkStart w:id="42" w:name="_Toc221452922"/>
       <w:bookmarkEnd w:id="41"/>
-      <w:proofErr w:type="spellStart"/>
-      <w:r>
-        <w:t>Título</w:t>
-      </w:r>
-      <w:proofErr w:type="spellEnd"/>
-      <w:r>
-        <w:t xml:space="preserve"> del</w:t>
+      <w:r>
+        <w:t>Título del</w:t>
       </w:r>
       <w:r>
         <w:t xml:space="preserve"> primer</w:t>
       </w:r>
       <w:r>
-        <w:t xml:space="preserve"> </w:t>
-      </w:r>
-      <w:proofErr w:type="spellStart"/>
-      <w:r>
-        <w:t>apéndice</w:t>
+        <w:t xml:space="preserve"> apéndice</w:t>
       </w:r>
       <w:bookmarkEnd w:id="42"/>
-      <w:proofErr w:type="spellEnd"/>
     </w:p>
     <w:p>
       <w:pPr>
@@ -9075,21 +8167,7 @@
         <w:rPr>
           <w:lang w:val="es-ES"/>
         </w:rPr>
-        <w:t xml:space="preserve">Para los títulos de las subsecciones de los apéndices se utiliza el estilo Título 8. Para las </w:t>
-      </w:r>
-      <w:proofErr w:type="spellStart"/>
-      <w:r>
-        <w:rPr>
-          <w:lang w:val="es-ES"/>
-        </w:rPr>
-        <w:t>sub-subsecciones</w:t>
-      </w:r>
-      <w:proofErr w:type="spellEnd"/>
-      <w:r>
-        <w:rPr>
-          <w:lang w:val="es-ES"/>
-        </w:rPr>
-        <w:t xml:space="preserve"> se usa el estilo Título 9, como aparece a continuación.</w:t>
+        <w:t>Para los títulos de las subsecciones de los apéndices se utiliza el estilo Título 8. Para las sub-subsecciones se usa el estilo Título 9, como aparece a continuación.</w:t>
       </w:r>
     </w:p>
     <w:p>
@@ -9099,82 +8177,23 @@
           <w:lang w:val="es-ES"/>
         </w:rPr>
       </w:pPr>
-      <w:proofErr w:type="spellStart"/>
-      <w:r>
-        <w:rPr>
-          <w:lang w:val="es-ES"/>
-        </w:rPr>
-        <w:t>Sub-subsecciones</w:t>
-      </w:r>
-      <w:proofErr w:type="spellEnd"/>
-      <w:r>
-        <w:rPr>
-          <w:lang w:val="es-ES"/>
-        </w:rPr>
-        <w:t xml:space="preserve"> del apéndice (Título 9)</w:t>
-      </w:r>
-    </w:p>
-    <w:p>
-      <w:r>
-        <w:rPr>
-          <w:lang w:val="es-ES"/>
-        </w:rPr>
-        <w:t xml:space="preserve">Para las </w:t>
-      </w:r>
-      <w:proofErr w:type="spellStart"/>
-      <w:r>
-        <w:rPr>
-          <w:lang w:val="es-ES"/>
-        </w:rPr>
-        <w:t>sub-subsecciones</w:t>
-      </w:r>
-      <w:proofErr w:type="spellEnd"/>
-      <w:r>
-        <w:rPr>
-          <w:lang w:val="es-ES"/>
-        </w:rPr>
-        <w:t xml:space="preserve"> de un apéndice se utiliza el estilo Título 9. </w:t>
-      </w:r>
-      <w:r>
-        <w:t xml:space="preserve">No se </w:t>
-      </w:r>
-      <w:proofErr w:type="spellStart"/>
-      <w:r>
-        <w:t>recomienda</w:t>
-      </w:r>
-      <w:proofErr w:type="spellEnd"/>
-      <w:r>
-        <w:t xml:space="preserve"> </w:t>
-      </w:r>
-      <w:proofErr w:type="spellStart"/>
-      <w:r>
-        <w:t>añadir</w:t>
-      </w:r>
-      <w:proofErr w:type="spellEnd"/>
-      <w:r>
-        <w:t xml:space="preserve"> </w:t>
-      </w:r>
-      <w:proofErr w:type="spellStart"/>
-      <w:r>
-        <w:t>más</w:t>
-      </w:r>
-      <w:proofErr w:type="spellEnd"/>
-      <w:r>
-        <w:t xml:space="preserve"> </w:t>
-      </w:r>
-      <w:proofErr w:type="spellStart"/>
-      <w:r>
-        <w:t>niveles</w:t>
-      </w:r>
-      <w:proofErr w:type="spellEnd"/>
-      <w:r>
-        <w:t xml:space="preserve"> de </w:t>
-      </w:r>
-      <w:proofErr w:type="spellStart"/>
-      <w:r>
-        <w:t>subsección</w:t>
-      </w:r>
-      <w:proofErr w:type="spellEnd"/>
+      <w:r>
+        <w:rPr>
+          <w:lang w:val="es-ES"/>
+        </w:rPr>
+        <w:t>Sub-subsecciones del apéndice (Título 9)</w:t>
+      </w:r>
+    </w:p>
+    <w:p>
+      <w:r>
+        <w:rPr>
+          <w:lang w:val="es-ES"/>
+        </w:rPr>
+        <w:t xml:space="preserve">Para las sub-subsecciones de un apéndice se utiliza el estilo Título 9. </w:t>
+      </w:r>
+      <w:r>
+        <w:t>No se recomienda añadir más niveles de subsección</w:t>
+      </w:r>
       <w:r>
         <w:t>.</w:t>
       </w:r>
@@ -9196,29 +8215,11 @@
         <w:pStyle w:val="Ttulo6"/>
       </w:pPr>
       <w:bookmarkStart w:id="43" w:name="_Toc221452923"/>
-      <w:proofErr w:type="spellStart"/>
       <w:r>
         <w:lastRenderedPageBreak/>
-        <w:t>Título</w:t>
-      </w:r>
-      <w:proofErr w:type="spellEnd"/>
-      <w:r>
-        <w:t xml:space="preserve"> del </w:t>
-      </w:r>
-      <w:proofErr w:type="spellStart"/>
-      <w:r>
-        <w:t>segundo</w:t>
-      </w:r>
-      <w:proofErr w:type="spellEnd"/>
-      <w:r>
-        <w:t xml:space="preserve"> </w:t>
-      </w:r>
-      <w:proofErr w:type="spellStart"/>
-      <w:r>
-        <w:t>apéndice</w:t>
+        <w:t>Título del segundo apéndice</w:t>
       </w:r>
       <w:bookmarkEnd w:id="43"/>
-      <w:proofErr w:type="spellEnd"/>
     </w:p>
     <w:p>
       <w:pPr>

</xml_diff>

<commit_message>
Memoria 1.0 + pdf
</commit_message>
<xml_diff>
--- a/Optimization of the circom compiler.docx
+++ b/Optimization of the circom compiler.docx
@@ -59,6 +59,7 @@
       </w:pPr>
       <w:r>
         <w:rPr>
+          <w:noProof/>
           <w:lang w:eastAsia="es-ES_tradnl"/>
         </w:rPr>
         <w:drawing>
@@ -120,8 +121,13 @@
       <w:pPr>
         <w:pStyle w:val="TitlePage"/>
       </w:pPr>
-      <w:r>
-        <w:t xml:space="preserve">Trabajo Fin </w:t>
+      <w:proofErr w:type="spellStart"/>
+      <w:r>
+        <w:t>Trabajo</w:t>
+      </w:r>
+      <w:proofErr w:type="spellEnd"/>
+      <w:r>
+        <w:t xml:space="preserve"> Fin </w:t>
       </w:r>
       <w:r>
         <w:t>de</w:t>
@@ -137,8 +143,13 @@
       <w:pPr>
         <w:pStyle w:val="TitlePage"/>
       </w:pPr>
-      <w:r>
-        <w:t>Curso 20</w:t>
+      <w:proofErr w:type="spellStart"/>
+      <w:r>
+        <w:t>Curso</w:t>
+      </w:r>
+      <w:proofErr w:type="spellEnd"/>
+      <w:r>
+        <w:t xml:space="preserve"> 20</w:t>
       </w:r>
       <w:r>
         <w:t>2</w:t>
@@ -245,8 +256,30 @@
         <w:rPr>
           <w:lang w:val="en-US"/>
         </w:rPr>
-        <w:t>Grado en Ingeniería Informática</w:t>
-      </w:r>
+        <w:t xml:space="preserve">Grado </w:t>
+      </w:r>
+      <w:proofErr w:type="spellStart"/>
+      <w:r>
+        <w:rPr>
+          <w:lang w:val="en-US"/>
+        </w:rPr>
+        <w:t>en</w:t>
+      </w:r>
+      <w:proofErr w:type="spellEnd"/>
+      <w:r>
+        <w:rPr>
+          <w:lang w:val="en-US"/>
+        </w:rPr>
+        <w:t xml:space="preserve"> Ingeniería </w:t>
+      </w:r>
+      <w:proofErr w:type="spellStart"/>
+      <w:r>
+        <w:rPr>
+          <w:lang w:val="en-US"/>
+        </w:rPr>
+        <w:t>Informática</w:t>
+      </w:r>
+      <w:proofErr w:type="spellEnd"/>
     </w:p>
     <w:p>
       <w:pPr>
@@ -255,12 +288,28 @@
           <w:lang w:val="en-US"/>
         </w:rPr>
       </w:pPr>
+      <w:proofErr w:type="spellStart"/>
       <w:r>
         <w:rPr>
           <w:lang w:val="en-US"/>
         </w:rPr>
-        <w:t>Facultad de Informática</w:t>
-      </w:r>
+        <w:t>Facultad</w:t>
+      </w:r>
+      <w:proofErr w:type="spellEnd"/>
+      <w:r>
+        <w:rPr>
+          <w:lang w:val="en-US"/>
+        </w:rPr>
+        <w:t xml:space="preserve"> de </w:t>
+      </w:r>
+      <w:proofErr w:type="spellStart"/>
+      <w:r>
+        <w:rPr>
+          <w:lang w:val="en-US"/>
+        </w:rPr>
+        <w:t>Informática</w:t>
+      </w:r>
+      <w:proofErr w:type="spellEnd"/>
     </w:p>
     <w:p>
       <w:pPr>
@@ -345,12 +394,30 @@
       <w:pPr>
         <w:pStyle w:val="TitlePage"/>
       </w:pPr>
-      <w:r>
-        <w:t xml:space="preserve">Trabajo de Fin de </w:t>
-      </w:r>
-      <w:r>
-        <w:t>Grado en Ingeniería Informática</w:t>
-      </w:r>
+      <w:proofErr w:type="spellStart"/>
+      <w:r>
+        <w:t>Trabajo</w:t>
+      </w:r>
+      <w:proofErr w:type="spellEnd"/>
+      <w:r>
+        <w:t xml:space="preserve"> de Fin de </w:t>
+      </w:r>
+      <w:r>
+        <w:t xml:space="preserve">Grado </w:t>
+      </w:r>
+      <w:proofErr w:type="spellStart"/>
+      <w:r>
+        <w:t>en</w:t>
+      </w:r>
+      <w:proofErr w:type="spellEnd"/>
+      <w:r>
+        <w:t xml:space="preserve"> Ingeniería </w:t>
+      </w:r>
+      <w:proofErr w:type="spellStart"/>
+      <w:r>
+        <w:t>Informática</w:t>
+      </w:r>
+      <w:proofErr w:type="spellEnd"/>
     </w:p>
     <w:p>
       <w:pPr>
@@ -438,18 +505,22 @@
       <w:pPr>
         <w:pStyle w:val="TitlePage"/>
       </w:pPr>
+      <w:proofErr w:type="spellStart"/>
       <w:r>
         <w:rPr>
           <w:b/>
         </w:rPr>
         <w:t>Convocatoria</w:t>
       </w:r>
+      <w:proofErr w:type="spellEnd"/>
       <w:r>
         <w:t xml:space="preserve">: </w:t>
       </w:r>
+      <w:proofErr w:type="spellStart"/>
       <w:r>
         <w:t>Septiembre</w:t>
       </w:r>
+      <w:proofErr w:type="spellEnd"/>
       <w:r>
         <w:t xml:space="preserve"> 2026</w:t>
       </w:r>
@@ -475,8 +546,30 @@
         <w:rPr>
           <w:lang w:val="en-US"/>
         </w:rPr>
-        <w:t>Grado en Ingeniería Informática</w:t>
-      </w:r>
+        <w:t xml:space="preserve">Grado </w:t>
+      </w:r>
+      <w:proofErr w:type="spellStart"/>
+      <w:r>
+        <w:rPr>
+          <w:lang w:val="en-US"/>
+        </w:rPr>
+        <w:t>en</w:t>
+      </w:r>
+      <w:proofErr w:type="spellEnd"/>
+      <w:r>
+        <w:rPr>
+          <w:lang w:val="en-US"/>
+        </w:rPr>
+        <w:t xml:space="preserve"> Ingeniería </w:t>
+      </w:r>
+      <w:proofErr w:type="spellStart"/>
+      <w:r>
+        <w:rPr>
+          <w:lang w:val="en-US"/>
+        </w:rPr>
+        <w:t>Informática</w:t>
+      </w:r>
+      <w:proofErr w:type="spellEnd"/>
     </w:p>
     <w:p>
       <w:pPr>
@@ -485,12 +578,28 @@
           <w:lang w:val="en-US"/>
         </w:rPr>
       </w:pPr>
+      <w:proofErr w:type="spellStart"/>
       <w:r>
         <w:rPr>
           <w:lang w:val="en-US"/>
         </w:rPr>
-        <w:t>Facultad de Informática</w:t>
-      </w:r>
+        <w:t>Facultad</w:t>
+      </w:r>
+      <w:proofErr w:type="spellEnd"/>
+      <w:r>
+        <w:rPr>
+          <w:lang w:val="en-US"/>
+        </w:rPr>
+        <w:t xml:space="preserve"> de </w:t>
+      </w:r>
+      <w:proofErr w:type="spellStart"/>
+      <w:r>
+        <w:rPr>
+          <w:lang w:val="en-US"/>
+        </w:rPr>
+        <w:t>Informática</w:t>
+      </w:r>
+      <w:proofErr w:type="spellEnd"/>
     </w:p>
     <w:p>
       <w:pPr>
@@ -679,8 +788,16 @@
         <w:rPr>
           <w:lang w:eastAsia="es-ES"/>
         </w:rPr>
-        <w:t>Circom is a domain-specific language widely used for describing arithmetic circuits in zk</w:t>
-      </w:r>
+        <w:t xml:space="preserve">Circom is a domain-specific language widely used for describing arithmetic circuits in </w:t>
+      </w:r>
+      <w:proofErr w:type="spellStart"/>
+      <w:r>
+        <w:rPr>
+          <w:lang w:eastAsia="es-ES"/>
+        </w:rPr>
+        <w:t>zk</w:t>
+      </w:r>
+      <w:proofErr w:type="spellEnd"/>
       <w:r>
         <w:rPr>
           <w:lang w:eastAsia="es-ES"/>
@@ -703,19 +820,7 @@
         <w:rPr>
           <w:lang w:eastAsia="es-ES"/>
         </w:rPr>
-        <w:t xml:space="preserve">inefficiencies in both C++ and </w:t>
-      </w:r>
-      <w:r>
-        <w:rPr>
-          <w:lang w:eastAsia="es-ES"/>
-        </w:rPr>
-        <w:t>Web Assembly</w:t>
-      </w:r>
-      <w:r>
-        <w:rPr>
-          <w:lang w:eastAsia="es-ES"/>
-        </w:rPr>
-        <w:t xml:space="preserve"> generated code, as </w:t>
+        <w:t xml:space="preserve">inefficiencies in both C++ and Web Assembly generated code, as </w:t>
       </w:r>
       <w:r>
         <w:rPr>
@@ -819,7 +924,15 @@
     </w:p>
     <w:p>
       <w:r>
-        <w:t>Circom, Compiler Optimization, zk-SNARKs, Memory Efficiency, Bounds Analysis, Rust.</w:t>
+        <w:t xml:space="preserve">Circom, Compiler Optimization, </w:t>
+      </w:r>
+      <w:proofErr w:type="spellStart"/>
+      <w:r>
+        <w:t>zk</w:t>
+      </w:r>
+      <w:proofErr w:type="spellEnd"/>
+      <w:r>
+        <w:t>-SNARKs, Memory Efficiency, Bounds Analysis, Rust.</w:t>
       </w:r>
     </w:p>
     <w:p/>
@@ -883,7 +996,6 @@
               <w:noProof/>
               <w:kern w:val="2"/>
               <w:sz w:val="24"/>
-              <w:lang w:val="es-ES" w:eastAsia="es-ES"/>
               <w14:ligatures w14:val="standardContextual"/>
             </w:rPr>
           </w:pPr>
@@ -896,13 +1008,13 @@
           <w:r>
             <w:fldChar w:fldCharType="separate"/>
           </w:r>
-          <w:hyperlink w:anchor="_Toc238984314" w:history="1">
+          <w:hyperlink w:anchor="_Toc238986512" w:history="1">
             <w:r>
               <w:rPr>
                 <w:rStyle w:val="Hipervnculo"/>
                 <w:noProof/>
               </w:rPr>
-              <w:t>Chapter 1 -Introduction</w:t>
+              <w:t>Capítulo 1 - Introduction</w:t>
             </w:r>
             <w:r>
               <w:rPr>
@@ -923,7 +1035,7 @@
                 <w:noProof/>
                 <w:webHidden/>
               </w:rPr>
-              <w:instrText xml:space="preserve"> PAGEREF _Toc238984314 \h </w:instrText>
+              <w:instrText xml:space="preserve"> PAGEREF _Toc238986512 \h </w:instrText>
             </w:r>
             <w:r>
               <w:rPr>
@@ -965,11 +1077,10 @@
               <w:noProof/>
               <w:kern w:val="2"/>
               <w:sz w:val="24"/>
-              <w:lang w:val="es-ES" w:eastAsia="es-ES"/>
               <w14:ligatures w14:val="standardContextual"/>
             </w:rPr>
           </w:pPr>
-          <w:hyperlink w:anchor="_Toc238984315" w:history="1">
+          <w:hyperlink w:anchor="_Toc238986513" w:history="1">
             <w:r>
               <w:rPr>
                 <w:rStyle w:val="Hipervnculo"/>
@@ -996,7 +1107,7 @@
                 <w:noProof/>
                 <w:webHidden/>
               </w:rPr>
-              <w:instrText xml:space="preserve"> PAGEREF _Toc238984315 \h </w:instrText>
+              <w:instrText xml:space="preserve"> PAGEREF _Toc238986513 \h </w:instrText>
             </w:r>
             <w:r>
               <w:rPr>
@@ -1038,11 +1149,10 @@
               <w:noProof/>
               <w:kern w:val="2"/>
               <w:sz w:val="24"/>
-              <w:lang w:val="es-ES" w:eastAsia="es-ES"/>
               <w14:ligatures w14:val="standardContextual"/>
             </w:rPr>
           </w:pPr>
-          <w:hyperlink w:anchor="_Toc238984316" w:history="1">
+          <w:hyperlink w:anchor="_Toc238986514" w:history="1">
             <w:r>
               <w:rPr>
                 <w:rStyle w:val="Hipervnculo"/>
@@ -1069,7 +1179,7 @@
                 <w:noProof/>
                 <w:webHidden/>
               </w:rPr>
-              <w:instrText xml:space="preserve"> PAGEREF _Toc238984316 \h </w:instrText>
+              <w:instrText xml:space="preserve"> PAGEREF _Toc238986514 \h </w:instrText>
             </w:r>
             <w:r>
               <w:rPr>
@@ -1111,11 +1221,10 @@
               <w:noProof/>
               <w:kern w:val="2"/>
               <w:sz w:val="24"/>
-              <w:lang w:val="es-ES" w:eastAsia="es-ES"/>
               <w14:ligatures w14:val="standardContextual"/>
             </w:rPr>
           </w:pPr>
-          <w:hyperlink w:anchor="_Toc238984317" w:history="1">
+          <w:hyperlink w:anchor="_Toc238986515" w:history="1">
             <w:r>
               <w:rPr>
                 <w:rStyle w:val="Hipervnculo"/>
@@ -1142,7 +1251,7 @@
                 <w:noProof/>
                 <w:webHidden/>
               </w:rPr>
-              <w:instrText xml:space="preserve"> PAGEREF _Toc238984317 \h </w:instrText>
+              <w:instrText xml:space="preserve"> PAGEREF _Toc238986515 \h </w:instrText>
             </w:r>
             <w:r>
               <w:rPr>
@@ -1184,11 +1293,10 @@
               <w:noProof/>
               <w:kern w:val="2"/>
               <w:sz w:val="24"/>
-              <w:lang w:val="es-ES" w:eastAsia="es-ES"/>
               <w14:ligatures w14:val="standardContextual"/>
             </w:rPr>
           </w:pPr>
-          <w:hyperlink w:anchor="_Toc238984318" w:history="1">
+          <w:hyperlink w:anchor="_Toc238986516" w:history="1">
             <w:r>
               <w:rPr>
                 <w:rStyle w:val="Hipervnculo"/>
@@ -1215,7 +1323,7 @@
                 <w:noProof/>
                 <w:webHidden/>
               </w:rPr>
-              <w:instrText xml:space="preserve"> PAGEREF _Toc238984318 \h </w:instrText>
+              <w:instrText xml:space="preserve"> PAGEREF _Toc238986516 \h </w:instrText>
             </w:r>
             <w:r>
               <w:rPr>
@@ -1257,11 +1365,10 @@
               <w:noProof/>
               <w:kern w:val="2"/>
               <w:sz w:val="24"/>
-              <w:lang w:val="es-ES" w:eastAsia="es-ES"/>
               <w14:ligatures w14:val="standardContextual"/>
             </w:rPr>
           </w:pPr>
-          <w:hyperlink w:anchor="_Toc238984319" w:history="1">
+          <w:hyperlink w:anchor="_Toc238986517" w:history="1">
             <w:r>
               <w:rPr>
                 <w:rStyle w:val="Hipervnculo"/>
@@ -1288,7 +1395,7 @@
                 <w:noProof/>
                 <w:webHidden/>
               </w:rPr>
-              <w:instrText xml:space="preserve"> PAGEREF _Toc238984319 \h </w:instrText>
+              <w:instrText xml:space="preserve"> PAGEREF _Toc238986517 \h </w:instrText>
             </w:r>
             <w:r>
               <w:rPr>
@@ -1327,11 +1434,10 @@
               <w:noProof/>
               <w:kern w:val="2"/>
               <w:sz w:val="24"/>
-              <w:lang w:val="es-ES" w:eastAsia="es-ES"/>
               <w14:ligatures w14:val="standardContextual"/>
             </w:rPr>
           </w:pPr>
-          <w:hyperlink w:anchor="_Toc238984320" w:history="1">
+          <w:hyperlink w:anchor="_Toc238986518" w:history="1">
             <w:r>
               <w:rPr>
                 <w:rStyle w:val="Hipervnculo"/>
@@ -1358,7 +1464,7 @@
                 <w:noProof/>
                 <w:webHidden/>
               </w:rPr>
-              <w:instrText xml:space="preserve"> PAGEREF _Toc238984320 \h </w:instrText>
+              <w:instrText xml:space="preserve"> PAGEREF _Toc238986518 \h </w:instrText>
             </w:r>
             <w:r>
               <w:rPr>
@@ -1397,11 +1503,10 @@
               <w:noProof/>
               <w:kern w:val="2"/>
               <w:sz w:val="24"/>
-              <w:lang w:val="es-ES" w:eastAsia="es-ES"/>
               <w14:ligatures w14:val="standardContextual"/>
             </w:rPr>
           </w:pPr>
-          <w:hyperlink w:anchor="_Toc238984321" w:history="1">
+          <w:hyperlink w:anchor="_Toc238986519" w:history="1">
             <w:r>
               <w:rPr>
                 <w:rStyle w:val="Hipervnculo"/>
@@ -1428,7 +1533,7 @@
                 <w:noProof/>
                 <w:webHidden/>
               </w:rPr>
-              <w:instrText xml:space="preserve"> PAGEREF _Toc238984321 \h </w:instrText>
+              <w:instrText xml:space="preserve"> PAGEREF _Toc238986519 \h </w:instrText>
             </w:r>
             <w:r>
               <w:rPr>
@@ -1470,11 +1575,10 @@
               <w:noProof/>
               <w:kern w:val="2"/>
               <w:sz w:val="24"/>
-              <w:lang w:val="es-ES" w:eastAsia="es-ES"/>
               <w14:ligatures w14:val="standardContextual"/>
             </w:rPr>
           </w:pPr>
-          <w:hyperlink w:anchor="_Toc238984322" w:history="1">
+          <w:hyperlink w:anchor="_Toc238986520" w:history="1">
             <w:r>
               <w:rPr>
                 <w:rStyle w:val="Hipervnculo"/>
@@ -1501,7 +1605,7 @@
                 <w:noProof/>
                 <w:webHidden/>
               </w:rPr>
-              <w:instrText xml:space="preserve"> PAGEREF _Toc238984322 \h </w:instrText>
+              <w:instrText xml:space="preserve"> PAGEREF _Toc238986520 \h </w:instrText>
             </w:r>
             <w:r>
               <w:rPr>
@@ -1543,11 +1647,10 @@
               <w:noProof/>
               <w:kern w:val="2"/>
               <w:sz w:val="24"/>
-              <w:lang w:val="es-ES" w:eastAsia="es-ES"/>
               <w14:ligatures w14:val="standardContextual"/>
             </w:rPr>
           </w:pPr>
-          <w:hyperlink w:anchor="_Toc238984323" w:history="1">
+          <w:hyperlink w:anchor="_Toc238986521" w:history="1">
             <w:r>
               <w:rPr>
                 <w:rStyle w:val="Hipervnculo"/>
@@ -1574,7 +1677,7 @@
                 <w:noProof/>
                 <w:webHidden/>
               </w:rPr>
-              <w:instrText xml:space="preserve"> PAGEREF _Toc238984323 \h </w:instrText>
+              <w:instrText xml:space="preserve"> PAGEREF _Toc238986521 \h </w:instrText>
             </w:r>
             <w:r>
               <w:rPr>
@@ -1616,11 +1719,10 @@
               <w:noProof/>
               <w:kern w:val="2"/>
               <w:sz w:val="24"/>
-              <w:lang w:val="es-ES" w:eastAsia="es-ES"/>
               <w14:ligatures w14:val="standardContextual"/>
             </w:rPr>
           </w:pPr>
-          <w:hyperlink w:anchor="_Toc238984324" w:history="1">
+          <w:hyperlink w:anchor="_Toc238986522" w:history="1">
             <w:r>
               <w:rPr>
                 <w:rStyle w:val="Hipervnculo"/>
@@ -1647,7 +1749,7 @@
                 <w:noProof/>
                 <w:webHidden/>
               </w:rPr>
-              <w:instrText xml:space="preserve"> PAGEREF _Toc238984324 \h </w:instrText>
+              <w:instrText xml:space="preserve"> PAGEREF _Toc238986522 \h </w:instrText>
             </w:r>
             <w:r>
               <w:rPr>
@@ -1689,11 +1791,10 @@
               <w:noProof/>
               <w:kern w:val="2"/>
               <w:sz w:val="24"/>
-              <w:lang w:val="es-ES" w:eastAsia="es-ES"/>
               <w14:ligatures w14:val="standardContextual"/>
             </w:rPr>
           </w:pPr>
-          <w:hyperlink w:anchor="_Toc238984325" w:history="1">
+          <w:hyperlink w:anchor="_Toc238986523" w:history="1">
             <w:r>
               <w:rPr>
                 <w:rStyle w:val="Hipervnculo"/>
@@ -1720,7 +1821,7 @@
                 <w:noProof/>
                 <w:webHidden/>
               </w:rPr>
-              <w:instrText xml:space="preserve"> PAGEREF _Toc238984325 \h </w:instrText>
+              <w:instrText xml:space="preserve"> PAGEREF _Toc238986523 \h </w:instrText>
             </w:r>
             <w:r>
               <w:rPr>
@@ -1762,11 +1863,10 @@
               <w:noProof/>
               <w:kern w:val="2"/>
               <w:sz w:val="24"/>
-              <w:lang w:val="es-ES" w:eastAsia="es-ES"/>
               <w14:ligatures w14:val="standardContextual"/>
             </w:rPr>
           </w:pPr>
-          <w:hyperlink w:anchor="_Toc238984326" w:history="1">
+          <w:hyperlink w:anchor="_Toc238986524" w:history="1">
             <w:r>
               <w:rPr>
                 <w:rStyle w:val="Hipervnculo"/>
@@ -1793,7 +1893,7 @@
                 <w:noProof/>
                 <w:webHidden/>
               </w:rPr>
-              <w:instrText xml:space="preserve"> PAGEREF _Toc238984326 \h </w:instrText>
+              <w:instrText xml:space="preserve"> PAGEREF _Toc238986524 \h </w:instrText>
             </w:r>
             <w:r>
               <w:rPr>
@@ -1835,11 +1935,10 @@
               <w:noProof/>
               <w:kern w:val="2"/>
               <w:sz w:val="24"/>
-              <w:lang w:val="es-ES" w:eastAsia="es-ES"/>
               <w14:ligatures w14:val="standardContextual"/>
             </w:rPr>
           </w:pPr>
-          <w:hyperlink w:anchor="_Toc238984327" w:history="1">
+          <w:hyperlink w:anchor="_Toc238986525" w:history="1">
             <w:r>
               <w:rPr>
                 <w:rStyle w:val="Hipervnculo"/>
@@ -1866,7 +1965,7 @@
                 <w:noProof/>
                 <w:webHidden/>
               </w:rPr>
-              <w:instrText xml:space="preserve"> PAGEREF _Toc238984327 \h </w:instrText>
+              <w:instrText xml:space="preserve"> PAGEREF _Toc238986525 \h </w:instrText>
             </w:r>
             <w:r>
               <w:rPr>
@@ -1908,11 +2007,10 @@
               <w:noProof/>
               <w:kern w:val="2"/>
               <w:sz w:val="24"/>
-              <w:lang w:val="es-ES" w:eastAsia="es-ES"/>
               <w14:ligatures w14:val="standardContextual"/>
             </w:rPr>
           </w:pPr>
-          <w:hyperlink w:anchor="_Toc238984328" w:history="1">
+          <w:hyperlink w:anchor="_Toc238986526" w:history="1">
             <w:r>
               <w:rPr>
                 <w:rStyle w:val="Hipervnculo"/>
@@ -1939,7 +2037,7 @@
                 <w:noProof/>
                 <w:webHidden/>
               </w:rPr>
-              <w:instrText xml:space="preserve"> PAGEREF _Toc238984328 \h </w:instrText>
+              <w:instrText xml:space="preserve"> PAGEREF _Toc238986526 \h </w:instrText>
             </w:r>
             <w:r>
               <w:rPr>
@@ -1981,11 +2079,10 @@
               <w:noProof/>
               <w:kern w:val="2"/>
               <w:sz w:val="24"/>
-              <w:lang w:val="es-ES" w:eastAsia="es-ES"/>
               <w14:ligatures w14:val="standardContextual"/>
             </w:rPr>
           </w:pPr>
-          <w:hyperlink w:anchor="_Toc238984329" w:history="1">
+          <w:hyperlink w:anchor="_Toc238986527" w:history="1">
             <w:r>
               <w:rPr>
                 <w:rStyle w:val="Hipervnculo"/>
@@ -2012,7 +2109,7 @@
                 <w:noProof/>
                 <w:webHidden/>
               </w:rPr>
-              <w:instrText xml:space="preserve"> PAGEREF _Toc238984329 \h </w:instrText>
+              <w:instrText xml:space="preserve"> PAGEREF _Toc238986527 \h </w:instrText>
             </w:r>
             <w:r>
               <w:rPr>
@@ -2054,11 +2151,10 @@
               <w:noProof/>
               <w:kern w:val="2"/>
               <w:sz w:val="24"/>
-              <w:lang w:val="es-ES" w:eastAsia="es-ES"/>
               <w14:ligatures w14:val="standardContextual"/>
             </w:rPr>
           </w:pPr>
-          <w:hyperlink w:anchor="_Toc238984330" w:history="1">
+          <w:hyperlink w:anchor="_Toc238986528" w:history="1">
             <w:r>
               <w:rPr>
                 <w:rStyle w:val="Hipervnculo"/>
@@ -2085,7 +2181,7 @@
                 <w:noProof/>
                 <w:webHidden/>
               </w:rPr>
-              <w:instrText xml:space="preserve"> PAGEREF _Toc238984330 \h </w:instrText>
+              <w:instrText xml:space="preserve"> PAGEREF _Toc238986528 \h </w:instrText>
             </w:r>
             <w:r>
               <w:rPr>
@@ -2127,11 +2223,10 @@
               <w:noProof/>
               <w:kern w:val="2"/>
               <w:sz w:val="24"/>
-              <w:lang w:val="es-ES" w:eastAsia="es-ES"/>
               <w14:ligatures w14:val="standardContextual"/>
             </w:rPr>
           </w:pPr>
-          <w:hyperlink w:anchor="_Toc238984331" w:history="1">
+          <w:hyperlink w:anchor="_Toc238986529" w:history="1">
             <w:r>
               <w:rPr>
                 <w:rStyle w:val="Hipervnculo"/>
@@ -2158,7 +2253,7 @@
                 <w:noProof/>
                 <w:webHidden/>
               </w:rPr>
-              <w:instrText xml:space="preserve"> PAGEREF _Toc238984331 \h </w:instrText>
+              <w:instrText xml:space="preserve"> PAGEREF _Toc238986529 \h </w:instrText>
             </w:r>
             <w:r>
               <w:rPr>
@@ -2200,11 +2295,10 @@
               <w:noProof/>
               <w:kern w:val="2"/>
               <w:sz w:val="24"/>
-              <w:lang w:val="es-ES" w:eastAsia="es-ES"/>
               <w14:ligatures w14:val="standardContextual"/>
             </w:rPr>
           </w:pPr>
-          <w:hyperlink w:anchor="_Toc238984332" w:history="1">
+          <w:hyperlink w:anchor="_Toc238986530" w:history="1">
             <w:r>
               <w:rPr>
                 <w:rStyle w:val="Hipervnculo"/>
@@ -2231,7 +2325,7 @@
                 <w:noProof/>
                 <w:webHidden/>
               </w:rPr>
-              <w:instrText xml:space="preserve"> PAGEREF _Toc238984332 \h </w:instrText>
+              <w:instrText xml:space="preserve"> PAGEREF _Toc238986530 \h </w:instrText>
             </w:r>
             <w:r>
               <w:rPr>
@@ -2273,11 +2367,10 @@
               <w:noProof/>
               <w:kern w:val="2"/>
               <w:sz w:val="24"/>
-              <w:lang w:val="es-ES" w:eastAsia="es-ES"/>
               <w14:ligatures w14:val="standardContextual"/>
             </w:rPr>
           </w:pPr>
-          <w:hyperlink w:anchor="_Toc238984333" w:history="1">
+          <w:hyperlink w:anchor="_Toc238986531" w:history="1">
             <w:r>
               <w:rPr>
                 <w:rStyle w:val="Hipervnculo"/>
@@ -2304,7 +2397,7 @@
                 <w:noProof/>
                 <w:webHidden/>
               </w:rPr>
-              <w:instrText xml:space="preserve"> PAGEREF _Toc238984333 \h </w:instrText>
+              <w:instrText xml:space="preserve"> PAGEREF _Toc238986531 \h </w:instrText>
             </w:r>
             <w:r>
               <w:rPr>
@@ -2343,11 +2436,10 @@
               <w:noProof/>
               <w:kern w:val="2"/>
               <w:sz w:val="24"/>
-              <w:lang w:val="es-ES" w:eastAsia="es-ES"/>
               <w14:ligatures w14:val="standardContextual"/>
             </w:rPr>
           </w:pPr>
-          <w:hyperlink w:anchor="_Toc238984334" w:history="1">
+          <w:hyperlink w:anchor="_Toc238986532" w:history="1">
             <w:r>
               <w:rPr>
                 <w:rStyle w:val="Hipervnculo"/>
@@ -2374,7 +2466,7 @@
                 <w:noProof/>
                 <w:webHidden/>
               </w:rPr>
-              <w:instrText xml:space="preserve"> PAGEREF _Toc238984334 \h </w:instrText>
+              <w:instrText xml:space="preserve"> PAGEREF _Toc238986532 \h </w:instrText>
             </w:r>
             <w:r>
               <w:rPr>
@@ -2413,11 +2505,10 @@
               <w:noProof/>
               <w:kern w:val="2"/>
               <w:sz w:val="24"/>
-              <w:lang w:val="es-ES" w:eastAsia="es-ES"/>
               <w14:ligatures w14:val="standardContextual"/>
             </w:rPr>
           </w:pPr>
-          <w:hyperlink w:anchor="_Toc238984335" w:history="1">
+          <w:hyperlink w:anchor="_Toc238986533" w:history="1">
             <w:r>
               <w:rPr>
                 <w:rStyle w:val="Hipervnculo"/>
@@ -2444,7 +2535,7 @@
                 <w:noProof/>
                 <w:webHidden/>
               </w:rPr>
-              <w:instrText xml:space="preserve"> PAGEREF _Toc238984335 \h </w:instrText>
+              <w:instrText xml:space="preserve"> PAGEREF _Toc238986533 \h </w:instrText>
             </w:r>
             <w:r>
               <w:rPr>
@@ -2483,11 +2574,10 @@
               <w:noProof/>
               <w:kern w:val="2"/>
               <w:sz w:val="24"/>
-              <w:lang w:val="es-ES" w:eastAsia="es-ES"/>
               <w14:ligatures w14:val="standardContextual"/>
             </w:rPr>
           </w:pPr>
-          <w:hyperlink w:anchor="_Toc238984336" w:history="1">
+          <w:hyperlink w:anchor="_Toc238986534" w:history="1">
             <w:r>
               <w:rPr>
                 <w:rStyle w:val="Hipervnculo"/>
@@ -2514,7 +2604,7 @@
                 <w:noProof/>
                 <w:webHidden/>
               </w:rPr>
-              <w:instrText xml:space="preserve"> PAGEREF _Toc238984336 \h </w:instrText>
+              <w:instrText xml:space="preserve"> PAGEREF _Toc238986534 \h </w:instrText>
             </w:r>
             <w:r>
               <w:rPr>
@@ -2647,9 +2737,10 @@
         </w:r>
         <w:r>
           <w:rPr>
+            <w:noProof/>
             <w:webHidden/>
           </w:rPr>
-          <w:t>16</w:t>
+          <w:t>14</w:t>
         </w:r>
         <w:r>
           <w:rPr>
@@ -2718,9 +2809,10 @@
         </w:r>
         <w:r>
           <w:rPr>
+            <w:noProof/>
             <w:webHidden/>
           </w:rPr>
-          <w:t>20</w:t>
+          <w:t>18</w:t>
         </w:r>
         <w:r>
           <w:rPr>
@@ -2838,9 +2930,10 @@
         </w:r>
         <w:r>
           <w:rPr>
+            <w:noProof/>
             <w:webHidden/>
           </w:rPr>
-          <w:t>34</w:t>
+          <w:t>32</w:t>
         </w:r>
         <w:r>
           <w:rPr>
@@ -2878,11 +2971,12 @@
       <w:bookmarkStart w:id="3" w:name="_Ref11682300"/>
       <w:bookmarkStart w:id="4" w:name="_Ref11684759"/>
       <w:bookmarkStart w:id="5" w:name="_Toc116636436"/>
-      <w:bookmarkStart w:id="6" w:name="_Toc238984314"/>
+      <w:bookmarkStart w:id="6" w:name="_Toc238986512"/>
       <w:r>
         <w:lastRenderedPageBreak/>
         <w:t>Introduction</w:t>
       </w:r>
+      <w:bookmarkEnd w:id="6"/>
     </w:p>
     <w:p>
       <w:pPr>
@@ -2892,9 +2986,16 @@
       <w:bookmarkEnd w:id="3"/>
       <w:bookmarkEnd w:id="4"/>
       <w:bookmarkEnd w:id="5"/>
-      <w:bookmarkEnd w:id="6"/>
-      <w:r>
-        <w:t xml:space="preserve">Zero-knowledge cryptography allows one party to prove that a statement is true without revealing any additional information beyond the validity of the statement itself. In this context, zk-SNARKs are one of the most widely used constructions, since they provide short proofs that can be verified efficiently. To generate the constraint systems required by these protocols, several domain-specific languages have been developed. These languages make it easier for users to describe arithmetic circuits and other cryptographic computations in a high-level way, without having to deal directly with the low-level representation of constraints. </w:t>
+      <w:r>
+        <w:t xml:space="preserve">Zero-knowledge cryptography allows one party to prove that a statement is true without revealing any additional information beyond the validity of the statement itself. In this context, </w:t>
+      </w:r>
+      <w:proofErr w:type="spellStart"/>
+      <w:r>
+        <w:t>zk</w:t>
+      </w:r>
+      <w:proofErr w:type="spellEnd"/>
+      <w:r>
+        <w:t xml:space="preserve">-SNARKs are one of the most widely used constructions, since they provide short proofs that can be verified efficiently. To generate the constraint systems required by these protocols, several domain-specific languages have been developed. These languages make it easier for users to describe arithmetic circuits and other cryptographic computations in a high-level way, without having to deal directly with the low-level representation of constraints. </w:t>
       </w:r>
     </w:p>
     <w:p>
@@ -2943,7 +3044,7 @@
       <w:pPr>
         <w:pStyle w:val="Ttulo2"/>
       </w:pPr>
-      <w:bookmarkStart w:id="8" w:name="_Toc238984315"/>
+      <w:bookmarkStart w:id="8" w:name="_Toc238986513"/>
       <w:r>
         <w:lastRenderedPageBreak/>
         <w:t>Moti</w:t>
@@ -3001,7 +3102,7 @@
       <w:pPr>
         <w:pStyle w:val="Ttulo2"/>
       </w:pPr>
-      <w:bookmarkStart w:id="9" w:name="_Toc238984316"/>
+      <w:bookmarkStart w:id="9" w:name="_Toc238986514"/>
       <w:r>
         <w:t>Circom</w:t>
       </w:r>
@@ -3042,7 +3143,15 @@
         <w:t>L</w:t>
       </w:r>
       <w:r>
-        <w:t>anguage (DSL) for describing arithmetic circuits used in zk-SNARK systems. Circuits consist of addition and multiplication gates over a finite field. A typical Circom program defines signals, components, and templates in a C-like syntax. Circom also supports arrays of signals, loops, and user-defined templates, enabling modular circuit design. This modularity makes it easier to compose and audit large circuits: each template can be tested independently before instantiation.</w:t>
+        <w:t xml:space="preserve">anguage (DSL) for describing arithmetic circuits used in </w:t>
+      </w:r>
+      <w:proofErr w:type="spellStart"/>
+      <w:r>
+        <w:t>zk</w:t>
+      </w:r>
+      <w:proofErr w:type="spellEnd"/>
+      <w:r>
+        <w:t>-SNARK systems. Circuits consist of addition and multiplication gates over a finite field. A typical Circom program defines signals, components, and templates in a C-like syntax. Circom also supports arrays of signals, loops, and user-defined templates, enabling modular circuit design. This modularity makes it easier to compose and audit large circuits: each template can be tested independently before instantiation.</w:t>
       </w:r>
     </w:p>
     <w:p>
@@ -3051,6 +3160,9 @@
         <w:keepNext/>
       </w:pPr>
       <w:r>
+        <w:rPr>
+          <w:noProof/>
+        </w:rPr>
         <w:drawing>
           <wp:inline distT="0" distB="0" distL="0" distR="0" wp14:anchorId="2AB607CD" wp14:editId="2456100D">
             <wp:extent cx="3010161" cy="2149026"/>
@@ -3088,6 +3200,9 @@
         </w:drawing>
       </w:r>
       <w:r>
+        <w:rPr>
+          <w:noProof/>
+        </w:rPr>
         <w:drawing>
           <wp:inline distT="0" distB="0" distL="0" distR="0" wp14:anchorId="14B28EA1" wp14:editId="21166A0B">
             <wp:extent cx="2320636" cy="2156440"/>
@@ -3150,7 +3265,10 @@
         <w:fldChar w:fldCharType="separate"/>
       </w:r>
       <w:r>
-        <w:t>3</w:t>
+        <w:rPr>
+          <w:noProof/>
+        </w:rPr>
+        <w:t>1</w:t>
       </w:r>
       <w:r>
         <w:fldChar w:fldCharType="end"/>
@@ -3168,6 +3286,9 @@
         <w:fldChar w:fldCharType="separate"/>
       </w:r>
       <w:r>
+        <w:rPr>
+          <w:noProof/>
+        </w:rPr>
         <w:t>1</w:t>
       </w:r>
       <w:r>
@@ -3265,7 +3386,31 @@
         <w:t>T</w:t>
       </w:r>
       <w:r>
-        <w:t xml:space="preserve">ree (AST), performs semantic analysis, and then synthesizes constraints. Every arithmetic operation in the circuit (such as “out &lt;== x * y”) is translated into one or more rank-1 constraints of the form (linear_combination_A) * (linear_combination_B) = (linear_combination_C). </w:t>
+        <w:t>ree (AST), performs semantic analysis, and then synthesizes constraints. Every arithmetic operation in the circuit (such as “out &lt;== x * y”) is translated into one or more rank-1 constraints of the form (</w:t>
+      </w:r>
+      <w:proofErr w:type="spellStart"/>
+      <w:r>
+        <w:t>linear_combination_A</w:t>
+      </w:r>
+      <w:proofErr w:type="spellEnd"/>
+      <w:r>
+        <w:t>) * (</w:t>
+      </w:r>
+      <w:proofErr w:type="spellStart"/>
+      <w:r>
+        <w:t>linear_combination_B</w:t>
+      </w:r>
+      <w:proofErr w:type="spellEnd"/>
+      <w:r>
+        <w:t>) = (</w:t>
+      </w:r>
+      <w:proofErr w:type="spellStart"/>
+      <w:r>
+        <w:t>linear_combination_C</w:t>
+      </w:r>
+      <w:proofErr w:type="spellEnd"/>
+      <w:r>
+        <w:t xml:space="preserve">). </w:t>
       </w:r>
     </w:p>
     <w:p>
@@ -3348,7 +3493,7 @@
       <w:pPr>
         <w:pStyle w:val="Ttulo2"/>
       </w:pPr>
-      <w:bookmarkStart w:id="12" w:name="_Toc238984317"/>
+      <w:bookmarkStart w:id="12" w:name="_Toc238986515"/>
       <w:r>
         <w:lastRenderedPageBreak/>
         <w:t>Rust</w:t>
@@ -3434,7 +3579,15 @@
         <w:t>’</w:t>
       </w:r>
       <w:r>
-        <w:t>s rich type system aids in writing compiler code. For example, signals, components, and constraints can be modeled with Rust enums and checked exhaustively by the compiler. This reduces bugs in handling complex cases.</w:t>
+        <w:t xml:space="preserve">s rich type system aids in writing compiler code. For example, signals, components, and constraints can be modeled with Rust </w:t>
+      </w:r>
+      <w:proofErr w:type="spellStart"/>
+      <w:r>
+        <w:t>enums</w:t>
+      </w:r>
+      <w:proofErr w:type="spellEnd"/>
+      <w:r>
+        <w:t xml:space="preserve"> and checked exhaustively by the compiler. This reduces bugs in handling complex cases.</w:t>
       </w:r>
     </w:p>
     <w:p>
@@ -3467,7 +3620,7 @@
         <w:pStyle w:val="Ttulo2"/>
       </w:pPr>
       <w:bookmarkStart w:id="13" w:name="_Toc116636438"/>
-      <w:bookmarkStart w:id="14" w:name="_Toc238984318"/>
+      <w:bookmarkStart w:id="14" w:name="_Toc238986516"/>
       <w:r>
         <w:lastRenderedPageBreak/>
         <w:t>Obj</w:t>
@@ -3533,7 +3686,7 @@
       <w:pPr>
         <w:pStyle w:val="Ttulo2"/>
       </w:pPr>
-      <w:bookmarkStart w:id="15" w:name="_Toc238984319"/>
+      <w:bookmarkStart w:id="15" w:name="_Toc238986517"/>
       <w:r>
         <w:t>Work Plan</w:t>
       </w:r>
@@ -3613,7 +3766,7 @@
       <w:pPr>
         <w:pStyle w:val="Ttulo1"/>
       </w:pPr>
-      <w:bookmarkStart w:id="16" w:name="_Toc238984320"/>
+      <w:bookmarkStart w:id="16" w:name="_Toc238986518"/>
       <w:r>
         <w:lastRenderedPageBreak/>
         <w:t>The problem to solve</w:t>
@@ -3655,6 +3808,9 @@
         <w:pStyle w:val="Descripcin"/>
       </w:pPr>
       <w:r>
+        <w:rPr>
+          <w:noProof/>
+        </w:rPr>
         <w:drawing>
           <wp:inline distT="0" distB="0" distL="0" distR="0" wp14:anchorId="46EF787F" wp14:editId="6BEE6DFC">
             <wp:extent cx="1996613" cy="2118544"/>
@@ -3717,7 +3873,10 @@
         <w:fldChar w:fldCharType="separate"/>
       </w:r>
       <w:r>
-        <w:t>3</w:t>
+        <w:rPr>
+          <w:noProof/>
+        </w:rPr>
+        <w:t>2</w:t>
       </w:r>
       <w:r>
         <w:fldChar w:fldCharType="end"/>
@@ -3735,17 +3894,17 @@
         <w:fldChar w:fldCharType="separate"/>
       </w:r>
       <w:r>
-        <w:t>2</w:t>
+        <w:rPr>
+          <w:noProof/>
+        </w:rPr>
+        <w:t>1</w:t>
       </w:r>
       <w:r>
         <w:fldChar w:fldCharType="end"/>
       </w:r>
       <w:bookmarkEnd w:id="17"/>
       <w:r>
-        <w:t xml:space="preserve">. </w:t>
-      </w:r>
-      <w:r>
-        <w:t>IsZero template From Circomlib</w:t>
+        <w:t>. IsZero template From Circomlib</w:t>
       </w:r>
       <w:bookmarkEnd w:id="18"/>
     </w:p>
@@ -3758,7 +3917,13 @@
       </w:pPr>
       <w:r>
         <w:lastRenderedPageBreak/>
-        <w:t xml:space="preserve">The work presented in this project is divided into two main phases. First, the bounds of the different signals are detected by analyzing the operations and statements that define them. Once these bounds are known, they can be used in two ways: to generate more efficient C or WebAssembly code, and to verify that the constraints produced by the circuit are sufficient to guarantee that those bounds always hold. </w:t>
+        <w:t xml:space="preserve">The work presented in this project is divided into two main phases. First, the bounds of the different signals are detected by analyzing the operations and statements that define them. Once these bounds are known, they can be used in two ways: to generate more efficient C or </w:t>
+      </w:r>
+      <w:r>
+        <w:t>Web Assembly</w:t>
+      </w:r>
+      <w:r>
+        <w:t xml:space="preserve"> code, and to verify that the constraints produced by the circuit are sufficient to guarantee that those bounds always hold. </w:t>
       </w:r>
     </w:p>
     <w:p>
@@ -3782,7 +3947,7 @@
       <w:pPr>
         <w:pStyle w:val="Ttulo1"/>
       </w:pPr>
-      <w:bookmarkStart w:id="19" w:name="_Toc238984321"/>
+      <w:bookmarkStart w:id="19" w:name="_Toc238986519"/>
       <w:r>
         <w:lastRenderedPageBreak/>
         <w:t>Analysis</w:t>
@@ -3831,7 +3996,7 @@
         </w:numPr>
       </w:pPr>
       <w:bookmarkStart w:id="20" w:name="_Toc116636442"/>
-      <w:bookmarkStart w:id="21" w:name="_Toc238984322"/>
+      <w:bookmarkStart w:id="21" w:name="_Toc238986520"/>
       <w:r>
         <w:t>3.1 Compute bounds</w:t>
       </w:r>
@@ -3890,7 +4055,7 @@
       <w:pPr>
         <w:pStyle w:val="Ttulo3"/>
       </w:pPr>
-      <w:bookmarkStart w:id="22" w:name="_Toc238984323"/>
+      <w:bookmarkStart w:id="22" w:name="_Toc238986521"/>
       <w:r>
         <w:lastRenderedPageBreak/>
         <w:t>Infix operations</w:t>
@@ -3929,7 +4094,15 @@
         <w:pStyle w:val="Textoindependiente"/>
       </w:pPr>
       <w:r>
-        <w:t>For the Add operation you just have to add the bounds, min with min and max with max, and you will have the bounds of the whole expression.</w:t>
+        <w:t xml:space="preserve">For the Add operation you just </w:t>
+      </w:r>
+      <w:proofErr w:type="gramStart"/>
+      <w:r>
+        <w:t>have to</w:t>
+      </w:r>
+      <w:proofErr w:type="gramEnd"/>
+      <w:r>
+        <w:t xml:space="preserve"> add the bounds, min with min and max with max, and you will have the bounds of the whole expression.</w:t>
       </w:r>
     </w:p>
     <w:p>
@@ -3945,7 +4118,15 @@
         <w:pStyle w:val="Textoindependiente"/>
       </w:pPr>
       <w:r>
-        <w:t>And finally, the Mul operations works as the Add operation with th twist that now you multiply instead of summing.</w:t>
+        <w:t xml:space="preserve">And finally, the Mul operations works as the Add operation with </w:t>
+      </w:r>
+      <w:proofErr w:type="spellStart"/>
+      <w:r>
+        <w:t>th</w:t>
+      </w:r>
+      <w:proofErr w:type="spellEnd"/>
+      <w:r>
+        <w:t xml:space="preserve"> twist that now you multiply instead of summing.</w:t>
       </w:r>
     </w:p>
     <w:p>
@@ -4165,7 +4346,27 @@
         <w:pStyle w:val="Textoindependiente"/>
       </w:pPr>
       <w:r>
-        <w:t xml:space="preserve">There are two kinds of divisions in Circom, the Divison and the Interger Division. </w:t>
+        <w:t xml:space="preserve">There are two </w:t>
+      </w:r>
+      <w:proofErr w:type="gramStart"/>
+      <w:r>
+        <w:t>kinds of divisions</w:t>
+      </w:r>
+      <w:proofErr w:type="gramEnd"/>
+      <w:r>
+        <w:t xml:space="preserve"> in Circom, the </w:t>
+      </w:r>
+      <w:r>
+        <w:t>Division</w:t>
+      </w:r>
+      <w:r>
+        <w:t xml:space="preserve"> and the </w:t>
+      </w:r>
+      <w:r>
+        <w:t>Integer</w:t>
+      </w:r>
+      <w:r>
+        <w:t xml:space="preserve"> Division. </w:t>
       </w:r>
     </w:p>
     <w:p>
@@ -4835,8 +5036,9 @@
       <w:pPr>
         <w:pStyle w:val="Ttulo3"/>
       </w:pPr>
-      <w:bookmarkStart w:id="23" w:name="_Toc238984324"/>
-      <w:r>
+      <w:bookmarkStart w:id="23" w:name="_Toc238986522"/>
+      <w:r>
+        <w:lastRenderedPageBreak/>
         <w:t>Prefix operations</w:t>
       </w:r>
       <w:bookmarkEnd w:id="23"/>
@@ -4938,7 +5140,13 @@
         <w:t>These</w:t>
       </w:r>
       <w:r>
-        <w:t xml:space="preserve"> binary operations converts all 1s to 0s and vice versa, therefore, the </w:t>
+        <w:t xml:space="preserve"> binary operations </w:t>
+      </w:r>
+      <w:r>
+        <w:t>convert</w:t>
+      </w:r>
+      <w:r>
+        <w:t xml:space="preserve"> all 1s to 0s and vice versa, therefore, the </w:t>
       </w:r>
       <w:r>
         <w:t>minimum</w:t>
@@ -4999,7 +5207,7 @@
       <w:pPr>
         <w:pStyle w:val="Ttulo3"/>
       </w:pPr>
-      <w:bookmarkStart w:id="24" w:name="_Toc238984325"/>
+      <w:bookmarkStart w:id="24" w:name="_Toc238986523"/>
       <w:r>
         <w:lastRenderedPageBreak/>
         <w:t>Switch operations</w:t>
@@ -5087,7 +5295,7 @@
       <w:pPr>
         <w:pStyle w:val="Ttulo3"/>
       </w:pPr>
-      <w:bookmarkStart w:id="25" w:name="_Toc238984326"/>
+      <w:bookmarkStart w:id="25" w:name="_Toc238986524"/>
       <w:r>
         <w:t>Variables</w:t>
       </w:r>
@@ -5125,7 +5333,7 @@
       <w:pPr>
         <w:pStyle w:val="Ttulo3"/>
       </w:pPr>
-      <w:bookmarkStart w:id="26" w:name="_Toc238984327"/>
+      <w:bookmarkStart w:id="26" w:name="_Toc238986525"/>
       <w:r>
         <w:t>Numbers</w:t>
       </w:r>
@@ -5151,7 +5359,7 @@
       <w:pPr>
         <w:pStyle w:val="Ttulo3"/>
       </w:pPr>
-      <w:bookmarkStart w:id="27" w:name="_Toc238984328"/>
+      <w:bookmarkStart w:id="27" w:name="_Toc238986526"/>
       <w:r>
         <w:t>Array in line</w:t>
       </w:r>
@@ -5273,7 +5481,7 @@
       <w:pPr>
         <w:pStyle w:val="Ttulo3"/>
       </w:pPr>
-      <w:bookmarkStart w:id="28" w:name="_Toc238984329"/>
+      <w:bookmarkStart w:id="28" w:name="_Toc238986527"/>
       <w:r>
         <w:lastRenderedPageBreak/>
         <w:t>Uniform array</w:t>
@@ -5316,7 +5524,7 @@
       <w:pPr>
         <w:pStyle w:val="Ttulo2"/>
       </w:pPr>
-      <w:bookmarkStart w:id="29" w:name="_Toc238984330"/>
+      <w:bookmarkStart w:id="29" w:name="_Toc238986528"/>
       <w:r>
         <w:t>Treat statements</w:t>
       </w:r>
@@ -5345,7 +5553,7 @@
       <w:pPr>
         <w:pStyle w:val="Ttulo3"/>
       </w:pPr>
-      <w:bookmarkStart w:id="30" w:name="_Toc238984331"/>
+      <w:bookmarkStart w:id="30" w:name="_Toc238986529"/>
       <w:r>
         <w:t>Treat conditional</w:t>
       </w:r>
@@ -5458,7 +5666,7 @@
       <w:pPr>
         <w:pStyle w:val="Ttulo3"/>
       </w:pPr>
-      <w:bookmarkStart w:id="31" w:name="_Toc238984332"/>
+      <w:bookmarkStart w:id="31" w:name="_Toc238986530"/>
       <w:r>
         <w:lastRenderedPageBreak/>
         <w:t>Treat while</w:t>
@@ -5573,7 +5781,7 @@
       <w:pPr>
         <w:pStyle w:val="Ttulo2"/>
       </w:pPr>
-      <w:bookmarkStart w:id="32" w:name="_Toc238984333"/>
+      <w:bookmarkStart w:id="32" w:name="_Toc238986531"/>
       <w:r>
         <w:lastRenderedPageBreak/>
         <w:t>Bounds inheritance</w:t>
@@ -5695,7 +5903,7 @@
       <w:pPr>
         <w:pStyle w:val="Ttulo1"/>
       </w:pPr>
-      <w:bookmarkStart w:id="33" w:name="_Toc238984334"/>
+      <w:bookmarkStart w:id="33" w:name="_Toc238986532"/>
       <w:r>
         <w:lastRenderedPageBreak/>
         <w:t>Testing</w:t>
@@ -7212,7 +7420,10 @@
         <w:fldChar w:fldCharType="separate"/>
       </w:r>
       <w:r>
-        <w:t>3</w:t>
+        <w:rPr>
+          <w:noProof/>
+        </w:rPr>
+        <w:t>4</w:t>
       </w:r>
       <w:r>
         <w:fldChar w:fldCharType="end"/>
@@ -7230,6 +7441,9 @@
         <w:fldChar w:fldCharType="separate"/>
       </w:r>
       <w:r>
+        <w:rPr>
+          <w:noProof/>
+        </w:rPr>
         <w:t>1</w:t>
       </w:r>
       <w:r>
@@ -7287,7 +7501,7 @@
       </w:pPr>
       <w:bookmarkStart w:id="36" w:name="_Ref11684775"/>
       <w:bookmarkStart w:id="37" w:name="_Toc116636446"/>
-      <w:bookmarkStart w:id="38" w:name="_Toc238984335"/>
+      <w:bookmarkStart w:id="38" w:name="_Toc238986533"/>
       <w:r>
         <w:lastRenderedPageBreak/>
         <w:t>Conclusions</w:t>
@@ -7331,30 +7545,24 @@
         <w:t>solves</w:t>
       </w:r>
       <w:r>
+        <w:t xml:space="preserve"> memory inefficiency within the Circom compiler. Because Circom </w:t>
+      </w:r>
+      <w:r>
+        <w:t xml:space="preserve">treats </w:t>
+      </w:r>
+      <w:r>
+        <w:t xml:space="preserve">all signals as maximum-width prime field elements, generated witness calculators carried unnecessary computational and memory overhead. The implementation of a </w:t>
+      </w:r>
+      <w:r>
+        <w:t>bound</w:t>
+      </w:r>
+      <w:r>
+        <w:t xml:space="preserve"> analyzer allows the compiler to</w:t>
+      </w:r>
+      <w:r>
         <w:t xml:space="preserve"> </w:t>
       </w:r>
       <w:r>
-        <w:t>memory</w:t>
-      </w:r>
-      <w:r>
-        <w:t xml:space="preserve"> inefficiency within the Circom compiler. Because Circom </w:t>
-      </w:r>
-      <w:r>
-        <w:t xml:space="preserve">treats </w:t>
-      </w:r>
-      <w:r>
-        <w:t xml:space="preserve">all signals as maximum-width prime field elements, generated witness calculators carried unnecessary computational and memory overhead. The implementation of a </w:t>
-      </w:r>
-      <w:r>
-        <w:t>bound’s</w:t>
-      </w:r>
-      <w:r>
-        <w:t xml:space="preserve"> analyzer allows the compiler to</w:t>
-      </w:r>
-      <w:r>
-        <w:t xml:space="preserve"> </w:t>
-      </w:r>
-      <w:r>
         <w:t xml:space="preserve">predict signal ranges through complex infix, prefix, and bitwise operations, as well as through program state changes like conditionals and loops.  </w:t>
       </w:r>
     </w:p>
@@ -7369,7 +7577,13 @@
         <w:t>circuits from the Circomlib repository, it was proven that assigning appropriate primitive types</w:t>
       </w:r>
       <w:r>
-        <w:t xml:space="preserve">, like boleans and integers, generates a </w:t>
+        <w:t>, like bo</w:t>
+      </w:r>
+      <w:r>
+        <w:t>o</w:t>
+      </w:r>
+      <w:r>
+        <w:t xml:space="preserve">leans and integers, generates a </w:t>
       </w:r>
       <w:r>
         <w:t xml:space="preserve">performance gain. Across the </w:t>
@@ -7428,29 +7642,14 @@
     </w:p>
     <w:p>
       <w:pPr>
-        <w:pStyle w:val="Textoindependiente"/>
-        <w:ind w:firstLine="0"/>
-        <w:sectPr>
-          <w:type w:val="oddPage"/>
-          <w:pgSz w:w="12240" w:h="15840"/>
-          <w:pgMar w:top="1440" w:right="1440" w:bottom="1440" w:left="1440" w:header="720" w:footer="720" w:gutter="0"/>
-          <w:cols w:space="720"/>
-          <w:docGrid w:linePitch="360"/>
-        </w:sectPr>
-      </w:pPr>
-      <w:bookmarkStart w:id="39" w:name="Bibliografía"/>
-    </w:p>
-    <w:p>
-      <w:pPr>
         <w:pStyle w:val="PageHeadingTOC"/>
       </w:pPr>
-      <w:bookmarkStart w:id="40" w:name="_Toc238984336"/>
-      <w:bookmarkEnd w:id="39"/>
+      <w:bookmarkStart w:id="39" w:name="_Toc238986534"/>
       <w:r>
         <w:lastRenderedPageBreak/>
         <w:t>Bibliography</w:t>
       </w:r>
-      <w:bookmarkEnd w:id="40"/>
+      <w:bookmarkEnd w:id="39"/>
       <w:r>
         <w:rPr>
           <w:sz w:val="22"/>
@@ -7643,10 +7842,7 @@
               <w:pStyle w:val="Bibliografa"/>
             </w:pPr>
             <w:r>
-              <w:t xml:space="preserve">Circomlib </w:t>
-            </w:r>
-            <w:r>
-              <w:t>https://github.com/iden3/circomlib</w:t>
+              <w:t>Circomlib https://github.com/iden3/circomlib</w:t>
             </w:r>
           </w:p>
         </w:tc>
@@ -7667,9 +7863,9 @@
       <w:r>
         <w:fldChar w:fldCharType="end"/>
       </w:r>
-      <w:bookmarkStart w:id="41" w:name="Apendices"/>
-    </w:p>
-    <w:bookmarkEnd w:id="41"/>
+      <w:bookmarkStart w:id="40" w:name="Apendices"/>
+    </w:p>
+    <w:bookmarkEnd w:id="40"/>
     <w:p>
       <w:pPr>
         <w:ind w:firstLine="0"/>

</xml_diff>